<commit_message>
Updated phase fitting fieldwork data
</commit_message>
<xml_diff>
--- a/TimeLapse_LaTeX/Thesis/working summary.docx
+++ b/TimeLapse_LaTeX/Thesis/working summary.docx
@@ -193,6 +193,18 @@
     </w:p>
     <w:p>
       <w:pPr>
+        <w:pStyle w:val="ListParagraph"/>
+        <w:numPr>
+          <w:ilvl w:val="0"/>
+          <w:numId w:val="1"/>
+        </w:numPr>
+      </w:pPr>
+      <w:r>
+        <w:t>Discuss WLS phase-difference-fit framework</w:t>
+      </w:r>
+    </w:p>
+    <w:p>
+      <w:pPr>
         <w:ind w:left="360"/>
       </w:pPr>
     </w:p>
@@ -689,6 +701,74 @@
         <w:t>?</w:t>
       </w:r>
     </w:p>
+    <w:p>
+      <w:r>
+        <w:rPr>
+          <w:b/>
+          <w:bCs/>
+        </w:rPr>
+        <w:t>Answer</w:t>
+      </w:r>
+      <w:r>
+        <w:t>: yes</w:t>
+      </w:r>
+      <w:r>
+        <w:t>,</w:t>
+      </w:r>
+      <w:r>
+        <w:t xml:space="preserve"> when we look at the phase</w:t>
+      </w:r>
+      <w:r>
+        <w:t xml:space="preserve"> changes</w:t>
+      </w:r>
+    </w:p>
+    <w:p>
+      <w:pPr>
+        <w:rPr>
+          <w:b/>
+          <w:bCs/>
+        </w:rPr>
+      </w:pPr>
+    </w:p>
+    <w:p>
+      <w:r>
+        <w:rPr>
+          <w:b/>
+          <w:bCs/>
+        </w:rPr>
+        <w:t>Hypothesis 1</w:t>
+      </w:r>
+      <w:r>
+        <w:t xml:space="preserve">: can we infer lateral, vertical, diagonal subwavelength movement? </w:t>
+      </w:r>
+    </w:p>
+    <w:p>
+      <w:r>
+        <w:rPr>
+          <w:b/>
+          <w:bCs/>
+        </w:rPr>
+        <w:t>Answer</w:t>
+      </w:r>
+      <w:r>
+        <w:t xml:space="preserve">: </w:t>
+      </w:r>
+      <w:r>
+        <w:t>y</w:t>
+      </w:r>
+      <w:r>
+        <w:t>es</w:t>
+      </w:r>
+      <w:r>
+        <w:t>,</w:t>
+      </w:r>
+      <w:r>
+        <w:t xml:space="preserve"> when looking at phase changes</w:t>
+      </w:r>
+      <w:r>
+        <w:t>. All three migration techniques work.</w:t>
+      </w:r>
+    </w:p>
     <w:p/>
     <w:p>
       <w:r>
@@ -696,88 +776,46 @@
           <w:b/>
           <w:bCs/>
         </w:rPr>
+        <w:t>Hypothesis 2</w:t>
+      </w:r>
+      <w:r>
+        <w:t>: which migration technique would be best for it</w:t>
+      </w:r>
+      <w:r>
+        <w:t xml:space="preserve"> (when dealing with noise)</w:t>
+      </w:r>
+      <w:r>
+        <w:t xml:space="preserve">? </w:t>
+      </w:r>
+    </w:p>
+    <w:p>
+      <w:r>
+        <w:rPr>
+          <w:b/>
+          <w:bCs/>
+        </w:rPr>
         <w:t>Answer</w:t>
       </w:r>
       <w:r>
-        <w:t>: yes</w:t>
-      </w:r>
-      <w:r>
-        <w:t>,</w:t>
-      </w:r>
-      <w:r>
-        <w:t xml:space="preserve"> when we look at the phase</w:t>
-      </w:r>
-      <w:r>
-        <w:t xml:space="preserve"> changes</w:t>
-      </w:r>
-    </w:p>
-    <w:p>
-      <w:r>
-        <w:rPr>
-          <w:b/>
-          <w:bCs/>
-        </w:rPr>
-        <w:t>Hypothesis 1</w:t>
-      </w:r>
-      <w:r>
-        <w:t xml:space="preserve">: can we infer lateral, vertical, diagonal subwavelength movement? </w:t>
-      </w:r>
-    </w:p>
-    <w:p>
-      <w:r>
-        <w:rPr>
-          <w:b/>
-          <w:bCs/>
-        </w:rPr>
-        <w:t>Answer</w:t>
-      </w:r>
-      <w:r>
         <w:t xml:space="preserve">: </w:t>
       </w:r>
       <w:r>
-        <w:t>y</w:t>
-      </w:r>
-      <w:r>
-        <w:t>es</w:t>
-      </w:r>
-      <w:r>
-        <w:t>,</w:t>
-      </w:r>
-      <w:r>
-        <w:t xml:space="preserve"> when looking at phase changes</w:t>
-      </w:r>
-    </w:p>
-    <w:p>
-      <w:r>
-        <w:rPr>
-          <w:b/>
-          <w:bCs/>
-        </w:rPr>
-        <w:t>Hypothesis 2</w:t>
-      </w:r>
-      <w:r>
-        <w:t>: which migration technique would be best for it</w:t>
-      </w:r>
-      <w:r>
-        <w:t xml:space="preserve">? </w:t>
-      </w:r>
-    </w:p>
-    <w:p>
-      <w:r>
-        <w:rPr>
-          <w:b/>
-          <w:bCs/>
-        </w:rPr>
-        <w:t>Answer</w:t>
-      </w:r>
-      <w:r>
-        <w:t xml:space="preserve">: </w:t>
-      </w:r>
-      <w:r>
         <w:t>Back</w:t>
       </w:r>
       <w:r>
-        <w:t xml:space="preserve"> propagation as we keep the physics correct</w:t>
+        <w:t xml:space="preserve"> propagation </w:t>
+      </w:r>
+      <w:r>
+        <w:t>(</w:t>
+      </w:r>
+      <w:r>
+        <w:t>as we keep the physics correct</w:t>
+      </w:r>
+      <w:r>
+        <w:t xml:space="preserve"> and we do not have to multiply dx with 2 as we do with Kirchhoff and Gazdag</w:t>
+      </w:r>
+      <w:r>
+        <w:t>)</w:t>
       </w:r>
       <w:r>
         <w:t xml:space="preserve">. Also test on moving fluid </w:t>
@@ -795,6 +833,7 @@
         <w:t>, so tracking material change rather than a scatterer translation</w:t>
       </w:r>
     </w:p>
+    <w:p/>
     <w:p>
       <w:r>
         <w:rPr>
@@ -804,25 +843,16 @@
         <w:t>Hypothesis 3</w:t>
       </w:r>
       <w:r>
-        <w:t>: can we still infer this when looking a</w:t>
-      </w:r>
-      <w:r>
-        <w:t xml:space="preserve">t noisy B-scans? Test it on </w:t>
-      </w:r>
-      <w:r>
-        <w:t xml:space="preserve">synthetic </w:t>
-      </w:r>
-      <w:r>
-        <w:t>noisy data</w:t>
-      </w:r>
-      <w:r>
-        <w:t xml:space="preserve"> and </w:t>
-      </w:r>
-      <w:r>
-        <w:t>field data</w:t>
-      </w:r>
-      <w:r>
-        <w:t>.</w:t>
+        <w:t xml:space="preserve">: can we still infer </w:t>
+      </w:r>
+      <w:r>
+        <w:t xml:space="preserve">subwavelength movement in complex models </w:t>
+      </w:r>
+      <w:r>
+        <w:t xml:space="preserve">(read multiple scatterers in different direction + noise) </w:t>
+      </w:r>
+      <w:r>
+        <w:t>or field data?</w:t>
       </w:r>
     </w:p>
     <w:p>

</xml_diff>

<commit_message>
Experimented with phase fit of field data different stages
</commit_message>
<xml_diff>
--- a/TimeLapse_LaTeX/Thesis/working summary.docx
+++ b/TimeLapse_LaTeX/Thesis/working summary.docx
@@ -1,6 +1,6 @@
 
 <file path=word/document.xml><?xml version="1.0" encoding="utf-8"?>
-<w:document xmlns:wpc="http://schemas.microsoft.com/office/word/2010/wordprocessingCanvas" xmlns:cx="http://schemas.microsoft.com/office/drawing/2014/chartex" xmlns:cx1="http://schemas.microsoft.com/office/drawing/2015/9/8/chartex" xmlns:cx2="http://schemas.microsoft.com/office/drawing/2015/10/21/chartex" xmlns:cx3="http://schemas.microsoft.com/office/drawing/2016/5/9/chartex" xmlns:cx4="http://schemas.microsoft.com/office/drawing/2016/5/10/chartex" xmlns:cx5="http://schemas.microsoft.com/office/drawing/2016/5/11/chartex" xmlns:cx6="http://schemas.microsoft.com/office/drawing/2016/5/12/chartex" xmlns:cx7="http://schemas.microsoft.com/office/drawing/2016/5/13/chartex" xmlns:cx8="http://schemas.microsoft.com/office/drawing/2016/5/14/chartex" xmlns:mc="http://schemas.openxmlformats.org/markup-compatibility/2006" xmlns:aink="http://schemas.microsoft.com/office/drawing/2016/ink" xmlns:am3d="http://schemas.microsoft.com/office/drawing/2017/model3d" xmlns:o="urn:schemas-microsoft-com:office:office" xmlns:oel="http://schemas.microsoft.com/office/2019/extlst" xmlns:r="http://schemas.openxmlformats.org/officeDocument/2006/relationships" xmlns:m="http://schemas.openxmlformats.org/officeDocument/2006/math" xmlns:v="urn:schemas-microsoft-com:vml" xmlns:wp14="http://schemas.microsoft.com/office/word/2010/wordprocessingDrawing" xmlns:wp="http://schemas.openxmlformats.org/drawingml/2006/wordprocessingDrawing" xmlns:w10="urn:schemas-microsoft-com:office:word" xmlns:w="http://schemas.openxmlformats.org/wordprocessingml/2006/main" xmlns:w14="http://schemas.microsoft.com/office/word/2010/wordml" xmlns:w15="http://schemas.microsoft.com/office/word/2012/wordml" xmlns:w16cei="http://schemas.microsoft.com/office/word/2026/wordml/cei" xmlns:w16cex="http://schemas.microsoft.com/office/word/2018/wordml/cex" xmlns:w16cid="http://schemas.microsoft.com/office/word/2016/wordml/cid" xmlns:w16="http://schemas.microsoft.com/office/word/2018/wordml" xmlns:w16du="http://schemas.microsoft.com/office/word/2023/wordml/word16du" xmlns:w16sdtdh="http://schemas.microsoft.com/office/word/2020/wordml/sdtdatahash" xmlns:w16sdtfl="http://schemas.microsoft.com/office/word/2024/wordml/sdtformatlock" xmlns:w16se="http://schemas.microsoft.com/office/word/2015/wordml/symex" xmlns:wpg="http://schemas.microsoft.com/office/word/2010/wordprocessingGroup" xmlns:wpi="http://schemas.microsoft.com/office/word/2010/wordprocessingInk" xmlns:wne="http://schemas.microsoft.com/office/word/2006/wordml" xmlns:wps="http://schemas.microsoft.com/office/word/2010/wordprocessingShape" mc:Ignorable="w14 w15 w16se w16cid w16 w16cex w16sdtdh w16sdtfl w16du wp14">
+<w:document xmlns:wpc="http://schemas.microsoft.com/office/word/2010/wordprocessingCanvas" xmlns:cx="http://schemas.microsoft.com/office/drawing/2014/chartex" xmlns:cx1="http://schemas.microsoft.com/office/drawing/2015/9/8/chartex" xmlns:cx2="http://schemas.microsoft.com/office/drawing/2015/10/21/chartex" xmlns:cx3="http://schemas.microsoft.com/office/drawing/2016/5/9/chartex" xmlns:cx4="http://schemas.microsoft.com/office/drawing/2016/5/10/chartex" xmlns:cx5="http://schemas.microsoft.com/office/drawing/2016/5/11/chartex" xmlns:cx6="http://schemas.microsoft.com/office/drawing/2016/5/12/chartex" xmlns:cx7="http://schemas.microsoft.com/office/drawing/2016/5/13/chartex" xmlns:cx8="http://schemas.microsoft.com/office/drawing/2016/5/14/chartex" xmlns:mc="http://schemas.openxmlformats.org/markup-compatibility/2006" xmlns:aink="http://schemas.microsoft.com/office/drawing/2016/ink" xmlns:am3d="http://schemas.microsoft.com/office/drawing/2017/model3d" xmlns:o="urn:schemas-microsoft-com:office:office" xmlns:oel="http://schemas.microsoft.com/office/2019/extlst" xmlns:r="http://schemas.openxmlformats.org/officeDocument/2006/relationships" xmlns:m="http://schemas.openxmlformats.org/officeDocument/2006/math" xmlns:v="urn:schemas-microsoft-com:vml" xmlns:wp14="http://schemas.microsoft.com/office/word/2010/wordprocessingDrawing" xmlns:wp="http://schemas.openxmlformats.org/drawingml/2006/wordprocessingDrawing" xmlns:w10="urn:schemas-microsoft-com:office:word" xmlns:w="http://schemas.openxmlformats.org/wordprocessingml/2006/main" xmlns:w14="http://schemas.microsoft.com/office/word/2010/wordml" xmlns:w15="http://schemas.microsoft.com/office/word/2012/wordml" xmlns:w16cex="http://schemas.microsoft.com/office/word/2018/wordml/cex" xmlns:w16cid="http://schemas.microsoft.com/office/word/2016/wordml/cid" xmlns:w16="http://schemas.microsoft.com/office/word/2018/wordml" xmlns:w16du="http://schemas.microsoft.com/office/word/2023/wordml/word16du" xmlns:w16sdtdh="http://schemas.microsoft.com/office/word/2020/wordml/sdtdatahash" xmlns:w16sdtfl="http://schemas.microsoft.com/office/word/2024/wordml/sdtformatlock" xmlns:w16se="http://schemas.microsoft.com/office/word/2015/wordml/symex" xmlns:wpg="http://schemas.microsoft.com/office/word/2010/wordprocessingGroup" xmlns:wpi="http://schemas.microsoft.com/office/word/2010/wordprocessingInk" xmlns:wne="http://schemas.microsoft.com/office/word/2006/wordml" xmlns:wps="http://schemas.microsoft.com/office/word/2010/wordprocessingShape" mc:Ignorable="w14 w15 w16se w16cid w16 w16cex w16sdtdh w16sdtfl w16du wp14">
   <w:body>
     <w:p>
       <w:pPr>
@@ -90,7 +90,7 @@
     </w:p>
     <w:p>
       <w:pPr>
-        <w:pStyle w:val="ListParagraph"/>
+        <w:pStyle w:val="Lijstalinea"/>
         <w:numPr>
           <w:ilvl w:val="0"/>
           <w:numId w:val="1"/>
@@ -105,7 +105,7 @@
     </w:p>
     <w:p>
       <w:pPr>
-        <w:pStyle w:val="ListParagraph"/>
+        <w:pStyle w:val="Lijstalinea"/>
         <w:numPr>
           <w:ilvl w:val="0"/>
           <w:numId w:val="1"/>
@@ -117,7 +117,7 @@
     </w:p>
     <w:p>
       <w:pPr>
-        <w:pStyle w:val="ListParagraph"/>
+        <w:pStyle w:val="Lijstalinea"/>
         <w:numPr>
           <w:ilvl w:val="0"/>
           <w:numId w:val="1"/>
@@ -129,7 +129,7 @@
     </w:p>
     <w:p>
       <w:pPr>
-        <w:pStyle w:val="ListParagraph"/>
+        <w:pStyle w:val="Lijstalinea"/>
       </w:pPr>
     </w:p>
     <w:p>
@@ -157,7 +157,7 @@
     </w:p>
     <w:p>
       <w:pPr>
-        <w:pStyle w:val="ListParagraph"/>
+        <w:pStyle w:val="Lijstalinea"/>
         <w:numPr>
           <w:ilvl w:val="0"/>
           <w:numId w:val="1"/>
@@ -169,7 +169,7 @@
     </w:p>
     <w:p>
       <w:pPr>
-        <w:pStyle w:val="ListParagraph"/>
+        <w:pStyle w:val="Lijstalinea"/>
         <w:numPr>
           <w:ilvl w:val="0"/>
           <w:numId w:val="1"/>
@@ -181,7 +181,7 @@
     </w:p>
     <w:p>
       <w:pPr>
-        <w:pStyle w:val="ListParagraph"/>
+        <w:pStyle w:val="Lijstalinea"/>
         <w:numPr>
           <w:ilvl w:val="0"/>
           <w:numId w:val="1"/>
@@ -193,7 +193,7 @@
     </w:p>
     <w:p>
       <w:pPr>
-        <w:pStyle w:val="ListParagraph"/>
+        <w:pStyle w:val="Lijstalinea"/>
         <w:numPr>
           <w:ilvl w:val="0"/>
           <w:numId w:val="1"/>
@@ -285,6 +285,7 @@
     </w:p>
     <w:p>
       <w:r>
+        <w:lastRenderedPageBreak/>
         <w:t>A discussion of the results of all the experiments in relation to the general hypothesis that was justified in the General Introduction.</w:t>
       </w:r>
     </w:p>
@@ -668,6 +669,7 @@
     <w:p/>
     <w:p>
       <w:r>
+        <w:lastRenderedPageBreak/>
         <w:t>Change working summary</w:t>
       </w:r>
       <w:r>
@@ -878,6 +880,9 @@
         </w:rPr>
         <w:t>maybe</w:t>
       </w:r>
+      <w:r>
+        <w:t>, and when isolating the timelapse changes correctly</w:t>
+      </w:r>
     </w:p>
     <w:p/>
     <w:p>
@@ -894,7 +899,7 @@
     </w:p>
     <w:p>
       <w:pPr>
-        <w:pStyle w:val="ListParagraph"/>
+        <w:pStyle w:val="Lijstalinea"/>
         <w:numPr>
           <w:ilvl w:val="0"/>
           <w:numId w:val="1"/>
@@ -906,7 +911,7 @@
     </w:p>
     <w:p>
       <w:pPr>
-        <w:pStyle w:val="ListParagraph"/>
+        <w:pStyle w:val="Lijstalinea"/>
         <w:numPr>
           <w:ilvl w:val="0"/>
           <w:numId w:val="1"/>
@@ -918,7 +923,7 @@
     </w:p>
     <w:p>
       <w:pPr>
-        <w:pStyle w:val="ListParagraph"/>
+        <w:pStyle w:val="Lijstalinea"/>
         <w:numPr>
           <w:ilvl w:val="0"/>
           <w:numId w:val="1"/>
@@ -954,7 +959,7 @@
 </file>
 
 <file path=word/numbering.xml><?xml version="1.0" encoding="utf-8"?>
-<w:numbering xmlns:wpc="http://schemas.microsoft.com/office/word/2010/wordprocessingCanvas" xmlns:cx="http://schemas.microsoft.com/office/drawing/2014/chartex" xmlns:cx1="http://schemas.microsoft.com/office/drawing/2015/9/8/chartex" xmlns:cx2="http://schemas.microsoft.com/office/drawing/2015/10/21/chartex" xmlns:cx3="http://schemas.microsoft.com/office/drawing/2016/5/9/chartex" xmlns:cx4="http://schemas.microsoft.com/office/drawing/2016/5/10/chartex" xmlns:cx5="http://schemas.microsoft.com/office/drawing/2016/5/11/chartex" xmlns:cx6="http://schemas.microsoft.com/office/drawing/2016/5/12/chartex" xmlns:cx7="http://schemas.microsoft.com/office/drawing/2016/5/13/chartex" xmlns:cx8="http://schemas.microsoft.com/office/drawing/2016/5/14/chartex" xmlns:mc="http://schemas.openxmlformats.org/markup-compatibility/2006" xmlns:aink="http://schemas.microsoft.com/office/drawing/2016/ink" xmlns:am3d="http://schemas.microsoft.com/office/drawing/2017/model3d" xmlns:o="urn:schemas-microsoft-com:office:office" xmlns:oel="http://schemas.microsoft.com/office/2019/extlst" xmlns:r="http://schemas.openxmlformats.org/officeDocument/2006/relationships" xmlns:m="http://schemas.openxmlformats.org/officeDocument/2006/math" xmlns:v="urn:schemas-microsoft-com:vml" xmlns:wp14="http://schemas.microsoft.com/office/word/2010/wordprocessingDrawing" xmlns:wp="http://schemas.openxmlformats.org/drawingml/2006/wordprocessingDrawing" xmlns:w10="urn:schemas-microsoft-com:office:word" xmlns:w="http://schemas.openxmlformats.org/wordprocessingml/2006/main" xmlns:w14="http://schemas.microsoft.com/office/word/2010/wordml" xmlns:w15="http://schemas.microsoft.com/office/word/2012/wordml" xmlns:w16cei="http://schemas.microsoft.com/office/word/2026/wordml/cei" xmlns:w16cex="http://schemas.microsoft.com/office/word/2018/wordml/cex" xmlns:w16cid="http://schemas.microsoft.com/office/word/2016/wordml/cid" xmlns:w16="http://schemas.microsoft.com/office/word/2018/wordml" xmlns:w16du="http://schemas.microsoft.com/office/word/2023/wordml/word16du" xmlns:w16sdtdh="http://schemas.microsoft.com/office/word/2020/wordml/sdtdatahash" xmlns:w16sdtfl="http://schemas.microsoft.com/office/word/2024/wordml/sdtformatlock" xmlns:w16se="http://schemas.microsoft.com/office/word/2015/wordml/symex" xmlns:wpg="http://schemas.microsoft.com/office/word/2010/wordprocessingGroup" xmlns:wpi="http://schemas.microsoft.com/office/word/2010/wordprocessingInk" xmlns:wne="http://schemas.microsoft.com/office/word/2006/wordml" xmlns:wps="http://schemas.microsoft.com/office/word/2010/wordprocessingShape" mc:Ignorable="w14 w15 w16se w16cid w16 w16cex w16sdtdh w16sdtfl w16du wp14">
+<w:numbering xmlns:wpc="http://schemas.microsoft.com/office/word/2010/wordprocessingCanvas" xmlns:cx="http://schemas.microsoft.com/office/drawing/2014/chartex" xmlns:cx1="http://schemas.microsoft.com/office/drawing/2015/9/8/chartex" xmlns:cx2="http://schemas.microsoft.com/office/drawing/2015/10/21/chartex" xmlns:cx3="http://schemas.microsoft.com/office/drawing/2016/5/9/chartex" xmlns:cx4="http://schemas.microsoft.com/office/drawing/2016/5/10/chartex" xmlns:cx5="http://schemas.microsoft.com/office/drawing/2016/5/11/chartex" xmlns:cx6="http://schemas.microsoft.com/office/drawing/2016/5/12/chartex" xmlns:cx7="http://schemas.microsoft.com/office/drawing/2016/5/13/chartex" xmlns:cx8="http://schemas.microsoft.com/office/drawing/2016/5/14/chartex" xmlns:mc="http://schemas.openxmlformats.org/markup-compatibility/2006" xmlns:aink="http://schemas.microsoft.com/office/drawing/2016/ink" xmlns:am3d="http://schemas.microsoft.com/office/drawing/2017/model3d" xmlns:o="urn:schemas-microsoft-com:office:office" xmlns:oel="http://schemas.microsoft.com/office/2019/extlst" xmlns:r="http://schemas.openxmlformats.org/officeDocument/2006/relationships" xmlns:m="http://schemas.openxmlformats.org/officeDocument/2006/math" xmlns:v="urn:schemas-microsoft-com:vml" xmlns:wp14="http://schemas.microsoft.com/office/word/2010/wordprocessingDrawing" xmlns:wp="http://schemas.openxmlformats.org/drawingml/2006/wordprocessingDrawing" xmlns:w10="urn:schemas-microsoft-com:office:word" xmlns:w="http://schemas.openxmlformats.org/wordprocessingml/2006/main" xmlns:w14="http://schemas.microsoft.com/office/word/2010/wordml" xmlns:w15="http://schemas.microsoft.com/office/word/2012/wordml" xmlns:w16cex="http://schemas.microsoft.com/office/word/2018/wordml/cex" xmlns:w16cid="http://schemas.microsoft.com/office/word/2016/wordml/cid" xmlns:w16="http://schemas.microsoft.com/office/word/2018/wordml" xmlns:w16du="http://schemas.microsoft.com/office/word/2023/wordml/word16du" xmlns:w16sdtdh="http://schemas.microsoft.com/office/word/2020/wordml/sdtdatahash" xmlns:w16sdtfl="http://schemas.microsoft.com/office/word/2024/wordml/sdtformatlock" xmlns:w16se="http://schemas.microsoft.com/office/word/2015/wordml/symex" xmlns:wpg="http://schemas.microsoft.com/office/word/2010/wordprocessingGroup" xmlns:wpi="http://schemas.microsoft.com/office/word/2010/wordprocessingInk" xmlns:wne="http://schemas.microsoft.com/office/word/2006/wordml" xmlns:wps="http://schemas.microsoft.com/office/word/2010/wordprocessingShape" mc:Ignorable="w14 w15 w16se w16cid w16 w16cex w16sdtdh w16sdtfl w16du wp14">
   <w:abstractNum w:abstractNumId="0" w15:restartNumberingAfterBreak="0">
     <w:nsid w:val="3894545A"/>
     <w:multiLevelType w:val="hybridMultilevel"/>
@@ -1470,15 +1475,15 @@
     <w:lsdException w:name="Unresolved Mention" w:semiHidden="1" w:unhideWhenUsed="1"/>
     <w:lsdException w:name="Smart Link" w:semiHidden="1" w:unhideWhenUsed="1"/>
   </w:latentStyles>
-  <w:style w:type="paragraph" w:default="1" w:styleId="Normal">
+  <w:style w:type="paragraph" w:default="1" w:styleId="Standaard">
     <w:name w:val="Normal"/>
     <w:qFormat/>
   </w:style>
-  <w:style w:type="paragraph" w:styleId="Heading1">
+  <w:style w:type="paragraph" w:styleId="Kop1">
     <w:name w:val="heading 1"/>
-    <w:basedOn w:val="Normal"/>
-    <w:next w:val="Normal"/>
-    <w:link w:val="Heading1Char"/>
+    <w:basedOn w:val="Standaard"/>
+    <w:next w:val="Standaard"/>
+    <w:link w:val="Kop1Char"/>
     <w:uiPriority w:val="9"/>
     <w:qFormat/>
     <w:rsid w:val="005B10CC"/>
@@ -1495,11 +1500,11 @@
       <w:szCs w:val="40"/>
     </w:rPr>
   </w:style>
-  <w:style w:type="paragraph" w:styleId="Heading2">
+  <w:style w:type="paragraph" w:styleId="Kop2">
     <w:name w:val="heading 2"/>
-    <w:basedOn w:val="Normal"/>
-    <w:next w:val="Normal"/>
-    <w:link w:val="Heading2Char"/>
+    <w:basedOn w:val="Standaard"/>
+    <w:next w:val="Standaard"/>
+    <w:link w:val="Kop2Char"/>
     <w:uiPriority w:val="9"/>
     <w:semiHidden/>
     <w:unhideWhenUsed/>
@@ -1518,11 +1523,11 @@
       <w:szCs w:val="32"/>
     </w:rPr>
   </w:style>
-  <w:style w:type="paragraph" w:styleId="Heading3">
+  <w:style w:type="paragraph" w:styleId="Kop3">
     <w:name w:val="heading 3"/>
-    <w:basedOn w:val="Normal"/>
-    <w:next w:val="Normal"/>
-    <w:link w:val="Heading3Char"/>
+    <w:basedOn w:val="Standaard"/>
+    <w:next w:val="Standaard"/>
+    <w:link w:val="Kop3Char"/>
     <w:uiPriority w:val="9"/>
     <w:semiHidden/>
     <w:unhideWhenUsed/>
@@ -1541,11 +1546,11 @@
       <w:szCs w:val="28"/>
     </w:rPr>
   </w:style>
-  <w:style w:type="paragraph" w:styleId="Heading4">
+  <w:style w:type="paragraph" w:styleId="Kop4">
     <w:name w:val="heading 4"/>
-    <w:basedOn w:val="Normal"/>
-    <w:next w:val="Normal"/>
-    <w:link w:val="Heading4Char"/>
+    <w:basedOn w:val="Standaard"/>
+    <w:next w:val="Standaard"/>
+    <w:link w:val="Kop4Char"/>
     <w:uiPriority w:val="9"/>
     <w:semiHidden/>
     <w:unhideWhenUsed/>
@@ -1564,11 +1569,11 @@
       <w:color w:val="0F4761" w:themeColor="accent1" w:themeShade="BF"/>
     </w:rPr>
   </w:style>
-  <w:style w:type="paragraph" w:styleId="Heading5">
+  <w:style w:type="paragraph" w:styleId="Kop5">
     <w:name w:val="heading 5"/>
-    <w:basedOn w:val="Normal"/>
-    <w:next w:val="Normal"/>
-    <w:link w:val="Heading5Char"/>
+    <w:basedOn w:val="Standaard"/>
+    <w:next w:val="Standaard"/>
+    <w:link w:val="Kop5Char"/>
     <w:uiPriority w:val="9"/>
     <w:semiHidden/>
     <w:unhideWhenUsed/>
@@ -1585,11 +1590,11 @@
       <w:color w:val="0F4761" w:themeColor="accent1" w:themeShade="BF"/>
     </w:rPr>
   </w:style>
-  <w:style w:type="paragraph" w:styleId="Heading6">
+  <w:style w:type="paragraph" w:styleId="Kop6">
     <w:name w:val="heading 6"/>
-    <w:basedOn w:val="Normal"/>
-    <w:next w:val="Normal"/>
-    <w:link w:val="Heading6Char"/>
+    <w:basedOn w:val="Standaard"/>
+    <w:next w:val="Standaard"/>
+    <w:link w:val="Kop6Char"/>
     <w:uiPriority w:val="9"/>
     <w:semiHidden/>
     <w:unhideWhenUsed/>
@@ -1608,11 +1613,11 @@
       <w:color w:val="595959" w:themeColor="text1" w:themeTint="A6"/>
     </w:rPr>
   </w:style>
-  <w:style w:type="paragraph" w:styleId="Heading7">
+  <w:style w:type="paragraph" w:styleId="Kop7">
     <w:name w:val="heading 7"/>
-    <w:basedOn w:val="Normal"/>
-    <w:next w:val="Normal"/>
-    <w:link w:val="Heading7Char"/>
+    <w:basedOn w:val="Standaard"/>
+    <w:next w:val="Standaard"/>
+    <w:link w:val="Kop7Char"/>
     <w:uiPriority w:val="9"/>
     <w:semiHidden/>
     <w:unhideWhenUsed/>
@@ -1629,11 +1634,11 @@
       <w:color w:val="595959" w:themeColor="text1" w:themeTint="A6"/>
     </w:rPr>
   </w:style>
-  <w:style w:type="paragraph" w:styleId="Heading8">
+  <w:style w:type="paragraph" w:styleId="Kop8">
     <w:name w:val="heading 8"/>
-    <w:basedOn w:val="Normal"/>
-    <w:next w:val="Normal"/>
-    <w:link w:val="Heading8Char"/>
+    <w:basedOn w:val="Standaard"/>
+    <w:next w:val="Standaard"/>
+    <w:link w:val="Kop8Char"/>
     <w:uiPriority w:val="9"/>
     <w:semiHidden/>
     <w:unhideWhenUsed/>
@@ -1652,11 +1657,11 @@
       <w:color w:val="272727" w:themeColor="text1" w:themeTint="D8"/>
     </w:rPr>
   </w:style>
-  <w:style w:type="paragraph" w:styleId="Heading9">
+  <w:style w:type="paragraph" w:styleId="Kop9">
     <w:name w:val="heading 9"/>
-    <w:basedOn w:val="Normal"/>
-    <w:next w:val="Normal"/>
-    <w:link w:val="Heading9Char"/>
+    <w:basedOn w:val="Standaard"/>
+    <w:next w:val="Standaard"/>
+    <w:link w:val="Kop9Char"/>
     <w:uiPriority w:val="9"/>
     <w:semiHidden/>
     <w:unhideWhenUsed/>
@@ -1673,13 +1678,13 @@
       <w:color w:val="272727" w:themeColor="text1" w:themeTint="D8"/>
     </w:rPr>
   </w:style>
-  <w:style w:type="character" w:default="1" w:styleId="DefaultParagraphFont">
+  <w:style w:type="character" w:default="1" w:styleId="Standaardalinea-lettertype">
     <w:name w:val="Default Paragraph Font"/>
     <w:uiPriority w:val="1"/>
     <w:semiHidden/>
     <w:unhideWhenUsed/>
   </w:style>
-  <w:style w:type="table" w:default="1" w:styleId="TableNormal">
+  <w:style w:type="table" w:default="1" w:styleId="Standaardtabel">
     <w:name w:val="Normal Table"/>
     <w:uiPriority w:val="99"/>
     <w:semiHidden/>
@@ -1694,16 +1699,16 @@
       </w:tblCellMar>
     </w:tblPr>
   </w:style>
-  <w:style w:type="numbering" w:default="1" w:styleId="NoList">
+  <w:style w:type="numbering" w:default="1" w:styleId="Geenlijst">
     <w:name w:val="No List"/>
     <w:uiPriority w:val="99"/>
     <w:semiHidden/>
     <w:unhideWhenUsed/>
   </w:style>
-  <w:style w:type="character" w:customStyle="1" w:styleId="Heading1Char">
-    <w:name w:val="Heading 1 Char"/>
-    <w:basedOn w:val="DefaultParagraphFont"/>
-    <w:link w:val="Heading1"/>
+  <w:style w:type="character" w:customStyle="1" w:styleId="Kop1Char">
+    <w:name w:val="Kop 1 Char"/>
+    <w:basedOn w:val="Standaardalinea-lettertype"/>
+    <w:link w:val="Kop1"/>
     <w:uiPriority w:val="9"/>
     <w:rsid w:val="005B10CC"/>
     <w:rPr>
@@ -1713,10 +1718,10 @@
       <w:szCs w:val="40"/>
     </w:rPr>
   </w:style>
-  <w:style w:type="character" w:customStyle="1" w:styleId="Heading2Char">
-    <w:name w:val="Heading 2 Char"/>
-    <w:basedOn w:val="DefaultParagraphFont"/>
-    <w:link w:val="Heading2"/>
+  <w:style w:type="character" w:customStyle="1" w:styleId="Kop2Char">
+    <w:name w:val="Kop 2 Char"/>
+    <w:basedOn w:val="Standaardalinea-lettertype"/>
+    <w:link w:val="Kop2"/>
     <w:uiPriority w:val="9"/>
     <w:semiHidden/>
     <w:rsid w:val="005B10CC"/>
@@ -1727,10 +1732,10 @@
       <w:szCs w:val="32"/>
     </w:rPr>
   </w:style>
-  <w:style w:type="character" w:customStyle="1" w:styleId="Heading3Char">
-    <w:name w:val="Heading 3 Char"/>
-    <w:basedOn w:val="DefaultParagraphFont"/>
-    <w:link w:val="Heading3"/>
+  <w:style w:type="character" w:customStyle="1" w:styleId="Kop3Char">
+    <w:name w:val="Kop 3 Char"/>
+    <w:basedOn w:val="Standaardalinea-lettertype"/>
+    <w:link w:val="Kop3"/>
     <w:uiPriority w:val="9"/>
     <w:semiHidden/>
     <w:rsid w:val="005B10CC"/>
@@ -1741,10 +1746,10 @@
       <w:szCs w:val="28"/>
     </w:rPr>
   </w:style>
-  <w:style w:type="character" w:customStyle="1" w:styleId="Heading4Char">
-    <w:name w:val="Heading 4 Char"/>
-    <w:basedOn w:val="DefaultParagraphFont"/>
-    <w:link w:val="Heading4"/>
+  <w:style w:type="character" w:customStyle="1" w:styleId="Kop4Char">
+    <w:name w:val="Kop 4 Char"/>
+    <w:basedOn w:val="Standaardalinea-lettertype"/>
+    <w:link w:val="Kop4"/>
     <w:uiPriority w:val="9"/>
     <w:semiHidden/>
     <w:rsid w:val="005B10CC"/>
@@ -1755,10 +1760,10 @@
       <w:color w:val="0F4761" w:themeColor="accent1" w:themeShade="BF"/>
     </w:rPr>
   </w:style>
-  <w:style w:type="character" w:customStyle="1" w:styleId="Heading5Char">
-    <w:name w:val="Heading 5 Char"/>
-    <w:basedOn w:val="DefaultParagraphFont"/>
-    <w:link w:val="Heading5"/>
+  <w:style w:type="character" w:customStyle="1" w:styleId="Kop5Char">
+    <w:name w:val="Kop 5 Char"/>
+    <w:basedOn w:val="Standaardalinea-lettertype"/>
+    <w:link w:val="Kop5"/>
     <w:uiPriority w:val="9"/>
     <w:semiHidden/>
     <w:rsid w:val="005B10CC"/>
@@ -1767,10 +1772,10 @@
       <w:color w:val="0F4761" w:themeColor="accent1" w:themeShade="BF"/>
     </w:rPr>
   </w:style>
-  <w:style w:type="character" w:customStyle="1" w:styleId="Heading6Char">
-    <w:name w:val="Heading 6 Char"/>
-    <w:basedOn w:val="DefaultParagraphFont"/>
-    <w:link w:val="Heading6"/>
+  <w:style w:type="character" w:customStyle="1" w:styleId="Kop6Char">
+    <w:name w:val="Kop 6 Char"/>
+    <w:basedOn w:val="Standaardalinea-lettertype"/>
+    <w:link w:val="Kop6"/>
     <w:uiPriority w:val="9"/>
     <w:semiHidden/>
     <w:rsid w:val="005B10CC"/>
@@ -1781,10 +1786,10 @@
       <w:color w:val="595959" w:themeColor="text1" w:themeTint="A6"/>
     </w:rPr>
   </w:style>
-  <w:style w:type="character" w:customStyle="1" w:styleId="Heading7Char">
-    <w:name w:val="Heading 7 Char"/>
-    <w:basedOn w:val="DefaultParagraphFont"/>
-    <w:link w:val="Heading7"/>
+  <w:style w:type="character" w:customStyle="1" w:styleId="Kop7Char">
+    <w:name w:val="Kop 7 Char"/>
+    <w:basedOn w:val="Standaardalinea-lettertype"/>
+    <w:link w:val="Kop7"/>
     <w:uiPriority w:val="9"/>
     <w:semiHidden/>
     <w:rsid w:val="005B10CC"/>
@@ -1793,10 +1798,10 @@
       <w:color w:val="595959" w:themeColor="text1" w:themeTint="A6"/>
     </w:rPr>
   </w:style>
-  <w:style w:type="character" w:customStyle="1" w:styleId="Heading8Char">
-    <w:name w:val="Heading 8 Char"/>
-    <w:basedOn w:val="DefaultParagraphFont"/>
-    <w:link w:val="Heading8"/>
+  <w:style w:type="character" w:customStyle="1" w:styleId="Kop8Char">
+    <w:name w:val="Kop 8 Char"/>
+    <w:basedOn w:val="Standaardalinea-lettertype"/>
+    <w:link w:val="Kop8"/>
     <w:uiPriority w:val="9"/>
     <w:semiHidden/>
     <w:rsid w:val="005B10CC"/>
@@ -1807,10 +1812,10 @@
       <w:color w:val="272727" w:themeColor="text1" w:themeTint="D8"/>
     </w:rPr>
   </w:style>
-  <w:style w:type="character" w:customStyle="1" w:styleId="Heading9Char">
-    <w:name w:val="Heading 9 Char"/>
-    <w:basedOn w:val="DefaultParagraphFont"/>
-    <w:link w:val="Heading9"/>
+  <w:style w:type="character" w:customStyle="1" w:styleId="Kop9Char">
+    <w:name w:val="Kop 9 Char"/>
+    <w:basedOn w:val="Standaardalinea-lettertype"/>
+    <w:link w:val="Kop9"/>
     <w:uiPriority w:val="9"/>
     <w:semiHidden/>
     <w:rsid w:val="005B10CC"/>
@@ -1819,11 +1824,11 @@
       <w:color w:val="272727" w:themeColor="text1" w:themeTint="D8"/>
     </w:rPr>
   </w:style>
-  <w:style w:type="paragraph" w:styleId="Title">
+  <w:style w:type="paragraph" w:styleId="Titel">
     <w:name w:val="Title"/>
-    <w:basedOn w:val="Normal"/>
-    <w:next w:val="Normal"/>
-    <w:link w:val="TitleChar"/>
+    <w:basedOn w:val="Standaard"/>
+    <w:next w:val="Standaard"/>
+    <w:link w:val="TitelChar"/>
     <w:uiPriority w:val="10"/>
     <w:qFormat/>
     <w:rsid w:val="005B10CC"/>
@@ -1839,10 +1844,10 @@
       <w:szCs w:val="56"/>
     </w:rPr>
   </w:style>
-  <w:style w:type="character" w:customStyle="1" w:styleId="TitleChar">
-    <w:name w:val="Title Char"/>
-    <w:basedOn w:val="DefaultParagraphFont"/>
-    <w:link w:val="Title"/>
+  <w:style w:type="character" w:customStyle="1" w:styleId="TitelChar">
+    <w:name w:val="Titel Char"/>
+    <w:basedOn w:val="Standaardalinea-lettertype"/>
+    <w:link w:val="Titel"/>
     <w:uiPriority w:val="10"/>
     <w:rsid w:val="005B10CC"/>
     <w:rPr>
@@ -1853,11 +1858,11 @@
       <w:szCs w:val="56"/>
     </w:rPr>
   </w:style>
-  <w:style w:type="paragraph" w:styleId="Subtitle">
+  <w:style w:type="paragraph" w:styleId="Ondertitel">
     <w:name w:val="Subtitle"/>
-    <w:basedOn w:val="Normal"/>
-    <w:next w:val="Normal"/>
-    <w:link w:val="SubtitleChar"/>
+    <w:basedOn w:val="Standaard"/>
+    <w:next w:val="Standaard"/>
+    <w:link w:val="OndertitelChar"/>
     <w:uiPriority w:val="11"/>
     <w:qFormat/>
     <w:rsid w:val="005B10CC"/>
@@ -1874,10 +1879,10 @@
       <w:szCs w:val="28"/>
     </w:rPr>
   </w:style>
-  <w:style w:type="character" w:customStyle="1" w:styleId="SubtitleChar">
-    <w:name w:val="Subtitle Char"/>
-    <w:basedOn w:val="DefaultParagraphFont"/>
-    <w:link w:val="Subtitle"/>
+  <w:style w:type="character" w:customStyle="1" w:styleId="OndertitelChar">
+    <w:name w:val="Ondertitel Char"/>
+    <w:basedOn w:val="Standaardalinea-lettertype"/>
+    <w:link w:val="Ondertitel"/>
     <w:uiPriority w:val="11"/>
     <w:rsid w:val="005B10CC"/>
     <w:rPr>
@@ -1888,11 +1893,11 @@
       <w:szCs w:val="28"/>
     </w:rPr>
   </w:style>
-  <w:style w:type="paragraph" w:styleId="Quote">
+  <w:style w:type="paragraph" w:styleId="Citaat">
     <w:name w:val="Quote"/>
-    <w:basedOn w:val="Normal"/>
-    <w:next w:val="Normal"/>
-    <w:link w:val="QuoteChar"/>
+    <w:basedOn w:val="Standaard"/>
+    <w:next w:val="Standaard"/>
+    <w:link w:val="CitaatChar"/>
     <w:uiPriority w:val="29"/>
     <w:qFormat/>
     <w:rsid w:val="005B10CC"/>
@@ -1906,10 +1911,10 @@
       <w:color w:val="404040" w:themeColor="text1" w:themeTint="BF"/>
     </w:rPr>
   </w:style>
-  <w:style w:type="character" w:customStyle="1" w:styleId="QuoteChar">
-    <w:name w:val="Quote Char"/>
-    <w:basedOn w:val="DefaultParagraphFont"/>
-    <w:link w:val="Quote"/>
+  <w:style w:type="character" w:customStyle="1" w:styleId="CitaatChar">
+    <w:name w:val="Citaat Char"/>
+    <w:basedOn w:val="Standaardalinea-lettertype"/>
+    <w:link w:val="Citaat"/>
     <w:uiPriority w:val="29"/>
     <w:rsid w:val="005B10CC"/>
     <w:rPr>
@@ -1918,9 +1923,9 @@
       <w:color w:val="404040" w:themeColor="text1" w:themeTint="BF"/>
     </w:rPr>
   </w:style>
-  <w:style w:type="paragraph" w:styleId="ListParagraph">
+  <w:style w:type="paragraph" w:styleId="Lijstalinea">
     <w:name w:val="List Paragraph"/>
-    <w:basedOn w:val="Normal"/>
+    <w:basedOn w:val="Standaard"/>
     <w:uiPriority w:val="34"/>
     <w:qFormat/>
     <w:rsid w:val="005B10CC"/>
@@ -1929,9 +1934,9 @@
       <w:contextualSpacing/>
     </w:pPr>
   </w:style>
-  <w:style w:type="character" w:styleId="IntenseEmphasis">
+  <w:style w:type="character" w:styleId="Intensievebenadrukking">
     <w:name w:val="Intense Emphasis"/>
-    <w:basedOn w:val="DefaultParagraphFont"/>
+    <w:basedOn w:val="Standaardalinea-lettertype"/>
     <w:uiPriority w:val="21"/>
     <w:qFormat/>
     <w:rsid w:val="005B10CC"/>
@@ -1941,11 +1946,11 @@
       <w:color w:val="0F4761" w:themeColor="accent1" w:themeShade="BF"/>
     </w:rPr>
   </w:style>
-  <w:style w:type="paragraph" w:styleId="IntenseQuote">
+  <w:style w:type="paragraph" w:styleId="Duidelijkcitaat">
     <w:name w:val="Intense Quote"/>
-    <w:basedOn w:val="Normal"/>
-    <w:next w:val="Normal"/>
-    <w:link w:val="IntenseQuoteChar"/>
+    <w:basedOn w:val="Standaard"/>
+    <w:next w:val="Standaard"/>
+    <w:link w:val="DuidelijkcitaatChar"/>
     <w:uiPriority w:val="30"/>
     <w:qFormat/>
     <w:rsid w:val="005B10CC"/>
@@ -1964,10 +1969,10 @@
       <w:color w:val="0F4761" w:themeColor="accent1" w:themeShade="BF"/>
     </w:rPr>
   </w:style>
-  <w:style w:type="character" w:customStyle="1" w:styleId="IntenseQuoteChar">
-    <w:name w:val="Intense Quote Char"/>
-    <w:basedOn w:val="DefaultParagraphFont"/>
-    <w:link w:val="IntenseQuote"/>
+  <w:style w:type="character" w:customStyle="1" w:styleId="DuidelijkcitaatChar">
+    <w:name w:val="Duidelijk citaat Char"/>
+    <w:basedOn w:val="Standaardalinea-lettertype"/>
+    <w:link w:val="Duidelijkcitaat"/>
     <w:uiPriority w:val="30"/>
     <w:rsid w:val="005B10CC"/>
     <w:rPr>
@@ -1976,9 +1981,9 @@
       <w:color w:val="0F4761" w:themeColor="accent1" w:themeShade="BF"/>
     </w:rPr>
   </w:style>
-  <w:style w:type="character" w:styleId="IntenseReference">
+  <w:style w:type="character" w:styleId="Intensieveverwijzing">
     <w:name w:val="Intense Reference"/>
-    <w:basedOn w:val="DefaultParagraphFont"/>
+    <w:basedOn w:val="Standaardalinea-lettertype"/>
     <w:uiPriority w:val="32"/>
     <w:qFormat/>
     <w:rsid w:val="005B10CC"/>
@@ -1990,9 +1995,9 @@
       <w:spacing w:val="5"/>
     </w:rPr>
   </w:style>
-  <w:style w:type="table" w:styleId="TableGrid">
+  <w:style w:type="table" w:styleId="Tabelraster">
     <w:name w:val="Table Grid"/>
-    <w:basedOn w:val="TableNormal"/>
+    <w:basedOn w:val="Standaardtabel"/>
     <w:uiPriority w:val="39"/>
     <w:rsid w:val="0024613D"/>
     <w:pPr>

</xml_diff>

<commit_message>
No longer taking time lapse difference to reference twice and still experimenting with improving the phase fit
</commit_message>
<xml_diff>
--- a/TimeLapse_LaTeX/Thesis/working summary.docx
+++ b/TimeLapse_LaTeX/Thesis/working summary.docx
@@ -151,8 +151,13 @@
       <w:r>
         <w:tab/>
       </w:r>
-      <w:r>
-        <w:t>All of the materials and methods common to two or more experiments—specifically excluding the experimental procedure for each experiment.</w:t>
+      <w:proofErr w:type="gramStart"/>
+      <w:r>
+        <w:t>All of</w:t>
+      </w:r>
+      <w:proofErr w:type="gramEnd"/>
+      <w:r>
+        <w:t xml:space="preserve"> the materials and methods common to two or more experiments—specifically excluding the experimental procedure for each experiment.</w:t>
       </w:r>
     </w:p>
     <w:p>
@@ -176,8 +181,13 @@
         </w:numPr>
       </w:pPr>
       <w:r>
-        <w:t>Discuss gprMax</w:t>
-      </w:r>
+        <w:t xml:space="preserve">Discuss </w:t>
+      </w:r>
+      <w:proofErr w:type="spellStart"/>
+      <w:r>
+        <w:t>gprMax</w:t>
+      </w:r>
+      <w:proofErr w:type="spellEnd"/>
     </w:p>
     <w:p>
       <w:pPr>
@@ -464,7 +474,31 @@
         <w:shd w:val="clear" w:color="auto" w:fill="83CAEB" w:themeFill="accent1" w:themeFillTint="66"/>
       </w:pPr>
       <w:r>
-        <w:t>Run gpr simulations for 2 lambda to 1/32 lambda movement and see if we can infer this movement using amplitude and phase based techniques</w:t>
+        <w:t xml:space="preserve">Run </w:t>
+      </w:r>
+      <w:proofErr w:type="spellStart"/>
+      <w:r>
+        <w:t>gpr</w:t>
+      </w:r>
+      <w:proofErr w:type="spellEnd"/>
+      <w:r>
+        <w:t xml:space="preserve"> simulations for 2 </w:t>
+      </w:r>
+      <w:proofErr w:type="gramStart"/>
+      <w:r>
+        <w:t>lambda</w:t>
+      </w:r>
+      <w:proofErr w:type="gramEnd"/>
+      <w:r>
+        <w:t xml:space="preserve"> to 1/32 lambda movement and see if we can infer this movement using amplitude and </w:t>
+      </w:r>
+      <w:proofErr w:type="gramStart"/>
+      <w:r>
+        <w:t>phase based</w:t>
+      </w:r>
+      <w:proofErr w:type="gramEnd"/>
+      <w:r>
+        <w:t xml:space="preserve"> techniques</w:t>
       </w:r>
     </w:p>
     <w:p/>
@@ -485,7 +519,39 @@
         <w:shd w:val="clear" w:color="auto" w:fill="E8E8E8" w:themeFill="background2"/>
       </w:pPr>
       <w:r>
-        <w:t>Tracking del_phi/del_x and del_phi/del_y to infer horizontal and vertical translation</w:t>
+        <w:t xml:space="preserve">Tracking </w:t>
+      </w:r>
+      <w:proofErr w:type="spellStart"/>
+      <w:r>
+        <w:t>del_phi</w:t>
+      </w:r>
+      <w:proofErr w:type="spellEnd"/>
+      <w:r>
+        <w:t>/</w:t>
+      </w:r>
+      <w:proofErr w:type="spellStart"/>
+      <w:r>
+        <w:t>del_x</w:t>
+      </w:r>
+      <w:proofErr w:type="spellEnd"/>
+      <w:r>
+        <w:t xml:space="preserve"> and </w:t>
+      </w:r>
+      <w:proofErr w:type="spellStart"/>
+      <w:r>
+        <w:t>del_phi</w:t>
+      </w:r>
+      <w:proofErr w:type="spellEnd"/>
+      <w:r>
+        <w:t>/</w:t>
+      </w:r>
+      <w:proofErr w:type="spellStart"/>
+      <w:r>
+        <w:t>del_y</w:t>
+      </w:r>
+      <w:proofErr w:type="spellEnd"/>
+      <w:r>
+        <w:t xml:space="preserve"> to infer horizontal and vertical translation</w:t>
       </w:r>
     </w:p>
     <w:p>
@@ -558,7 +624,23 @@
         <w:shd w:val="clear" w:color="auto" w:fill="B3E5A1" w:themeFill="accent6" w:themeFillTint="66"/>
       </w:pPr>
       <w:r>
-        <w:t>Run gpr simulations for scatterers changing material properties and a moving fluid front and see if we can infer this movement using amplitude and phase based techniques and see if we can infer the material change</w:t>
+        <w:t xml:space="preserve">Run </w:t>
+      </w:r>
+      <w:proofErr w:type="spellStart"/>
+      <w:r>
+        <w:t>gpr</w:t>
+      </w:r>
+      <w:proofErr w:type="spellEnd"/>
+      <w:r>
+        <w:t xml:space="preserve"> simulations for scatterers changing material properties and a moving fluid front and see if we can infer this movement using amplitude and </w:t>
+      </w:r>
+      <w:proofErr w:type="gramStart"/>
+      <w:r>
+        <w:t>phase based</w:t>
+      </w:r>
+      <w:proofErr w:type="gramEnd"/>
+      <w:r>
+        <w:t xml:space="preserve"> techniques and see if we can infer the material change</w:t>
       </w:r>
     </w:p>
     <w:p/>
@@ -948,6 +1030,353 @@
         <w:t>Keep it as short and coherent as possible</w:t>
       </w:r>
     </w:p>
+    <w:p/>
+    <w:p/>
+    <w:p/>
+    <w:p/>
+    <w:p/>
+    <w:p/>
+    <w:p/>
+    <w:p>
+      <w:r>
+        <w:rPr>
+          <w:b/>
+          <w:bCs/>
+        </w:rPr>
+        <w:lastRenderedPageBreak/>
+        <w:t>To do for literature review:</w:t>
+      </w:r>
+    </w:p>
+    <w:p/>
+    <w:p/>
+    <w:p>
+      <w:r>
+        <w:rPr>
+          <w:b/>
+          <w:bCs/>
+        </w:rPr>
+        <w:t>To do for writing:</w:t>
+      </w:r>
+    </w:p>
+    <w:p/>
+    <w:p/>
+    <w:p>
+      <w:r>
+        <w:rPr>
+          <w:b/>
+          <w:bCs/>
+        </w:rPr>
+        <w:t>To do for field data results:</w:t>
+      </w:r>
+    </w:p>
+    <w:p>
+      <w:pPr>
+        <w:pStyle w:val="Lijstalinea"/>
+        <w:numPr>
+          <w:ilvl w:val="0"/>
+          <w:numId w:val="3"/>
+        </w:numPr>
+        <w:rPr>
+          <w:highlight w:val="yellow"/>
+        </w:rPr>
+      </w:pPr>
+      <w:r>
+        <w:rPr>
+          <w:highlight w:val="yellow"/>
+        </w:rPr>
+        <w:t xml:space="preserve">Remove </w:t>
+      </w:r>
+      <w:r>
+        <w:rPr>
+          <w:highlight w:val="yellow"/>
+        </w:rPr>
+        <w:t xml:space="preserve">taking a difference with the reference data in the pre-processing. Only take differences after migration. </w:t>
+      </w:r>
+      <w:r>
+        <w:rPr>
+          <w:highlight w:val="yellow"/>
+        </w:rPr>
+        <w:t>Also include the reference data in the profiles, so instead of taking the difference between migrated 2 and 1, start with taking the difference between migrated 1 and 0</w:t>
+      </w:r>
+      <w:r>
+        <w:rPr>
+          <w:highlight w:val="yellow"/>
+        </w:rPr>
+        <w:t>:</w:t>
+      </w:r>
+    </w:p>
+    <w:p>
+      <w:pPr>
+        <w:pStyle w:val="Lijstalinea"/>
+        <w:numPr>
+          <w:ilvl w:val="1"/>
+          <w:numId w:val="3"/>
+        </w:numPr>
+        <w:rPr>
+          <w:highlight w:val="yellow"/>
+        </w:rPr>
+      </w:pPr>
+      <w:proofErr w:type="spellStart"/>
+      <w:proofErr w:type="gramStart"/>
+      <w:r>
+        <w:rPr>
+          <w:highlight w:val="yellow"/>
+        </w:rPr>
+        <w:t>prof.rd</w:t>
+      </w:r>
+      <w:proofErr w:type="spellEnd"/>
+      <w:proofErr w:type="gramEnd"/>
+      <w:r>
+        <w:rPr>
+          <w:highlight w:val="yellow"/>
+        </w:rPr>
+        <w:t xml:space="preserve"> is the reference</w:t>
+      </w:r>
+    </w:p>
+    <w:p>
+      <w:pPr>
+        <w:pStyle w:val="Lijstalinea"/>
+        <w:numPr>
+          <w:ilvl w:val="1"/>
+          <w:numId w:val="3"/>
+        </w:numPr>
+        <w:rPr>
+          <w:highlight w:val="yellow"/>
+        </w:rPr>
+      </w:pPr>
+      <w:r>
+        <w:rPr>
+          <w:highlight w:val="yellow"/>
+        </w:rPr>
+        <w:t>prof_1 is already during the pushing stage</w:t>
+      </w:r>
+    </w:p>
+    <w:p>
+      <w:pPr>
+        <w:rPr>
+          <w:highlight w:val="yellow"/>
+        </w:rPr>
+      </w:pPr>
+    </w:p>
+    <w:p>
+      <w:pPr>
+        <w:pStyle w:val="Lijstalinea"/>
+        <w:numPr>
+          <w:ilvl w:val="0"/>
+          <w:numId w:val="3"/>
+        </w:numPr>
+      </w:pPr>
+      <w:r>
+        <w:t>Instead of taking differences for every phase (pushing, chasing, waiting, pulling), take a difference every 2,3,4,5, etc profiles. See if the movements accumulate similarly and the noise cancels out when accumulating and prevent wrap-around effects when big movements occur.</w:t>
+      </w:r>
+    </w:p>
+    <w:p/>
+    <w:p>
+      <w:pPr>
+        <w:pStyle w:val="Lijstalinea"/>
+        <w:numPr>
+          <w:ilvl w:val="0"/>
+          <w:numId w:val="3"/>
+        </w:numPr>
+      </w:pPr>
+      <w:r>
+        <w:t>When fitting a phase plane, try removing the negative frequencies to see if we get a better fit. Also highlight which frequencies are used, when doing a plane fit.</w:t>
+      </w:r>
+    </w:p>
+    <w:p/>
+    <w:p>
+      <w:pPr>
+        <w:pStyle w:val="Lijstalinea"/>
+        <w:numPr>
+          <w:ilvl w:val="0"/>
+          <w:numId w:val="3"/>
+        </w:numPr>
+      </w:pPr>
+      <w:r>
+        <w:t>When extracting data from a Region of Interest: pad around it in both x- and y-direction and taper it, before calculating the phase plane fit.</w:t>
+      </w:r>
+    </w:p>
+    <w:p/>
+    <w:p>
+      <w:pPr>
+        <w:pStyle w:val="Lijstalinea"/>
+        <w:numPr>
+          <w:ilvl w:val="0"/>
+          <w:numId w:val="3"/>
+        </w:numPr>
+      </w:pPr>
+      <w:r>
+        <w:t>Try masking the Regions of Interest in three different ways</w:t>
+      </w:r>
+      <w:r>
+        <w:t xml:space="preserve"> to filter out events</w:t>
+      </w:r>
+      <w:r>
+        <w:t>:</w:t>
+      </w:r>
+    </w:p>
+    <w:p>
+      <w:pPr>
+        <w:pStyle w:val="Lijstalinea"/>
+        <w:numPr>
+          <w:ilvl w:val="1"/>
+          <w:numId w:val="3"/>
+        </w:numPr>
+      </w:pPr>
+      <w:r>
+        <w:t>A manual rectangular mask</w:t>
+      </w:r>
+    </w:p>
+    <w:p>
+      <w:pPr>
+        <w:pStyle w:val="Lijstalinea"/>
+        <w:numPr>
+          <w:ilvl w:val="1"/>
+          <w:numId w:val="3"/>
+        </w:numPr>
+      </w:pPr>
+      <w:r>
+        <w:t>Using Napari (package) where you can paint the mask</w:t>
+      </w:r>
+    </w:p>
+    <w:p>
+      <w:pPr>
+        <w:pStyle w:val="Lijstalinea"/>
+        <w:numPr>
+          <w:ilvl w:val="1"/>
+          <w:numId w:val="3"/>
+        </w:numPr>
+      </w:pPr>
+      <w:r>
+        <w:t>A sliding filter</w:t>
+      </w:r>
+      <w:r>
+        <w:t xml:space="preserve"> of different sizes, sliding in vertical and lateral directions</w:t>
+      </w:r>
+      <w:r>
+        <w:t xml:space="preserve">. </w:t>
+      </w:r>
+      <w:r>
+        <w:t xml:space="preserve">Slide pixel, by pixel. </w:t>
+      </w:r>
+      <w:r>
+        <w:t>The window size is probably dependent on the wavelength</w:t>
+      </w:r>
+      <w:r>
+        <w:t xml:space="preserve"> (e.g. width of </w:t>
+      </w:r>
+      <w:r>
+        <w:t>1/8 lambda</w:t>
+      </w:r>
+      <w:r>
+        <w:t>)</w:t>
+      </w:r>
+      <w:r>
+        <w:t xml:space="preserve">. </w:t>
+      </w:r>
+      <w:r>
+        <w:t>Especially apply this, for the results where we don’t know where the most change occurred (the back-propagation results)</w:t>
+      </w:r>
+      <w:r>
+        <w:t xml:space="preserve"> by doing many phase plane fittings. Investigate if the movements peak at a certain location in the whole domain.</w:t>
+      </w:r>
+      <w:r>
+        <w:t xml:space="preserve"> Try coming up </w:t>
+      </w:r>
+      <w:r>
+        <w:lastRenderedPageBreak/>
+        <w:t xml:space="preserve">with a metric to define the fit </w:t>
+      </w:r>
+      <w:r>
+        <w:t>of the phase plane and plot that on top of the whole domain.</w:t>
+      </w:r>
+    </w:p>
+    <w:p/>
+    <w:p>
+      <w:pPr>
+        <w:pStyle w:val="Lijstalinea"/>
+        <w:numPr>
+          <w:ilvl w:val="0"/>
+          <w:numId w:val="3"/>
+        </w:numPr>
+      </w:pPr>
+      <w:r>
+        <w:rPr>
+          <w:u w:val="single"/>
+        </w:rPr>
+        <w:t>Investigate in literature</w:t>
+      </w:r>
+      <w:r>
+        <w:t xml:space="preserve"> for back-propagation how pre-processing is done before playing it back in </w:t>
+      </w:r>
+      <w:proofErr w:type="spellStart"/>
+      <w:r>
+        <w:t>gprMax</w:t>
+      </w:r>
+      <w:proofErr w:type="spellEnd"/>
+      <w:r>
+        <w:t xml:space="preserve"> to </w:t>
+      </w:r>
+      <w:r>
+        <w:t xml:space="preserve">get rid of the noise. Or maybe mask a large Region of Influence around the event before migrating it. Make sure to get most of the energy and get rid of the early </w:t>
+      </w:r>
+      <w:r>
+        <w:t>and late noise. Also investigate 3D spreading before migrating</w:t>
+      </w:r>
+      <w:r>
+        <w:t xml:space="preserve">. In 3D energy spreads 1/r^3, whereas in </w:t>
+      </w:r>
+      <w:r>
+        <w:t xml:space="preserve">in 2D it spreads 1/r^2. We already apply a linear gain in the pre-processing but </w:t>
+      </w:r>
+      <w:r>
+        <w:rPr>
+          <w:u w:val="single"/>
+        </w:rPr>
+        <w:t>check with literature</w:t>
+      </w:r>
+      <w:r>
+        <w:t>.</w:t>
+      </w:r>
+    </w:p>
+    <w:p>
+      <w:pPr>
+        <w:pStyle w:val="Lijstalinea"/>
+      </w:pPr>
+    </w:p>
+    <w:p>
+      <w:pPr>
+        <w:pStyle w:val="Lijstalinea"/>
+        <w:numPr>
+          <w:ilvl w:val="0"/>
+          <w:numId w:val="3"/>
+        </w:numPr>
+      </w:pPr>
+      <w:r>
+        <w:t>Remember that when taking measurements at two points in time, there can be overlap in</w:t>
+      </w:r>
+      <w:r>
+        <w:t xml:space="preserve"> the location of the fluid front, so when taking the difference, it will not highlight. </w:t>
+      </w:r>
+      <w:proofErr w:type="gramStart"/>
+      <w:r>
+        <w:t>Also</w:t>
+      </w:r>
+      <w:proofErr w:type="gramEnd"/>
+      <w:r>
+        <w:t xml:space="preserve"> when taking a B-scan it takes time</w:t>
+      </w:r>
+      <w:r>
+        <w:t xml:space="preserve"> (~1 min), and during that time, the fluid front might have moved.</w:t>
+      </w:r>
+    </w:p>
+    <w:p>
+      <w:pPr>
+        <w:pStyle w:val="Lijstalinea"/>
+      </w:pPr>
+    </w:p>
+    <w:p/>
+    <w:p/>
     <w:sectPr>
       <w:pgSz w:w="11906" w:h="16838"/>
       <w:pgMar w:top="1417" w:right="1417" w:bottom="1134" w:left="1417" w:header="708" w:footer="708" w:gutter="0"/>
@@ -961,6 +1390,95 @@
 <file path=word/numbering.xml><?xml version="1.0" encoding="utf-8"?>
 <w:numbering xmlns:wpc="http://schemas.microsoft.com/office/word/2010/wordprocessingCanvas" xmlns:cx="http://schemas.microsoft.com/office/drawing/2014/chartex" xmlns:cx1="http://schemas.microsoft.com/office/drawing/2015/9/8/chartex" xmlns:cx2="http://schemas.microsoft.com/office/drawing/2015/10/21/chartex" xmlns:cx3="http://schemas.microsoft.com/office/drawing/2016/5/9/chartex" xmlns:cx4="http://schemas.microsoft.com/office/drawing/2016/5/10/chartex" xmlns:cx5="http://schemas.microsoft.com/office/drawing/2016/5/11/chartex" xmlns:cx6="http://schemas.microsoft.com/office/drawing/2016/5/12/chartex" xmlns:cx7="http://schemas.microsoft.com/office/drawing/2016/5/13/chartex" xmlns:cx8="http://schemas.microsoft.com/office/drawing/2016/5/14/chartex" xmlns:mc="http://schemas.openxmlformats.org/markup-compatibility/2006" xmlns:aink="http://schemas.microsoft.com/office/drawing/2016/ink" xmlns:am3d="http://schemas.microsoft.com/office/drawing/2017/model3d" xmlns:o="urn:schemas-microsoft-com:office:office" xmlns:oel="http://schemas.microsoft.com/office/2019/extlst" xmlns:r="http://schemas.openxmlformats.org/officeDocument/2006/relationships" xmlns:m="http://schemas.openxmlformats.org/officeDocument/2006/math" xmlns:v="urn:schemas-microsoft-com:vml" xmlns:wp14="http://schemas.microsoft.com/office/word/2010/wordprocessingDrawing" xmlns:wp="http://schemas.openxmlformats.org/drawingml/2006/wordprocessingDrawing" xmlns:w10="urn:schemas-microsoft-com:office:word" xmlns:w="http://schemas.openxmlformats.org/wordprocessingml/2006/main" xmlns:w14="http://schemas.microsoft.com/office/word/2010/wordml" xmlns:w15="http://schemas.microsoft.com/office/word/2012/wordml" xmlns:w16cex="http://schemas.microsoft.com/office/word/2018/wordml/cex" xmlns:w16cid="http://schemas.microsoft.com/office/word/2016/wordml/cid" xmlns:w16="http://schemas.microsoft.com/office/word/2018/wordml" xmlns:w16du="http://schemas.microsoft.com/office/word/2023/wordml/word16du" xmlns:w16sdtdh="http://schemas.microsoft.com/office/word/2020/wordml/sdtdatahash" xmlns:w16sdtfl="http://schemas.microsoft.com/office/word/2024/wordml/sdtformatlock" xmlns:w16se="http://schemas.microsoft.com/office/word/2015/wordml/symex" xmlns:wpg="http://schemas.microsoft.com/office/word/2010/wordprocessingGroup" xmlns:wpi="http://schemas.microsoft.com/office/word/2010/wordprocessingInk" xmlns:wne="http://schemas.microsoft.com/office/word/2006/wordml" xmlns:wps="http://schemas.microsoft.com/office/word/2010/wordprocessingShape" mc:Ignorable="w14 w15 w16se w16cid w16 w16cex w16sdtdh w16sdtfl w16du wp14">
   <w:abstractNum w:abstractNumId="0" w15:restartNumberingAfterBreak="0">
+    <w:nsid w:val="039C1E25"/>
+    <w:multiLevelType w:val="hybridMultilevel"/>
+    <w:tmpl w:val="35EE3666"/>
+    <w:lvl w:ilvl="0" w:tplc="0413000F">
+      <w:start w:val="1"/>
+      <w:numFmt w:val="decimal"/>
+      <w:lvlText w:val="%1."/>
+      <w:lvlJc w:val="left"/>
+      <w:pPr>
+        <w:ind w:left="720" w:hanging="360"/>
+      </w:pPr>
+      <w:rPr>
+        <w:rFonts w:hint="default"/>
+      </w:rPr>
+    </w:lvl>
+    <w:lvl w:ilvl="1" w:tplc="04130019" w:tentative="1">
+      <w:start w:val="1"/>
+      <w:numFmt w:val="lowerLetter"/>
+      <w:lvlText w:val="%2."/>
+      <w:lvlJc w:val="left"/>
+      <w:pPr>
+        <w:ind w:left="1440" w:hanging="360"/>
+      </w:pPr>
+    </w:lvl>
+    <w:lvl w:ilvl="2" w:tplc="0413001B" w:tentative="1">
+      <w:start w:val="1"/>
+      <w:numFmt w:val="lowerRoman"/>
+      <w:lvlText w:val="%3."/>
+      <w:lvlJc w:val="right"/>
+      <w:pPr>
+        <w:ind w:left="2160" w:hanging="180"/>
+      </w:pPr>
+    </w:lvl>
+    <w:lvl w:ilvl="3" w:tplc="0413000F" w:tentative="1">
+      <w:start w:val="1"/>
+      <w:numFmt w:val="decimal"/>
+      <w:lvlText w:val="%4."/>
+      <w:lvlJc w:val="left"/>
+      <w:pPr>
+        <w:ind w:left="2880" w:hanging="360"/>
+      </w:pPr>
+    </w:lvl>
+    <w:lvl w:ilvl="4" w:tplc="04130019" w:tentative="1">
+      <w:start w:val="1"/>
+      <w:numFmt w:val="lowerLetter"/>
+      <w:lvlText w:val="%5."/>
+      <w:lvlJc w:val="left"/>
+      <w:pPr>
+        <w:ind w:left="3600" w:hanging="360"/>
+      </w:pPr>
+    </w:lvl>
+    <w:lvl w:ilvl="5" w:tplc="0413001B" w:tentative="1">
+      <w:start w:val="1"/>
+      <w:numFmt w:val="lowerRoman"/>
+      <w:lvlText w:val="%6."/>
+      <w:lvlJc w:val="right"/>
+      <w:pPr>
+        <w:ind w:left="4320" w:hanging="180"/>
+      </w:pPr>
+    </w:lvl>
+    <w:lvl w:ilvl="6" w:tplc="0413000F" w:tentative="1">
+      <w:start w:val="1"/>
+      <w:numFmt w:val="decimal"/>
+      <w:lvlText w:val="%7."/>
+      <w:lvlJc w:val="left"/>
+      <w:pPr>
+        <w:ind w:left="5040" w:hanging="360"/>
+      </w:pPr>
+    </w:lvl>
+    <w:lvl w:ilvl="7" w:tplc="04130019" w:tentative="1">
+      <w:start w:val="1"/>
+      <w:numFmt w:val="lowerLetter"/>
+      <w:lvlText w:val="%8."/>
+      <w:lvlJc w:val="left"/>
+      <w:pPr>
+        <w:ind w:left="5760" w:hanging="360"/>
+      </w:pPr>
+    </w:lvl>
+    <w:lvl w:ilvl="8" w:tplc="0413001B" w:tentative="1">
+      <w:start w:val="1"/>
+      <w:numFmt w:val="lowerRoman"/>
+      <w:lvlText w:val="%9."/>
+      <w:lvlJc w:val="right"/>
+      <w:pPr>
+        <w:ind w:left="6480" w:hanging="180"/>
+      </w:pPr>
+    </w:lvl>
+  </w:abstractNum>
+  <w:abstractNum w:abstractNumId="1" w15:restartNumberingAfterBreak="0">
     <w:nsid w:val="3894545A"/>
     <w:multiLevelType w:val="hybridMultilevel"/>
     <w:tmpl w:val="8FBC964A"/>
@@ -1072,8 +1590,103 @@
       </w:rPr>
     </w:lvl>
   </w:abstractNum>
+  <w:abstractNum w:abstractNumId="2" w15:restartNumberingAfterBreak="0">
+    <w:nsid w:val="59B11C82"/>
+    <w:multiLevelType w:val="hybridMultilevel"/>
+    <w:tmpl w:val="4D3C7386"/>
+    <w:lvl w:ilvl="0" w:tplc="0413000F">
+      <w:start w:val="1"/>
+      <w:numFmt w:val="decimal"/>
+      <w:lvlText w:val="%1."/>
+      <w:lvlJc w:val="left"/>
+      <w:pPr>
+        <w:ind w:left="720" w:hanging="360"/>
+      </w:pPr>
+      <w:rPr>
+        <w:rFonts w:hint="default"/>
+      </w:rPr>
+    </w:lvl>
+    <w:lvl w:ilvl="1" w:tplc="04130019">
+      <w:start w:val="1"/>
+      <w:numFmt w:val="lowerLetter"/>
+      <w:lvlText w:val="%2."/>
+      <w:lvlJc w:val="left"/>
+      <w:pPr>
+        <w:ind w:left="1440" w:hanging="360"/>
+      </w:pPr>
+    </w:lvl>
+    <w:lvl w:ilvl="2" w:tplc="0413001B" w:tentative="1">
+      <w:start w:val="1"/>
+      <w:numFmt w:val="lowerRoman"/>
+      <w:lvlText w:val="%3."/>
+      <w:lvlJc w:val="right"/>
+      <w:pPr>
+        <w:ind w:left="2160" w:hanging="180"/>
+      </w:pPr>
+    </w:lvl>
+    <w:lvl w:ilvl="3" w:tplc="0413000F" w:tentative="1">
+      <w:start w:val="1"/>
+      <w:numFmt w:val="decimal"/>
+      <w:lvlText w:val="%4."/>
+      <w:lvlJc w:val="left"/>
+      <w:pPr>
+        <w:ind w:left="2880" w:hanging="360"/>
+      </w:pPr>
+    </w:lvl>
+    <w:lvl w:ilvl="4" w:tplc="04130019" w:tentative="1">
+      <w:start w:val="1"/>
+      <w:numFmt w:val="lowerLetter"/>
+      <w:lvlText w:val="%5."/>
+      <w:lvlJc w:val="left"/>
+      <w:pPr>
+        <w:ind w:left="3600" w:hanging="360"/>
+      </w:pPr>
+    </w:lvl>
+    <w:lvl w:ilvl="5" w:tplc="0413001B" w:tentative="1">
+      <w:start w:val="1"/>
+      <w:numFmt w:val="lowerRoman"/>
+      <w:lvlText w:val="%6."/>
+      <w:lvlJc w:val="right"/>
+      <w:pPr>
+        <w:ind w:left="4320" w:hanging="180"/>
+      </w:pPr>
+    </w:lvl>
+    <w:lvl w:ilvl="6" w:tplc="0413000F" w:tentative="1">
+      <w:start w:val="1"/>
+      <w:numFmt w:val="decimal"/>
+      <w:lvlText w:val="%7."/>
+      <w:lvlJc w:val="left"/>
+      <w:pPr>
+        <w:ind w:left="5040" w:hanging="360"/>
+      </w:pPr>
+    </w:lvl>
+    <w:lvl w:ilvl="7" w:tplc="04130019" w:tentative="1">
+      <w:start w:val="1"/>
+      <w:numFmt w:val="lowerLetter"/>
+      <w:lvlText w:val="%8."/>
+      <w:lvlJc w:val="left"/>
+      <w:pPr>
+        <w:ind w:left="5760" w:hanging="360"/>
+      </w:pPr>
+    </w:lvl>
+    <w:lvl w:ilvl="8" w:tplc="0413001B" w:tentative="1">
+      <w:start w:val="1"/>
+      <w:numFmt w:val="lowerRoman"/>
+      <w:lvlText w:val="%9."/>
+      <w:lvlJc w:val="right"/>
+      <w:pPr>
+        <w:ind w:left="6480" w:hanging="180"/>
+      </w:pPr>
+    </w:lvl>
+  </w:abstractNum>
   <w:num w:numId="1" w16cid:durableId="227349705">
+    <w:abstractNumId w:val="1"/>
+  </w:num>
+  <w:num w:numId="2" w16cid:durableId="1361861515">
     <w:abstractNumId w:val="0"/>
+  </w:num>
+  <w:num w:numId="3" w16cid:durableId="18505631">
+    <w:abstractNumId w:val="2"/>
   </w:num>
 </w:numbering>
 </file>

</xml_diff>

<commit_message>
Fixed phase plane slope issues (see markdowns)
</commit_message>
<xml_diff>
--- a/TimeLapse_LaTeX/Thesis/working summary.docx
+++ b/TimeLapse_LaTeX/Thesis/working summary.docx
@@ -1191,8 +1191,14 @@
           <w:ilvl w:val="0"/>
           <w:numId w:val="3"/>
         </w:numPr>
-      </w:pPr>
-      <w:r>
+        <w:rPr>
+          <w:highlight w:val="yellow"/>
+        </w:rPr>
+      </w:pPr>
+      <w:r>
+        <w:rPr>
+          <w:highlight w:val="yellow"/>
+        </w:rPr>
         <w:t>When extracting data from a Region of Interest: pad around it in both x- and y-direction and taper it, before calculating the phase plane fit.</w:t>
       </w:r>
     </w:p>

</xml_diff>

<commit_message>
Improved phase fitting by using cubed weights (giving less weight to low-energy cells) and manual k_x band settings
</commit_message>
<xml_diff>
--- a/TimeLapse_LaTeX/Thesis/working summary.docx
+++ b/TimeLapse_LaTeX/Thesis/working summary.docx
@@ -90,7 +90,7 @@
     </w:p>
     <w:p>
       <w:pPr>
-        <w:pStyle w:val="Lijstalinea"/>
+        <w:pStyle w:val="ListParagraph"/>
         <w:numPr>
           <w:ilvl w:val="0"/>
           <w:numId w:val="1"/>
@@ -105,7 +105,7 @@
     </w:p>
     <w:p>
       <w:pPr>
-        <w:pStyle w:val="Lijstalinea"/>
+        <w:pStyle w:val="ListParagraph"/>
         <w:numPr>
           <w:ilvl w:val="0"/>
           <w:numId w:val="1"/>
@@ -117,7 +117,7 @@
     </w:p>
     <w:p>
       <w:pPr>
-        <w:pStyle w:val="Lijstalinea"/>
+        <w:pStyle w:val="ListParagraph"/>
         <w:numPr>
           <w:ilvl w:val="0"/>
           <w:numId w:val="1"/>
@@ -129,7 +129,7 @@
     </w:p>
     <w:p>
       <w:pPr>
-        <w:pStyle w:val="Lijstalinea"/>
+        <w:pStyle w:val="ListParagraph"/>
       </w:pPr>
     </w:p>
     <w:p>
@@ -151,18 +151,13 @@
       <w:r>
         <w:tab/>
       </w:r>
-      <w:proofErr w:type="gramStart"/>
-      <w:r>
-        <w:t>All of</w:t>
-      </w:r>
-      <w:proofErr w:type="gramEnd"/>
-      <w:r>
-        <w:t xml:space="preserve"> the materials and methods common to two or more experiments—specifically excluding the experimental procedure for each experiment.</w:t>
-      </w:r>
-    </w:p>
-    <w:p>
-      <w:pPr>
-        <w:pStyle w:val="Lijstalinea"/>
+      <w:r>
+        <w:t>All of the materials and methods common to two or more experiments—specifically excluding the experimental procedure for each experiment.</w:t>
+      </w:r>
+    </w:p>
+    <w:p>
+      <w:pPr>
+        <w:pStyle w:val="ListParagraph"/>
         <w:numPr>
           <w:ilvl w:val="0"/>
           <w:numId w:val="1"/>
@@ -174,24 +169,19 @@
     </w:p>
     <w:p>
       <w:pPr>
-        <w:pStyle w:val="Lijstalinea"/>
+        <w:pStyle w:val="ListParagraph"/>
         <w:numPr>
           <w:ilvl w:val="0"/>
           <w:numId w:val="1"/>
         </w:numPr>
       </w:pPr>
       <w:r>
-        <w:t xml:space="preserve">Discuss </w:t>
-      </w:r>
-      <w:proofErr w:type="spellStart"/>
-      <w:r>
-        <w:t>gprMax</w:t>
-      </w:r>
-      <w:proofErr w:type="spellEnd"/>
-    </w:p>
-    <w:p>
-      <w:pPr>
-        <w:pStyle w:val="Lijstalinea"/>
+        <w:t>Discuss gprMax</w:t>
+      </w:r>
+    </w:p>
+    <w:p>
+      <w:pPr>
+        <w:pStyle w:val="ListParagraph"/>
         <w:numPr>
           <w:ilvl w:val="0"/>
           <w:numId w:val="1"/>
@@ -203,7 +193,7 @@
     </w:p>
     <w:p>
       <w:pPr>
-        <w:pStyle w:val="Lijstalinea"/>
+        <w:pStyle w:val="ListParagraph"/>
         <w:numPr>
           <w:ilvl w:val="0"/>
           <w:numId w:val="1"/>
@@ -474,31 +464,7 @@
         <w:shd w:val="clear" w:color="auto" w:fill="83CAEB" w:themeFill="accent1" w:themeFillTint="66"/>
       </w:pPr>
       <w:r>
-        <w:t xml:space="preserve">Run </w:t>
-      </w:r>
-      <w:proofErr w:type="spellStart"/>
-      <w:r>
-        <w:t>gpr</w:t>
-      </w:r>
-      <w:proofErr w:type="spellEnd"/>
-      <w:r>
-        <w:t xml:space="preserve"> simulations for 2 </w:t>
-      </w:r>
-      <w:proofErr w:type="gramStart"/>
-      <w:r>
-        <w:t>lambda</w:t>
-      </w:r>
-      <w:proofErr w:type="gramEnd"/>
-      <w:r>
-        <w:t xml:space="preserve"> to 1/32 lambda movement and see if we can infer this movement using amplitude and </w:t>
-      </w:r>
-      <w:proofErr w:type="gramStart"/>
-      <w:r>
-        <w:t>phase based</w:t>
-      </w:r>
-      <w:proofErr w:type="gramEnd"/>
-      <w:r>
-        <w:t xml:space="preserve"> techniques</w:t>
+        <w:t>Run gpr simulations for 2 lambda to 1/32 lambda movement and see if we can infer this movement using amplitude and phase based techniques</w:t>
       </w:r>
     </w:p>
     <w:p/>
@@ -519,39 +485,7 @@
         <w:shd w:val="clear" w:color="auto" w:fill="E8E8E8" w:themeFill="background2"/>
       </w:pPr>
       <w:r>
-        <w:t xml:space="preserve">Tracking </w:t>
-      </w:r>
-      <w:proofErr w:type="spellStart"/>
-      <w:r>
-        <w:t>del_phi</w:t>
-      </w:r>
-      <w:proofErr w:type="spellEnd"/>
-      <w:r>
-        <w:t>/</w:t>
-      </w:r>
-      <w:proofErr w:type="spellStart"/>
-      <w:r>
-        <w:t>del_x</w:t>
-      </w:r>
-      <w:proofErr w:type="spellEnd"/>
-      <w:r>
-        <w:t xml:space="preserve"> and </w:t>
-      </w:r>
-      <w:proofErr w:type="spellStart"/>
-      <w:r>
-        <w:t>del_phi</w:t>
-      </w:r>
-      <w:proofErr w:type="spellEnd"/>
-      <w:r>
-        <w:t>/</w:t>
-      </w:r>
-      <w:proofErr w:type="spellStart"/>
-      <w:r>
-        <w:t>del_y</w:t>
-      </w:r>
-      <w:proofErr w:type="spellEnd"/>
-      <w:r>
-        <w:t xml:space="preserve"> to infer horizontal and vertical translation</w:t>
+        <w:t>Tracking del_phi/del_x and del_phi/del_y to infer horizontal and vertical translation</w:t>
       </w:r>
     </w:p>
     <w:p>
@@ -624,23 +558,7 @@
         <w:shd w:val="clear" w:color="auto" w:fill="B3E5A1" w:themeFill="accent6" w:themeFillTint="66"/>
       </w:pPr>
       <w:r>
-        <w:t xml:space="preserve">Run </w:t>
-      </w:r>
-      <w:proofErr w:type="spellStart"/>
-      <w:r>
-        <w:t>gpr</w:t>
-      </w:r>
-      <w:proofErr w:type="spellEnd"/>
-      <w:r>
-        <w:t xml:space="preserve"> simulations for scatterers changing material properties and a moving fluid front and see if we can infer this movement using amplitude and </w:t>
-      </w:r>
-      <w:proofErr w:type="gramStart"/>
-      <w:r>
-        <w:t>phase based</w:t>
-      </w:r>
-      <w:proofErr w:type="gramEnd"/>
-      <w:r>
-        <w:t xml:space="preserve"> techniques and see if we can infer the material change</w:t>
+        <w:t>Run gpr simulations for scatterers changing material properties and a moving fluid front and see if we can infer this movement using amplitude and phase based techniques and see if we can infer the material change</w:t>
       </w:r>
     </w:p>
     <w:p/>
@@ -981,7 +899,7 @@
     </w:p>
     <w:p>
       <w:pPr>
-        <w:pStyle w:val="Lijstalinea"/>
+        <w:pStyle w:val="ListParagraph"/>
         <w:numPr>
           <w:ilvl w:val="0"/>
           <w:numId w:val="1"/>
@@ -993,7 +911,7 @@
     </w:p>
     <w:p>
       <w:pPr>
-        <w:pStyle w:val="Lijstalinea"/>
+        <w:pStyle w:val="ListParagraph"/>
         <w:numPr>
           <w:ilvl w:val="0"/>
           <w:numId w:val="1"/>
@@ -1005,7 +923,7 @@
     </w:p>
     <w:p>
       <w:pPr>
-        <w:pStyle w:val="Lijstalinea"/>
+        <w:pStyle w:val="ListParagraph"/>
         <w:numPr>
           <w:ilvl w:val="0"/>
           <w:numId w:val="1"/>
@@ -1071,7 +989,7 @@
     </w:p>
     <w:p>
       <w:pPr>
-        <w:pStyle w:val="Lijstalinea"/>
+        <w:pStyle w:val="ListParagraph"/>
         <w:numPr>
           <w:ilvl w:val="0"/>
           <w:numId w:val="3"/>
@@ -1107,7 +1025,7 @@
     </w:p>
     <w:p>
       <w:pPr>
-        <w:pStyle w:val="Lijstalinea"/>
+        <w:pStyle w:val="ListParagraph"/>
         <w:numPr>
           <w:ilvl w:val="1"/>
           <w:numId w:val="3"/>
@@ -1116,26 +1034,16 @@
           <w:highlight w:val="yellow"/>
         </w:rPr>
       </w:pPr>
-      <w:proofErr w:type="spellStart"/>
-      <w:proofErr w:type="gramStart"/>
       <w:r>
         <w:rPr>
           <w:highlight w:val="yellow"/>
         </w:rPr>
-        <w:t>prof.rd</w:t>
-      </w:r>
-      <w:proofErr w:type="spellEnd"/>
-      <w:proofErr w:type="gramEnd"/>
-      <w:r>
-        <w:rPr>
-          <w:highlight w:val="yellow"/>
-        </w:rPr>
-        <w:t xml:space="preserve"> is the reference</w:t>
-      </w:r>
-    </w:p>
-    <w:p>
-      <w:pPr>
-        <w:pStyle w:val="Lijstalinea"/>
+        <w:t>prof.rd is the reference</w:t>
+      </w:r>
+    </w:p>
+    <w:p>
+      <w:pPr>
+        <w:pStyle w:val="ListParagraph"/>
         <w:numPr>
           <w:ilvl w:val="1"/>
           <w:numId w:val="3"/>
@@ -1160,7 +1068,7 @@
     </w:p>
     <w:p>
       <w:pPr>
-        <w:pStyle w:val="Lijstalinea"/>
+        <w:pStyle w:val="ListParagraph"/>
         <w:numPr>
           <w:ilvl w:val="0"/>
           <w:numId w:val="3"/>
@@ -1173,20 +1081,26 @@
     <w:p/>
     <w:p>
       <w:pPr>
-        <w:pStyle w:val="Lijstalinea"/>
+        <w:pStyle w:val="ListParagraph"/>
         <w:numPr>
           <w:ilvl w:val="0"/>
           <w:numId w:val="3"/>
         </w:numPr>
-      </w:pPr>
-      <w:r>
+        <w:rPr>
+          <w:highlight w:val="yellow"/>
+        </w:rPr>
+      </w:pPr>
+      <w:r>
+        <w:rPr>
+          <w:highlight w:val="yellow"/>
+        </w:rPr>
         <w:t>When fitting a phase plane, try removing the negative frequencies to see if we get a better fit. Also highlight which frequencies are used, when doing a plane fit.</w:t>
       </w:r>
     </w:p>
     <w:p/>
     <w:p>
       <w:pPr>
-        <w:pStyle w:val="Lijstalinea"/>
+        <w:pStyle w:val="ListParagraph"/>
         <w:numPr>
           <w:ilvl w:val="0"/>
           <w:numId w:val="3"/>
@@ -1205,7 +1119,7 @@
     <w:p/>
     <w:p>
       <w:pPr>
-        <w:pStyle w:val="Lijstalinea"/>
+        <w:pStyle w:val="ListParagraph"/>
         <w:numPr>
           <w:ilvl w:val="0"/>
           <w:numId w:val="3"/>
@@ -1223,7 +1137,7 @@
     </w:p>
     <w:p>
       <w:pPr>
-        <w:pStyle w:val="Lijstalinea"/>
+        <w:pStyle w:val="ListParagraph"/>
         <w:numPr>
           <w:ilvl w:val="1"/>
           <w:numId w:val="3"/>
@@ -1235,7 +1149,7 @@
     </w:p>
     <w:p>
       <w:pPr>
-        <w:pStyle w:val="Lijstalinea"/>
+        <w:pStyle w:val="ListParagraph"/>
         <w:numPr>
           <w:ilvl w:val="1"/>
           <w:numId w:val="3"/>
@@ -1247,7 +1161,7 @@
     </w:p>
     <w:p>
       <w:pPr>
-        <w:pStyle w:val="Lijstalinea"/>
+        <w:pStyle w:val="ListParagraph"/>
         <w:numPr>
           <w:ilvl w:val="1"/>
           <w:numId w:val="3"/>
@@ -1300,7 +1214,7 @@
     <w:p/>
     <w:p>
       <w:pPr>
-        <w:pStyle w:val="Lijstalinea"/>
+        <w:pStyle w:val="ListParagraph"/>
         <w:numPr>
           <w:ilvl w:val="0"/>
           <w:numId w:val="3"/>
@@ -1313,15 +1227,7 @@
         <w:t>Investigate in literature</w:t>
       </w:r>
       <w:r>
-        <w:t xml:space="preserve"> for back-propagation how pre-processing is done before playing it back in </w:t>
-      </w:r>
-      <w:proofErr w:type="spellStart"/>
-      <w:r>
-        <w:t>gprMax</w:t>
-      </w:r>
-      <w:proofErr w:type="spellEnd"/>
-      <w:r>
-        <w:t xml:space="preserve"> to </w:t>
+        <w:t xml:space="preserve"> for back-propagation how pre-processing is done before playing it back in gprMax to </w:t>
       </w:r>
       <w:r>
         <w:t xml:space="preserve">get rid of the noise. Or maybe mask a large Region of Influence around the event before migrating it. Make sure to get most of the energy and get rid of the early </w:t>
@@ -1347,12 +1253,12 @@
     </w:p>
     <w:p>
       <w:pPr>
-        <w:pStyle w:val="Lijstalinea"/>
-      </w:pPr>
-    </w:p>
-    <w:p>
-      <w:pPr>
-        <w:pStyle w:val="Lijstalinea"/>
+        <w:pStyle w:val="ListParagraph"/>
+      </w:pPr>
+    </w:p>
+    <w:p>
+      <w:pPr>
+        <w:pStyle w:val="ListParagraph"/>
         <w:numPr>
           <w:ilvl w:val="0"/>
           <w:numId w:val="3"/>
@@ -1362,15 +1268,7 @@
         <w:t>Remember that when taking measurements at two points in time, there can be overlap in</w:t>
       </w:r>
       <w:r>
-        <w:t xml:space="preserve"> the location of the fluid front, so when taking the difference, it will not highlight. </w:t>
-      </w:r>
-      <w:proofErr w:type="gramStart"/>
-      <w:r>
-        <w:t>Also</w:t>
-      </w:r>
-      <w:proofErr w:type="gramEnd"/>
-      <w:r>
-        <w:t xml:space="preserve"> when taking a B-scan it takes time</w:t>
+        <w:t xml:space="preserve"> the location of the fluid front, so when taking the difference, it will not highlight. Also when taking a B-scan it takes time</w:t>
       </w:r>
       <w:r>
         <w:t xml:space="preserve"> (~1 min), and during that time, the fluid front might have moved.</w:t>
@@ -1378,11 +1276,37 @@
     </w:p>
     <w:p>
       <w:pPr>
-        <w:pStyle w:val="Lijstalinea"/>
-      </w:pPr>
-    </w:p>
-    <w:p/>
-    <w:p/>
+        <w:pStyle w:val="ListParagraph"/>
+      </w:pPr>
+    </w:p>
+    <w:p/>
+    <w:p>
+      <w:pPr>
+        <w:pStyle w:val="ListParagraph"/>
+        <w:numPr>
+          <w:ilvl w:val="0"/>
+          <w:numId w:val="3"/>
+        </w:numPr>
+      </w:pPr>
+      <w:r>
+        <w:t>Cleaning up literature, creating clear titles, creating an index that Claude can read with short description and indexed</w:t>
+      </w:r>
+    </w:p>
+    <w:p>
+      <w:pPr>
+        <w:pStyle w:val="ListParagraph"/>
+        <w:numPr>
+          <w:ilvl w:val="0"/>
+          <w:numId w:val="3"/>
+        </w:numPr>
+      </w:pPr>
+      <w:r>
+        <w:t xml:space="preserve">Create a wiki per notebook for Claude, explaining what we did and what we discovered, and </w:t>
+      </w:r>
+      <w:r>
+        <w:t>index all the files</w:t>
+      </w:r>
+    </w:p>
     <w:sectPr>
       <w:pgSz w:w="11906" w:h="16838"/>
       <w:pgMar w:top="1417" w:right="1417" w:bottom="1134" w:left="1417" w:header="708" w:footer="708" w:gutter="0"/>
@@ -2094,15 +2018,15 @@
     <w:lsdException w:name="Unresolved Mention" w:semiHidden="1" w:unhideWhenUsed="1"/>
     <w:lsdException w:name="Smart Link" w:semiHidden="1" w:unhideWhenUsed="1"/>
   </w:latentStyles>
-  <w:style w:type="paragraph" w:default="1" w:styleId="Standaard">
+  <w:style w:type="paragraph" w:default="1" w:styleId="Normal">
     <w:name w:val="Normal"/>
     <w:qFormat/>
   </w:style>
-  <w:style w:type="paragraph" w:styleId="Kop1">
+  <w:style w:type="paragraph" w:styleId="Heading1">
     <w:name w:val="heading 1"/>
-    <w:basedOn w:val="Standaard"/>
-    <w:next w:val="Standaard"/>
-    <w:link w:val="Kop1Char"/>
+    <w:basedOn w:val="Normal"/>
+    <w:next w:val="Normal"/>
+    <w:link w:val="Heading1Char"/>
     <w:uiPriority w:val="9"/>
     <w:qFormat/>
     <w:rsid w:val="005B10CC"/>
@@ -2119,11 +2043,11 @@
       <w:szCs w:val="40"/>
     </w:rPr>
   </w:style>
-  <w:style w:type="paragraph" w:styleId="Kop2">
+  <w:style w:type="paragraph" w:styleId="Heading2">
     <w:name w:val="heading 2"/>
-    <w:basedOn w:val="Standaard"/>
-    <w:next w:val="Standaard"/>
-    <w:link w:val="Kop2Char"/>
+    <w:basedOn w:val="Normal"/>
+    <w:next w:val="Normal"/>
+    <w:link w:val="Heading2Char"/>
     <w:uiPriority w:val="9"/>
     <w:semiHidden/>
     <w:unhideWhenUsed/>
@@ -2142,11 +2066,11 @@
       <w:szCs w:val="32"/>
     </w:rPr>
   </w:style>
-  <w:style w:type="paragraph" w:styleId="Kop3">
+  <w:style w:type="paragraph" w:styleId="Heading3">
     <w:name w:val="heading 3"/>
-    <w:basedOn w:val="Standaard"/>
-    <w:next w:val="Standaard"/>
-    <w:link w:val="Kop3Char"/>
+    <w:basedOn w:val="Normal"/>
+    <w:next w:val="Normal"/>
+    <w:link w:val="Heading3Char"/>
     <w:uiPriority w:val="9"/>
     <w:semiHidden/>
     <w:unhideWhenUsed/>
@@ -2165,11 +2089,11 @@
       <w:szCs w:val="28"/>
     </w:rPr>
   </w:style>
-  <w:style w:type="paragraph" w:styleId="Kop4">
+  <w:style w:type="paragraph" w:styleId="Heading4">
     <w:name w:val="heading 4"/>
-    <w:basedOn w:val="Standaard"/>
-    <w:next w:val="Standaard"/>
-    <w:link w:val="Kop4Char"/>
+    <w:basedOn w:val="Normal"/>
+    <w:next w:val="Normal"/>
+    <w:link w:val="Heading4Char"/>
     <w:uiPriority w:val="9"/>
     <w:semiHidden/>
     <w:unhideWhenUsed/>
@@ -2188,11 +2112,11 @@
       <w:color w:val="0F4761" w:themeColor="accent1" w:themeShade="BF"/>
     </w:rPr>
   </w:style>
-  <w:style w:type="paragraph" w:styleId="Kop5">
+  <w:style w:type="paragraph" w:styleId="Heading5">
     <w:name w:val="heading 5"/>
-    <w:basedOn w:val="Standaard"/>
-    <w:next w:val="Standaard"/>
-    <w:link w:val="Kop5Char"/>
+    <w:basedOn w:val="Normal"/>
+    <w:next w:val="Normal"/>
+    <w:link w:val="Heading5Char"/>
     <w:uiPriority w:val="9"/>
     <w:semiHidden/>
     <w:unhideWhenUsed/>
@@ -2209,11 +2133,11 @@
       <w:color w:val="0F4761" w:themeColor="accent1" w:themeShade="BF"/>
     </w:rPr>
   </w:style>
-  <w:style w:type="paragraph" w:styleId="Kop6">
+  <w:style w:type="paragraph" w:styleId="Heading6">
     <w:name w:val="heading 6"/>
-    <w:basedOn w:val="Standaard"/>
-    <w:next w:val="Standaard"/>
-    <w:link w:val="Kop6Char"/>
+    <w:basedOn w:val="Normal"/>
+    <w:next w:val="Normal"/>
+    <w:link w:val="Heading6Char"/>
     <w:uiPriority w:val="9"/>
     <w:semiHidden/>
     <w:unhideWhenUsed/>
@@ -2232,11 +2156,11 @@
       <w:color w:val="595959" w:themeColor="text1" w:themeTint="A6"/>
     </w:rPr>
   </w:style>
-  <w:style w:type="paragraph" w:styleId="Kop7">
+  <w:style w:type="paragraph" w:styleId="Heading7">
     <w:name w:val="heading 7"/>
-    <w:basedOn w:val="Standaard"/>
-    <w:next w:val="Standaard"/>
-    <w:link w:val="Kop7Char"/>
+    <w:basedOn w:val="Normal"/>
+    <w:next w:val="Normal"/>
+    <w:link w:val="Heading7Char"/>
     <w:uiPriority w:val="9"/>
     <w:semiHidden/>
     <w:unhideWhenUsed/>
@@ -2253,11 +2177,11 @@
       <w:color w:val="595959" w:themeColor="text1" w:themeTint="A6"/>
     </w:rPr>
   </w:style>
-  <w:style w:type="paragraph" w:styleId="Kop8">
+  <w:style w:type="paragraph" w:styleId="Heading8">
     <w:name w:val="heading 8"/>
-    <w:basedOn w:val="Standaard"/>
-    <w:next w:val="Standaard"/>
-    <w:link w:val="Kop8Char"/>
+    <w:basedOn w:val="Normal"/>
+    <w:next w:val="Normal"/>
+    <w:link w:val="Heading8Char"/>
     <w:uiPriority w:val="9"/>
     <w:semiHidden/>
     <w:unhideWhenUsed/>
@@ -2276,11 +2200,11 @@
       <w:color w:val="272727" w:themeColor="text1" w:themeTint="D8"/>
     </w:rPr>
   </w:style>
-  <w:style w:type="paragraph" w:styleId="Kop9">
+  <w:style w:type="paragraph" w:styleId="Heading9">
     <w:name w:val="heading 9"/>
-    <w:basedOn w:val="Standaard"/>
-    <w:next w:val="Standaard"/>
-    <w:link w:val="Kop9Char"/>
+    <w:basedOn w:val="Normal"/>
+    <w:next w:val="Normal"/>
+    <w:link w:val="Heading9Char"/>
     <w:uiPriority w:val="9"/>
     <w:semiHidden/>
     <w:unhideWhenUsed/>
@@ -2297,13 +2221,13 @@
       <w:color w:val="272727" w:themeColor="text1" w:themeTint="D8"/>
     </w:rPr>
   </w:style>
-  <w:style w:type="character" w:default="1" w:styleId="Standaardalinea-lettertype">
+  <w:style w:type="character" w:default="1" w:styleId="DefaultParagraphFont">
     <w:name w:val="Default Paragraph Font"/>
     <w:uiPriority w:val="1"/>
     <w:semiHidden/>
     <w:unhideWhenUsed/>
   </w:style>
-  <w:style w:type="table" w:default="1" w:styleId="Standaardtabel">
+  <w:style w:type="table" w:default="1" w:styleId="TableNormal">
     <w:name w:val="Normal Table"/>
     <w:uiPriority w:val="99"/>
     <w:semiHidden/>
@@ -2318,16 +2242,16 @@
       </w:tblCellMar>
     </w:tblPr>
   </w:style>
-  <w:style w:type="numbering" w:default="1" w:styleId="Geenlijst">
+  <w:style w:type="numbering" w:default="1" w:styleId="NoList">
     <w:name w:val="No List"/>
     <w:uiPriority w:val="99"/>
     <w:semiHidden/>
     <w:unhideWhenUsed/>
   </w:style>
-  <w:style w:type="character" w:customStyle="1" w:styleId="Kop1Char">
-    <w:name w:val="Kop 1 Char"/>
-    <w:basedOn w:val="Standaardalinea-lettertype"/>
-    <w:link w:val="Kop1"/>
+  <w:style w:type="character" w:customStyle="1" w:styleId="Heading1Char">
+    <w:name w:val="Heading 1 Char"/>
+    <w:basedOn w:val="DefaultParagraphFont"/>
+    <w:link w:val="Heading1"/>
     <w:uiPriority w:val="9"/>
     <w:rsid w:val="005B10CC"/>
     <w:rPr>
@@ -2337,10 +2261,10 @@
       <w:szCs w:val="40"/>
     </w:rPr>
   </w:style>
-  <w:style w:type="character" w:customStyle="1" w:styleId="Kop2Char">
-    <w:name w:val="Kop 2 Char"/>
-    <w:basedOn w:val="Standaardalinea-lettertype"/>
-    <w:link w:val="Kop2"/>
+  <w:style w:type="character" w:customStyle="1" w:styleId="Heading2Char">
+    <w:name w:val="Heading 2 Char"/>
+    <w:basedOn w:val="DefaultParagraphFont"/>
+    <w:link w:val="Heading2"/>
     <w:uiPriority w:val="9"/>
     <w:semiHidden/>
     <w:rsid w:val="005B10CC"/>
@@ -2351,10 +2275,10 @@
       <w:szCs w:val="32"/>
     </w:rPr>
   </w:style>
-  <w:style w:type="character" w:customStyle="1" w:styleId="Kop3Char">
-    <w:name w:val="Kop 3 Char"/>
-    <w:basedOn w:val="Standaardalinea-lettertype"/>
-    <w:link w:val="Kop3"/>
+  <w:style w:type="character" w:customStyle="1" w:styleId="Heading3Char">
+    <w:name w:val="Heading 3 Char"/>
+    <w:basedOn w:val="DefaultParagraphFont"/>
+    <w:link w:val="Heading3"/>
     <w:uiPriority w:val="9"/>
     <w:semiHidden/>
     <w:rsid w:val="005B10CC"/>
@@ -2365,10 +2289,10 @@
       <w:szCs w:val="28"/>
     </w:rPr>
   </w:style>
-  <w:style w:type="character" w:customStyle="1" w:styleId="Kop4Char">
-    <w:name w:val="Kop 4 Char"/>
-    <w:basedOn w:val="Standaardalinea-lettertype"/>
-    <w:link w:val="Kop4"/>
+  <w:style w:type="character" w:customStyle="1" w:styleId="Heading4Char">
+    <w:name w:val="Heading 4 Char"/>
+    <w:basedOn w:val="DefaultParagraphFont"/>
+    <w:link w:val="Heading4"/>
     <w:uiPriority w:val="9"/>
     <w:semiHidden/>
     <w:rsid w:val="005B10CC"/>
@@ -2379,10 +2303,10 @@
       <w:color w:val="0F4761" w:themeColor="accent1" w:themeShade="BF"/>
     </w:rPr>
   </w:style>
-  <w:style w:type="character" w:customStyle="1" w:styleId="Kop5Char">
-    <w:name w:val="Kop 5 Char"/>
-    <w:basedOn w:val="Standaardalinea-lettertype"/>
-    <w:link w:val="Kop5"/>
+  <w:style w:type="character" w:customStyle="1" w:styleId="Heading5Char">
+    <w:name w:val="Heading 5 Char"/>
+    <w:basedOn w:val="DefaultParagraphFont"/>
+    <w:link w:val="Heading5"/>
     <w:uiPriority w:val="9"/>
     <w:semiHidden/>
     <w:rsid w:val="005B10CC"/>
@@ -2391,10 +2315,10 @@
       <w:color w:val="0F4761" w:themeColor="accent1" w:themeShade="BF"/>
     </w:rPr>
   </w:style>
-  <w:style w:type="character" w:customStyle="1" w:styleId="Kop6Char">
-    <w:name w:val="Kop 6 Char"/>
-    <w:basedOn w:val="Standaardalinea-lettertype"/>
-    <w:link w:val="Kop6"/>
+  <w:style w:type="character" w:customStyle="1" w:styleId="Heading6Char">
+    <w:name w:val="Heading 6 Char"/>
+    <w:basedOn w:val="DefaultParagraphFont"/>
+    <w:link w:val="Heading6"/>
     <w:uiPriority w:val="9"/>
     <w:semiHidden/>
     <w:rsid w:val="005B10CC"/>
@@ -2405,10 +2329,10 @@
       <w:color w:val="595959" w:themeColor="text1" w:themeTint="A6"/>
     </w:rPr>
   </w:style>
-  <w:style w:type="character" w:customStyle="1" w:styleId="Kop7Char">
-    <w:name w:val="Kop 7 Char"/>
-    <w:basedOn w:val="Standaardalinea-lettertype"/>
-    <w:link w:val="Kop7"/>
+  <w:style w:type="character" w:customStyle="1" w:styleId="Heading7Char">
+    <w:name w:val="Heading 7 Char"/>
+    <w:basedOn w:val="DefaultParagraphFont"/>
+    <w:link w:val="Heading7"/>
     <w:uiPriority w:val="9"/>
     <w:semiHidden/>
     <w:rsid w:val="005B10CC"/>
@@ -2417,10 +2341,10 @@
       <w:color w:val="595959" w:themeColor="text1" w:themeTint="A6"/>
     </w:rPr>
   </w:style>
-  <w:style w:type="character" w:customStyle="1" w:styleId="Kop8Char">
-    <w:name w:val="Kop 8 Char"/>
-    <w:basedOn w:val="Standaardalinea-lettertype"/>
-    <w:link w:val="Kop8"/>
+  <w:style w:type="character" w:customStyle="1" w:styleId="Heading8Char">
+    <w:name w:val="Heading 8 Char"/>
+    <w:basedOn w:val="DefaultParagraphFont"/>
+    <w:link w:val="Heading8"/>
     <w:uiPriority w:val="9"/>
     <w:semiHidden/>
     <w:rsid w:val="005B10CC"/>
@@ -2431,10 +2355,10 @@
       <w:color w:val="272727" w:themeColor="text1" w:themeTint="D8"/>
     </w:rPr>
   </w:style>
-  <w:style w:type="character" w:customStyle="1" w:styleId="Kop9Char">
-    <w:name w:val="Kop 9 Char"/>
-    <w:basedOn w:val="Standaardalinea-lettertype"/>
-    <w:link w:val="Kop9"/>
+  <w:style w:type="character" w:customStyle="1" w:styleId="Heading9Char">
+    <w:name w:val="Heading 9 Char"/>
+    <w:basedOn w:val="DefaultParagraphFont"/>
+    <w:link w:val="Heading9"/>
     <w:uiPriority w:val="9"/>
     <w:semiHidden/>
     <w:rsid w:val="005B10CC"/>
@@ -2443,11 +2367,11 @@
       <w:color w:val="272727" w:themeColor="text1" w:themeTint="D8"/>
     </w:rPr>
   </w:style>
-  <w:style w:type="paragraph" w:styleId="Titel">
+  <w:style w:type="paragraph" w:styleId="Title">
     <w:name w:val="Title"/>
-    <w:basedOn w:val="Standaard"/>
-    <w:next w:val="Standaard"/>
-    <w:link w:val="TitelChar"/>
+    <w:basedOn w:val="Normal"/>
+    <w:next w:val="Normal"/>
+    <w:link w:val="TitleChar"/>
     <w:uiPriority w:val="10"/>
     <w:qFormat/>
     <w:rsid w:val="005B10CC"/>
@@ -2463,10 +2387,10 @@
       <w:szCs w:val="56"/>
     </w:rPr>
   </w:style>
-  <w:style w:type="character" w:customStyle="1" w:styleId="TitelChar">
-    <w:name w:val="Titel Char"/>
-    <w:basedOn w:val="Standaardalinea-lettertype"/>
-    <w:link w:val="Titel"/>
+  <w:style w:type="character" w:customStyle="1" w:styleId="TitleChar">
+    <w:name w:val="Title Char"/>
+    <w:basedOn w:val="DefaultParagraphFont"/>
+    <w:link w:val="Title"/>
     <w:uiPriority w:val="10"/>
     <w:rsid w:val="005B10CC"/>
     <w:rPr>
@@ -2477,11 +2401,11 @@
       <w:szCs w:val="56"/>
     </w:rPr>
   </w:style>
-  <w:style w:type="paragraph" w:styleId="Ondertitel">
+  <w:style w:type="paragraph" w:styleId="Subtitle">
     <w:name w:val="Subtitle"/>
-    <w:basedOn w:val="Standaard"/>
-    <w:next w:val="Standaard"/>
-    <w:link w:val="OndertitelChar"/>
+    <w:basedOn w:val="Normal"/>
+    <w:next w:val="Normal"/>
+    <w:link w:val="SubtitleChar"/>
     <w:uiPriority w:val="11"/>
     <w:qFormat/>
     <w:rsid w:val="005B10CC"/>
@@ -2498,10 +2422,10 @@
       <w:szCs w:val="28"/>
     </w:rPr>
   </w:style>
-  <w:style w:type="character" w:customStyle="1" w:styleId="OndertitelChar">
-    <w:name w:val="Ondertitel Char"/>
-    <w:basedOn w:val="Standaardalinea-lettertype"/>
-    <w:link w:val="Ondertitel"/>
+  <w:style w:type="character" w:customStyle="1" w:styleId="SubtitleChar">
+    <w:name w:val="Subtitle Char"/>
+    <w:basedOn w:val="DefaultParagraphFont"/>
+    <w:link w:val="Subtitle"/>
     <w:uiPriority w:val="11"/>
     <w:rsid w:val="005B10CC"/>
     <w:rPr>
@@ -2512,11 +2436,11 @@
       <w:szCs w:val="28"/>
     </w:rPr>
   </w:style>
-  <w:style w:type="paragraph" w:styleId="Citaat">
+  <w:style w:type="paragraph" w:styleId="Quote">
     <w:name w:val="Quote"/>
-    <w:basedOn w:val="Standaard"/>
-    <w:next w:val="Standaard"/>
-    <w:link w:val="CitaatChar"/>
+    <w:basedOn w:val="Normal"/>
+    <w:next w:val="Normal"/>
+    <w:link w:val="QuoteChar"/>
     <w:uiPriority w:val="29"/>
     <w:qFormat/>
     <w:rsid w:val="005B10CC"/>
@@ -2530,10 +2454,10 @@
       <w:color w:val="404040" w:themeColor="text1" w:themeTint="BF"/>
     </w:rPr>
   </w:style>
-  <w:style w:type="character" w:customStyle="1" w:styleId="CitaatChar">
-    <w:name w:val="Citaat Char"/>
-    <w:basedOn w:val="Standaardalinea-lettertype"/>
-    <w:link w:val="Citaat"/>
+  <w:style w:type="character" w:customStyle="1" w:styleId="QuoteChar">
+    <w:name w:val="Quote Char"/>
+    <w:basedOn w:val="DefaultParagraphFont"/>
+    <w:link w:val="Quote"/>
     <w:uiPriority w:val="29"/>
     <w:rsid w:val="005B10CC"/>
     <w:rPr>
@@ -2542,9 +2466,9 @@
       <w:color w:val="404040" w:themeColor="text1" w:themeTint="BF"/>
     </w:rPr>
   </w:style>
-  <w:style w:type="paragraph" w:styleId="Lijstalinea">
+  <w:style w:type="paragraph" w:styleId="ListParagraph">
     <w:name w:val="List Paragraph"/>
-    <w:basedOn w:val="Standaard"/>
+    <w:basedOn w:val="Normal"/>
     <w:uiPriority w:val="34"/>
     <w:qFormat/>
     <w:rsid w:val="005B10CC"/>
@@ -2553,9 +2477,9 @@
       <w:contextualSpacing/>
     </w:pPr>
   </w:style>
-  <w:style w:type="character" w:styleId="Intensievebenadrukking">
+  <w:style w:type="character" w:styleId="IntenseEmphasis">
     <w:name w:val="Intense Emphasis"/>
-    <w:basedOn w:val="Standaardalinea-lettertype"/>
+    <w:basedOn w:val="DefaultParagraphFont"/>
     <w:uiPriority w:val="21"/>
     <w:qFormat/>
     <w:rsid w:val="005B10CC"/>
@@ -2565,11 +2489,11 @@
       <w:color w:val="0F4761" w:themeColor="accent1" w:themeShade="BF"/>
     </w:rPr>
   </w:style>
-  <w:style w:type="paragraph" w:styleId="Duidelijkcitaat">
+  <w:style w:type="paragraph" w:styleId="IntenseQuote">
     <w:name w:val="Intense Quote"/>
-    <w:basedOn w:val="Standaard"/>
-    <w:next w:val="Standaard"/>
-    <w:link w:val="DuidelijkcitaatChar"/>
+    <w:basedOn w:val="Normal"/>
+    <w:next w:val="Normal"/>
+    <w:link w:val="IntenseQuoteChar"/>
     <w:uiPriority w:val="30"/>
     <w:qFormat/>
     <w:rsid w:val="005B10CC"/>
@@ -2588,10 +2512,10 @@
       <w:color w:val="0F4761" w:themeColor="accent1" w:themeShade="BF"/>
     </w:rPr>
   </w:style>
-  <w:style w:type="character" w:customStyle="1" w:styleId="DuidelijkcitaatChar">
-    <w:name w:val="Duidelijk citaat Char"/>
-    <w:basedOn w:val="Standaardalinea-lettertype"/>
-    <w:link w:val="Duidelijkcitaat"/>
+  <w:style w:type="character" w:customStyle="1" w:styleId="IntenseQuoteChar">
+    <w:name w:val="Intense Quote Char"/>
+    <w:basedOn w:val="DefaultParagraphFont"/>
+    <w:link w:val="IntenseQuote"/>
     <w:uiPriority w:val="30"/>
     <w:rsid w:val="005B10CC"/>
     <w:rPr>
@@ -2600,9 +2524,9 @@
       <w:color w:val="0F4761" w:themeColor="accent1" w:themeShade="BF"/>
     </w:rPr>
   </w:style>
-  <w:style w:type="character" w:styleId="Intensieveverwijzing">
+  <w:style w:type="character" w:styleId="IntenseReference">
     <w:name w:val="Intense Reference"/>
-    <w:basedOn w:val="Standaardalinea-lettertype"/>
+    <w:basedOn w:val="DefaultParagraphFont"/>
     <w:uiPriority w:val="32"/>
     <w:qFormat/>
     <w:rsid w:val="005B10CC"/>
@@ -2614,9 +2538,9 @@
       <w:spacing w:val="5"/>
     </w:rPr>
   </w:style>
-  <w:style w:type="table" w:styleId="Tabelraster">
+  <w:style w:type="table" w:styleId="TableGrid">
     <w:name w:val="Table Grid"/>
-    <w:basedOn w:val="Standaardtabel"/>
+    <w:basedOn w:val="TableNormal"/>
     <w:uiPriority w:val="39"/>
     <w:rsid w:val="0024613D"/>
     <w:pPr>

</xml_diff>

<commit_message>
Reordered literature and create literature index file
</commit_message>
<xml_diff>
--- a/TimeLapse_LaTeX/Thesis/working summary.docx
+++ b/TimeLapse_LaTeX/Thesis/working summary.docx
@@ -151,8 +151,13 @@
       <w:r>
         <w:tab/>
       </w:r>
-      <w:r>
-        <w:t>All of the materials and methods common to two or more experiments—specifically excluding the experimental procedure for each experiment.</w:t>
+      <w:proofErr w:type="gramStart"/>
+      <w:r>
+        <w:t>All of</w:t>
+      </w:r>
+      <w:proofErr w:type="gramEnd"/>
+      <w:r>
+        <w:t xml:space="preserve"> the materials and methods common to two or more experiments—specifically excluding the experimental procedure for each experiment.</w:t>
       </w:r>
     </w:p>
     <w:p>
@@ -176,8 +181,13 @@
         </w:numPr>
       </w:pPr>
       <w:r>
-        <w:t>Discuss gprMax</w:t>
-      </w:r>
+        <w:t xml:space="preserve">Discuss </w:t>
+      </w:r>
+      <w:proofErr w:type="spellStart"/>
+      <w:r>
+        <w:t>gprMax</w:t>
+      </w:r>
+      <w:proofErr w:type="spellEnd"/>
     </w:p>
     <w:p>
       <w:pPr>
@@ -464,7 +474,31 @@
         <w:shd w:val="clear" w:color="auto" w:fill="83CAEB" w:themeFill="accent1" w:themeFillTint="66"/>
       </w:pPr>
       <w:r>
-        <w:t>Run gpr simulations for 2 lambda to 1/32 lambda movement and see if we can infer this movement using amplitude and phase based techniques</w:t>
+        <w:t xml:space="preserve">Run </w:t>
+      </w:r>
+      <w:proofErr w:type="spellStart"/>
+      <w:r>
+        <w:t>gpr</w:t>
+      </w:r>
+      <w:proofErr w:type="spellEnd"/>
+      <w:r>
+        <w:t xml:space="preserve"> simulations for 2 </w:t>
+      </w:r>
+      <w:proofErr w:type="gramStart"/>
+      <w:r>
+        <w:t>lambda</w:t>
+      </w:r>
+      <w:proofErr w:type="gramEnd"/>
+      <w:r>
+        <w:t xml:space="preserve"> to 1/32 lambda movement and see if we can infer this movement using amplitude and </w:t>
+      </w:r>
+      <w:proofErr w:type="gramStart"/>
+      <w:r>
+        <w:t>phase based</w:t>
+      </w:r>
+      <w:proofErr w:type="gramEnd"/>
+      <w:r>
+        <w:t xml:space="preserve"> techniques</w:t>
       </w:r>
     </w:p>
     <w:p/>
@@ -485,7 +519,39 @@
         <w:shd w:val="clear" w:color="auto" w:fill="E8E8E8" w:themeFill="background2"/>
       </w:pPr>
       <w:r>
-        <w:t>Tracking del_phi/del_x and del_phi/del_y to infer horizontal and vertical translation</w:t>
+        <w:t xml:space="preserve">Tracking </w:t>
+      </w:r>
+      <w:proofErr w:type="spellStart"/>
+      <w:r>
+        <w:t>del_phi</w:t>
+      </w:r>
+      <w:proofErr w:type="spellEnd"/>
+      <w:r>
+        <w:t>/</w:t>
+      </w:r>
+      <w:proofErr w:type="spellStart"/>
+      <w:r>
+        <w:t>del_x</w:t>
+      </w:r>
+      <w:proofErr w:type="spellEnd"/>
+      <w:r>
+        <w:t xml:space="preserve"> and </w:t>
+      </w:r>
+      <w:proofErr w:type="spellStart"/>
+      <w:r>
+        <w:t>del_phi</w:t>
+      </w:r>
+      <w:proofErr w:type="spellEnd"/>
+      <w:r>
+        <w:t>/</w:t>
+      </w:r>
+      <w:proofErr w:type="spellStart"/>
+      <w:r>
+        <w:t>del_y</w:t>
+      </w:r>
+      <w:proofErr w:type="spellEnd"/>
+      <w:r>
+        <w:t xml:space="preserve"> to infer horizontal and vertical translation</w:t>
       </w:r>
     </w:p>
     <w:p>
@@ -558,7 +624,23 @@
         <w:shd w:val="clear" w:color="auto" w:fill="B3E5A1" w:themeFill="accent6" w:themeFillTint="66"/>
       </w:pPr>
       <w:r>
-        <w:t>Run gpr simulations for scatterers changing material properties and a moving fluid front and see if we can infer this movement using amplitude and phase based techniques and see if we can infer the material change</w:t>
+        <w:t xml:space="preserve">Run </w:t>
+      </w:r>
+      <w:proofErr w:type="spellStart"/>
+      <w:r>
+        <w:t>gpr</w:t>
+      </w:r>
+      <w:proofErr w:type="spellEnd"/>
+      <w:r>
+        <w:t xml:space="preserve"> simulations for scatterers changing material properties and a moving fluid front and see if we can infer this movement using amplitude and </w:t>
+      </w:r>
+      <w:proofErr w:type="gramStart"/>
+      <w:r>
+        <w:t>phase based</w:t>
+      </w:r>
+      <w:proofErr w:type="gramEnd"/>
+      <w:r>
+        <w:t xml:space="preserve"> techniques and see if we can infer the material change</w:t>
       </w:r>
     </w:p>
     <w:p/>
@@ -1034,11 +1116,21 @@
           <w:highlight w:val="yellow"/>
         </w:rPr>
       </w:pPr>
+      <w:proofErr w:type="spellStart"/>
+      <w:proofErr w:type="gramStart"/>
       <w:r>
         <w:rPr>
           <w:highlight w:val="yellow"/>
         </w:rPr>
-        <w:t>prof.rd is the reference</w:t>
+        <w:t>prof.rd</w:t>
+      </w:r>
+      <w:proofErr w:type="spellEnd"/>
+      <w:proofErr w:type="gramEnd"/>
+      <w:r>
+        <w:rPr>
+          <w:highlight w:val="yellow"/>
+        </w:rPr>
+        <w:t xml:space="preserve"> is the reference</w:t>
       </w:r>
     </w:p>
     <w:p>
@@ -1227,7 +1319,15 @@
         <w:t>Investigate in literature</w:t>
       </w:r>
       <w:r>
-        <w:t xml:space="preserve"> for back-propagation how pre-processing is done before playing it back in gprMax to </w:t>
+        <w:t xml:space="preserve"> for back-propagation how pre-processing is done before playing it back in </w:t>
+      </w:r>
+      <w:proofErr w:type="spellStart"/>
+      <w:r>
+        <w:t>gprMax</w:t>
+      </w:r>
+      <w:proofErr w:type="spellEnd"/>
+      <w:r>
+        <w:t xml:space="preserve"> to </w:t>
       </w:r>
       <w:r>
         <w:t xml:space="preserve">get rid of the noise. Or maybe mask a large Region of Influence around the event before migrating it. Make sure to get most of the energy and get rid of the early </w:t>
@@ -1268,7 +1368,15 @@
         <w:t>Remember that when taking measurements at two points in time, there can be overlap in</w:t>
       </w:r>
       <w:r>
-        <w:t xml:space="preserve"> the location of the fluid front, so when taking the difference, it will not highlight. Also when taking a B-scan it takes time</w:t>
+        <w:t xml:space="preserve"> the location of the fluid front, so when taking the difference, it will not highlight. </w:t>
+      </w:r>
+      <w:proofErr w:type="gramStart"/>
+      <w:r>
+        <w:t>Also</w:t>
+      </w:r>
+      <w:proofErr w:type="gramEnd"/>
+      <w:r>
+        <w:t xml:space="preserve"> when taking a B-scan it takes time</w:t>
       </w:r>
       <w:r>
         <w:t xml:space="preserve"> (~1 min), and during that time, the fluid front might have moved.</w:t>
@@ -1299,11 +1407,20 @@
           <w:ilvl w:val="0"/>
           <w:numId w:val="3"/>
         </w:numPr>
-      </w:pPr>
-      <w:r>
+        <w:rPr>
+          <w:highlight w:val="yellow"/>
+        </w:rPr>
+      </w:pPr>
+      <w:r>
+        <w:rPr>
+          <w:highlight w:val="yellow"/>
+        </w:rPr>
         <w:t xml:space="preserve">Create a wiki per notebook for Claude, explaining what we did and what we discovered, and </w:t>
       </w:r>
       <w:r>
+        <w:rPr>
+          <w:highlight w:val="yellow"/>
+        </w:rPr>
         <w:t>index all the files</w:t>
       </w:r>
     </w:p>

</xml_diff>

<commit_message>
Updated how figures are saved
</commit_message>
<xml_diff>
--- a/TimeLapse_LaTeX/Thesis/working summary.docx
+++ b/TimeLapse_LaTeX/Thesis/working summary.docx
@@ -90,7 +90,7 @@
     </w:p>
     <w:p>
       <w:pPr>
-        <w:pStyle w:val="ListParagraph"/>
+        <w:pStyle w:val="Lijstalinea"/>
         <w:numPr>
           <w:ilvl w:val="0"/>
           <w:numId w:val="1"/>
@@ -105,7 +105,7 @@
     </w:p>
     <w:p>
       <w:pPr>
-        <w:pStyle w:val="ListParagraph"/>
+        <w:pStyle w:val="Lijstalinea"/>
         <w:numPr>
           <w:ilvl w:val="0"/>
           <w:numId w:val="1"/>
@@ -117,7 +117,7 @@
     </w:p>
     <w:p>
       <w:pPr>
-        <w:pStyle w:val="ListParagraph"/>
+        <w:pStyle w:val="Lijstalinea"/>
         <w:numPr>
           <w:ilvl w:val="0"/>
           <w:numId w:val="1"/>
@@ -129,7 +129,7 @@
     </w:p>
     <w:p>
       <w:pPr>
-        <w:pStyle w:val="ListParagraph"/>
+        <w:pStyle w:val="Lijstalinea"/>
       </w:pPr>
     </w:p>
     <w:p>
@@ -162,7 +162,7 @@
     </w:p>
     <w:p>
       <w:pPr>
-        <w:pStyle w:val="ListParagraph"/>
+        <w:pStyle w:val="Lijstalinea"/>
         <w:numPr>
           <w:ilvl w:val="0"/>
           <w:numId w:val="1"/>
@@ -174,7 +174,7 @@
     </w:p>
     <w:p>
       <w:pPr>
-        <w:pStyle w:val="ListParagraph"/>
+        <w:pStyle w:val="Lijstalinea"/>
         <w:numPr>
           <w:ilvl w:val="0"/>
           <w:numId w:val="1"/>
@@ -191,7 +191,7 @@
     </w:p>
     <w:p>
       <w:pPr>
-        <w:pStyle w:val="ListParagraph"/>
+        <w:pStyle w:val="Lijstalinea"/>
         <w:numPr>
           <w:ilvl w:val="0"/>
           <w:numId w:val="1"/>
@@ -203,7 +203,7 @@
     </w:p>
     <w:p>
       <w:pPr>
-        <w:pStyle w:val="ListParagraph"/>
+        <w:pStyle w:val="Lijstalinea"/>
         <w:numPr>
           <w:ilvl w:val="0"/>
           <w:numId w:val="1"/>
@@ -981,7 +981,7 @@
     </w:p>
     <w:p>
       <w:pPr>
-        <w:pStyle w:val="ListParagraph"/>
+        <w:pStyle w:val="Lijstalinea"/>
         <w:numPr>
           <w:ilvl w:val="0"/>
           <w:numId w:val="1"/>
@@ -993,7 +993,7 @@
     </w:p>
     <w:p>
       <w:pPr>
-        <w:pStyle w:val="ListParagraph"/>
+        <w:pStyle w:val="Lijstalinea"/>
         <w:numPr>
           <w:ilvl w:val="0"/>
           <w:numId w:val="1"/>
@@ -1005,7 +1005,7 @@
     </w:p>
     <w:p>
       <w:pPr>
-        <w:pStyle w:val="ListParagraph"/>
+        <w:pStyle w:val="Lijstalinea"/>
         <w:numPr>
           <w:ilvl w:val="0"/>
           <w:numId w:val="1"/>
@@ -1071,7 +1071,7 @@
     </w:p>
     <w:p>
       <w:pPr>
-        <w:pStyle w:val="ListParagraph"/>
+        <w:pStyle w:val="Lijstalinea"/>
         <w:numPr>
           <w:ilvl w:val="0"/>
           <w:numId w:val="3"/>
@@ -1107,7 +1107,7 @@
     </w:p>
     <w:p>
       <w:pPr>
-        <w:pStyle w:val="ListParagraph"/>
+        <w:pStyle w:val="Lijstalinea"/>
         <w:numPr>
           <w:ilvl w:val="1"/>
           <w:numId w:val="3"/>
@@ -1135,7 +1135,7 @@
     </w:p>
     <w:p>
       <w:pPr>
-        <w:pStyle w:val="ListParagraph"/>
+        <w:pStyle w:val="Lijstalinea"/>
         <w:numPr>
           <w:ilvl w:val="1"/>
           <w:numId w:val="3"/>
@@ -1160,7 +1160,7 @@
     </w:p>
     <w:p>
       <w:pPr>
-        <w:pStyle w:val="ListParagraph"/>
+        <w:pStyle w:val="Lijstalinea"/>
         <w:numPr>
           <w:ilvl w:val="0"/>
           <w:numId w:val="3"/>
@@ -1173,7 +1173,7 @@
     <w:p/>
     <w:p>
       <w:pPr>
-        <w:pStyle w:val="ListParagraph"/>
+        <w:pStyle w:val="Lijstalinea"/>
         <w:numPr>
           <w:ilvl w:val="0"/>
           <w:numId w:val="3"/>
@@ -1192,7 +1192,7 @@
     <w:p/>
     <w:p>
       <w:pPr>
-        <w:pStyle w:val="ListParagraph"/>
+        <w:pStyle w:val="Lijstalinea"/>
         <w:numPr>
           <w:ilvl w:val="0"/>
           <w:numId w:val="3"/>
@@ -1211,7 +1211,7 @@
     <w:p/>
     <w:p>
       <w:pPr>
-        <w:pStyle w:val="ListParagraph"/>
+        <w:pStyle w:val="Lijstalinea"/>
         <w:numPr>
           <w:ilvl w:val="0"/>
           <w:numId w:val="3"/>
@@ -1229,7 +1229,7 @@
     </w:p>
     <w:p>
       <w:pPr>
-        <w:pStyle w:val="ListParagraph"/>
+        <w:pStyle w:val="Lijstalinea"/>
         <w:numPr>
           <w:ilvl w:val="1"/>
           <w:numId w:val="3"/>
@@ -1241,7 +1241,7 @@
     </w:p>
     <w:p>
       <w:pPr>
-        <w:pStyle w:val="ListParagraph"/>
+        <w:pStyle w:val="Lijstalinea"/>
         <w:numPr>
           <w:ilvl w:val="1"/>
           <w:numId w:val="3"/>
@@ -1253,7 +1253,7 @@
     </w:p>
     <w:p>
       <w:pPr>
-        <w:pStyle w:val="ListParagraph"/>
+        <w:pStyle w:val="Lijstalinea"/>
         <w:numPr>
           <w:ilvl w:val="1"/>
           <w:numId w:val="3"/>
@@ -1306,7 +1306,7 @@
     <w:p/>
     <w:p>
       <w:pPr>
-        <w:pStyle w:val="ListParagraph"/>
+        <w:pStyle w:val="Lijstalinea"/>
         <w:numPr>
           <w:ilvl w:val="0"/>
           <w:numId w:val="3"/>
@@ -1353,12 +1353,12 @@
     </w:p>
     <w:p>
       <w:pPr>
-        <w:pStyle w:val="ListParagraph"/>
-      </w:pPr>
-    </w:p>
-    <w:p>
-      <w:pPr>
-        <w:pStyle w:val="ListParagraph"/>
+        <w:pStyle w:val="Lijstalinea"/>
+      </w:pPr>
+    </w:p>
+    <w:p>
+      <w:pPr>
+        <w:pStyle w:val="Lijstalinea"/>
         <w:numPr>
           <w:ilvl w:val="0"/>
           <w:numId w:val="3"/>
@@ -1384,25 +1384,31 @@
     </w:p>
     <w:p>
       <w:pPr>
-        <w:pStyle w:val="ListParagraph"/>
-      </w:pPr>
-    </w:p>
-    <w:p/>
-    <w:p>
-      <w:pPr>
-        <w:pStyle w:val="ListParagraph"/>
+        <w:pStyle w:val="Lijstalinea"/>
+      </w:pPr>
+    </w:p>
+    <w:p/>
+    <w:p>
+      <w:pPr>
+        <w:pStyle w:val="Lijstalinea"/>
         <w:numPr>
           <w:ilvl w:val="0"/>
           <w:numId w:val="3"/>
         </w:numPr>
-      </w:pPr>
-      <w:r>
+        <w:rPr>
+          <w:highlight w:val="yellow"/>
+        </w:rPr>
+      </w:pPr>
+      <w:r>
+        <w:rPr>
+          <w:highlight w:val="yellow"/>
+        </w:rPr>
         <w:t>Cleaning up literature, creating clear titles, creating an index that Claude can read with short description and indexed</w:t>
       </w:r>
     </w:p>
     <w:p>
       <w:pPr>
-        <w:pStyle w:val="ListParagraph"/>
+        <w:pStyle w:val="Lijstalinea"/>
         <w:numPr>
           <w:ilvl w:val="0"/>
           <w:numId w:val="3"/>
@@ -1423,6 +1429,65 @@
         </w:rPr>
         <w:t>index all the files</w:t>
       </w:r>
+    </w:p>
+    <w:p>
+      <w:pPr>
+        <w:pStyle w:val="Lijstalinea"/>
+        <w:numPr>
+          <w:ilvl w:val="0"/>
+          <w:numId w:val="3"/>
+        </w:numPr>
+      </w:pPr>
+      <w:r>
+        <w:t>Clean up how figures are generated and stored</w:t>
+      </w:r>
+    </w:p>
+    <w:p/>
+    <w:p>
+      <w:proofErr w:type="gramStart"/>
+      <w:r>
+        <w:t>In order to</w:t>
+      </w:r>
+      <w:proofErr w:type="gramEnd"/>
+      <w:r>
+        <w:t xml:space="preserve"> write paragraph-per-paragraph, topic-per-topic</w:t>
+      </w:r>
+      <w:r>
+        <w:t xml:space="preserve"> have this in order:</w:t>
+      </w:r>
+    </w:p>
+    <w:p>
+      <w:pPr>
+        <w:pStyle w:val="Lijstalinea"/>
+        <w:numPr>
+          <w:ilvl w:val="0"/>
+          <w:numId w:val="1"/>
+        </w:numPr>
+      </w:pPr>
+      <w:r>
+        <w:t>The wiki to describe each notebook and the main findings</w:t>
+      </w:r>
+    </w:p>
+    <w:p>
+      <w:pPr>
+        <w:pStyle w:val="Lijstalinea"/>
+        <w:numPr>
+          <w:ilvl w:val="0"/>
+          <w:numId w:val="1"/>
+        </w:numPr>
+      </w:pPr>
+      <w:r>
+        <w:t>The literature ordered per topic</w:t>
+      </w:r>
+    </w:p>
+    <w:p>
+      <w:pPr>
+        <w:pStyle w:val="Lijstalinea"/>
+        <w:numPr>
+          <w:ilvl w:val="0"/>
+          <w:numId w:val="1"/>
+        </w:numPr>
+      </w:pPr>
     </w:p>
     <w:sectPr>
       <w:pgSz w:w="11906" w:h="16838"/>
@@ -2135,15 +2200,15 @@
     <w:lsdException w:name="Unresolved Mention" w:semiHidden="1" w:unhideWhenUsed="1"/>
     <w:lsdException w:name="Smart Link" w:semiHidden="1" w:unhideWhenUsed="1"/>
   </w:latentStyles>
-  <w:style w:type="paragraph" w:default="1" w:styleId="Normal">
+  <w:style w:type="paragraph" w:default="1" w:styleId="Standaard">
     <w:name w:val="Normal"/>
     <w:qFormat/>
   </w:style>
-  <w:style w:type="paragraph" w:styleId="Heading1">
+  <w:style w:type="paragraph" w:styleId="Kop1">
     <w:name w:val="heading 1"/>
-    <w:basedOn w:val="Normal"/>
-    <w:next w:val="Normal"/>
-    <w:link w:val="Heading1Char"/>
+    <w:basedOn w:val="Standaard"/>
+    <w:next w:val="Standaard"/>
+    <w:link w:val="Kop1Char"/>
     <w:uiPriority w:val="9"/>
     <w:qFormat/>
     <w:rsid w:val="005B10CC"/>
@@ -2160,11 +2225,11 @@
       <w:szCs w:val="40"/>
     </w:rPr>
   </w:style>
-  <w:style w:type="paragraph" w:styleId="Heading2">
+  <w:style w:type="paragraph" w:styleId="Kop2">
     <w:name w:val="heading 2"/>
-    <w:basedOn w:val="Normal"/>
-    <w:next w:val="Normal"/>
-    <w:link w:val="Heading2Char"/>
+    <w:basedOn w:val="Standaard"/>
+    <w:next w:val="Standaard"/>
+    <w:link w:val="Kop2Char"/>
     <w:uiPriority w:val="9"/>
     <w:semiHidden/>
     <w:unhideWhenUsed/>
@@ -2183,11 +2248,11 @@
       <w:szCs w:val="32"/>
     </w:rPr>
   </w:style>
-  <w:style w:type="paragraph" w:styleId="Heading3">
+  <w:style w:type="paragraph" w:styleId="Kop3">
     <w:name w:val="heading 3"/>
-    <w:basedOn w:val="Normal"/>
-    <w:next w:val="Normal"/>
-    <w:link w:val="Heading3Char"/>
+    <w:basedOn w:val="Standaard"/>
+    <w:next w:val="Standaard"/>
+    <w:link w:val="Kop3Char"/>
     <w:uiPriority w:val="9"/>
     <w:semiHidden/>
     <w:unhideWhenUsed/>
@@ -2206,11 +2271,11 @@
       <w:szCs w:val="28"/>
     </w:rPr>
   </w:style>
-  <w:style w:type="paragraph" w:styleId="Heading4">
+  <w:style w:type="paragraph" w:styleId="Kop4">
     <w:name w:val="heading 4"/>
-    <w:basedOn w:val="Normal"/>
-    <w:next w:val="Normal"/>
-    <w:link w:val="Heading4Char"/>
+    <w:basedOn w:val="Standaard"/>
+    <w:next w:val="Standaard"/>
+    <w:link w:val="Kop4Char"/>
     <w:uiPriority w:val="9"/>
     <w:semiHidden/>
     <w:unhideWhenUsed/>
@@ -2229,11 +2294,11 @@
       <w:color w:val="0F4761" w:themeColor="accent1" w:themeShade="BF"/>
     </w:rPr>
   </w:style>
-  <w:style w:type="paragraph" w:styleId="Heading5">
+  <w:style w:type="paragraph" w:styleId="Kop5">
     <w:name w:val="heading 5"/>
-    <w:basedOn w:val="Normal"/>
-    <w:next w:val="Normal"/>
-    <w:link w:val="Heading5Char"/>
+    <w:basedOn w:val="Standaard"/>
+    <w:next w:val="Standaard"/>
+    <w:link w:val="Kop5Char"/>
     <w:uiPriority w:val="9"/>
     <w:semiHidden/>
     <w:unhideWhenUsed/>
@@ -2250,11 +2315,11 @@
       <w:color w:val="0F4761" w:themeColor="accent1" w:themeShade="BF"/>
     </w:rPr>
   </w:style>
-  <w:style w:type="paragraph" w:styleId="Heading6">
+  <w:style w:type="paragraph" w:styleId="Kop6">
     <w:name w:val="heading 6"/>
-    <w:basedOn w:val="Normal"/>
-    <w:next w:val="Normal"/>
-    <w:link w:val="Heading6Char"/>
+    <w:basedOn w:val="Standaard"/>
+    <w:next w:val="Standaard"/>
+    <w:link w:val="Kop6Char"/>
     <w:uiPriority w:val="9"/>
     <w:semiHidden/>
     <w:unhideWhenUsed/>
@@ -2273,11 +2338,11 @@
       <w:color w:val="595959" w:themeColor="text1" w:themeTint="A6"/>
     </w:rPr>
   </w:style>
-  <w:style w:type="paragraph" w:styleId="Heading7">
+  <w:style w:type="paragraph" w:styleId="Kop7">
     <w:name w:val="heading 7"/>
-    <w:basedOn w:val="Normal"/>
-    <w:next w:val="Normal"/>
-    <w:link w:val="Heading7Char"/>
+    <w:basedOn w:val="Standaard"/>
+    <w:next w:val="Standaard"/>
+    <w:link w:val="Kop7Char"/>
     <w:uiPriority w:val="9"/>
     <w:semiHidden/>
     <w:unhideWhenUsed/>
@@ -2294,11 +2359,11 @@
       <w:color w:val="595959" w:themeColor="text1" w:themeTint="A6"/>
     </w:rPr>
   </w:style>
-  <w:style w:type="paragraph" w:styleId="Heading8">
+  <w:style w:type="paragraph" w:styleId="Kop8">
     <w:name w:val="heading 8"/>
-    <w:basedOn w:val="Normal"/>
-    <w:next w:val="Normal"/>
-    <w:link w:val="Heading8Char"/>
+    <w:basedOn w:val="Standaard"/>
+    <w:next w:val="Standaard"/>
+    <w:link w:val="Kop8Char"/>
     <w:uiPriority w:val="9"/>
     <w:semiHidden/>
     <w:unhideWhenUsed/>
@@ -2317,11 +2382,11 @@
       <w:color w:val="272727" w:themeColor="text1" w:themeTint="D8"/>
     </w:rPr>
   </w:style>
-  <w:style w:type="paragraph" w:styleId="Heading9">
+  <w:style w:type="paragraph" w:styleId="Kop9">
     <w:name w:val="heading 9"/>
-    <w:basedOn w:val="Normal"/>
-    <w:next w:val="Normal"/>
-    <w:link w:val="Heading9Char"/>
+    <w:basedOn w:val="Standaard"/>
+    <w:next w:val="Standaard"/>
+    <w:link w:val="Kop9Char"/>
     <w:uiPriority w:val="9"/>
     <w:semiHidden/>
     <w:unhideWhenUsed/>
@@ -2338,13 +2403,13 @@
       <w:color w:val="272727" w:themeColor="text1" w:themeTint="D8"/>
     </w:rPr>
   </w:style>
-  <w:style w:type="character" w:default="1" w:styleId="DefaultParagraphFont">
+  <w:style w:type="character" w:default="1" w:styleId="Standaardalinea-lettertype">
     <w:name w:val="Default Paragraph Font"/>
     <w:uiPriority w:val="1"/>
     <w:semiHidden/>
     <w:unhideWhenUsed/>
   </w:style>
-  <w:style w:type="table" w:default="1" w:styleId="TableNormal">
+  <w:style w:type="table" w:default="1" w:styleId="Standaardtabel">
     <w:name w:val="Normal Table"/>
     <w:uiPriority w:val="99"/>
     <w:semiHidden/>
@@ -2359,16 +2424,16 @@
       </w:tblCellMar>
     </w:tblPr>
   </w:style>
-  <w:style w:type="numbering" w:default="1" w:styleId="NoList">
+  <w:style w:type="numbering" w:default="1" w:styleId="Geenlijst">
     <w:name w:val="No List"/>
     <w:uiPriority w:val="99"/>
     <w:semiHidden/>
     <w:unhideWhenUsed/>
   </w:style>
-  <w:style w:type="character" w:customStyle="1" w:styleId="Heading1Char">
-    <w:name w:val="Heading 1 Char"/>
-    <w:basedOn w:val="DefaultParagraphFont"/>
-    <w:link w:val="Heading1"/>
+  <w:style w:type="character" w:customStyle="1" w:styleId="Kop1Char">
+    <w:name w:val="Kop 1 Char"/>
+    <w:basedOn w:val="Standaardalinea-lettertype"/>
+    <w:link w:val="Kop1"/>
     <w:uiPriority w:val="9"/>
     <w:rsid w:val="005B10CC"/>
     <w:rPr>
@@ -2378,10 +2443,10 @@
       <w:szCs w:val="40"/>
     </w:rPr>
   </w:style>
-  <w:style w:type="character" w:customStyle="1" w:styleId="Heading2Char">
-    <w:name w:val="Heading 2 Char"/>
-    <w:basedOn w:val="DefaultParagraphFont"/>
-    <w:link w:val="Heading2"/>
+  <w:style w:type="character" w:customStyle="1" w:styleId="Kop2Char">
+    <w:name w:val="Kop 2 Char"/>
+    <w:basedOn w:val="Standaardalinea-lettertype"/>
+    <w:link w:val="Kop2"/>
     <w:uiPriority w:val="9"/>
     <w:semiHidden/>
     <w:rsid w:val="005B10CC"/>
@@ -2392,10 +2457,10 @@
       <w:szCs w:val="32"/>
     </w:rPr>
   </w:style>
-  <w:style w:type="character" w:customStyle="1" w:styleId="Heading3Char">
-    <w:name w:val="Heading 3 Char"/>
-    <w:basedOn w:val="DefaultParagraphFont"/>
-    <w:link w:val="Heading3"/>
+  <w:style w:type="character" w:customStyle="1" w:styleId="Kop3Char">
+    <w:name w:val="Kop 3 Char"/>
+    <w:basedOn w:val="Standaardalinea-lettertype"/>
+    <w:link w:val="Kop3"/>
     <w:uiPriority w:val="9"/>
     <w:semiHidden/>
     <w:rsid w:val="005B10CC"/>
@@ -2406,10 +2471,10 @@
       <w:szCs w:val="28"/>
     </w:rPr>
   </w:style>
-  <w:style w:type="character" w:customStyle="1" w:styleId="Heading4Char">
-    <w:name w:val="Heading 4 Char"/>
-    <w:basedOn w:val="DefaultParagraphFont"/>
-    <w:link w:val="Heading4"/>
+  <w:style w:type="character" w:customStyle="1" w:styleId="Kop4Char">
+    <w:name w:val="Kop 4 Char"/>
+    <w:basedOn w:val="Standaardalinea-lettertype"/>
+    <w:link w:val="Kop4"/>
     <w:uiPriority w:val="9"/>
     <w:semiHidden/>
     <w:rsid w:val="005B10CC"/>
@@ -2420,10 +2485,10 @@
       <w:color w:val="0F4761" w:themeColor="accent1" w:themeShade="BF"/>
     </w:rPr>
   </w:style>
-  <w:style w:type="character" w:customStyle="1" w:styleId="Heading5Char">
-    <w:name w:val="Heading 5 Char"/>
-    <w:basedOn w:val="DefaultParagraphFont"/>
-    <w:link w:val="Heading5"/>
+  <w:style w:type="character" w:customStyle="1" w:styleId="Kop5Char">
+    <w:name w:val="Kop 5 Char"/>
+    <w:basedOn w:val="Standaardalinea-lettertype"/>
+    <w:link w:val="Kop5"/>
     <w:uiPriority w:val="9"/>
     <w:semiHidden/>
     <w:rsid w:val="005B10CC"/>
@@ -2432,10 +2497,10 @@
       <w:color w:val="0F4761" w:themeColor="accent1" w:themeShade="BF"/>
     </w:rPr>
   </w:style>
-  <w:style w:type="character" w:customStyle="1" w:styleId="Heading6Char">
-    <w:name w:val="Heading 6 Char"/>
-    <w:basedOn w:val="DefaultParagraphFont"/>
-    <w:link w:val="Heading6"/>
+  <w:style w:type="character" w:customStyle="1" w:styleId="Kop6Char">
+    <w:name w:val="Kop 6 Char"/>
+    <w:basedOn w:val="Standaardalinea-lettertype"/>
+    <w:link w:val="Kop6"/>
     <w:uiPriority w:val="9"/>
     <w:semiHidden/>
     <w:rsid w:val="005B10CC"/>
@@ -2446,10 +2511,10 @@
       <w:color w:val="595959" w:themeColor="text1" w:themeTint="A6"/>
     </w:rPr>
   </w:style>
-  <w:style w:type="character" w:customStyle="1" w:styleId="Heading7Char">
-    <w:name w:val="Heading 7 Char"/>
-    <w:basedOn w:val="DefaultParagraphFont"/>
-    <w:link w:val="Heading7"/>
+  <w:style w:type="character" w:customStyle="1" w:styleId="Kop7Char">
+    <w:name w:val="Kop 7 Char"/>
+    <w:basedOn w:val="Standaardalinea-lettertype"/>
+    <w:link w:val="Kop7"/>
     <w:uiPriority w:val="9"/>
     <w:semiHidden/>
     <w:rsid w:val="005B10CC"/>
@@ -2458,10 +2523,10 @@
       <w:color w:val="595959" w:themeColor="text1" w:themeTint="A6"/>
     </w:rPr>
   </w:style>
-  <w:style w:type="character" w:customStyle="1" w:styleId="Heading8Char">
-    <w:name w:val="Heading 8 Char"/>
-    <w:basedOn w:val="DefaultParagraphFont"/>
-    <w:link w:val="Heading8"/>
+  <w:style w:type="character" w:customStyle="1" w:styleId="Kop8Char">
+    <w:name w:val="Kop 8 Char"/>
+    <w:basedOn w:val="Standaardalinea-lettertype"/>
+    <w:link w:val="Kop8"/>
     <w:uiPriority w:val="9"/>
     <w:semiHidden/>
     <w:rsid w:val="005B10CC"/>
@@ -2472,10 +2537,10 @@
       <w:color w:val="272727" w:themeColor="text1" w:themeTint="D8"/>
     </w:rPr>
   </w:style>
-  <w:style w:type="character" w:customStyle="1" w:styleId="Heading9Char">
-    <w:name w:val="Heading 9 Char"/>
-    <w:basedOn w:val="DefaultParagraphFont"/>
-    <w:link w:val="Heading9"/>
+  <w:style w:type="character" w:customStyle="1" w:styleId="Kop9Char">
+    <w:name w:val="Kop 9 Char"/>
+    <w:basedOn w:val="Standaardalinea-lettertype"/>
+    <w:link w:val="Kop9"/>
     <w:uiPriority w:val="9"/>
     <w:semiHidden/>
     <w:rsid w:val="005B10CC"/>
@@ -2484,11 +2549,11 @@
       <w:color w:val="272727" w:themeColor="text1" w:themeTint="D8"/>
     </w:rPr>
   </w:style>
-  <w:style w:type="paragraph" w:styleId="Title">
+  <w:style w:type="paragraph" w:styleId="Titel">
     <w:name w:val="Title"/>
-    <w:basedOn w:val="Normal"/>
-    <w:next w:val="Normal"/>
-    <w:link w:val="TitleChar"/>
+    <w:basedOn w:val="Standaard"/>
+    <w:next w:val="Standaard"/>
+    <w:link w:val="TitelChar"/>
     <w:uiPriority w:val="10"/>
     <w:qFormat/>
     <w:rsid w:val="005B10CC"/>
@@ -2504,10 +2569,10 @@
       <w:szCs w:val="56"/>
     </w:rPr>
   </w:style>
-  <w:style w:type="character" w:customStyle="1" w:styleId="TitleChar">
-    <w:name w:val="Title Char"/>
-    <w:basedOn w:val="DefaultParagraphFont"/>
-    <w:link w:val="Title"/>
+  <w:style w:type="character" w:customStyle="1" w:styleId="TitelChar">
+    <w:name w:val="Titel Char"/>
+    <w:basedOn w:val="Standaardalinea-lettertype"/>
+    <w:link w:val="Titel"/>
     <w:uiPriority w:val="10"/>
     <w:rsid w:val="005B10CC"/>
     <w:rPr>
@@ -2518,11 +2583,11 @@
       <w:szCs w:val="56"/>
     </w:rPr>
   </w:style>
-  <w:style w:type="paragraph" w:styleId="Subtitle">
+  <w:style w:type="paragraph" w:styleId="Ondertitel">
     <w:name w:val="Subtitle"/>
-    <w:basedOn w:val="Normal"/>
-    <w:next w:val="Normal"/>
-    <w:link w:val="SubtitleChar"/>
+    <w:basedOn w:val="Standaard"/>
+    <w:next w:val="Standaard"/>
+    <w:link w:val="OndertitelChar"/>
     <w:uiPriority w:val="11"/>
     <w:qFormat/>
     <w:rsid w:val="005B10CC"/>
@@ -2539,10 +2604,10 @@
       <w:szCs w:val="28"/>
     </w:rPr>
   </w:style>
-  <w:style w:type="character" w:customStyle="1" w:styleId="SubtitleChar">
-    <w:name w:val="Subtitle Char"/>
-    <w:basedOn w:val="DefaultParagraphFont"/>
-    <w:link w:val="Subtitle"/>
+  <w:style w:type="character" w:customStyle="1" w:styleId="OndertitelChar">
+    <w:name w:val="Ondertitel Char"/>
+    <w:basedOn w:val="Standaardalinea-lettertype"/>
+    <w:link w:val="Ondertitel"/>
     <w:uiPriority w:val="11"/>
     <w:rsid w:val="005B10CC"/>
     <w:rPr>
@@ -2553,11 +2618,11 @@
       <w:szCs w:val="28"/>
     </w:rPr>
   </w:style>
-  <w:style w:type="paragraph" w:styleId="Quote">
+  <w:style w:type="paragraph" w:styleId="Citaat">
     <w:name w:val="Quote"/>
-    <w:basedOn w:val="Normal"/>
-    <w:next w:val="Normal"/>
-    <w:link w:val="QuoteChar"/>
+    <w:basedOn w:val="Standaard"/>
+    <w:next w:val="Standaard"/>
+    <w:link w:val="CitaatChar"/>
     <w:uiPriority w:val="29"/>
     <w:qFormat/>
     <w:rsid w:val="005B10CC"/>
@@ -2571,10 +2636,10 @@
       <w:color w:val="404040" w:themeColor="text1" w:themeTint="BF"/>
     </w:rPr>
   </w:style>
-  <w:style w:type="character" w:customStyle="1" w:styleId="QuoteChar">
-    <w:name w:val="Quote Char"/>
-    <w:basedOn w:val="DefaultParagraphFont"/>
-    <w:link w:val="Quote"/>
+  <w:style w:type="character" w:customStyle="1" w:styleId="CitaatChar">
+    <w:name w:val="Citaat Char"/>
+    <w:basedOn w:val="Standaardalinea-lettertype"/>
+    <w:link w:val="Citaat"/>
     <w:uiPriority w:val="29"/>
     <w:rsid w:val="005B10CC"/>
     <w:rPr>
@@ -2583,9 +2648,9 @@
       <w:color w:val="404040" w:themeColor="text1" w:themeTint="BF"/>
     </w:rPr>
   </w:style>
-  <w:style w:type="paragraph" w:styleId="ListParagraph">
+  <w:style w:type="paragraph" w:styleId="Lijstalinea">
     <w:name w:val="List Paragraph"/>
-    <w:basedOn w:val="Normal"/>
+    <w:basedOn w:val="Standaard"/>
     <w:uiPriority w:val="34"/>
     <w:qFormat/>
     <w:rsid w:val="005B10CC"/>
@@ -2594,9 +2659,9 @@
       <w:contextualSpacing/>
     </w:pPr>
   </w:style>
-  <w:style w:type="character" w:styleId="IntenseEmphasis">
+  <w:style w:type="character" w:styleId="Intensievebenadrukking">
     <w:name w:val="Intense Emphasis"/>
-    <w:basedOn w:val="DefaultParagraphFont"/>
+    <w:basedOn w:val="Standaardalinea-lettertype"/>
     <w:uiPriority w:val="21"/>
     <w:qFormat/>
     <w:rsid w:val="005B10CC"/>
@@ -2606,11 +2671,11 @@
       <w:color w:val="0F4761" w:themeColor="accent1" w:themeShade="BF"/>
     </w:rPr>
   </w:style>
-  <w:style w:type="paragraph" w:styleId="IntenseQuote">
+  <w:style w:type="paragraph" w:styleId="Duidelijkcitaat">
     <w:name w:val="Intense Quote"/>
-    <w:basedOn w:val="Normal"/>
-    <w:next w:val="Normal"/>
-    <w:link w:val="IntenseQuoteChar"/>
+    <w:basedOn w:val="Standaard"/>
+    <w:next w:val="Standaard"/>
+    <w:link w:val="DuidelijkcitaatChar"/>
     <w:uiPriority w:val="30"/>
     <w:qFormat/>
     <w:rsid w:val="005B10CC"/>
@@ -2629,10 +2694,10 @@
       <w:color w:val="0F4761" w:themeColor="accent1" w:themeShade="BF"/>
     </w:rPr>
   </w:style>
-  <w:style w:type="character" w:customStyle="1" w:styleId="IntenseQuoteChar">
-    <w:name w:val="Intense Quote Char"/>
-    <w:basedOn w:val="DefaultParagraphFont"/>
-    <w:link w:val="IntenseQuote"/>
+  <w:style w:type="character" w:customStyle="1" w:styleId="DuidelijkcitaatChar">
+    <w:name w:val="Duidelijk citaat Char"/>
+    <w:basedOn w:val="Standaardalinea-lettertype"/>
+    <w:link w:val="Duidelijkcitaat"/>
     <w:uiPriority w:val="30"/>
     <w:rsid w:val="005B10CC"/>
     <w:rPr>
@@ -2641,9 +2706,9 @@
       <w:color w:val="0F4761" w:themeColor="accent1" w:themeShade="BF"/>
     </w:rPr>
   </w:style>
-  <w:style w:type="character" w:styleId="IntenseReference">
+  <w:style w:type="character" w:styleId="Intensieveverwijzing">
     <w:name w:val="Intense Reference"/>
-    <w:basedOn w:val="DefaultParagraphFont"/>
+    <w:basedOn w:val="Standaardalinea-lettertype"/>
     <w:uiPriority w:val="32"/>
     <w:qFormat/>
     <w:rsid w:val="005B10CC"/>
@@ -2655,9 +2720,9 @@
       <w:spacing w:val="5"/>
     </w:rPr>
   </w:style>
-  <w:style w:type="table" w:styleId="TableGrid">
+  <w:style w:type="table" w:styleId="Tabelraster">
     <w:name w:val="Table Grid"/>
-    <w:basedOn w:val="TableNormal"/>
+    <w:basedOn w:val="Standaardtabel"/>
     <w:uiPriority w:val="39"/>
     <w:rsid w:val="0024613D"/>
     <w:pPr>

</xml_diff>

<commit_message>
Cleaned up image tree folder structure and saving them correctly
</commit_message>
<xml_diff>
--- a/TimeLapse_LaTeX/Thesis/working summary.docx
+++ b/TimeLapse_LaTeX/Thesis/working summary.docx
@@ -1437,8 +1437,14 @@
           <w:ilvl w:val="0"/>
           <w:numId w:val="3"/>
         </w:numPr>
-      </w:pPr>
-      <w:r>
+        <w:rPr>
+          <w:highlight w:val="yellow"/>
+        </w:rPr>
+      </w:pPr>
+      <w:r>
+        <w:rPr>
+          <w:highlight w:val="yellow"/>
+        </w:rPr>
         <w:t>Clean up how figures are generated and stored</w:t>
       </w:r>
     </w:p>
@@ -1487,6 +1493,254 @@
           <w:ilvl w:val="0"/>
           <w:numId w:val="1"/>
         </w:numPr>
+      </w:pPr>
+      <w:r>
+        <w:t xml:space="preserve">Have on </w:t>
+      </w:r>
+      <w:proofErr w:type="spellStart"/>
+      <w:r>
+        <w:t>notebookLM</w:t>
+      </w:r>
+      <w:proofErr w:type="spellEnd"/>
+      <w:r>
+        <w:t xml:space="preserve"> per main topic group:</w:t>
+      </w:r>
+    </w:p>
+    <w:p>
+      <w:pPr>
+        <w:pStyle w:val="Lijstalinea"/>
+        <w:numPr>
+          <w:ilvl w:val="0"/>
+          <w:numId w:val="4"/>
+        </w:numPr>
+      </w:pPr>
+      <w:r>
+        <w:t>EM theory, GPR resolution, acquisition</w:t>
+      </w:r>
+    </w:p>
+    <w:p>
+      <w:pPr>
+        <w:pStyle w:val="Lijstalinea"/>
+        <w:numPr>
+          <w:ilvl w:val="0"/>
+          <w:numId w:val="4"/>
+        </w:numPr>
+      </w:pPr>
+      <w:r>
+        <w:t>Migration techniques</w:t>
+      </w:r>
+    </w:p>
+    <w:p>
+      <w:pPr>
+        <w:pStyle w:val="Lijstalinea"/>
+        <w:numPr>
+          <w:ilvl w:val="0"/>
+          <w:numId w:val="4"/>
+        </w:numPr>
+      </w:pPr>
+      <w:r>
+        <w:t>GPR results processing/ filtering</w:t>
+      </w:r>
+    </w:p>
+    <w:p>
+      <w:pPr>
+        <w:pStyle w:val="Lijstalinea"/>
+        <w:numPr>
+          <w:ilvl w:val="0"/>
+          <w:numId w:val="4"/>
+        </w:numPr>
+      </w:pPr>
+      <w:r>
+        <w:t>Wavenumber, phase, frequency analysis</w:t>
+      </w:r>
+    </w:p>
+    <w:p/>
+    <w:p>
+      <w:pPr>
+        <w:pStyle w:val="Lijstalinea"/>
+        <w:numPr>
+          <w:ilvl w:val="0"/>
+          <w:numId w:val="5"/>
+        </w:numPr>
+        <w:rPr>
+          <w:lang w:val="en-US"/>
+        </w:rPr>
+      </w:pPr>
+      <w:r>
+        <w:rPr>
+          <w:lang w:val="en-US"/>
+        </w:rPr>
+        <w:t xml:space="preserve"> </w:t>
+      </w:r>
+      <w:r>
+        <w:rPr>
+          <w:b/>
+          <w:bCs/>
+          <w:lang w:val="en-US"/>
+        </w:rPr>
+        <w:t>Notebook 1 (Theory &amp; Acquisition):</w:t>
+      </w:r>
+      <w:r>
+        <w:rPr>
+          <w:lang w:val="en-US"/>
+        </w:rPr>
+        <w:t xml:space="preserve"> This is your </w:t>
+      </w:r>
+      <w:r>
+        <w:rPr>
+          <w:b/>
+          <w:bCs/>
+          <w:lang w:val="en-US"/>
+        </w:rPr>
+        <w:t>Chapter 2: Background</w:t>
+      </w:r>
+      <w:r>
+        <w:rPr>
+          <w:lang w:val="en-US"/>
+        </w:rPr>
+        <w:t>. It holds all your fundamental physics, Maxwell's equations, dielectric constants, and hardware constraints.</w:t>
+      </w:r>
+    </w:p>
+    <w:p>
+      <w:pPr>
+        <w:pStyle w:val="Lijstalinea"/>
+        <w:numPr>
+          <w:ilvl w:val="0"/>
+          <w:numId w:val="5"/>
+        </w:numPr>
+        <w:rPr>
+          <w:lang w:val="en-US"/>
+        </w:rPr>
+      </w:pPr>
+      <w:r>
+        <w:rPr>
+          <w:b/>
+          <w:bCs/>
+          <w:lang w:val="en-US"/>
+        </w:rPr>
+        <w:t>Notebook 2 (Migration):</w:t>
+      </w:r>
+      <w:r>
+        <w:rPr>
+          <w:lang w:val="en-US"/>
+        </w:rPr>
+        <w:t xml:space="preserve"> This is the </w:t>
+      </w:r>
+      <w:r>
+        <w:rPr>
+          <w:b/>
+          <w:bCs/>
+          <w:lang w:val="en-US"/>
+        </w:rPr>
+        <w:t>core mathematical engine</w:t>
+      </w:r>
+      <w:r>
+        <w:rPr>
+          <w:lang w:val="en-US"/>
+        </w:rPr>
+        <w:t xml:space="preserve"> of your thesis. Keeping Kirchhoff, Gazdag, and Back-Propagation here allows you to deeply compare algorithms without wading through raw hardware specs.</w:t>
+      </w:r>
+    </w:p>
+    <w:p>
+      <w:pPr>
+        <w:pStyle w:val="Lijstalinea"/>
+        <w:numPr>
+          <w:ilvl w:val="0"/>
+          <w:numId w:val="5"/>
+        </w:numPr>
+        <w:rPr>
+          <w:lang w:val="en-US"/>
+        </w:rPr>
+      </w:pPr>
+      <w:r>
+        <w:rPr>
+          <w:b/>
+          <w:bCs/>
+          <w:lang w:val="en-US"/>
+        </w:rPr>
+        <w:lastRenderedPageBreak/>
+        <w:t>Notebook 3 (Processing &amp; Filtering):</w:t>
+      </w:r>
+      <w:r>
+        <w:rPr>
+          <w:lang w:val="en-US"/>
+        </w:rPr>
+        <w:t xml:space="preserve"> This handles your </w:t>
+      </w:r>
+      <w:r>
+        <w:rPr>
+          <w:b/>
+          <w:bCs/>
+          <w:lang w:val="en-US"/>
+        </w:rPr>
+        <w:t>practical workflow</w:t>
+      </w:r>
+      <w:r>
+        <w:rPr>
+          <w:lang w:val="en-US"/>
+        </w:rPr>
+        <w:t xml:space="preserve"> (gain control, deconvolution, muting). It bridges raw data to the migration step.</w:t>
+      </w:r>
+    </w:p>
+    <w:p>
+      <w:pPr>
+        <w:pStyle w:val="Lijstalinea"/>
+        <w:numPr>
+          <w:ilvl w:val="0"/>
+          <w:numId w:val="5"/>
+        </w:numPr>
+        <w:rPr>
+          <w:lang w:val="en-US"/>
+        </w:rPr>
+      </w:pPr>
+      <w:r>
+        <w:rPr>
+          <w:b/>
+          <w:bCs/>
+          <w:lang w:val="en-US"/>
+        </w:rPr>
+        <w:t>Notebook 4 (Spectral Analysis):</w:t>
+      </w:r>
+      <w:r>
+        <w:rPr>
+          <w:lang w:val="en-US"/>
+        </w:rPr>
+        <w:t xml:space="preserve"> This is your </w:t>
+      </w:r>
+      <w:r>
+        <w:rPr>
+          <w:b/>
+          <w:bCs/>
+          <w:lang w:val="en-US"/>
+        </w:rPr>
+        <w:t>Advanced Discussion/Insights</w:t>
+      </w:r>
+      <w:r>
+        <w:rPr>
+          <w:lang w:val="en-US"/>
+        </w:rPr>
+        <w:t xml:space="preserve"> powerhouse. Wavenumber and phase analysis are where you prove </w:t>
+      </w:r>
+      <w:r>
+        <w:rPr>
+          <w:i/>
+          <w:iCs/>
+          <w:lang w:val="en-US"/>
+        </w:rPr>
+        <w:t>why</w:t>
+      </w:r>
+      <w:r>
+        <w:rPr>
+          <w:lang w:val="en-US"/>
+        </w:rPr>
+        <w:t xml:space="preserve"> certain migrations worked better than others.</w:t>
+      </w:r>
+    </w:p>
+    <w:p>
+      <w:pPr>
+        <w:rPr>
+          <w:lang w:val="en-US"/>
+        </w:rPr>
       </w:pPr>
     </w:p>
     <w:sectPr>
@@ -1591,6 +1845,95 @@
     </w:lvl>
   </w:abstractNum>
   <w:abstractNum w:abstractNumId="1" w15:restartNumberingAfterBreak="0">
+    <w:nsid w:val="3623261C"/>
+    <w:multiLevelType w:val="hybridMultilevel"/>
+    <w:tmpl w:val="3A4E3940"/>
+    <w:lvl w:ilvl="0" w:tplc="7D40995E">
+      <w:start w:val="1"/>
+      <w:numFmt w:val="decimal"/>
+      <w:lvlText w:val="%1."/>
+      <w:lvlJc w:val="left"/>
+      <w:pPr>
+        <w:ind w:left="1800" w:hanging="360"/>
+      </w:pPr>
+      <w:rPr>
+        <w:rFonts w:hint="default"/>
+      </w:rPr>
+    </w:lvl>
+    <w:lvl w:ilvl="1" w:tplc="04130019" w:tentative="1">
+      <w:start w:val="1"/>
+      <w:numFmt w:val="lowerLetter"/>
+      <w:lvlText w:val="%2."/>
+      <w:lvlJc w:val="left"/>
+      <w:pPr>
+        <w:ind w:left="2520" w:hanging="360"/>
+      </w:pPr>
+    </w:lvl>
+    <w:lvl w:ilvl="2" w:tplc="0413001B" w:tentative="1">
+      <w:start w:val="1"/>
+      <w:numFmt w:val="lowerRoman"/>
+      <w:lvlText w:val="%3."/>
+      <w:lvlJc w:val="right"/>
+      <w:pPr>
+        <w:ind w:left="3240" w:hanging="180"/>
+      </w:pPr>
+    </w:lvl>
+    <w:lvl w:ilvl="3" w:tplc="0413000F" w:tentative="1">
+      <w:start w:val="1"/>
+      <w:numFmt w:val="decimal"/>
+      <w:lvlText w:val="%4."/>
+      <w:lvlJc w:val="left"/>
+      <w:pPr>
+        <w:ind w:left="3960" w:hanging="360"/>
+      </w:pPr>
+    </w:lvl>
+    <w:lvl w:ilvl="4" w:tplc="04130019" w:tentative="1">
+      <w:start w:val="1"/>
+      <w:numFmt w:val="lowerLetter"/>
+      <w:lvlText w:val="%5."/>
+      <w:lvlJc w:val="left"/>
+      <w:pPr>
+        <w:ind w:left="4680" w:hanging="360"/>
+      </w:pPr>
+    </w:lvl>
+    <w:lvl w:ilvl="5" w:tplc="0413001B" w:tentative="1">
+      <w:start w:val="1"/>
+      <w:numFmt w:val="lowerRoman"/>
+      <w:lvlText w:val="%6."/>
+      <w:lvlJc w:val="right"/>
+      <w:pPr>
+        <w:ind w:left="5400" w:hanging="180"/>
+      </w:pPr>
+    </w:lvl>
+    <w:lvl w:ilvl="6" w:tplc="0413000F" w:tentative="1">
+      <w:start w:val="1"/>
+      <w:numFmt w:val="decimal"/>
+      <w:lvlText w:val="%7."/>
+      <w:lvlJc w:val="left"/>
+      <w:pPr>
+        <w:ind w:left="6120" w:hanging="360"/>
+      </w:pPr>
+    </w:lvl>
+    <w:lvl w:ilvl="7" w:tplc="04130019" w:tentative="1">
+      <w:start w:val="1"/>
+      <w:numFmt w:val="lowerLetter"/>
+      <w:lvlText w:val="%8."/>
+      <w:lvlJc w:val="left"/>
+      <w:pPr>
+        <w:ind w:left="6840" w:hanging="360"/>
+      </w:pPr>
+    </w:lvl>
+    <w:lvl w:ilvl="8" w:tplc="0413001B" w:tentative="1">
+      <w:start w:val="1"/>
+      <w:numFmt w:val="lowerRoman"/>
+      <w:lvlText w:val="%9."/>
+      <w:lvlJc w:val="right"/>
+      <w:pPr>
+        <w:ind w:left="7560" w:hanging="180"/>
+      </w:pPr>
+    </w:lvl>
+  </w:abstractNum>
+  <w:abstractNum w:abstractNumId="2" w15:restartNumberingAfterBreak="0">
     <w:nsid w:val="3894545A"/>
     <w:multiLevelType w:val="hybridMultilevel"/>
     <w:tmpl w:val="8FBC964A"/>
@@ -1605,7 +1948,7 @@
         <w:rFonts w:ascii="Aptos" w:eastAsiaTheme="minorHAnsi" w:hAnsi="Aptos" w:cstheme="minorBidi" w:hint="default"/>
       </w:rPr>
     </w:lvl>
-    <w:lvl w:ilvl="1" w:tplc="08090003" w:tentative="1">
+    <w:lvl w:ilvl="1" w:tplc="08090003">
       <w:start w:val="1"/>
       <w:numFmt w:val="bullet"/>
       <w:lvlText w:val="o"/>
@@ -1702,7 +2045,120 @@
       </w:rPr>
     </w:lvl>
   </w:abstractNum>
-  <w:abstractNum w:abstractNumId="2" w15:restartNumberingAfterBreak="0">
+  <w:abstractNum w:abstractNumId="3" w15:restartNumberingAfterBreak="0">
+    <w:nsid w:val="4E81638E"/>
+    <w:multiLevelType w:val="hybridMultilevel"/>
+    <w:tmpl w:val="14148838"/>
+    <w:lvl w:ilvl="0" w:tplc="133E7878">
+      <w:start w:val="1"/>
+      <w:numFmt w:val="bullet"/>
+      <w:lvlText w:val=""/>
+      <w:lvlJc w:val="left"/>
+      <w:pPr>
+        <w:ind w:left="720" w:hanging="360"/>
+      </w:pPr>
+      <w:rPr>
+        <w:rFonts w:ascii="Symbol" w:eastAsiaTheme="minorHAnsi" w:hAnsi="Symbol" w:cstheme="minorBidi" w:hint="default"/>
+      </w:rPr>
+    </w:lvl>
+    <w:lvl w:ilvl="1" w:tplc="04130003" w:tentative="1">
+      <w:start w:val="1"/>
+      <w:numFmt w:val="bullet"/>
+      <w:lvlText w:val="o"/>
+      <w:lvlJc w:val="left"/>
+      <w:pPr>
+        <w:ind w:left="1440" w:hanging="360"/>
+      </w:pPr>
+      <w:rPr>
+        <w:rFonts w:ascii="Courier New" w:hAnsi="Courier New" w:cs="Courier New" w:hint="default"/>
+      </w:rPr>
+    </w:lvl>
+    <w:lvl w:ilvl="2" w:tplc="04130005" w:tentative="1">
+      <w:start w:val="1"/>
+      <w:numFmt w:val="bullet"/>
+      <w:lvlText w:val=""/>
+      <w:lvlJc w:val="left"/>
+      <w:pPr>
+        <w:ind w:left="2160" w:hanging="360"/>
+      </w:pPr>
+      <w:rPr>
+        <w:rFonts w:ascii="Wingdings" w:hAnsi="Wingdings" w:hint="default"/>
+      </w:rPr>
+    </w:lvl>
+    <w:lvl w:ilvl="3" w:tplc="04130001" w:tentative="1">
+      <w:start w:val="1"/>
+      <w:numFmt w:val="bullet"/>
+      <w:lvlText w:val=""/>
+      <w:lvlJc w:val="left"/>
+      <w:pPr>
+        <w:ind w:left="2880" w:hanging="360"/>
+      </w:pPr>
+      <w:rPr>
+        <w:rFonts w:ascii="Symbol" w:hAnsi="Symbol" w:hint="default"/>
+      </w:rPr>
+    </w:lvl>
+    <w:lvl w:ilvl="4" w:tplc="04130003" w:tentative="1">
+      <w:start w:val="1"/>
+      <w:numFmt w:val="bullet"/>
+      <w:lvlText w:val="o"/>
+      <w:lvlJc w:val="left"/>
+      <w:pPr>
+        <w:ind w:left="3600" w:hanging="360"/>
+      </w:pPr>
+      <w:rPr>
+        <w:rFonts w:ascii="Courier New" w:hAnsi="Courier New" w:cs="Courier New" w:hint="default"/>
+      </w:rPr>
+    </w:lvl>
+    <w:lvl w:ilvl="5" w:tplc="04130005" w:tentative="1">
+      <w:start w:val="1"/>
+      <w:numFmt w:val="bullet"/>
+      <w:lvlText w:val=""/>
+      <w:lvlJc w:val="left"/>
+      <w:pPr>
+        <w:ind w:left="4320" w:hanging="360"/>
+      </w:pPr>
+      <w:rPr>
+        <w:rFonts w:ascii="Wingdings" w:hAnsi="Wingdings" w:hint="default"/>
+      </w:rPr>
+    </w:lvl>
+    <w:lvl w:ilvl="6" w:tplc="04130001" w:tentative="1">
+      <w:start w:val="1"/>
+      <w:numFmt w:val="bullet"/>
+      <w:lvlText w:val=""/>
+      <w:lvlJc w:val="left"/>
+      <w:pPr>
+        <w:ind w:left="5040" w:hanging="360"/>
+      </w:pPr>
+      <w:rPr>
+        <w:rFonts w:ascii="Symbol" w:hAnsi="Symbol" w:hint="default"/>
+      </w:rPr>
+    </w:lvl>
+    <w:lvl w:ilvl="7" w:tplc="04130003" w:tentative="1">
+      <w:start w:val="1"/>
+      <w:numFmt w:val="bullet"/>
+      <w:lvlText w:val="o"/>
+      <w:lvlJc w:val="left"/>
+      <w:pPr>
+        <w:ind w:left="5760" w:hanging="360"/>
+      </w:pPr>
+      <w:rPr>
+        <w:rFonts w:ascii="Courier New" w:hAnsi="Courier New" w:cs="Courier New" w:hint="default"/>
+      </w:rPr>
+    </w:lvl>
+    <w:lvl w:ilvl="8" w:tplc="04130005" w:tentative="1">
+      <w:start w:val="1"/>
+      <w:numFmt w:val="bullet"/>
+      <w:lvlText w:val=""/>
+      <w:lvlJc w:val="left"/>
+      <w:pPr>
+        <w:ind w:left="6480" w:hanging="360"/>
+      </w:pPr>
+      <w:rPr>
+        <w:rFonts w:ascii="Wingdings" w:hAnsi="Wingdings" w:hint="default"/>
+      </w:rPr>
+    </w:lvl>
+  </w:abstractNum>
+  <w:abstractNum w:abstractNumId="4" w15:restartNumberingAfterBreak="0">
     <w:nsid w:val="59B11C82"/>
     <w:multiLevelType w:val="hybridMultilevel"/>
     <w:tmpl w:val="4D3C7386"/>
@@ -1792,13 +2248,19 @@
     </w:lvl>
   </w:abstractNum>
   <w:num w:numId="1" w16cid:durableId="227349705">
-    <w:abstractNumId w:val="1"/>
+    <w:abstractNumId w:val="2"/>
   </w:num>
   <w:num w:numId="2" w16cid:durableId="1361861515">
     <w:abstractNumId w:val="0"/>
   </w:num>
   <w:num w:numId="3" w16cid:durableId="18505631">
-    <w:abstractNumId w:val="2"/>
+    <w:abstractNumId w:val="4"/>
+  </w:num>
+  <w:num w:numId="4" w16cid:durableId="295137552">
+    <w:abstractNumId w:val="1"/>
+  </w:num>
+  <w:num w:numId="5" w16cid:durableId="1339388064">
+    <w:abstractNumId w:val="3"/>
   </w:num>
 </w:numbering>
 </file>
@@ -2406,7 +2868,6 @@
   <w:style w:type="character" w:default="1" w:styleId="Standaardalinea-lettertype">
     <w:name w:val="Default Paragraph Font"/>
     <w:uiPriority w:val="1"/>
-    <w:semiHidden/>
     <w:unhideWhenUsed/>
   </w:style>
   <w:style w:type="table" w:default="1" w:styleId="Standaardtabel">

</xml_diff>

<commit_message>
Made notebooks more consistent: grouped together plotting functions in visualisation.py and imports the migrated results so they do not have to be rerun
</commit_message>
<xml_diff>
--- a/TimeLapse_LaTeX/Thesis/working summary.docx
+++ b/TimeLapse_LaTeX/Thesis/working summary.docx
@@ -90,7 +90,7 @@
     </w:p>
     <w:p>
       <w:pPr>
-        <w:pStyle w:val="Lijstalinea"/>
+        <w:pStyle w:val="ListParagraph"/>
         <w:numPr>
           <w:ilvl w:val="0"/>
           <w:numId w:val="1"/>
@@ -105,7 +105,7 @@
     </w:p>
     <w:p>
       <w:pPr>
-        <w:pStyle w:val="Lijstalinea"/>
+        <w:pStyle w:val="ListParagraph"/>
         <w:numPr>
           <w:ilvl w:val="0"/>
           <w:numId w:val="1"/>
@@ -117,7 +117,7 @@
     </w:p>
     <w:p>
       <w:pPr>
-        <w:pStyle w:val="Lijstalinea"/>
+        <w:pStyle w:val="ListParagraph"/>
         <w:numPr>
           <w:ilvl w:val="0"/>
           <w:numId w:val="1"/>
@@ -129,7 +129,7 @@
     </w:p>
     <w:p>
       <w:pPr>
-        <w:pStyle w:val="Lijstalinea"/>
+        <w:pStyle w:val="ListParagraph"/>
       </w:pPr>
     </w:p>
     <w:p>
@@ -162,7 +162,7 @@
     </w:p>
     <w:p>
       <w:pPr>
-        <w:pStyle w:val="Lijstalinea"/>
+        <w:pStyle w:val="ListParagraph"/>
         <w:numPr>
           <w:ilvl w:val="0"/>
           <w:numId w:val="1"/>
@@ -174,7 +174,7 @@
     </w:p>
     <w:p>
       <w:pPr>
-        <w:pStyle w:val="Lijstalinea"/>
+        <w:pStyle w:val="ListParagraph"/>
         <w:numPr>
           <w:ilvl w:val="0"/>
           <w:numId w:val="1"/>
@@ -191,7 +191,7 @@
     </w:p>
     <w:p>
       <w:pPr>
-        <w:pStyle w:val="Lijstalinea"/>
+        <w:pStyle w:val="ListParagraph"/>
         <w:numPr>
           <w:ilvl w:val="0"/>
           <w:numId w:val="1"/>
@@ -203,7 +203,7 @@
     </w:p>
     <w:p>
       <w:pPr>
-        <w:pStyle w:val="Lijstalinea"/>
+        <w:pStyle w:val="ListParagraph"/>
         <w:numPr>
           <w:ilvl w:val="0"/>
           <w:numId w:val="1"/>
@@ -981,7 +981,7 @@
     </w:p>
     <w:p>
       <w:pPr>
-        <w:pStyle w:val="Lijstalinea"/>
+        <w:pStyle w:val="ListParagraph"/>
         <w:numPr>
           <w:ilvl w:val="0"/>
           <w:numId w:val="1"/>
@@ -993,7 +993,7 @@
     </w:p>
     <w:p>
       <w:pPr>
-        <w:pStyle w:val="Lijstalinea"/>
+        <w:pStyle w:val="ListParagraph"/>
         <w:numPr>
           <w:ilvl w:val="0"/>
           <w:numId w:val="1"/>
@@ -1005,7 +1005,7 @@
     </w:p>
     <w:p>
       <w:pPr>
-        <w:pStyle w:val="Lijstalinea"/>
+        <w:pStyle w:val="ListParagraph"/>
         <w:numPr>
           <w:ilvl w:val="0"/>
           <w:numId w:val="1"/>
@@ -1071,7 +1071,7 @@
     </w:p>
     <w:p>
       <w:pPr>
-        <w:pStyle w:val="Lijstalinea"/>
+        <w:pStyle w:val="ListParagraph"/>
         <w:numPr>
           <w:ilvl w:val="0"/>
           <w:numId w:val="3"/>
@@ -1107,7 +1107,7 @@
     </w:p>
     <w:p>
       <w:pPr>
-        <w:pStyle w:val="Lijstalinea"/>
+        <w:pStyle w:val="ListParagraph"/>
         <w:numPr>
           <w:ilvl w:val="1"/>
           <w:numId w:val="3"/>
@@ -1135,7 +1135,7 @@
     </w:p>
     <w:p>
       <w:pPr>
-        <w:pStyle w:val="Lijstalinea"/>
+        <w:pStyle w:val="ListParagraph"/>
         <w:numPr>
           <w:ilvl w:val="1"/>
           <w:numId w:val="3"/>
@@ -1160,7 +1160,7 @@
     </w:p>
     <w:p>
       <w:pPr>
-        <w:pStyle w:val="Lijstalinea"/>
+        <w:pStyle w:val="ListParagraph"/>
         <w:numPr>
           <w:ilvl w:val="0"/>
           <w:numId w:val="3"/>
@@ -1173,7 +1173,7 @@
     <w:p/>
     <w:p>
       <w:pPr>
-        <w:pStyle w:val="Lijstalinea"/>
+        <w:pStyle w:val="ListParagraph"/>
         <w:numPr>
           <w:ilvl w:val="0"/>
           <w:numId w:val="3"/>
@@ -1192,7 +1192,7 @@
     <w:p/>
     <w:p>
       <w:pPr>
-        <w:pStyle w:val="Lijstalinea"/>
+        <w:pStyle w:val="ListParagraph"/>
         <w:numPr>
           <w:ilvl w:val="0"/>
           <w:numId w:val="3"/>
@@ -1211,7 +1211,7 @@
     <w:p/>
     <w:p>
       <w:pPr>
-        <w:pStyle w:val="Lijstalinea"/>
+        <w:pStyle w:val="ListParagraph"/>
         <w:numPr>
           <w:ilvl w:val="0"/>
           <w:numId w:val="3"/>
@@ -1229,7 +1229,7 @@
     </w:p>
     <w:p>
       <w:pPr>
-        <w:pStyle w:val="Lijstalinea"/>
+        <w:pStyle w:val="ListParagraph"/>
         <w:numPr>
           <w:ilvl w:val="1"/>
           <w:numId w:val="3"/>
@@ -1241,7 +1241,7 @@
     </w:p>
     <w:p>
       <w:pPr>
-        <w:pStyle w:val="Lijstalinea"/>
+        <w:pStyle w:val="ListParagraph"/>
         <w:numPr>
           <w:ilvl w:val="1"/>
           <w:numId w:val="3"/>
@@ -1253,7 +1253,7 @@
     </w:p>
     <w:p>
       <w:pPr>
-        <w:pStyle w:val="Lijstalinea"/>
+        <w:pStyle w:val="ListParagraph"/>
         <w:numPr>
           <w:ilvl w:val="1"/>
           <w:numId w:val="3"/>
@@ -1306,7 +1306,7 @@
     <w:p/>
     <w:p>
       <w:pPr>
-        <w:pStyle w:val="Lijstalinea"/>
+        <w:pStyle w:val="ListParagraph"/>
         <w:numPr>
           <w:ilvl w:val="0"/>
           <w:numId w:val="3"/>
@@ -1350,15 +1350,25 @@
       <w:r>
         <w:t>.</w:t>
       </w:r>
-    </w:p>
-    <w:p>
-      <w:pPr>
-        <w:pStyle w:val="Lijstalinea"/>
-      </w:pPr>
-    </w:p>
-    <w:p>
-      <w:pPr>
-        <w:pStyle w:val="Lijstalinea"/>
+      <w:r>
+        <w:t xml:space="preserve"> </w:t>
+      </w:r>
+      <w:r>
+        <w:rPr>
+          <w:b/>
+          <w:bCs/>
+        </w:rPr>
+        <w:t>See Johannes’ e-mail</w:t>
+      </w:r>
+    </w:p>
+    <w:p>
+      <w:pPr>
+        <w:pStyle w:val="ListParagraph"/>
+      </w:pPr>
+    </w:p>
+    <w:p>
+      <w:pPr>
+        <w:pStyle w:val="ListParagraph"/>
         <w:numPr>
           <w:ilvl w:val="0"/>
           <w:numId w:val="3"/>
@@ -1384,13 +1394,13 @@
     </w:p>
     <w:p>
       <w:pPr>
-        <w:pStyle w:val="Lijstalinea"/>
-      </w:pPr>
-    </w:p>
-    <w:p/>
-    <w:p>
-      <w:pPr>
-        <w:pStyle w:val="Lijstalinea"/>
+        <w:pStyle w:val="ListParagraph"/>
+      </w:pPr>
+    </w:p>
+    <w:p/>
+    <w:p>
+      <w:pPr>
+        <w:pStyle w:val="ListParagraph"/>
         <w:numPr>
           <w:ilvl w:val="0"/>
           <w:numId w:val="3"/>
@@ -1408,7 +1418,7 @@
     </w:p>
     <w:p>
       <w:pPr>
-        <w:pStyle w:val="Lijstalinea"/>
+        <w:pStyle w:val="ListParagraph"/>
         <w:numPr>
           <w:ilvl w:val="0"/>
           <w:numId w:val="3"/>
@@ -1432,7 +1442,7 @@
     </w:p>
     <w:p>
       <w:pPr>
-        <w:pStyle w:val="Lijstalinea"/>
+        <w:pStyle w:val="ListParagraph"/>
         <w:numPr>
           <w:ilvl w:val="0"/>
           <w:numId w:val="3"/>
@@ -1464,7 +1474,7 @@
     </w:p>
     <w:p>
       <w:pPr>
-        <w:pStyle w:val="Lijstalinea"/>
+        <w:pStyle w:val="ListParagraph"/>
         <w:numPr>
           <w:ilvl w:val="0"/>
           <w:numId w:val="1"/>
@@ -1476,7 +1486,7 @@
     </w:p>
     <w:p>
       <w:pPr>
-        <w:pStyle w:val="Lijstalinea"/>
+        <w:pStyle w:val="ListParagraph"/>
         <w:numPr>
           <w:ilvl w:val="0"/>
           <w:numId w:val="1"/>
@@ -1488,7 +1498,7 @@
     </w:p>
     <w:p>
       <w:pPr>
-        <w:pStyle w:val="Lijstalinea"/>
+        <w:pStyle w:val="ListParagraph"/>
         <w:numPr>
           <w:ilvl w:val="0"/>
           <w:numId w:val="1"/>
@@ -1508,7 +1518,7 @@
     </w:p>
     <w:p>
       <w:pPr>
-        <w:pStyle w:val="Lijstalinea"/>
+        <w:pStyle w:val="ListParagraph"/>
         <w:numPr>
           <w:ilvl w:val="0"/>
           <w:numId w:val="4"/>
@@ -1520,7 +1530,7 @@
     </w:p>
     <w:p>
       <w:pPr>
-        <w:pStyle w:val="Lijstalinea"/>
+        <w:pStyle w:val="ListParagraph"/>
         <w:numPr>
           <w:ilvl w:val="0"/>
           <w:numId w:val="4"/>
@@ -1532,7 +1542,7 @@
     </w:p>
     <w:p>
       <w:pPr>
-        <w:pStyle w:val="Lijstalinea"/>
+        <w:pStyle w:val="ListParagraph"/>
         <w:numPr>
           <w:ilvl w:val="0"/>
           <w:numId w:val="4"/>
@@ -1544,7 +1554,7 @@
     </w:p>
     <w:p>
       <w:pPr>
-        <w:pStyle w:val="Lijstalinea"/>
+        <w:pStyle w:val="ListParagraph"/>
         <w:numPr>
           <w:ilvl w:val="0"/>
           <w:numId w:val="4"/>
@@ -1557,7 +1567,7 @@
     <w:p/>
     <w:p>
       <w:pPr>
-        <w:pStyle w:val="Lijstalinea"/>
+        <w:pStyle w:val="ListParagraph"/>
         <w:numPr>
           <w:ilvl w:val="0"/>
           <w:numId w:val="5"/>
@@ -1603,7 +1613,7 @@
     </w:p>
     <w:p>
       <w:pPr>
-        <w:pStyle w:val="Lijstalinea"/>
+        <w:pStyle w:val="ListParagraph"/>
         <w:numPr>
           <w:ilvl w:val="0"/>
           <w:numId w:val="5"/>
@@ -1618,6 +1628,7 @@
           <w:bCs/>
           <w:lang w:val="en-US"/>
         </w:rPr>
+        <w:lastRenderedPageBreak/>
         <w:t>Notebook 2 (Migration):</w:t>
       </w:r>
       <w:r>
@@ -1643,7 +1654,7 @@
     </w:p>
     <w:p>
       <w:pPr>
-        <w:pStyle w:val="Lijstalinea"/>
+        <w:pStyle w:val="ListParagraph"/>
         <w:numPr>
           <w:ilvl w:val="0"/>
           <w:numId w:val="5"/>
@@ -1658,7 +1669,6 @@
           <w:bCs/>
           <w:lang w:val="en-US"/>
         </w:rPr>
-        <w:lastRenderedPageBreak/>
         <w:t>Notebook 3 (Processing &amp; Filtering):</w:t>
       </w:r>
       <w:r>
@@ -1684,7 +1694,7 @@
     </w:p>
     <w:p>
       <w:pPr>
-        <w:pStyle w:val="Lijstalinea"/>
+        <w:pStyle w:val="ListParagraph"/>
         <w:numPr>
           <w:ilvl w:val="0"/>
           <w:numId w:val="5"/>
@@ -2662,15 +2672,15 @@
     <w:lsdException w:name="Unresolved Mention" w:semiHidden="1" w:unhideWhenUsed="1"/>
     <w:lsdException w:name="Smart Link" w:semiHidden="1" w:unhideWhenUsed="1"/>
   </w:latentStyles>
-  <w:style w:type="paragraph" w:default="1" w:styleId="Standaard">
+  <w:style w:type="paragraph" w:default="1" w:styleId="Normal">
     <w:name w:val="Normal"/>
     <w:qFormat/>
   </w:style>
-  <w:style w:type="paragraph" w:styleId="Kop1">
+  <w:style w:type="paragraph" w:styleId="Heading1">
     <w:name w:val="heading 1"/>
-    <w:basedOn w:val="Standaard"/>
-    <w:next w:val="Standaard"/>
-    <w:link w:val="Kop1Char"/>
+    <w:basedOn w:val="Normal"/>
+    <w:next w:val="Normal"/>
+    <w:link w:val="Heading1Char"/>
     <w:uiPriority w:val="9"/>
     <w:qFormat/>
     <w:rsid w:val="005B10CC"/>
@@ -2687,11 +2697,11 @@
       <w:szCs w:val="40"/>
     </w:rPr>
   </w:style>
-  <w:style w:type="paragraph" w:styleId="Kop2">
+  <w:style w:type="paragraph" w:styleId="Heading2">
     <w:name w:val="heading 2"/>
-    <w:basedOn w:val="Standaard"/>
-    <w:next w:val="Standaard"/>
-    <w:link w:val="Kop2Char"/>
+    <w:basedOn w:val="Normal"/>
+    <w:next w:val="Normal"/>
+    <w:link w:val="Heading2Char"/>
     <w:uiPriority w:val="9"/>
     <w:semiHidden/>
     <w:unhideWhenUsed/>
@@ -2710,11 +2720,11 @@
       <w:szCs w:val="32"/>
     </w:rPr>
   </w:style>
-  <w:style w:type="paragraph" w:styleId="Kop3">
+  <w:style w:type="paragraph" w:styleId="Heading3">
     <w:name w:val="heading 3"/>
-    <w:basedOn w:val="Standaard"/>
-    <w:next w:val="Standaard"/>
-    <w:link w:val="Kop3Char"/>
+    <w:basedOn w:val="Normal"/>
+    <w:next w:val="Normal"/>
+    <w:link w:val="Heading3Char"/>
     <w:uiPriority w:val="9"/>
     <w:semiHidden/>
     <w:unhideWhenUsed/>
@@ -2733,11 +2743,11 @@
       <w:szCs w:val="28"/>
     </w:rPr>
   </w:style>
-  <w:style w:type="paragraph" w:styleId="Kop4">
+  <w:style w:type="paragraph" w:styleId="Heading4">
     <w:name w:val="heading 4"/>
-    <w:basedOn w:val="Standaard"/>
-    <w:next w:val="Standaard"/>
-    <w:link w:val="Kop4Char"/>
+    <w:basedOn w:val="Normal"/>
+    <w:next w:val="Normal"/>
+    <w:link w:val="Heading4Char"/>
     <w:uiPriority w:val="9"/>
     <w:semiHidden/>
     <w:unhideWhenUsed/>
@@ -2756,11 +2766,11 @@
       <w:color w:val="0F4761" w:themeColor="accent1" w:themeShade="BF"/>
     </w:rPr>
   </w:style>
-  <w:style w:type="paragraph" w:styleId="Kop5">
+  <w:style w:type="paragraph" w:styleId="Heading5">
     <w:name w:val="heading 5"/>
-    <w:basedOn w:val="Standaard"/>
-    <w:next w:val="Standaard"/>
-    <w:link w:val="Kop5Char"/>
+    <w:basedOn w:val="Normal"/>
+    <w:next w:val="Normal"/>
+    <w:link w:val="Heading5Char"/>
     <w:uiPriority w:val="9"/>
     <w:semiHidden/>
     <w:unhideWhenUsed/>
@@ -2777,11 +2787,11 @@
       <w:color w:val="0F4761" w:themeColor="accent1" w:themeShade="BF"/>
     </w:rPr>
   </w:style>
-  <w:style w:type="paragraph" w:styleId="Kop6">
+  <w:style w:type="paragraph" w:styleId="Heading6">
     <w:name w:val="heading 6"/>
-    <w:basedOn w:val="Standaard"/>
-    <w:next w:val="Standaard"/>
-    <w:link w:val="Kop6Char"/>
+    <w:basedOn w:val="Normal"/>
+    <w:next w:val="Normal"/>
+    <w:link w:val="Heading6Char"/>
     <w:uiPriority w:val="9"/>
     <w:semiHidden/>
     <w:unhideWhenUsed/>
@@ -2800,11 +2810,11 @@
       <w:color w:val="595959" w:themeColor="text1" w:themeTint="A6"/>
     </w:rPr>
   </w:style>
-  <w:style w:type="paragraph" w:styleId="Kop7">
+  <w:style w:type="paragraph" w:styleId="Heading7">
     <w:name w:val="heading 7"/>
-    <w:basedOn w:val="Standaard"/>
-    <w:next w:val="Standaard"/>
-    <w:link w:val="Kop7Char"/>
+    <w:basedOn w:val="Normal"/>
+    <w:next w:val="Normal"/>
+    <w:link w:val="Heading7Char"/>
     <w:uiPriority w:val="9"/>
     <w:semiHidden/>
     <w:unhideWhenUsed/>
@@ -2821,11 +2831,11 @@
       <w:color w:val="595959" w:themeColor="text1" w:themeTint="A6"/>
     </w:rPr>
   </w:style>
-  <w:style w:type="paragraph" w:styleId="Kop8">
+  <w:style w:type="paragraph" w:styleId="Heading8">
     <w:name w:val="heading 8"/>
-    <w:basedOn w:val="Standaard"/>
-    <w:next w:val="Standaard"/>
-    <w:link w:val="Kop8Char"/>
+    <w:basedOn w:val="Normal"/>
+    <w:next w:val="Normal"/>
+    <w:link w:val="Heading8Char"/>
     <w:uiPriority w:val="9"/>
     <w:semiHidden/>
     <w:unhideWhenUsed/>
@@ -2844,11 +2854,11 @@
       <w:color w:val="272727" w:themeColor="text1" w:themeTint="D8"/>
     </w:rPr>
   </w:style>
-  <w:style w:type="paragraph" w:styleId="Kop9">
+  <w:style w:type="paragraph" w:styleId="Heading9">
     <w:name w:val="heading 9"/>
-    <w:basedOn w:val="Standaard"/>
-    <w:next w:val="Standaard"/>
-    <w:link w:val="Kop9Char"/>
+    <w:basedOn w:val="Normal"/>
+    <w:next w:val="Normal"/>
+    <w:link w:val="Heading9Char"/>
     <w:uiPriority w:val="9"/>
     <w:semiHidden/>
     <w:unhideWhenUsed/>
@@ -2865,12 +2875,13 @@
       <w:color w:val="272727" w:themeColor="text1" w:themeTint="D8"/>
     </w:rPr>
   </w:style>
-  <w:style w:type="character" w:default="1" w:styleId="Standaardalinea-lettertype">
+  <w:style w:type="character" w:default="1" w:styleId="DefaultParagraphFont">
     <w:name w:val="Default Paragraph Font"/>
     <w:uiPriority w:val="1"/>
+    <w:semiHidden/>
     <w:unhideWhenUsed/>
   </w:style>
-  <w:style w:type="table" w:default="1" w:styleId="Standaardtabel">
+  <w:style w:type="table" w:default="1" w:styleId="TableNormal">
     <w:name w:val="Normal Table"/>
     <w:uiPriority w:val="99"/>
     <w:semiHidden/>
@@ -2885,16 +2896,16 @@
       </w:tblCellMar>
     </w:tblPr>
   </w:style>
-  <w:style w:type="numbering" w:default="1" w:styleId="Geenlijst">
+  <w:style w:type="numbering" w:default="1" w:styleId="NoList">
     <w:name w:val="No List"/>
     <w:uiPriority w:val="99"/>
     <w:semiHidden/>
     <w:unhideWhenUsed/>
   </w:style>
-  <w:style w:type="character" w:customStyle="1" w:styleId="Kop1Char">
-    <w:name w:val="Kop 1 Char"/>
-    <w:basedOn w:val="Standaardalinea-lettertype"/>
-    <w:link w:val="Kop1"/>
+  <w:style w:type="character" w:customStyle="1" w:styleId="Heading1Char">
+    <w:name w:val="Heading 1 Char"/>
+    <w:basedOn w:val="DefaultParagraphFont"/>
+    <w:link w:val="Heading1"/>
     <w:uiPriority w:val="9"/>
     <w:rsid w:val="005B10CC"/>
     <w:rPr>
@@ -2904,10 +2915,10 @@
       <w:szCs w:val="40"/>
     </w:rPr>
   </w:style>
-  <w:style w:type="character" w:customStyle="1" w:styleId="Kop2Char">
-    <w:name w:val="Kop 2 Char"/>
-    <w:basedOn w:val="Standaardalinea-lettertype"/>
-    <w:link w:val="Kop2"/>
+  <w:style w:type="character" w:customStyle="1" w:styleId="Heading2Char">
+    <w:name w:val="Heading 2 Char"/>
+    <w:basedOn w:val="DefaultParagraphFont"/>
+    <w:link w:val="Heading2"/>
     <w:uiPriority w:val="9"/>
     <w:semiHidden/>
     <w:rsid w:val="005B10CC"/>
@@ -2918,10 +2929,10 @@
       <w:szCs w:val="32"/>
     </w:rPr>
   </w:style>
-  <w:style w:type="character" w:customStyle="1" w:styleId="Kop3Char">
-    <w:name w:val="Kop 3 Char"/>
-    <w:basedOn w:val="Standaardalinea-lettertype"/>
-    <w:link w:val="Kop3"/>
+  <w:style w:type="character" w:customStyle="1" w:styleId="Heading3Char">
+    <w:name w:val="Heading 3 Char"/>
+    <w:basedOn w:val="DefaultParagraphFont"/>
+    <w:link w:val="Heading3"/>
     <w:uiPriority w:val="9"/>
     <w:semiHidden/>
     <w:rsid w:val="005B10CC"/>
@@ -2932,10 +2943,10 @@
       <w:szCs w:val="28"/>
     </w:rPr>
   </w:style>
-  <w:style w:type="character" w:customStyle="1" w:styleId="Kop4Char">
-    <w:name w:val="Kop 4 Char"/>
-    <w:basedOn w:val="Standaardalinea-lettertype"/>
-    <w:link w:val="Kop4"/>
+  <w:style w:type="character" w:customStyle="1" w:styleId="Heading4Char">
+    <w:name w:val="Heading 4 Char"/>
+    <w:basedOn w:val="DefaultParagraphFont"/>
+    <w:link w:val="Heading4"/>
     <w:uiPriority w:val="9"/>
     <w:semiHidden/>
     <w:rsid w:val="005B10CC"/>
@@ -2946,10 +2957,10 @@
       <w:color w:val="0F4761" w:themeColor="accent1" w:themeShade="BF"/>
     </w:rPr>
   </w:style>
-  <w:style w:type="character" w:customStyle="1" w:styleId="Kop5Char">
-    <w:name w:val="Kop 5 Char"/>
-    <w:basedOn w:val="Standaardalinea-lettertype"/>
-    <w:link w:val="Kop5"/>
+  <w:style w:type="character" w:customStyle="1" w:styleId="Heading5Char">
+    <w:name w:val="Heading 5 Char"/>
+    <w:basedOn w:val="DefaultParagraphFont"/>
+    <w:link w:val="Heading5"/>
     <w:uiPriority w:val="9"/>
     <w:semiHidden/>
     <w:rsid w:val="005B10CC"/>
@@ -2958,10 +2969,10 @@
       <w:color w:val="0F4761" w:themeColor="accent1" w:themeShade="BF"/>
     </w:rPr>
   </w:style>
-  <w:style w:type="character" w:customStyle="1" w:styleId="Kop6Char">
-    <w:name w:val="Kop 6 Char"/>
-    <w:basedOn w:val="Standaardalinea-lettertype"/>
-    <w:link w:val="Kop6"/>
+  <w:style w:type="character" w:customStyle="1" w:styleId="Heading6Char">
+    <w:name w:val="Heading 6 Char"/>
+    <w:basedOn w:val="DefaultParagraphFont"/>
+    <w:link w:val="Heading6"/>
     <w:uiPriority w:val="9"/>
     <w:semiHidden/>
     <w:rsid w:val="005B10CC"/>
@@ -2972,10 +2983,10 @@
       <w:color w:val="595959" w:themeColor="text1" w:themeTint="A6"/>
     </w:rPr>
   </w:style>
-  <w:style w:type="character" w:customStyle="1" w:styleId="Kop7Char">
-    <w:name w:val="Kop 7 Char"/>
-    <w:basedOn w:val="Standaardalinea-lettertype"/>
-    <w:link w:val="Kop7"/>
+  <w:style w:type="character" w:customStyle="1" w:styleId="Heading7Char">
+    <w:name w:val="Heading 7 Char"/>
+    <w:basedOn w:val="DefaultParagraphFont"/>
+    <w:link w:val="Heading7"/>
     <w:uiPriority w:val="9"/>
     <w:semiHidden/>
     <w:rsid w:val="005B10CC"/>
@@ -2984,10 +2995,10 @@
       <w:color w:val="595959" w:themeColor="text1" w:themeTint="A6"/>
     </w:rPr>
   </w:style>
-  <w:style w:type="character" w:customStyle="1" w:styleId="Kop8Char">
-    <w:name w:val="Kop 8 Char"/>
-    <w:basedOn w:val="Standaardalinea-lettertype"/>
-    <w:link w:val="Kop8"/>
+  <w:style w:type="character" w:customStyle="1" w:styleId="Heading8Char">
+    <w:name w:val="Heading 8 Char"/>
+    <w:basedOn w:val="DefaultParagraphFont"/>
+    <w:link w:val="Heading8"/>
     <w:uiPriority w:val="9"/>
     <w:semiHidden/>
     <w:rsid w:val="005B10CC"/>
@@ -2998,10 +3009,10 @@
       <w:color w:val="272727" w:themeColor="text1" w:themeTint="D8"/>
     </w:rPr>
   </w:style>
-  <w:style w:type="character" w:customStyle="1" w:styleId="Kop9Char">
-    <w:name w:val="Kop 9 Char"/>
-    <w:basedOn w:val="Standaardalinea-lettertype"/>
-    <w:link w:val="Kop9"/>
+  <w:style w:type="character" w:customStyle="1" w:styleId="Heading9Char">
+    <w:name w:val="Heading 9 Char"/>
+    <w:basedOn w:val="DefaultParagraphFont"/>
+    <w:link w:val="Heading9"/>
     <w:uiPriority w:val="9"/>
     <w:semiHidden/>
     <w:rsid w:val="005B10CC"/>
@@ -3010,11 +3021,11 @@
       <w:color w:val="272727" w:themeColor="text1" w:themeTint="D8"/>
     </w:rPr>
   </w:style>
-  <w:style w:type="paragraph" w:styleId="Titel">
+  <w:style w:type="paragraph" w:styleId="Title">
     <w:name w:val="Title"/>
-    <w:basedOn w:val="Standaard"/>
-    <w:next w:val="Standaard"/>
-    <w:link w:val="TitelChar"/>
+    <w:basedOn w:val="Normal"/>
+    <w:next w:val="Normal"/>
+    <w:link w:val="TitleChar"/>
     <w:uiPriority w:val="10"/>
     <w:qFormat/>
     <w:rsid w:val="005B10CC"/>
@@ -3030,10 +3041,10 @@
       <w:szCs w:val="56"/>
     </w:rPr>
   </w:style>
-  <w:style w:type="character" w:customStyle="1" w:styleId="TitelChar">
-    <w:name w:val="Titel Char"/>
-    <w:basedOn w:val="Standaardalinea-lettertype"/>
-    <w:link w:val="Titel"/>
+  <w:style w:type="character" w:customStyle="1" w:styleId="TitleChar">
+    <w:name w:val="Title Char"/>
+    <w:basedOn w:val="DefaultParagraphFont"/>
+    <w:link w:val="Title"/>
     <w:uiPriority w:val="10"/>
     <w:rsid w:val="005B10CC"/>
     <w:rPr>
@@ -3044,11 +3055,11 @@
       <w:szCs w:val="56"/>
     </w:rPr>
   </w:style>
-  <w:style w:type="paragraph" w:styleId="Ondertitel">
+  <w:style w:type="paragraph" w:styleId="Subtitle">
     <w:name w:val="Subtitle"/>
-    <w:basedOn w:val="Standaard"/>
-    <w:next w:val="Standaard"/>
-    <w:link w:val="OndertitelChar"/>
+    <w:basedOn w:val="Normal"/>
+    <w:next w:val="Normal"/>
+    <w:link w:val="SubtitleChar"/>
     <w:uiPriority w:val="11"/>
     <w:qFormat/>
     <w:rsid w:val="005B10CC"/>
@@ -3065,10 +3076,10 @@
       <w:szCs w:val="28"/>
     </w:rPr>
   </w:style>
-  <w:style w:type="character" w:customStyle="1" w:styleId="OndertitelChar">
-    <w:name w:val="Ondertitel Char"/>
-    <w:basedOn w:val="Standaardalinea-lettertype"/>
-    <w:link w:val="Ondertitel"/>
+  <w:style w:type="character" w:customStyle="1" w:styleId="SubtitleChar">
+    <w:name w:val="Subtitle Char"/>
+    <w:basedOn w:val="DefaultParagraphFont"/>
+    <w:link w:val="Subtitle"/>
     <w:uiPriority w:val="11"/>
     <w:rsid w:val="005B10CC"/>
     <w:rPr>
@@ -3079,11 +3090,11 @@
       <w:szCs w:val="28"/>
     </w:rPr>
   </w:style>
-  <w:style w:type="paragraph" w:styleId="Citaat">
+  <w:style w:type="paragraph" w:styleId="Quote">
     <w:name w:val="Quote"/>
-    <w:basedOn w:val="Standaard"/>
-    <w:next w:val="Standaard"/>
-    <w:link w:val="CitaatChar"/>
+    <w:basedOn w:val="Normal"/>
+    <w:next w:val="Normal"/>
+    <w:link w:val="QuoteChar"/>
     <w:uiPriority w:val="29"/>
     <w:qFormat/>
     <w:rsid w:val="005B10CC"/>
@@ -3097,10 +3108,10 @@
       <w:color w:val="404040" w:themeColor="text1" w:themeTint="BF"/>
     </w:rPr>
   </w:style>
-  <w:style w:type="character" w:customStyle="1" w:styleId="CitaatChar">
-    <w:name w:val="Citaat Char"/>
-    <w:basedOn w:val="Standaardalinea-lettertype"/>
-    <w:link w:val="Citaat"/>
+  <w:style w:type="character" w:customStyle="1" w:styleId="QuoteChar">
+    <w:name w:val="Quote Char"/>
+    <w:basedOn w:val="DefaultParagraphFont"/>
+    <w:link w:val="Quote"/>
     <w:uiPriority w:val="29"/>
     <w:rsid w:val="005B10CC"/>
     <w:rPr>
@@ -3109,9 +3120,9 @@
       <w:color w:val="404040" w:themeColor="text1" w:themeTint="BF"/>
     </w:rPr>
   </w:style>
-  <w:style w:type="paragraph" w:styleId="Lijstalinea">
+  <w:style w:type="paragraph" w:styleId="ListParagraph">
     <w:name w:val="List Paragraph"/>
-    <w:basedOn w:val="Standaard"/>
+    <w:basedOn w:val="Normal"/>
     <w:uiPriority w:val="34"/>
     <w:qFormat/>
     <w:rsid w:val="005B10CC"/>
@@ -3120,9 +3131,9 @@
       <w:contextualSpacing/>
     </w:pPr>
   </w:style>
-  <w:style w:type="character" w:styleId="Intensievebenadrukking">
+  <w:style w:type="character" w:styleId="IntenseEmphasis">
     <w:name w:val="Intense Emphasis"/>
-    <w:basedOn w:val="Standaardalinea-lettertype"/>
+    <w:basedOn w:val="DefaultParagraphFont"/>
     <w:uiPriority w:val="21"/>
     <w:qFormat/>
     <w:rsid w:val="005B10CC"/>
@@ -3132,11 +3143,11 @@
       <w:color w:val="0F4761" w:themeColor="accent1" w:themeShade="BF"/>
     </w:rPr>
   </w:style>
-  <w:style w:type="paragraph" w:styleId="Duidelijkcitaat">
+  <w:style w:type="paragraph" w:styleId="IntenseQuote">
     <w:name w:val="Intense Quote"/>
-    <w:basedOn w:val="Standaard"/>
-    <w:next w:val="Standaard"/>
-    <w:link w:val="DuidelijkcitaatChar"/>
+    <w:basedOn w:val="Normal"/>
+    <w:next w:val="Normal"/>
+    <w:link w:val="IntenseQuoteChar"/>
     <w:uiPriority w:val="30"/>
     <w:qFormat/>
     <w:rsid w:val="005B10CC"/>
@@ -3155,10 +3166,10 @@
       <w:color w:val="0F4761" w:themeColor="accent1" w:themeShade="BF"/>
     </w:rPr>
   </w:style>
-  <w:style w:type="character" w:customStyle="1" w:styleId="DuidelijkcitaatChar">
-    <w:name w:val="Duidelijk citaat Char"/>
-    <w:basedOn w:val="Standaardalinea-lettertype"/>
-    <w:link w:val="Duidelijkcitaat"/>
+  <w:style w:type="character" w:customStyle="1" w:styleId="IntenseQuoteChar">
+    <w:name w:val="Intense Quote Char"/>
+    <w:basedOn w:val="DefaultParagraphFont"/>
+    <w:link w:val="IntenseQuote"/>
     <w:uiPriority w:val="30"/>
     <w:rsid w:val="005B10CC"/>
     <w:rPr>
@@ -3167,9 +3178,9 @@
       <w:color w:val="0F4761" w:themeColor="accent1" w:themeShade="BF"/>
     </w:rPr>
   </w:style>
-  <w:style w:type="character" w:styleId="Intensieveverwijzing">
+  <w:style w:type="character" w:styleId="IntenseReference">
     <w:name w:val="Intense Reference"/>
-    <w:basedOn w:val="Standaardalinea-lettertype"/>
+    <w:basedOn w:val="DefaultParagraphFont"/>
     <w:uiPriority w:val="32"/>
     <w:qFormat/>
     <w:rsid w:val="005B10CC"/>
@@ -3181,9 +3192,9 @@
       <w:spacing w:val="5"/>
     </w:rPr>
   </w:style>
-  <w:style w:type="table" w:styleId="Tabelraster">
+  <w:style w:type="table" w:styleId="TableGrid">
     <w:name w:val="Table Grid"/>
-    <w:basedOn w:val="Standaardtabel"/>
+    <w:basedOn w:val="TableNormal"/>
     <w:uiPriority w:val="39"/>
     <w:rsid w:val="0024613D"/>
     <w:pPr>

</xml_diff>

<commit_message>
Added to notebooks: create migration and PSF galleries
</commit_message>
<xml_diff>
--- a/TimeLapse_LaTeX/Thesis/working summary.docx
+++ b/TimeLapse_LaTeX/Thesis/working summary.docx
@@ -1,6 +1,6 @@
 
 <file path=word/document.xml><?xml version="1.0" encoding="utf-8"?>
-<w:document xmlns:wpc="http://schemas.microsoft.com/office/word/2010/wordprocessingCanvas" xmlns:cx="http://schemas.microsoft.com/office/drawing/2014/chartex" xmlns:cx1="http://schemas.microsoft.com/office/drawing/2015/9/8/chartex" xmlns:cx2="http://schemas.microsoft.com/office/drawing/2015/10/21/chartex" xmlns:cx3="http://schemas.microsoft.com/office/drawing/2016/5/9/chartex" xmlns:cx4="http://schemas.microsoft.com/office/drawing/2016/5/10/chartex" xmlns:cx5="http://schemas.microsoft.com/office/drawing/2016/5/11/chartex" xmlns:cx6="http://schemas.microsoft.com/office/drawing/2016/5/12/chartex" xmlns:cx7="http://schemas.microsoft.com/office/drawing/2016/5/13/chartex" xmlns:cx8="http://schemas.microsoft.com/office/drawing/2016/5/14/chartex" xmlns:mc="http://schemas.openxmlformats.org/markup-compatibility/2006" xmlns:aink="http://schemas.microsoft.com/office/drawing/2016/ink" xmlns:am3d="http://schemas.microsoft.com/office/drawing/2017/model3d" xmlns:o="urn:schemas-microsoft-com:office:office" xmlns:oel="http://schemas.microsoft.com/office/2019/extlst" xmlns:r="http://schemas.openxmlformats.org/officeDocument/2006/relationships" xmlns:m="http://schemas.openxmlformats.org/officeDocument/2006/math" xmlns:v="urn:schemas-microsoft-com:vml" xmlns:wp14="http://schemas.microsoft.com/office/word/2010/wordprocessingDrawing" xmlns:wp="http://schemas.openxmlformats.org/drawingml/2006/wordprocessingDrawing" xmlns:w10="urn:schemas-microsoft-com:office:word" xmlns:w="http://schemas.openxmlformats.org/wordprocessingml/2006/main" xmlns:w14="http://schemas.microsoft.com/office/word/2010/wordml" xmlns:w15="http://schemas.microsoft.com/office/word/2012/wordml" xmlns:w16cex="http://schemas.microsoft.com/office/word/2018/wordml/cex" xmlns:w16cid="http://schemas.microsoft.com/office/word/2016/wordml/cid" xmlns:w16="http://schemas.microsoft.com/office/word/2018/wordml" xmlns:w16du="http://schemas.microsoft.com/office/word/2023/wordml/word16du" xmlns:w16sdtdh="http://schemas.microsoft.com/office/word/2020/wordml/sdtdatahash" xmlns:w16sdtfl="http://schemas.microsoft.com/office/word/2024/wordml/sdtformatlock" xmlns:w16se="http://schemas.microsoft.com/office/word/2015/wordml/symex" xmlns:wpg="http://schemas.microsoft.com/office/word/2010/wordprocessingGroup" xmlns:wpi="http://schemas.microsoft.com/office/word/2010/wordprocessingInk" xmlns:wne="http://schemas.microsoft.com/office/word/2006/wordml" xmlns:wps="http://schemas.microsoft.com/office/word/2010/wordprocessingShape" mc:Ignorable="w14 w15 w16se w16cid w16 w16cex w16sdtdh w16sdtfl w16du wp14">
+<w:document xmlns:wpc="http://schemas.microsoft.com/office/word/2010/wordprocessingCanvas" xmlns:cx="http://schemas.microsoft.com/office/drawing/2014/chartex" xmlns:cx1="http://schemas.microsoft.com/office/drawing/2015/9/8/chartex" xmlns:cx2="http://schemas.microsoft.com/office/drawing/2015/10/21/chartex" xmlns:cx3="http://schemas.microsoft.com/office/drawing/2016/5/9/chartex" xmlns:cx4="http://schemas.microsoft.com/office/drawing/2016/5/10/chartex" xmlns:cx5="http://schemas.microsoft.com/office/drawing/2016/5/11/chartex" xmlns:cx6="http://schemas.microsoft.com/office/drawing/2016/5/12/chartex" xmlns:cx7="http://schemas.microsoft.com/office/drawing/2016/5/13/chartex" xmlns:cx8="http://schemas.microsoft.com/office/drawing/2016/5/14/chartex" xmlns:mc="http://schemas.openxmlformats.org/markup-compatibility/2006" xmlns:aink="http://schemas.microsoft.com/office/drawing/2016/ink" xmlns:am3d="http://schemas.microsoft.com/office/drawing/2017/model3d" xmlns:o="urn:schemas-microsoft-com:office:office" xmlns:oel="http://schemas.microsoft.com/office/2019/extlst" xmlns:r="http://schemas.openxmlformats.org/officeDocument/2006/relationships" xmlns:m="http://schemas.openxmlformats.org/officeDocument/2006/math" xmlns:v="urn:schemas-microsoft-com:vml" xmlns:wp14="http://schemas.microsoft.com/office/word/2010/wordprocessingDrawing" xmlns:wp="http://schemas.openxmlformats.org/drawingml/2006/wordprocessingDrawing" xmlns:w10="urn:schemas-microsoft-com:office:word" xmlns:w="http://schemas.openxmlformats.org/wordprocessingml/2006/main" xmlns:w14="http://schemas.microsoft.com/office/word/2010/wordml" xmlns:w15="http://schemas.microsoft.com/office/word/2012/wordml" xmlns:w16cei="http://schemas.microsoft.com/office/word/2026/wordml/cei" xmlns:w16cex="http://schemas.microsoft.com/office/word/2018/wordml/cex" xmlns:w16cid="http://schemas.microsoft.com/office/word/2016/wordml/cid" xmlns:w16="http://schemas.microsoft.com/office/word/2018/wordml" xmlns:w16du="http://schemas.microsoft.com/office/word/2023/wordml/word16du" xmlns:w16sdtdh="http://schemas.microsoft.com/office/word/2020/wordml/sdtdatahash" xmlns:w16sdtfl="http://schemas.microsoft.com/office/word/2024/wordml/sdtformatlock" xmlns:w16se="http://schemas.microsoft.com/office/word/2015/wordml/symex" xmlns:wpg="http://schemas.microsoft.com/office/word/2010/wordprocessingGroup" xmlns:wpi="http://schemas.microsoft.com/office/word/2010/wordprocessingInk" xmlns:wne="http://schemas.microsoft.com/office/word/2006/wordml" xmlns:wps="http://schemas.microsoft.com/office/word/2010/wordprocessingShape" mc:Ignorable="w14 w15 w16se w16cid w16 w16cex w16sdtdh w16sdtfl w16du wp14">
   <w:body>
     <w:p>
       <w:pPr>
@@ -285,7 +285,6 @@
     </w:p>
     <w:p>
       <w:r>
-        <w:lastRenderedPageBreak/>
         <w:t>A discussion of the results of all the experiments in relation to the general hypothesis that was justified in the General Introduction.</w:t>
       </w:r>
     </w:p>
@@ -669,7 +668,6 @@
     <w:p/>
     <w:p>
       <w:r>
-        <w:lastRenderedPageBreak/>
         <w:t>Change working summary</w:t>
       </w:r>
       <w:r>
@@ -961,7 +959,6 @@
           <w:b/>
           <w:bCs/>
         </w:rPr>
-        <w:lastRenderedPageBreak/>
         <w:t>To do for literature review:</w:t>
       </w:r>
     </w:p>
@@ -1201,11 +1198,7 @@
         <w:t xml:space="preserve"> by doing many phase plane fittings. Investigate if the movements peak at a certain location in the whole domain.</w:t>
       </w:r>
       <w:r>
-        <w:t xml:space="preserve"> Try coming up </w:t>
-      </w:r>
-      <w:r>
-        <w:lastRenderedPageBreak/>
-        <w:t xml:space="preserve">with a metric to define the fit </w:t>
+        <w:t xml:space="preserve"> Try coming up with a metric to define the fit </w:t>
       </w:r>
       <w:r>
         <w:t>of the phase plane and plot that on top of the whole domain.</w:t>
@@ -1426,47 +1419,92 @@
           <w:ilvl w:val="0"/>
           <w:numId w:val="3"/>
         </w:numPr>
-      </w:pPr>
-      <w:r>
+        <w:rPr>
+          <w:highlight w:val="yellow"/>
+        </w:rPr>
+      </w:pPr>
+      <w:r>
+        <w:rPr>
+          <w:highlight w:val="yellow"/>
+        </w:rPr>
         <w:t xml:space="preserve">Move </w:t>
       </w:r>
       <w:r>
+        <w:rPr>
+          <w:highlight w:val="yellow"/>
+        </w:rPr>
         <w:t>ext</w:t>
       </w:r>
       <w:r>
+        <w:rPr>
+          <w:highlight w:val="yellow"/>
+        </w:rPr>
         <w:t>ra image</w:t>
       </w:r>
       <w:r>
+        <w:rPr>
+          <w:highlight w:val="yellow"/>
+        </w:rPr>
         <w:t xml:space="preserve">s from </w:t>
       </w:r>
       <w:r>
+        <w:rPr>
+          <w:highlight w:val="yellow"/>
+        </w:rPr>
         <w:t>hyp</w:t>
       </w:r>
       <w:r>
+        <w:rPr>
+          <w:highlight w:val="yellow"/>
+        </w:rPr>
         <w:t>otheses</w:t>
       </w:r>
       <w:r>
+        <w:rPr>
+          <w:highlight w:val="yellow"/>
+        </w:rPr>
         <w:t xml:space="preserve"> 1 and 2 to </w:t>
       </w:r>
       <w:r>
+        <w:rPr>
+          <w:highlight w:val="yellow"/>
+        </w:rPr>
         <w:t xml:space="preserve">appendix </w:t>
       </w:r>
       <w:r>
+        <w:rPr>
+          <w:highlight w:val="yellow"/>
+        </w:rPr>
         <w:t xml:space="preserve">and only </w:t>
       </w:r>
       <w:r>
+        <w:rPr>
+          <w:highlight w:val="yellow"/>
+        </w:rPr>
         <w:t xml:space="preserve">keep </w:t>
       </w:r>
       <w:r>
+        <w:rPr>
+          <w:highlight w:val="yellow"/>
+        </w:rPr>
         <w:t>migration g</w:t>
       </w:r>
       <w:r>
+        <w:rPr>
+          <w:highlight w:val="yellow"/>
+        </w:rPr>
         <w:t xml:space="preserve">alleries </w:t>
       </w:r>
       <w:r>
+        <w:rPr>
+          <w:highlight w:val="yellow"/>
+        </w:rPr>
         <w:t>and PSF</w:t>
       </w:r>
       <w:r>
+        <w:rPr>
+          <w:highlight w:val="yellow"/>
+        </w:rPr>
         <w:t>’s</w:t>
       </w:r>
     </w:p>
@@ -1484,6 +1522,36 @@
       <w:r>
         <w:t>migration</w:t>
       </w:r>
+      <w:r>
+        <w:t xml:space="preserve"> gal</w:t>
+      </w:r>
+      <w:r>
+        <w:t>ler</w:t>
+      </w:r>
+      <w:r>
+        <w:t xml:space="preserve">ies </w:t>
+      </w:r>
+      <w:r>
+        <w:t xml:space="preserve">and </w:t>
+      </w:r>
+      <w:r>
+        <w:t>phase pla</w:t>
+      </w:r>
+      <w:r>
+        <w:t xml:space="preserve">ne fit </w:t>
+      </w:r>
+      <w:r>
+        <w:t xml:space="preserve">galleries </w:t>
+      </w:r>
+      <w:r>
+        <w:t>for fi</w:t>
+      </w:r>
+      <w:r>
+        <w:t>eld dat</w:t>
+      </w:r>
+      <w:r>
+        <w:t>a results</w:t>
+      </w:r>
     </w:p>
     <w:p/>
     <w:p>
@@ -1539,11 +1607,7 @@
         </w:numPr>
       </w:pPr>
       <w:r>
-        <w:t>EM theory, GPR</w:t>
-      </w:r>
-      <w:r>
-        <w:lastRenderedPageBreak/>
-        <w:t xml:space="preserve"> resolution, acquisition</w:t>
+        <w:t>EM theory, GPR resolution, acquisition</w:t>
       </w:r>
     </w:p>
     <w:p>
@@ -1781,7 +1845,7 @@
 </file>
 
 <file path=word/numbering.xml><?xml version="1.0" encoding="utf-8"?>
-<w:numbering xmlns:wpc="http://schemas.microsoft.com/office/word/2010/wordprocessingCanvas" xmlns:cx="http://schemas.microsoft.com/office/drawing/2014/chartex" xmlns:cx1="http://schemas.microsoft.com/office/drawing/2015/9/8/chartex" xmlns:cx2="http://schemas.microsoft.com/office/drawing/2015/10/21/chartex" xmlns:cx3="http://schemas.microsoft.com/office/drawing/2016/5/9/chartex" xmlns:cx4="http://schemas.microsoft.com/office/drawing/2016/5/10/chartex" xmlns:cx5="http://schemas.microsoft.com/office/drawing/2016/5/11/chartex" xmlns:cx6="http://schemas.microsoft.com/office/drawing/2016/5/12/chartex" xmlns:cx7="http://schemas.microsoft.com/office/drawing/2016/5/13/chartex" xmlns:cx8="http://schemas.microsoft.com/office/drawing/2016/5/14/chartex" xmlns:mc="http://schemas.openxmlformats.org/markup-compatibility/2006" xmlns:aink="http://schemas.microsoft.com/office/drawing/2016/ink" xmlns:am3d="http://schemas.microsoft.com/office/drawing/2017/model3d" xmlns:o="urn:schemas-microsoft-com:office:office" xmlns:oel="http://schemas.microsoft.com/office/2019/extlst" xmlns:r="http://schemas.openxmlformats.org/officeDocument/2006/relationships" xmlns:m="http://schemas.openxmlformats.org/officeDocument/2006/math" xmlns:v="urn:schemas-microsoft-com:vml" xmlns:wp14="http://schemas.microsoft.com/office/word/2010/wordprocessingDrawing" xmlns:wp="http://schemas.openxmlformats.org/drawingml/2006/wordprocessingDrawing" xmlns:w10="urn:schemas-microsoft-com:office:word" xmlns:w="http://schemas.openxmlformats.org/wordprocessingml/2006/main" xmlns:w14="http://schemas.microsoft.com/office/word/2010/wordml" xmlns:w15="http://schemas.microsoft.com/office/word/2012/wordml" xmlns:w16cex="http://schemas.microsoft.com/office/word/2018/wordml/cex" xmlns:w16cid="http://schemas.microsoft.com/office/word/2016/wordml/cid" xmlns:w16="http://schemas.microsoft.com/office/word/2018/wordml" xmlns:w16du="http://schemas.microsoft.com/office/word/2023/wordml/word16du" xmlns:w16sdtdh="http://schemas.microsoft.com/office/word/2020/wordml/sdtdatahash" xmlns:w16sdtfl="http://schemas.microsoft.com/office/word/2024/wordml/sdtformatlock" xmlns:w16se="http://schemas.microsoft.com/office/word/2015/wordml/symex" xmlns:wpg="http://schemas.microsoft.com/office/word/2010/wordprocessingGroup" xmlns:wpi="http://schemas.microsoft.com/office/word/2010/wordprocessingInk" xmlns:wne="http://schemas.microsoft.com/office/word/2006/wordml" xmlns:wps="http://schemas.microsoft.com/office/word/2010/wordprocessingShape" mc:Ignorable="w14 w15 w16se w16cid w16 w16cex w16sdtdh w16sdtfl w16du wp14">
+<w:numbering xmlns:wpc="http://schemas.microsoft.com/office/word/2010/wordprocessingCanvas" xmlns:cx="http://schemas.microsoft.com/office/drawing/2014/chartex" xmlns:cx1="http://schemas.microsoft.com/office/drawing/2015/9/8/chartex" xmlns:cx2="http://schemas.microsoft.com/office/drawing/2015/10/21/chartex" xmlns:cx3="http://schemas.microsoft.com/office/drawing/2016/5/9/chartex" xmlns:cx4="http://schemas.microsoft.com/office/drawing/2016/5/10/chartex" xmlns:cx5="http://schemas.microsoft.com/office/drawing/2016/5/11/chartex" xmlns:cx6="http://schemas.microsoft.com/office/drawing/2016/5/12/chartex" xmlns:cx7="http://schemas.microsoft.com/office/drawing/2016/5/13/chartex" xmlns:cx8="http://schemas.microsoft.com/office/drawing/2016/5/14/chartex" xmlns:mc="http://schemas.openxmlformats.org/markup-compatibility/2006" xmlns:aink="http://schemas.microsoft.com/office/drawing/2016/ink" xmlns:am3d="http://schemas.microsoft.com/office/drawing/2017/model3d" xmlns:o="urn:schemas-microsoft-com:office:office" xmlns:oel="http://schemas.microsoft.com/office/2019/extlst" xmlns:r="http://schemas.openxmlformats.org/officeDocument/2006/relationships" xmlns:m="http://schemas.openxmlformats.org/officeDocument/2006/math" xmlns:v="urn:schemas-microsoft-com:vml" xmlns:wp14="http://schemas.microsoft.com/office/word/2010/wordprocessingDrawing" xmlns:wp="http://schemas.openxmlformats.org/drawingml/2006/wordprocessingDrawing" xmlns:w10="urn:schemas-microsoft-com:office:word" xmlns:w="http://schemas.openxmlformats.org/wordprocessingml/2006/main" xmlns:w14="http://schemas.microsoft.com/office/word/2010/wordml" xmlns:w15="http://schemas.microsoft.com/office/word/2012/wordml" xmlns:w16cei="http://schemas.microsoft.com/office/word/2026/wordml/cei" xmlns:w16cex="http://schemas.microsoft.com/office/word/2018/wordml/cex" xmlns:w16cid="http://schemas.microsoft.com/office/word/2016/wordml/cid" xmlns:w16="http://schemas.microsoft.com/office/word/2018/wordml" xmlns:w16du="http://schemas.microsoft.com/office/word/2023/wordml/word16du" xmlns:w16sdtdh="http://schemas.microsoft.com/office/word/2020/wordml/sdtdatahash" xmlns:w16sdtfl="http://schemas.microsoft.com/office/word/2024/wordml/sdtformatlock" xmlns:w16se="http://schemas.microsoft.com/office/word/2015/wordml/symex" xmlns:wpg="http://schemas.microsoft.com/office/word/2010/wordprocessingGroup" xmlns:wpi="http://schemas.microsoft.com/office/word/2010/wordprocessingInk" xmlns:wne="http://schemas.microsoft.com/office/word/2006/wordml" xmlns:wps="http://schemas.microsoft.com/office/word/2010/wordprocessingShape" mc:Ignorable="w14 w15 w16se w16cid w16 w16cex w16sdtdh w16sdtfl w16du wp14">
   <w:abstractNum w:abstractNumId="0" w15:restartNumberingAfterBreak="0">
     <w:nsid w:val="039C1E25"/>
     <w:multiLevelType w:val="hybridMultilevel"/>

</xml_diff>

<commit_message>
Updated figures for hypothesis 3 and added to thesis
</commit_message>
<xml_diff>
--- a/TimeLapse_LaTeX/Thesis/working summary.docx
+++ b/TimeLapse_LaTeX/Thesis/working summary.docx
@@ -1,6 +1,6 @@
 
 <file path=word/document.xml><?xml version="1.0" encoding="utf-8"?>
-<w:document xmlns:wpc="http://schemas.microsoft.com/office/word/2010/wordprocessingCanvas" xmlns:cx="http://schemas.microsoft.com/office/drawing/2014/chartex" xmlns:cx1="http://schemas.microsoft.com/office/drawing/2015/9/8/chartex" xmlns:cx2="http://schemas.microsoft.com/office/drawing/2015/10/21/chartex" xmlns:cx3="http://schemas.microsoft.com/office/drawing/2016/5/9/chartex" xmlns:cx4="http://schemas.microsoft.com/office/drawing/2016/5/10/chartex" xmlns:cx5="http://schemas.microsoft.com/office/drawing/2016/5/11/chartex" xmlns:cx6="http://schemas.microsoft.com/office/drawing/2016/5/12/chartex" xmlns:cx7="http://schemas.microsoft.com/office/drawing/2016/5/13/chartex" xmlns:cx8="http://schemas.microsoft.com/office/drawing/2016/5/14/chartex" xmlns:mc="http://schemas.openxmlformats.org/markup-compatibility/2006" xmlns:aink="http://schemas.microsoft.com/office/drawing/2016/ink" xmlns:am3d="http://schemas.microsoft.com/office/drawing/2017/model3d" xmlns:o="urn:schemas-microsoft-com:office:office" xmlns:oel="http://schemas.microsoft.com/office/2019/extlst" xmlns:r="http://schemas.openxmlformats.org/officeDocument/2006/relationships" xmlns:m="http://schemas.openxmlformats.org/officeDocument/2006/math" xmlns:v="urn:schemas-microsoft-com:vml" xmlns:wp14="http://schemas.microsoft.com/office/word/2010/wordprocessingDrawing" xmlns:wp="http://schemas.openxmlformats.org/drawingml/2006/wordprocessingDrawing" xmlns:w10="urn:schemas-microsoft-com:office:word" xmlns:w="http://schemas.openxmlformats.org/wordprocessingml/2006/main" xmlns:w14="http://schemas.microsoft.com/office/word/2010/wordml" xmlns:w15="http://schemas.microsoft.com/office/word/2012/wordml" xmlns:w16cei="http://schemas.microsoft.com/office/word/2026/wordml/cei" xmlns:w16cex="http://schemas.microsoft.com/office/word/2018/wordml/cex" xmlns:w16cid="http://schemas.microsoft.com/office/word/2016/wordml/cid" xmlns:w16="http://schemas.microsoft.com/office/word/2018/wordml" xmlns:w16du="http://schemas.microsoft.com/office/word/2023/wordml/word16du" xmlns:w16sdtdh="http://schemas.microsoft.com/office/word/2020/wordml/sdtdatahash" xmlns:w16sdtfl="http://schemas.microsoft.com/office/word/2024/wordml/sdtformatlock" xmlns:w16se="http://schemas.microsoft.com/office/word/2015/wordml/symex" xmlns:wpg="http://schemas.microsoft.com/office/word/2010/wordprocessingGroup" xmlns:wpi="http://schemas.microsoft.com/office/word/2010/wordprocessingInk" xmlns:wne="http://schemas.microsoft.com/office/word/2006/wordml" xmlns:wps="http://schemas.microsoft.com/office/word/2010/wordprocessingShape" mc:Ignorable="w14 w15 w16se w16cid w16 w16cex w16sdtdh w16sdtfl w16du wp14">
+<w:document xmlns:wpc="http://schemas.microsoft.com/office/word/2010/wordprocessingCanvas" xmlns:cx="http://schemas.microsoft.com/office/drawing/2014/chartex" xmlns:cx1="http://schemas.microsoft.com/office/drawing/2015/9/8/chartex" xmlns:cx2="http://schemas.microsoft.com/office/drawing/2015/10/21/chartex" xmlns:cx3="http://schemas.microsoft.com/office/drawing/2016/5/9/chartex" xmlns:cx4="http://schemas.microsoft.com/office/drawing/2016/5/10/chartex" xmlns:cx5="http://schemas.microsoft.com/office/drawing/2016/5/11/chartex" xmlns:cx6="http://schemas.microsoft.com/office/drawing/2016/5/12/chartex" xmlns:cx7="http://schemas.microsoft.com/office/drawing/2016/5/13/chartex" xmlns:cx8="http://schemas.microsoft.com/office/drawing/2016/5/14/chartex" xmlns:mc="http://schemas.openxmlformats.org/markup-compatibility/2006" xmlns:aink="http://schemas.microsoft.com/office/drawing/2016/ink" xmlns:am3d="http://schemas.microsoft.com/office/drawing/2017/model3d" xmlns:o="urn:schemas-microsoft-com:office:office" xmlns:oel="http://schemas.microsoft.com/office/2019/extlst" xmlns:r="http://schemas.openxmlformats.org/officeDocument/2006/relationships" xmlns:m="http://schemas.openxmlformats.org/officeDocument/2006/math" xmlns:v="urn:schemas-microsoft-com:vml" xmlns:wp14="http://schemas.microsoft.com/office/word/2010/wordprocessingDrawing" xmlns:wp="http://schemas.openxmlformats.org/drawingml/2006/wordprocessingDrawing" xmlns:w10="urn:schemas-microsoft-com:office:word" xmlns:w="http://schemas.openxmlformats.org/wordprocessingml/2006/main" xmlns:w14="http://schemas.microsoft.com/office/word/2010/wordml" xmlns:w15="http://schemas.microsoft.com/office/word/2012/wordml" xmlns:w16cex="http://schemas.microsoft.com/office/word/2018/wordml/cex" xmlns:w16cid="http://schemas.microsoft.com/office/word/2016/wordml/cid" xmlns:w16="http://schemas.microsoft.com/office/word/2018/wordml" xmlns:w16du="http://schemas.microsoft.com/office/word/2023/wordml/word16du" xmlns:w16sdtdh="http://schemas.microsoft.com/office/word/2020/wordml/sdtdatahash" xmlns:w16sdtfl="http://schemas.microsoft.com/office/word/2024/wordml/sdtformatlock" xmlns:w16se="http://schemas.microsoft.com/office/word/2015/wordml/symex" xmlns:wpg="http://schemas.microsoft.com/office/word/2010/wordprocessingGroup" xmlns:wpi="http://schemas.microsoft.com/office/word/2010/wordprocessingInk" xmlns:wne="http://schemas.microsoft.com/office/word/2006/wordml" xmlns:wps="http://schemas.microsoft.com/office/word/2010/wordprocessingShape" mc:Ignorable="w14 w15 w16se w16cid w16 w16cex w16sdtdh w16sdtfl w16du wp14">
   <w:body>
     <w:p>
       <w:pPr>
@@ -151,8 +151,13 @@
       <w:r>
         <w:tab/>
       </w:r>
-      <w:r>
-        <w:t>All of the materials and methods common to two or more experiments—specifically excluding the experimental procedure for each experiment.</w:t>
+      <w:proofErr w:type="gramStart"/>
+      <w:r>
+        <w:t>All of</w:t>
+      </w:r>
+      <w:proofErr w:type="gramEnd"/>
+      <w:r>
+        <w:t xml:space="preserve"> the materials and methods common to two or more experiments—specifically excluding the experimental procedure for each experiment.</w:t>
       </w:r>
     </w:p>
     <w:p>
@@ -176,8 +181,13 @@
         </w:numPr>
       </w:pPr>
       <w:r>
-        <w:t>Discuss gprMax</w:t>
-      </w:r>
+        <w:t xml:space="preserve">Discuss </w:t>
+      </w:r>
+      <w:proofErr w:type="spellStart"/>
+      <w:r>
+        <w:t>gprMax</w:t>
+      </w:r>
+      <w:proofErr w:type="spellEnd"/>
     </w:p>
     <w:p>
       <w:pPr>
@@ -285,6 +295,7 @@
     </w:p>
     <w:p>
       <w:r>
+        <w:lastRenderedPageBreak/>
         <w:t>A discussion of the results of all the experiments in relation to the general hypothesis that was justified in the General Introduction.</w:t>
       </w:r>
     </w:p>
@@ -463,7 +474,31 @@
         <w:shd w:val="clear" w:color="auto" w:fill="83CAEB" w:themeFill="accent1" w:themeFillTint="66"/>
       </w:pPr>
       <w:r>
-        <w:t>Run gpr simulations for 2 lambda to 1/32 lambda movement and see if we can infer this movement using amplitude and phase based techniques</w:t>
+        <w:t xml:space="preserve">Run </w:t>
+      </w:r>
+      <w:proofErr w:type="spellStart"/>
+      <w:r>
+        <w:t>gpr</w:t>
+      </w:r>
+      <w:proofErr w:type="spellEnd"/>
+      <w:r>
+        <w:t xml:space="preserve"> simulations for 2 </w:t>
+      </w:r>
+      <w:proofErr w:type="gramStart"/>
+      <w:r>
+        <w:t>lambda</w:t>
+      </w:r>
+      <w:proofErr w:type="gramEnd"/>
+      <w:r>
+        <w:t xml:space="preserve"> to 1/32 lambda movement and see if we can infer this movement using amplitude and </w:t>
+      </w:r>
+      <w:proofErr w:type="gramStart"/>
+      <w:r>
+        <w:t>phase based</w:t>
+      </w:r>
+      <w:proofErr w:type="gramEnd"/>
+      <w:r>
+        <w:t xml:space="preserve"> techniques</w:t>
       </w:r>
     </w:p>
     <w:p/>
@@ -484,7 +519,39 @@
         <w:shd w:val="clear" w:color="auto" w:fill="E8E8E8" w:themeFill="background2"/>
       </w:pPr>
       <w:r>
-        <w:t>Tracking del_phi/del_x and del_phi/del_y to infer horizontal and vertical translation</w:t>
+        <w:t xml:space="preserve">Tracking </w:t>
+      </w:r>
+      <w:proofErr w:type="spellStart"/>
+      <w:r>
+        <w:t>del_phi</w:t>
+      </w:r>
+      <w:proofErr w:type="spellEnd"/>
+      <w:r>
+        <w:t>/</w:t>
+      </w:r>
+      <w:proofErr w:type="spellStart"/>
+      <w:r>
+        <w:t>del_x</w:t>
+      </w:r>
+      <w:proofErr w:type="spellEnd"/>
+      <w:r>
+        <w:t xml:space="preserve"> and </w:t>
+      </w:r>
+      <w:proofErr w:type="spellStart"/>
+      <w:r>
+        <w:t>del_phi</w:t>
+      </w:r>
+      <w:proofErr w:type="spellEnd"/>
+      <w:r>
+        <w:t>/</w:t>
+      </w:r>
+      <w:proofErr w:type="spellStart"/>
+      <w:r>
+        <w:t>del_y</w:t>
+      </w:r>
+      <w:proofErr w:type="spellEnd"/>
+      <w:r>
+        <w:t xml:space="preserve"> to infer horizontal and vertical translation</w:t>
       </w:r>
     </w:p>
     <w:p>
@@ -557,7 +624,23 @@
         <w:shd w:val="clear" w:color="auto" w:fill="B3E5A1" w:themeFill="accent6" w:themeFillTint="66"/>
       </w:pPr>
       <w:r>
-        <w:t>Run gpr simulations for scatterers changing material properties and a moving fluid front and see if we can infer this movement using amplitude and phase based techniques and see if we can infer the material change</w:t>
+        <w:t xml:space="preserve">Run </w:t>
+      </w:r>
+      <w:proofErr w:type="spellStart"/>
+      <w:r>
+        <w:t>gpr</w:t>
+      </w:r>
+      <w:proofErr w:type="spellEnd"/>
+      <w:r>
+        <w:t xml:space="preserve"> simulations for scatterers changing material properties and a moving fluid front and see if we can infer this movement using amplitude and </w:t>
+      </w:r>
+      <w:proofErr w:type="gramStart"/>
+      <w:r>
+        <w:t>phase based</w:t>
+      </w:r>
+      <w:proofErr w:type="gramEnd"/>
+      <w:r>
+        <w:t xml:space="preserve"> techniques and see if we can infer the material change</w:t>
       </w:r>
     </w:p>
     <w:p/>
@@ -668,6 +751,7 @@
     <w:p/>
     <w:p>
       <w:r>
+        <w:lastRenderedPageBreak/>
         <w:t>Change working summary</w:t>
       </w:r>
       <w:r>
@@ -959,6 +1043,7 @@
           <w:b/>
           <w:bCs/>
         </w:rPr>
+        <w:lastRenderedPageBreak/>
         <w:t>To do for literature review:</w:t>
       </w:r>
     </w:p>
@@ -1031,11 +1116,21 @@
           <w:highlight w:val="yellow"/>
         </w:rPr>
       </w:pPr>
+      <w:proofErr w:type="spellStart"/>
+      <w:proofErr w:type="gramStart"/>
       <w:r>
         <w:rPr>
           <w:highlight w:val="yellow"/>
         </w:rPr>
-        <w:t>prof.rd is the reference</w:t>
+        <w:t>prof.rd</w:t>
+      </w:r>
+      <w:proofErr w:type="spellEnd"/>
+      <w:proofErr w:type="gramEnd"/>
+      <w:r>
+        <w:rPr>
+          <w:highlight w:val="yellow"/>
+        </w:rPr>
+        <w:t xml:space="preserve"> is the reference</w:t>
       </w:r>
     </w:p>
     <w:p>
@@ -1198,7 +1293,11 @@
         <w:t xml:space="preserve"> by doing many phase plane fittings. Investigate if the movements peak at a certain location in the whole domain.</w:t>
       </w:r>
       <w:r>
-        <w:t xml:space="preserve"> Try coming up with a metric to define the fit </w:t>
+        <w:t xml:space="preserve"> Try coming up </w:t>
+      </w:r>
+      <w:r>
+        <w:lastRenderedPageBreak/>
+        <w:t xml:space="preserve">with a metric to define the fit </w:t>
       </w:r>
       <w:r>
         <w:t>of the phase plane and plot that on top of the whole domain.</w:t>
@@ -1220,7 +1319,15 @@
         <w:t>Investigate in literature</w:t>
       </w:r>
       <w:r>
-        <w:t xml:space="preserve"> for back-propagation how pre-processing is done before playing it back in gprMax to </w:t>
+        <w:t xml:space="preserve"> for back-propagation how pre-processing is done before playing it back in </w:t>
+      </w:r>
+      <w:proofErr w:type="spellStart"/>
+      <w:r>
+        <w:t>gprMax</w:t>
+      </w:r>
+      <w:proofErr w:type="spellEnd"/>
+      <w:r>
+        <w:t xml:space="preserve"> to </w:t>
       </w:r>
       <w:r>
         <w:t xml:space="preserve">get rid of the noise. Or maybe mask a large Region of Influence around the event before migrating it. Make sure to get most of the energy and get rid of the early </w:t>
@@ -1271,7 +1378,15 @@
         <w:t>Remember that when taking measurements at two points in time, there can be overlap in</w:t>
       </w:r>
       <w:r>
-        <w:t xml:space="preserve"> the location of the fluid front, so when taking the difference, it will not highlight. Also when taking a B-scan it takes time</w:t>
+        <w:t xml:space="preserve"> the location of the fluid front, so when taking the difference, it will not highlight. </w:t>
+      </w:r>
+      <w:proofErr w:type="gramStart"/>
+      <w:r>
+        <w:t>Also</w:t>
+      </w:r>
+      <w:proofErr w:type="gramEnd"/>
+      <w:r>
+        <w:t xml:space="preserve"> when taking a B-scan it takes time</w:t>
       </w:r>
       <w:r>
         <w:t xml:space="preserve"> (~1 min), and during that time, the fluid front might have moved.</w:t>
@@ -1555,8 +1670,13 @@
     </w:p>
     <w:p/>
     <w:p>
-      <w:r>
-        <w:t>In order to write paragraph-per-paragraph, topic-per-topic</w:t>
+      <w:proofErr w:type="gramStart"/>
+      <w:r>
+        <w:t>In order to</w:t>
+      </w:r>
+      <w:proofErr w:type="gramEnd"/>
+      <w:r>
+        <w:t xml:space="preserve"> write paragraph-per-paragraph, topic-per-topic</w:t>
       </w:r>
       <w:r>
         <w:t xml:space="preserve"> have this in order:</w:t>
@@ -1595,7 +1715,15 @@
         </w:numPr>
       </w:pPr>
       <w:r>
-        <w:t>Have on notebookLM per main topic group:</w:t>
+        <w:t xml:space="preserve">Have on </w:t>
+      </w:r>
+      <w:proofErr w:type="spellStart"/>
+      <w:r>
+        <w:t>notebookLM</w:t>
+      </w:r>
+      <w:proofErr w:type="spellEnd"/>
+      <w:r>
+        <w:t xml:space="preserve"> per main topic group:</w:t>
       </w:r>
     </w:p>
     <w:p>
@@ -1662,6 +1790,7 @@
         <w:rPr>
           <w:lang w:val="en-US"/>
         </w:rPr>
+        <w:lastRenderedPageBreak/>
         <w:t xml:space="preserve"> </w:t>
       </w:r>
       <w:r>
@@ -1833,6 +1962,1020 @@
           <w:lang w:val="en-US"/>
         </w:rPr>
       </w:pPr>
+    </w:p>
+    <w:p>
+      <w:pPr>
+        <w:rPr>
+          <w:lang w:val="en-US"/>
+        </w:rPr>
+      </w:pPr>
+    </w:p>
+    <w:p>
+      <w:pPr>
+        <w:rPr>
+          <w:b/>
+          <w:bCs/>
+          <w:lang w:val="en-US"/>
+        </w:rPr>
+      </w:pPr>
+      <w:r>
+        <w:rPr>
+          <w:b/>
+          <w:bCs/>
+          <w:lang w:val="en-US"/>
+        </w:rPr>
+        <w:t>Literature</w:t>
+      </w:r>
+      <w:r>
+        <w:rPr>
+          <w:b/>
+          <w:bCs/>
+          <w:lang w:val="en-US"/>
+        </w:rPr>
+        <w:t>:</w:t>
+      </w:r>
+    </w:p>
+    <w:p>
+      <w:pPr>
+        <w:pStyle w:val="ListParagraph"/>
+        <w:numPr>
+          <w:ilvl w:val="0"/>
+          <w:numId w:val="7"/>
+        </w:numPr>
+        <w:rPr>
+          <w:b/>
+          <w:bCs/>
+        </w:rPr>
+      </w:pPr>
+      <w:r>
+        <w:rPr>
+          <w:b/>
+          <w:bCs/>
+        </w:rPr>
+        <w:t>EM/GPR Physics &amp; Forward Modelling</w:t>
+      </w:r>
+    </w:p>
+    <w:p>
+      <w:pPr>
+        <w:shd w:val="clear" w:color="auto" w:fill="DAE9F7" w:themeFill="text2" w:themeFillTint="1A"/>
+        <w:rPr>
+          <w:sz w:val="20"/>
+          <w:szCs w:val="20"/>
+        </w:rPr>
+      </w:pPr>
+      <w:r>
+        <w:rPr>
+          <w:sz w:val="20"/>
+          <w:szCs w:val="20"/>
+        </w:rPr>
+        <w:t xml:space="preserve">Maxwell's equations, material properties, forward-modelling principles → underlies </w:t>
+      </w:r>
+      <w:r>
+        <w:rPr>
+          <w:sz w:val="20"/>
+          <w:szCs w:val="20"/>
+          <w:u w:val="single"/>
+        </w:rPr>
+        <w:t>Ch. 2.1</w:t>
+      </w:r>
+      <w:r>
+        <w:rPr>
+          <w:sz w:val="20"/>
+          <w:szCs w:val="20"/>
+        </w:rPr>
+        <w:t xml:space="preserve"> and your </w:t>
+      </w:r>
+      <w:proofErr w:type="spellStart"/>
+      <w:r>
+        <w:rPr>
+          <w:sz w:val="20"/>
+          <w:szCs w:val="20"/>
+        </w:rPr>
+        <w:t>gprMax</w:t>
+      </w:r>
+      <w:proofErr w:type="spellEnd"/>
+      <w:r>
+        <w:rPr>
+          <w:sz w:val="20"/>
+          <w:szCs w:val="20"/>
+        </w:rPr>
+        <w:t xml:space="preserve"> setup in </w:t>
+      </w:r>
+      <w:r>
+        <w:rPr>
+          <w:sz w:val="20"/>
+          <w:szCs w:val="20"/>
+          <w:u w:val="single"/>
+        </w:rPr>
+        <w:t>Ch. 4</w:t>
+      </w:r>
+      <w:r>
+        <w:rPr>
+          <w:sz w:val="20"/>
+          <w:szCs w:val="20"/>
+        </w:rPr>
+        <w:t>.</w:t>
+      </w:r>
+    </w:p>
+    <w:p>
+      <w:pPr>
+        <w:pStyle w:val="ListParagraph"/>
+        <w:numPr>
+          <w:ilvl w:val="1"/>
+          <w:numId w:val="7"/>
+        </w:numPr>
+        <w:rPr>
+          <w:lang w:val="en-US"/>
+        </w:rPr>
+      </w:pPr>
+      <w:r>
+        <w:rPr>
+          <w:b/>
+          <w:bCs/>
+          <w:lang w:val="en-US"/>
+        </w:rPr>
+        <w:t>EM/GPR Physics</w:t>
+      </w:r>
+    </w:p>
+    <w:p>
+      <w:pPr>
+        <w:pStyle w:val="ListParagraph"/>
+        <w:numPr>
+          <w:ilvl w:val="1"/>
+          <w:numId w:val="7"/>
+        </w:numPr>
+        <w:rPr>
+          <w:lang w:val="en-US"/>
+        </w:rPr>
+      </w:pPr>
+      <w:r>
+        <w:rPr>
+          <w:b/>
+          <w:bCs/>
+          <w:lang w:val="en-US"/>
+        </w:rPr>
+        <w:t>Forward Modelling</w:t>
+      </w:r>
+    </w:p>
+    <w:p>
+      <w:pPr>
+        <w:rPr>
+          <w:lang w:val="en-US"/>
+        </w:rPr>
+      </w:pPr>
+    </w:p>
+    <w:p>
+      <w:pPr>
+        <w:pStyle w:val="ListParagraph"/>
+        <w:numPr>
+          <w:ilvl w:val="0"/>
+          <w:numId w:val="7"/>
+        </w:numPr>
+        <w:rPr>
+          <w:lang w:val="en-US"/>
+        </w:rPr>
+      </w:pPr>
+      <w:r>
+        <w:rPr>
+          <w:b/>
+          <w:bCs/>
+          <w:lang w:val="en-US"/>
+        </w:rPr>
+        <w:t>Resolution &amp; Fresnel Zone Theory</w:t>
+      </w:r>
+    </w:p>
+    <w:p>
+      <w:pPr>
+        <w:shd w:val="clear" w:color="auto" w:fill="DAE9F7" w:themeFill="text2" w:themeFillTint="1A"/>
+        <w:rPr>
+          <w:sz w:val="20"/>
+          <w:szCs w:val="20"/>
+          <w:lang w:val="en-US"/>
+        </w:rPr>
+      </w:pPr>
+      <w:r>
+        <w:rPr>
+          <w:sz w:val="20"/>
+          <w:szCs w:val="20"/>
+        </w:rPr>
+        <w:t xml:space="preserve">Lateral/vertical resolution, fracture aperture &amp; thickness, </w:t>
+      </w:r>
+      <w:proofErr w:type="gramStart"/>
+      <w:r>
+        <w:rPr>
+          <w:sz w:val="20"/>
+          <w:szCs w:val="20"/>
+        </w:rPr>
+        <w:t>thin-bed</w:t>
+      </w:r>
+      <w:proofErr w:type="gramEnd"/>
+      <w:r>
+        <w:rPr>
+          <w:sz w:val="20"/>
+          <w:szCs w:val="20"/>
+        </w:rPr>
+        <w:t xml:space="preserve">/sub-wavelength detection → </w:t>
+      </w:r>
+      <w:r>
+        <w:rPr>
+          <w:sz w:val="20"/>
+          <w:szCs w:val="20"/>
+          <w:u w:val="single"/>
+        </w:rPr>
+        <w:t>Ch. 2.2</w:t>
+      </w:r>
+      <w:r>
+        <w:rPr>
+          <w:sz w:val="20"/>
+          <w:szCs w:val="20"/>
+        </w:rPr>
+        <w:t xml:space="preserve">, motivates </w:t>
+      </w:r>
+      <w:r>
+        <w:rPr>
+          <w:i/>
+          <w:iCs/>
+          <w:sz w:val="20"/>
+          <w:szCs w:val="20"/>
+        </w:rPr>
+        <w:t>why</w:t>
+      </w:r>
+      <w:r>
+        <w:rPr>
+          <w:sz w:val="20"/>
+          <w:szCs w:val="20"/>
+        </w:rPr>
+        <w:t xml:space="preserve"> migration/phase methods matter at all.</w:t>
+      </w:r>
+    </w:p>
+    <w:p>
+      <w:pPr>
+        <w:pStyle w:val="ListParagraph"/>
+        <w:numPr>
+          <w:ilvl w:val="1"/>
+          <w:numId w:val="7"/>
+        </w:numPr>
+        <w:rPr>
+          <w:lang w:val="en-US"/>
+        </w:rPr>
+      </w:pPr>
+      <w:r>
+        <w:rPr>
+          <w:b/>
+          <w:bCs/>
+          <w:lang w:val="en-US"/>
+        </w:rPr>
+        <w:t>Lateral and Vertical Resolution</w:t>
+      </w:r>
+    </w:p>
+    <w:p>
+      <w:pPr>
+        <w:pStyle w:val="ListParagraph"/>
+        <w:numPr>
+          <w:ilvl w:val="1"/>
+          <w:numId w:val="7"/>
+        </w:numPr>
+        <w:rPr>
+          <w:lang w:val="en-US"/>
+        </w:rPr>
+      </w:pPr>
+      <w:r>
+        <w:rPr>
+          <w:b/>
+          <w:bCs/>
+          <w:lang w:val="en-US"/>
+        </w:rPr>
+        <w:t>Thin Beds and Subwavelength Detection</w:t>
+      </w:r>
+    </w:p>
+    <w:p>
+      <w:pPr>
+        <w:rPr>
+          <w:lang w:val="en-US"/>
+        </w:rPr>
+      </w:pPr>
+    </w:p>
+    <w:p>
+      <w:pPr>
+        <w:pStyle w:val="ListParagraph"/>
+        <w:numPr>
+          <w:ilvl w:val="0"/>
+          <w:numId w:val="7"/>
+        </w:numPr>
+        <w:rPr>
+          <w:lang w:val="en-US"/>
+        </w:rPr>
+      </w:pPr>
+      <w:r>
+        <w:rPr>
+          <w:b/>
+          <w:bCs/>
+          <w:lang w:val="en-US"/>
+        </w:rPr>
+        <w:t>Migration</w:t>
+      </w:r>
+      <w:r>
+        <w:rPr>
+          <w:b/>
+          <w:bCs/>
+          <w:lang w:val="en-US"/>
+        </w:rPr>
+        <w:t xml:space="preserve"> &amp; Imaging Algorithms</w:t>
+      </w:r>
+    </w:p>
+    <w:p>
+      <w:pPr>
+        <w:shd w:val="clear" w:color="auto" w:fill="DAE9F7" w:themeFill="text2" w:themeFillTint="1A"/>
+        <w:rPr>
+          <w:sz w:val="20"/>
+          <w:szCs w:val="20"/>
+          <w:lang w:val="en-US"/>
+        </w:rPr>
+      </w:pPr>
+      <w:r>
+        <w:rPr>
+          <w:sz w:val="20"/>
+          <w:szCs w:val="20"/>
+          <w:lang w:val="en-US"/>
+        </w:rPr>
+        <w:t xml:space="preserve">Kirchhoff, Gazdag phase-shift, back-propagation/time-reversal, RTM, least-squares migration, FWI, Bayesian inversion, super-resolution/MUSIC, general migration reviews → </w:t>
+      </w:r>
+      <w:r>
+        <w:rPr>
+          <w:sz w:val="20"/>
+          <w:szCs w:val="20"/>
+          <w:u w:val="single"/>
+          <w:lang w:val="en-US"/>
+        </w:rPr>
+        <w:t>Ch. 2.3</w:t>
+      </w:r>
+      <w:r>
+        <w:rPr>
+          <w:sz w:val="20"/>
+          <w:szCs w:val="20"/>
+          <w:lang w:val="en-US"/>
+        </w:rPr>
+        <w:t xml:space="preserve"> core + </w:t>
+      </w:r>
+      <w:r>
+        <w:rPr>
+          <w:sz w:val="20"/>
+          <w:szCs w:val="20"/>
+          <w:u w:val="single"/>
+          <w:lang w:val="en-US"/>
+        </w:rPr>
+        <w:t>Ch. 3.1</w:t>
+      </w:r>
+      <w:r>
+        <w:rPr>
+          <w:sz w:val="20"/>
+          <w:szCs w:val="20"/>
+          <w:lang w:val="en-US"/>
+        </w:rPr>
+        <w:t xml:space="preserve">, feeds </w:t>
+      </w:r>
+      <w:r>
+        <w:rPr>
+          <w:sz w:val="20"/>
+          <w:szCs w:val="20"/>
+          <w:u w:val="single"/>
+          <w:lang w:val="en-US"/>
+        </w:rPr>
+        <w:t>Hypothesis 2 (migration/noise)</w:t>
+      </w:r>
+    </w:p>
+    <w:p>
+      <w:pPr>
+        <w:pStyle w:val="ListParagraph"/>
+        <w:numPr>
+          <w:ilvl w:val="1"/>
+          <w:numId w:val="7"/>
+        </w:numPr>
+        <w:rPr>
+          <w:lang w:val="en-US"/>
+        </w:rPr>
+      </w:pPr>
+      <w:r>
+        <w:rPr>
+          <w:b/>
+          <w:bCs/>
+          <w:lang w:val="en-US"/>
+        </w:rPr>
+        <w:t>Used</w:t>
+      </w:r>
+      <w:r>
+        <w:rPr>
+          <w:b/>
+          <w:bCs/>
+          <w:lang w:val="en-US"/>
+        </w:rPr>
+        <w:t xml:space="preserve"> in Thesis</w:t>
+      </w:r>
+    </w:p>
+    <w:p>
+      <w:pPr>
+        <w:pStyle w:val="ListParagraph"/>
+        <w:numPr>
+          <w:ilvl w:val="2"/>
+          <w:numId w:val="7"/>
+        </w:numPr>
+        <w:rPr>
+          <w:lang w:val="en-US"/>
+        </w:rPr>
+      </w:pPr>
+      <w:r>
+        <w:t>Kirchhoff</w:t>
+      </w:r>
+    </w:p>
+    <w:p>
+      <w:pPr>
+        <w:pStyle w:val="ListParagraph"/>
+        <w:numPr>
+          <w:ilvl w:val="2"/>
+          <w:numId w:val="7"/>
+        </w:numPr>
+        <w:rPr>
+          <w:lang w:val="en-US"/>
+        </w:rPr>
+      </w:pPr>
+      <w:r>
+        <w:t>Gazdag</w:t>
+      </w:r>
+      <w:r>
+        <w:t xml:space="preserve"> </w:t>
+      </w:r>
+      <w:r>
+        <w:t>Phase-Shift</w:t>
+      </w:r>
+    </w:p>
+    <w:p>
+      <w:pPr>
+        <w:pStyle w:val="ListParagraph"/>
+        <w:numPr>
+          <w:ilvl w:val="2"/>
+          <w:numId w:val="7"/>
+        </w:numPr>
+        <w:rPr>
+          <w:lang w:val="en-US"/>
+        </w:rPr>
+      </w:pPr>
+      <w:r>
+        <w:t>Back-Propagation</w:t>
+      </w:r>
+      <w:r>
+        <w:t xml:space="preserve"> </w:t>
+      </w:r>
+      <w:r>
+        <w:t>Time-Reversal</w:t>
+      </w:r>
+    </w:p>
+    <w:p>
+      <w:pPr>
+        <w:pStyle w:val="ListParagraph"/>
+        <w:numPr>
+          <w:ilvl w:val="2"/>
+          <w:numId w:val="7"/>
+        </w:numPr>
+        <w:rPr>
+          <w:lang w:val="en-US"/>
+        </w:rPr>
+      </w:pPr>
+      <w:r>
+        <w:t>Time-Lapse</w:t>
+      </w:r>
+      <w:r>
+        <w:t xml:space="preserve"> </w:t>
+      </w:r>
+      <w:r>
+        <w:t>Imaging</w:t>
+      </w:r>
+      <w:r>
+        <w:t xml:space="preserve"> </w:t>
+      </w:r>
+      <w:r>
+        <w:t>Applications</w:t>
+      </w:r>
+    </w:p>
+    <w:p>
+      <w:pPr>
+        <w:pStyle w:val="ListParagraph"/>
+        <w:numPr>
+          <w:ilvl w:val="2"/>
+          <w:numId w:val="7"/>
+        </w:numPr>
+        <w:rPr>
+          <w:lang w:val="en-US"/>
+        </w:rPr>
+      </w:pPr>
+      <w:r>
+        <w:t>General</w:t>
+      </w:r>
+      <w:r>
+        <w:t xml:space="preserve"> </w:t>
+      </w:r>
+      <w:r>
+        <w:t>Migration</w:t>
+      </w:r>
+      <w:r>
+        <w:t xml:space="preserve"> </w:t>
+      </w:r>
+      <w:r>
+        <w:t>Reviews</w:t>
+      </w:r>
+    </w:p>
+    <w:p>
+      <w:pPr>
+        <w:pStyle w:val="ListParagraph"/>
+        <w:numPr>
+          <w:ilvl w:val="1"/>
+          <w:numId w:val="7"/>
+        </w:numPr>
+        <w:rPr>
+          <w:lang w:val="en-US"/>
+        </w:rPr>
+      </w:pPr>
+      <w:r>
+        <w:rPr>
+          <w:b/>
+          <w:bCs/>
+          <w:lang w:val="en-US"/>
+        </w:rPr>
+        <w:lastRenderedPageBreak/>
+        <w:t>Advanced / Alternative</w:t>
+      </w:r>
+      <w:r>
+        <w:rPr>
+          <w:b/>
+          <w:bCs/>
+          <w:lang w:val="en-US"/>
+        </w:rPr>
+        <w:t xml:space="preserve"> (</w:t>
+      </w:r>
+      <w:r>
+        <w:rPr>
+          <w:b/>
+          <w:bCs/>
+        </w:rPr>
+        <w:t>context, not implemented</w:t>
+      </w:r>
+      <w:r>
+        <w:rPr>
+          <w:b/>
+          <w:bCs/>
+          <w:lang w:val="en-US"/>
+        </w:rPr>
+        <w:t>)</w:t>
+      </w:r>
+    </w:p>
+    <w:p>
+      <w:pPr>
+        <w:pStyle w:val="ListParagraph"/>
+        <w:numPr>
+          <w:ilvl w:val="2"/>
+          <w:numId w:val="7"/>
+        </w:numPr>
+        <w:rPr>
+          <w:lang w:val="en-US"/>
+        </w:rPr>
+      </w:pPr>
+      <w:r>
+        <w:t>Reverse-Time</w:t>
+      </w:r>
+      <w:r>
+        <w:t xml:space="preserve"> </w:t>
+      </w:r>
+      <w:r>
+        <w:t>Migration</w:t>
+      </w:r>
+    </w:p>
+    <w:p>
+      <w:pPr>
+        <w:pStyle w:val="ListParagraph"/>
+        <w:numPr>
+          <w:ilvl w:val="2"/>
+          <w:numId w:val="7"/>
+        </w:numPr>
+        <w:rPr>
+          <w:lang w:val="en-US"/>
+        </w:rPr>
+      </w:pPr>
+      <w:r>
+        <w:t>Least-Squares</w:t>
+      </w:r>
+      <w:r>
+        <w:t xml:space="preserve"> </w:t>
+      </w:r>
+      <w:r>
+        <w:t>Migration</w:t>
+      </w:r>
+    </w:p>
+    <w:p>
+      <w:pPr>
+        <w:pStyle w:val="ListParagraph"/>
+        <w:numPr>
+          <w:ilvl w:val="2"/>
+          <w:numId w:val="7"/>
+        </w:numPr>
+        <w:rPr>
+          <w:lang w:val="en-US"/>
+        </w:rPr>
+      </w:pPr>
+      <w:r>
+        <w:t>Full</w:t>
+      </w:r>
+      <w:r>
+        <w:t xml:space="preserve"> </w:t>
+      </w:r>
+      <w:r>
+        <w:t>Waveform</w:t>
+      </w:r>
+      <w:r>
+        <w:t xml:space="preserve"> </w:t>
+      </w:r>
+      <w:r>
+        <w:t>Inversion</w:t>
+      </w:r>
+    </w:p>
+    <w:p>
+      <w:pPr>
+        <w:pStyle w:val="ListParagraph"/>
+        <w:numPr>
+          <w:ilvl w:val="2"/>
+          <w:numId w:val="7"/>
+        </w:numPr>
+        <w:rPr>
+          <w:lang w:val="en-US"/>
+        </w:rPr>
+      </w:pPr>
+      <w:r>
+        <w:t>Bayesian</w:t>
+      </w:r>
+      <w:r>
+        <w:t xml:space="preserve"> </w:t>
+      </w:r>
+      <w:r>
+        <w:t>Inversion</w:t>
+      </w:r>
+    </w:p>
+    <w:p>
+      <w:pPr>
+        <w:pStyle w:val="ListParagraph"/>
+        <w:numPr>
+          <w:ilvl w:val="2"/>
+          <w:numId w:val="7"/>
+        </w:numPr>
+        <w:rPr>
+          <w:lang w:val="en-US"/>
+        </w:rPr>
+      </w:pPr>
+      <w:r>
+        <w:t>Super-Resolution</w:t>
+      </w:r>
+      <w:r>
+        <w:t xml:space="preserve"> </w:t>
+      </w:r>
+      <w:r>
+        <w:t>and</w:t>
+      </w:r>
+      <w:r>
+        <w:t xml:space="preserve"> </w:t>
+      </w:r>
+      <w:r>
+        <w:t>MUSIC</w:t>
+      </w:r>
+    </w:p>
+    <w:p>
+      <w:pPr>
+        <w:shd w:val="clear" w:color="auto" w:fill="FAE2D5" w:themeFill="accent2" w:themeFillTint="33"/>
+        <w:rPr>
+          <w:sz w:val="20"/>
+          <w:szCs w:val="20"/>
+        </w:rPr>
+      </w:pPr>
+      <w:r>
+        <w:rPr>
+          <w:sz w:val="20"/>
+          <w:szCs w:val="20"/>
+        </w:rPr>
+        <w:t>3b becomes your "these more sophisticated methods exist and here's how they relate to/could extend what I did" discussion material (useful for Ch. 8 Discussion / future work), while 3a is squarely the Ch. 3 theory + Hypothesis 2 methodology backbone.</w:t>
+      </w:r>
+    </w:p>
+    <w:p>
+      <w:pPr>
+        <w:shd w:val="clear" w:color="auto" w:fill="FAE2D5" w:themeFill="accent2" w:themeFillTint="33"/>
+        <w:rPr>
+          <w:sz w:val="20"/>
+          <w:szCs w:val="20"/>
+          <w:lang w:val="en-US"/>
+        </w:rPr>
+      </w:pPr>
+      <w:proofErr w:type="spellStart"/>
+      <w:r>
+        <w:rPr>
+          <w:sz w:val="20"/>
+          <w:szCs w:val="20"/>
+        </w:rPr>
+        <w:t>General_Migration_Reviews</w:t>
+      </w:r>
+      <w:proofErr w:type="spellEnd"/>
+      <w:r>
+        <w:rPr>
+          <w:sz w:val="20"/>
+          <w:szCs w:val="20"/>
+        </w:rPr>
+        <w:t xml:space="preserve"> papers likely survey </w:t>
+      </w:r>
+      <w:r>
+        <w:rPr>
+          <w:i/>
+          <w:iCs/>
+          <w:sz w:val="20"/>
+          <w:szCs w:val="20"/>
+        </w:rPr>
+        <w:t>all</w:t>
+      </w:r>
+      <w:r>
+        <w:rPr>
+          <w:sz w:val="20"/>
+          <w:szCs w:val="20"/>
+        </w:rPr>
+        <w:t xml:space="preserve"> methods including RTM/FWI/etc., not just your three — so they arguably belong in both. </w:t>
+      </w:r>
+      <w:r>
+        <w:rPr>
+          <w:sz w:val="20"/>
+          <w:szCs w:val="20"/>
+        </w:rPr>
+        <w:t>T</w:t>
+      </w:r>
+      <w:r>
+        <w:rPr>
+          <w:sz w:val="20"/>
+          <w:szCs w:val="20"/>
+        </w:rPr>
+        <w:t xml:space="preserve">hey're what justifies </w:t>
+      </w:r>
+      <w:r>
+        <w:rPr>
+          <w:i/>
+          <w:iCs/>
+          <w:sz w:val="20"/>
+          <w:szCs w:val="20"/>
+        </w:rPr>
+        <w:t>why</w:t>
+      </w:r>
+      <w:r>
+        <w:rPr>
+          <w:sz w:val="20"/>
+          <w:szCs w:val="20"/>
+        </w:rPr>
+        <w:t xml:space="preserve"> you picked these three over the alternatives</w:t>
+      </w:r>
+    </w:p>
+    <w:p>
+      <w:pPr>
+        <w:rPr>
+          <w:lang w:val="en-US"/>
+        </w:rPr>
+      </w:pPr>
+    </w:p>
+    <w:p>
+      <w:pPr>
+        <w:pStyle w:val="ListParagraph"/>
+        <w:numPr>
+          <w:ilvl w:val="0"/>
+          <w:numId w:val="7"/>
+        </w:numPr>
+        <w:rPr>
+          <w:lang w:val="en-US"/>
+        </w:rPr>
+      </w:pPr>
+      <w:r>
+        <w:rPr>
+          <w:b/>
+          <w:bCs/>
+          <w:lang w:val="en-US"/>
+        </w:rPr>
+        <w:t>Signal Processing</w:t>
+      </w:r>
+    </w:p>
+    <w:p>
+      <w:pPr>
+        <w:shd w:val="clear" w:color="auto" w:fill="DAE9F7" w:themeFill="text2" w:themeFillTint="1A"/>
+        <w:rPr>
+          <w:sz w:val="20"/>
+          <w:szCs w:val="20"/>
+          <w:lang w:val="en-US"/>
+        </w:rPr>
+      </w:pPr>
+      <w:r>
+        <w:rPr>
+          <w:sz w:val="20"/>
+          <w:szCs w:val="20"/>
+        </w:rPr>
+        <w:t xml:space="preserve">RPCA, SVD, multiple removal, wavelet/time-frequency methods → </w:t>
+      </w:r>
+      <w:r>
+        <w:rPr>
+          <w:sz w:val="20"/>
+          <w:szCs w:val="20"/>
+          <w:u w:val="single"/>
+        </w:rPr>
+        <w:t>Ch. 2.3</w:t>
+      </w:r>
+      <w:r>
+        <w:rPr>
+          <w:sz w:val="20"/>
+          <w:szCs w:val="20"/>
+        </w:rPr>
+        <w:t xml:space="preserve">, mostly pre-processing/decomposition tools feeding </w:t>
+      </w:r>
+      <w:r>
+        <w:rPr>
+          <w:sz w:val="20"/>
+          <w:szCs w:val="20"/>
+          <w:u w:val="single"/>
+        </w:rPr>
+        <w:t>Hypothesis 3 (complex/phase analysis)</w:t>
+      </w:r>
+      <w:r>
+        <w:rPr>
+          <w:sz w:val="20"/>
+          <w:szCs w:val="20"/>
+        </w:rPr>
+        <w:t>.</w:t>
+      </w:r>
+    </w:p>
+    <w:p>
+      <w:pPr>
+        <w:pStyle w:val="ListParagraph"/>
+        <w:numPr>
+          <w:ilvl w:val="1"/>
+          <w:numId w:val="7"/>
+        </w:numPr>
+        <w:rPr>
+          <w:lang w:val="en-US"/>
+        </w:rPr>
+      </w:pPr>
+      <w:r>
+        <w:rPr>
+          <w:b/>
+          <w:bCs/>
+          <w:lang w:val="en-US"/>
+        </w:rPr>
+        <w:t>Clutter &amp; Direct-Wave Removal</w:t>
+      </w:r>
+    </w:p>
+    <w:p>
+      <w:pPr>
+        <w:pStyle w:val="ListParagraph"/>
+        <w:numPr>
+          <w:ilvl w:val="1"/>
+          <w:numId w:val="7"/>
+        </w:numPr>
+        <w:rPr>
+          <w:lang w:val="en-US"/>
+        </w:rPr>
+      </w:pPr>
+      <w:r>
+        <w:rPr>
+          <w:b/>
+          <w:bCs/>
+          <w:lang w:val="en-US"/>
+        </w:rPr>
+        <w:t>Wavelet &amp; Time-Frequency Analysis</w:t>
+      </w:r>
+    </w:p>
+    <w:p>
+      <w:pPr>
+        <w:rPr>
+          <w:lang w:val="en-US"/>
+        </w:rPr>
+      </w:pPr>
+    </w:p>
+    <w:p>
+      <w:pPr>
+        <w:pStyle w:val="ListParagraph"/>
+        <w:numPr>
+          <w:ilvl w:val="0"/>
+          <w:numId w:val="7"/>
+        </w:numPr>
+        <w:rPr>
+          <w:lang w:val="en-US"/>
+        </w:rPr>
+      </w:pPr>
+      <w:r>
+        <w:rPr>
+          <w:b/>
+          <w:bCs/>
+        </w:rPr>
+        <w:t>Phase-Based Interpretation &amp; Time-Lapse Theory</w:t>
+      </w:r>
+    </w:p>
+    <w:p>
+      <w:pPr>
+        <w:shd w:val="clear" w:color="auto" w:fill="DAE9F7" w:themeFill="text2" w:themeFillTint="1A"/>
+        <w:rPr>
+          <w:sz w:val="20"/>
+          <w:szCs w:val="20"/>
+          <w:lang w:val="en-US"/>
+        </w:rPr>
+      </w:pPr>
+      <w:r>
+        <w:rPr>
+          <w:sz w:val="20"/>
+          <w:szCs w:val="20"/>
+        </w:rPr>
+        <w:t xml:space="preserve">Phase decomposition, WLS phase-difference fitting, cross-spectrum, Fourier shift theorem, space-wavenumber duality → </w:t>
+      </w:r>
+      <w:r>
+        <w:rPr>
+          <w:sz w:val="20"/>
+          <w:szCs w:val="20"/>
+          <w:u w:val="single"/>
+        </w:rPr>
+        <w:t>Ch. 2.4 + Ch. 3</w:t>
+      </w:r>
+      <w:r>
+        <w:rPr>
+          <w:sz w:val="20"/>
+          <w:szCs w:val="20"/>
+        </w:rPr>
+        <w:t xml:space="preserve">, the theoretical spine connecting </w:t>
+      </w:r>
+      <w:r>
+        <w:rPr>
+          <w:sz w:val="20"/>
+          <w:szCs w:val="20"/>
+          <w:u w:val="single"/>
+        </w:rPr>
+        <w:t>Hypotheses 1 (translation) and 3 (complex/phase)</w:t>
+      </w:r>
+      <w:r>
+        <w:rPr>
+          <w:sz w:val="20"/>
+          <w:szCs w:val="20"/>
+        </w:rPr>
+        <w:t>.</w:t>
+      </w:r>
+    </w:p>
+    <w:p>
+      <w:pPr>
+        <w:rPr>
+          <w:lang w:val="en-US"/>
+        </w:rPr>
+      </w:pPr>
+    </w:p>
+    <w:p>
+      <w:pPr>
+        <w:pStyle w:val="ListParagraph"/>
+        <w:numPr>
+          <w:ilvl w:val="0"/>
+          <w:numId w:val="7"/>
+        </w:numPr>
+        <w:rPr>
+          <w:lang w:val="en-US"/>
+        </w:rPr>
+      </w:pPr>
+      <w:r>
+        <w:rPr>
+          <w:b/>
+          <w:bCs/>
+        </w:rPr>
+        <w:t>Field &amp; Time-Lapse GPR Case Studies</w:t>
+      </w:r>
+    </w:p>
+    <w:p>
+      <w:pPr>
+        <w:shd w:val="clear" w:color="auto" w:fill="DAE9F7" w:themeFill="text2" w:themeFillTint="1A"/>
+        <w:rPr>
+          <w:sz w:val="20"/>
+          <w:szCs w:val="20"/>
+          <w:lang w:val="en-US"/>
+        </w:rPr>
+      </w:pPr>
+      <w:r>
+        <w:rPr>
+          <w:sz w:val="20"/>
+          <w:szCs w:val="20"/>
+        </w:rPr>
+        <w:t xml:space="preserve">Precedent field/time-lapse studies (glacier collapse, resin injection, unsaturated flow, root detection, etc.) → </w:t>
+      </w:r>
+      <w:r>
+        <w:rPr>
+          <w:sz w:val="20"/>
+          <w:szCs w:val="20"/>
+          <w:u w:val="single"/>
+        </w:rPr>
+        <w:t>Ch. 5–7</w:t>
+      </w:r>
+      <w:r>
+        <w:rPr>
+          <w:sz w:val="20"/>
+          <w:szCs w:val="20"/>
+        </w:rPr>
+        <w:t>, your comparison/validation literature.</w:t>
+      </w:r>
     </w:p>
     <w:sectPr>
       <w:pgSz w:w="11906" w:h="16838"/>
@@ -1845,7 +2988,7 @@
 </file>
 
 <file path=word/numbering.xml><?xml version="1.0" encoding="utf-8"?>
-<w:numbering xmlns:wpc="http://schemas.microsoft.com/office/word/2010/wordprocessingCanvas" xmlns:cx="http://schemas.microsoft.com/office/drawing/2014/chartex" xmlns:cx1="http://schemas.microsoft.com/office/drawing/2015/9/8/chartex" xmlns:cx2="http://schemas.microsoft.com/office/drawing/2015/10/21/chartex" xmlns:cx3="http://schemas.microsoft.com/office/drawing/2016/5/9/chartex" xmlns:cx4="http://schemas.microsoft.com/office/drawing/2016/5/10/chartex" xmlns:cx5="http://schemas.microsoft.com/office/drawing/2016/5/11/chartex" xmlns:cx6="http://schemas.microsoft.com/office/drawing/2016/5/12/chartex" xmlns:cx7="http://schemas.microsoft.com/office/drawing/2016/5/13/chartex" xmlns:cx8="http://schemas.microsoft.com/office/drawing/2016/5/14/chartex" xmlns:mc="http://schemas.openxmlformats.org/markup-compatibility/2006" xmlns:aink="http://schemas.microsoft.com/office/drawing/2016/ink" xmlns:am3d="http://schemas.microsoft.com/office/drawing/2017/model3d" xmlns:o="urn:schemas-microsoft-com:office:office" xmlns:oel="http://schemas.microsoft.com/office/2019/extlst" xmlns:r="http://schemas.openxmlformats.org/officeDocument/2006/relationships" xmlns:m="http://schemas.openxmlformats.org/officeDocument/2006/math" xmlns:v="urn:schemas-microsoft-com:vml" xmlns:wp14="http://schemas.microsoft.com/office/word/2010/wordprocessingDrawing" xmlns:wp="http://schemas.openxmlformats.org/drawingml/2006/wordprocessingDrawing" xmlns:w10="urn:schemas-microsoft-com:office:word" xmlns:w="http://schemas.openxmlformats.org/wordprocessingml/2006/main" xmlns:w14="http://schemas.microsoft.com/office/word/2010/wordml" xmlns:w15="http://schemas.microsoft.com/office/word/2012/wordml" xmlns:w16cei="http://schemas.microsoft.com/office/word/2026/wordml/cei" xmlns:w16cex="http://schemas.microsoft.com/office/word/2018/wordml/cex" xmlns:w16cid="http://schemas.microsoft.com/office/word/2016/wordml/cid" xmlns:w16="http://schemas.microsoft.com/office/word/2018/wordml" xmlns:w16du="http://schemas.microsoft.com/office/word/2023/wordml/word16du" xmlns:w16sdtdh="http://schemas.microsoft.com/office/word/2020/wordml/sdtdatahash" xmlns:w16sdtfl="http://schemas.microsoft.com/office/word/2024/wordml/sdtformatlock" xmlns:w16se="http://schemas.microsoft.com/office/word/2015/wordml/symex" xmlns:wpg="http://schemas.microsoft.com/office/word/2010/wordprocessingGroup" xmlns:wpi="http://schemas.microsoft.com/office/word/2010/wordprocessingInk" xmlns:wne="http://schemas.microsoft.com/office/word/2006/wordml" xmlns:wps="http://schemas.microsoft.com/office/word/2010/wordprocessingShape" mc:Ignorable="w14 w15 w16se w16cid w16 w16cex w16sdtdh w16sdtfl w16du wp14">
+<w:numbering xmlns:wpc="http://schemas.microsoft.com/office/word/2010/wordprocessingCanvas" xmlns:cx="http://schemas.microsoft.com/office/drawing/2014/chartex" xmlns:cx1="http://schemas.microsoft.com/office/drawing/2015/9/8/chartex" xmlns:cx2="http://schemas.microsoft.com/office/drawing/2015/10/21/chartex" xmlns:cx3="http://schemas.microsoft.com/office/drawing/2016/5/9/chartex" xmlns:cx4="http://schemas.microsoft.com/office/drawing/2016/5/10/chartex" xmlns:cx5="http://schemas.microsoft.com/office/drawing/2016/5/11/chartex" xmlns:cx6="http://schemas.microsoft.com/office/drawing/2016/5/12/chartex" xmlns:cx7="http://schemas.microsoft.com/office/drawing/2016/5/13/chartex" xmlns:cx8="http://schemas.microsoft.com/office/drawing/2016/5/14/chartex" xmlns:mc="http://schemas.openxmlformats.org/markup-compatibility/2006" xmlns:aink="http://schemas.microsoft.com/office/drawing/2016/ink" xmlns:am3d="http://schemas.microsoft.com/office/drawing/2017/model3d" xmlns:o="urn:schemas-microsoft-com:office:office" xmlns:oel="http://schemas.microsoft.com/office/2019/extlst" xmlns:r="http://schemas.openxmlformats.org/officeDocument/2006/relationships" xmlns:m="http://schemas.openxmlformats.org/officeDocument/2006/math" xmlns:v="urn:schemas-microsoft-com:vml" xmlns:wp14="http://schemas.microsoft.com/office/word/2010/wordprocessingDrawing" xmlns:wp="http://schemas.openxmlformats.org/drawingml/2006/wordprocessingDrawing" xmlns:w10="urn:schemas-microsoft-com:office:word" xmlns:w="http://schemas.openxmlformats.org/wordprocessingml/2006/main" xmlns:w14="http://schemas.microsoft.com/office/word/2010/wordml" xmlns:w15="http://schemas.microsoft.com/office/word/2012/wordml" xmlns:w16cex="http://schemas.microsoft.com/office/word/2018/wordml/cex" xmlns:w16cid="http://schemas.microsoft.com/office/word/2016/wordml/cid" xmlns:w16="http://schemas.microsoft.com/office/word/2018/wordml" xmlns:w16du="http://schemas.microsoft.com/office/word/2023/wordml/word16du" xmlns:w16sdtdh="http://schemas.microsoft.com/office/word/2020/wordml/sdtdatahash" xmlns:w16sdtfl="http://schemas.microsoft.com/office/word/2024/wordml/sdtformatlock" xmlns:w16se="http://schemas.microsoft.com/office/word/2015/wordml/symex" xmlns:wpg="http://schemas.microsoft.com/office/word/2010/wordprocessingGroup" xmlns:wpi="http://schemas.microsoft.com/office/word/2010/wordprocessingInk" xmlns:wne="http://schemas.microsoft.com/office/word/2006/wordml" xmlns:wps="http://schemas.microsoft.com/office/word/2010/wordprocessingShape" mc:Ignorable="w14 w15 w16se w16cid w16 w16cex w16sdtdh w16sdtfl w16du wp14">
   <w:abstractNum w:abstractNumId="0" w15:restartNumberingAfterBreak="0">
     <w:nsid w:val="039C1E25"/>
     <w:multiLevelType w:val="hybridMultilevel"/>
@@ -2329,6 +3472,184 @@
       </w:pPr>
     </w:lvl>
     <w:lvl w:ilvl="8" w:tplc="0413001B" w:tentative="1">
+      <w:start w:val="1"/>
+      <w:numFmt w:val="lowerRoman"/>
+      <w:lvlText w:val="%9."/>
+      <w:lvlJc w:val="right"/>
+      <w:pPr>
+        <w:ind w:left="6480" w:hanging="180"/>
+      </w:pPr>
+    </w:lvl>
+  </w:abstractNum>
+  <w:abstractNum w:abstractNumId="5" w15:restartNumberingAfterBreak="0">
+    <w:nsid w:val="74BC1098"/>
+    <w:multiLevelType w:val="hybridMultilevel"/>
+    <w:tmpl w:val="2E32C37A"/>
+    <w:lvl w:ilvl="0" w:tplc="0809000F">
+      <w:start w:val="1"/>
+      <w:numFmt w:val="decimal"/>
+      <w:lvlText w:val="%1."/>
+      <w:lvlJc w:val="left"/>
+      <w:pPr>
+        <w:ind w:left="720" w:hanging="360"/>
+      </w:pPr>
+      <w:rPr>
+        <w:rFonts w:hint="default"/>
+      </w:rPr>
+    </w:lvl>
+    <w:lvl w:ilvl="1" w:tplc="08090019">
+      <w:start w:val="1"/>
+      <w:numFmt w:val="lowerLetter"/>
+      <w:lvlText w:val="%2."/>
+      <w:lvlJc w:val="left"/>
+      <w:pPr>
+        <w:ind w:left="1440" w:hanging="360"/>
+      </w:pPr>
+    </w:lvl>
+    <w:lvl w:ilvl="2" w:tplc="0809001B">
+      <w:start w:val="1"/>
+      <w:numFmt w:val="lowerRoman"/>
+      <w:lvlText w:val="%3."/>
+      <w:lvlJc w:val="right"/>
+      <w:pPr>
+        <w:ind w:left="2160" w:hanging="180"/>
+      </w:pPr>
+    </w:lvl>
+    <w:lvl w:ilvl="3" w:tplc="0809000F" w:tentative="1">
+      <w:start w:val="1"/>
+      <w:numFmt w:val="decimal"/>
+      <w:lvlText w:val="%4."/>
+      <w:lvlJc w:val="left"/>
+      <w:pPr>
+        <w:ind w:left="2880" w:hanging="360"/>
+      </w:pPr>
+    </w:lvl>
+    <w:lvl w:ilvl="4" w:tplc="08090019" w:tentative="1">
+      <w:start w:val="1"/>
+      <w:numFmt w:val="lowerLetter"/>
+      <w:lvlText w:val="%5."/>
+      <w:lvlJc w:val="left"/>
+      <w:pPr>
+        <w:ind w:left="3600" w:hanging="360"/>
+      </w:pPr>
+    </w:lvl>
+    <w:lvl w:ilvl="5" w:tplc="0809001B" w:tentative="1">
+      <w:start w:val="1"/>
+      <w:numFmt w:val="lowerRoman"/>
+      <w:lvlText w:val="%6."/>
+      <w:lvlJc w:val="right"/>
+      <w:pPr>
+        <w:ind w:left="4320" w:hanging="180"/>
+      </w:pPr>
+    </w:lvl>
+    <w:lvl w:ilvl="6" w:tplc="0809000F" w:tentative="1">
+      <w:start w:val="1"/>
+      <w:numFmt w:val="decimal"/>
+      <w:lvlText w:val="%7."/>
+      <w:lvlJc w:val="left"/>
+      <w:pPr>
+        <w:ind w:left="5040" w:hanging="360"/>
+      </w:pPr>
+    </w:lvl>
+    <w:lvl w:ilvl="7" w:tplc="08090019" w:tentative="1">
+      <w:start w:val="1"/>
+      <w:numFmt w:val="lowerLetter"/>
+      <w:lvlText w:val="%8."/>
+      <w:lvlJc w:val="left"/>
+      <w:pPr>
+        <w:ind w:left="5760" w:hanging="360"/>
+      </w:pPr>
+    </w:lvl>
+    <w:lvl w:ilvl="8" w:tplc="0809001B" w:tentative="1">
+      <w:start w:val="1"/>
+      <w:numFmt w:val="lowerRoman"/>
+      <w:lvlText w:val="%9."/>
+      <w:lvlJc w:val="right"/>
+      <w:pPr>
+        <w:ind w:left="6480" w:hanging="180"/>
+      </w:pPr>
+    </w:lvl>
+  </w:abstractNum>
+  <w:abstractNum w:abstractNumId="6" w15:restartNumberingAfterBreak="0">
+    <w:nsid w:val="772C15E0"/>
+    <w:multiLevelType w:val="hybridMultilevel"/>
+    <w:tmpl w:val="353CBA26"/>
+    <w:lvl w:ilvl="0" w:tplc="0809000F">
+      <w:start w:val="1"/>
+      <w:numFmt w:val="decimal"/>
+      <w:lvlText w:val="%1."/>
+      <w:lvlJc w:val="left"/>
+      <w:pPr>
+        <w:ind w:left="720" w:hanging="360"/>
+      </w:pPr>
+      <w:rPr>
+        <w:rFonts w:hint="default"/>
+      </w:rPr>
+    </w:lvl>
+    <w:lvl w:ilvl="1" w:tplc="08090019" w:tentative="1">
+      <w:start w:val="1"/>
+      <w:numFmt w:val="lowerLetter"/>
+      <w:lvlText w:val="%2."/>
+      <w:lvlJc w:val="left"/>
+      <w:pPr>
+        <w:ind w:left="1440" w:hanging="360"/>
+      </w:pPr>
+    </w:lvl>
+    <w:lvl w:ilvl="2" w:tplc="0809001B" w:tentative="1">
+      <w:start w:val="1"/>
+      <w:numFmt w:val="lowerRoman"/>
+      <w:lvlText w:val="%3."/>
+      <w:lvlJc w:val="right"/>
+      <w:pPr>
+        <w:ind w:left="2160" w:hanging="180"/>
+      </w:pPr>
+    </w:lvl>
+    <w:lvl w:ilvl="3" w:tplc="0809000F" w:tentative="1">
+      <w:start w:val="1"/>
+      <w:numFmt w:val="decimal"/>
+      <w:lvlText w:val="%4."/>
+      <w:lvlJc w:val="left"/>
+      <w:pPr>
+        <w:ind w:left="2880" w:hanging="360"/>
+      </w:pPr>
+    </w:lvl>
+    <w:lvl w:ilvl="4" w:tplc="08090019" w:tentative="1">
+      <w:start w:val="1"/>
+      <w:numFmt w:val="lowerLetter"/>
+      <w:lvlText w:val="%5."/>
+      <w:lvlJc w:val="left"/>
+      <w:pPr>
+        <w:ind w:left="3600" w:hanging="360"/>
+      </w:pPr>
+    </w:lvl>
+    <w:lvl w:ilvl="5" w:tplc="0809001B" w:tentative="1">
+      <w:start w:val="1"/>
+      <w:numFmt w:val="lowerRoman"/>
+      <w:lvlText w:val="%6."/>
+      <w:lvlJc w:val="right"/>
+      <w:pPr>
+        <w:ind w:left="4320" w:hanging="180"/>
+      </w:pPr>
+    </w:lvl>
+    <w:lvl w:ilvl="6" w:tplc="0809000F" w:tentative="1">
+      <w:start w:val="1"/>
+      <w:numFmt w:val="decimal"/>
+      <w:lvlText w:val="%7."/>
+      <w:lvlJc w:val="left"/>
+      <w:pPr>
+        <w:ind w:left="5040" w:hanging="360"/>
+      </w:pPr>
+    </w:lvl>
+    <w:lvl w:ilvl="7" w:tplc="08090019" w:tentative="1">
+      <w:start w:val="1"/>
+      <w:numFmt w:val="lowerLetter"/>
+      <w:lvlText w:val="%8."/>
+      <w:lvlJc w:val="left"/>
+      <w:pPr>
+        <w:ind w:left="5760" w:hanging="360"/>
+      </w:pPr>
+    </w:lvl>
+    <w:lvl w:ilvl="8" w:tplc="0809001B" w:tentative="1">
       <w:start w:val="1"/>
       <w:numFmt w:val="lowerRoman"/>
       <w:lvlText w:val="%9."/>
@@ -2352,6 +3673,12 @@
   </w:num>
   <w:num w:numId="5" w16cid:durableId="295137552">
     <w:abstractNumId w:val="1"/>
+  </w:num>
+  <w:num w:numId="6" w16cid:durableId="1924609991">
+    <w:abstractNumId w:val="6"/>
+  </w:num>
+  <w:num w:numId="7" w16cid:durableId="1603563524">
+    <w:abstractNumId w:val="5"/>
   </w:num>
 </w:numbering>
 </file>
@@ -2807,7 +4134,6 @@
     <w:next w:val="Normal"/>
     <w:link w:val="Heading3Char"/>
     <w:uiPriority w:val="9"/>
-    <w:semiHidden/>
     <w:unhideWhenUsed/>
     <w:qFormat/>
     <w:rsid w:val="005B10CC"/>
@@ -2959,7 +4285,6 @@
   <w:style w:type="character" w:default="1" w:styleId="DefaultParagraphFont">
     <w:name w:val="Default Paragraph Font"/>
     <w:uiPriority w:val="1"/>
-    <w:semiHidden/>
     <w:unhideWhenUsed/>
   </w:style>
   <w:style w:type="table" w:default="1" w:styleId="TableNormal">
@@ -3015,7 +4340,6 @@
     <w:basedOn w:val="DefaultParagraphFont"/>
     <w:link w:val="Heading3"/>
     <w:uiPriority w:val="9"/>
-    <w:semiHidden/>
     <w:rsid w:val="005B10CC"/>
     <w:rPr>
       <w:rFonts w:eastAsiaTheme="majorEastAsia" w:cstheme="majorBidi"/>

</xml_diff>

<commit_message>
Cleaned up migration gallery figures and fixed the colourbar in the B-scan
</commit_message>
<xml_diff>
--- a/TimeLapse_LaTeX/Thesis/working summary.docx
+++ b/TimeLapse_LaTeX/Thesis/working summary.docx
@@ -90,7 +90,7 @@
     </w:p>
     <w:p>
       <w:pPr>
-        <w:pStyle w:val="ListParagraph"/>
+        <w:pStyle w:val="Lijstalinea"/>
         <w:numPr>
           <w:ilvl w:val="0"/>
           <w:numId w:val="4"/>
@@ -105,7 +105,7 @@
     </w:p>
     <w:p>
       <w:pPr>
-        <w:pStyle w:val="ListParagraph"/>
+        <w:pStyle w:val="Lijstalinea"/>
         <w:numPr>
           <w:ilvl w:val="0"/>
           <w:numId w:val="4"/>
@@ -117,7 +117,7 @@
     </w:p>
     <w:p>
       <w:pPr>
-        <w:pStyle w:val="ListParagraph"/>
+        <w:pStyle w:val="Lijstalinea"/>
         <w:numPr>
           <w:ilvl w:val="0"/>
           <w:numId w:val="4"/>
@@ -129,7 +129,7 @@
     </w:p>
     <w:p>
       <w:pPr>
-        <w:pStyle w:val="ListParagraph"/>
+        <w:pStyle w:val="Lijstalinea"/>
       </w:pPr>
     </w:p>
     <w:p>
@@ -162,7 +162,7 @@
     </w:p>
     <w:p>
       <w:pPr>
-        <w:pStyle w:val="ListParagraph"/>
+        <w:pStyle w:val="Lijstalinea"/>
         <w:numPr>
           <w:ilvl w:val="0"/>
           <w:numId w:val="4"/>
@@ -174,7 +174,7 @@
     </w:p>
     <w:p>
       <w:pPr>
-        <w:pStyle w:val="ListParagraph"/>
+        <w:pStyle w:val="Lijstalinea"/>
         <w:numPr>
           <w:ilvl w:val="0"/>
           <w:numId w:val="4"/>
@@ -191,7 +191,7 @@
     </w:p>
     <w:p>
       <w:pPr>
-        <w:pStyle w:val="ListParagraph"/>
+        <w:pStyle w:val="Lijstalinea"/>
         <w:numPr>
           <w:ilvl w:val="0"/>
           <w:numId w:val="4"/>
@@ -203,7 +203,7 @@
     </w:p>
     <w:p>
       <w:pPr>
-        <w:pStyle w:val="ListParagraph"/>
+        <w:pStyle w:val="Lijstalinea"/>
         <w:numPr>
           <w:ilvl w:val="0"/>
           <w:numId w:val="4"/>
@@ -981,7 +981,7 @@
     </w:p>
     <w:p>
       <w:pPr>
-        <w:pStyle w:val="ListParagraph"/>
+        <w:pStyle w:val="Lijstalinea"/>
         <w:numPr>
           <w:ilvl w:val="0"/>
           <w:numId w:val="4"/>
@@ -993,7 +993,7 @@
     </w:p>
     <w:p>
       <w:pPr>
-        <w:pStyle w:val="ListParagraph"/>
+        <w:pStyle w:val="Lijstalinea"/>
         <w:numPr>
           <w:ilvl w:val="0"/>
           <w:numId w:val="4"/>
@@ -1005,7 +1005,7 @@
     </w:p>
     <w:p>
       <w:pPr>
-        <w:pStyle w:val="ListParagraph"/>
+        <w:pStyle w:val="Lijstalinea"/>
         <w:numPr>
           <w:ilvl w:val="0"/>
           <w:numId w:val="4"/>
@@ -1071,7 +1071,7 @@
     </w:p>
     <w:p>
       <w:pPr>
-        <w:pStyle w:val="ListParagraph"/>
+        <w:pStyle w:val="Lijstalinea"/>
         <w:numPr>
           <w:ilvl w:val="0"/>
           <w:numId w:val="3"/>
@@ -1107,7 +1107,7 @@
     </w:p>
     <w:p>
       <w:pPr>
-        <w:pStyle w:val="ListParagraph"/>
+        <w:pStyle w:val="Lijstalinea"/>
         <w:numPr>
           <w:ilvl w:val="1"/>
           <w:numId w:val="3"/>
@@ -1135,7 +1135,7 @@
     </w:p>
     <w:p>
       <w:pPr>
-        <w:pStyle w:val="ListParagraph"/>
+        <w:pStyle w:val="Lijstalinea"/>
         <w:numPr>
           <w:ilvl w:val="1"/>
           <w:numId w:val="3"/>
@@ -1160,7 +1160,7 @@
     </w:p>
     <w:p>
       <w:pPr>
-        <w:pStyle w:val="ListParagraph"/>
+        <w:pStyle w:val="Lijstalinea"/>
         <w:numPr>
           <w:ilvl w:val="0"/>
           <w:numId w:val="3"/>
@@ -1173,7 +1173,7 @@
     <w:p/>
     <w:p>
       <w:pPr>
-        <w:pStyle w:val="ListParagraph"/>
+        <w:pStyle w:val="Lijstalinea"/>
         <w:numPr>
           <w:ilvl w:val="0"/>
           <w:numId w:val="3"/>
@@ -1192,7 +1192,7 @@
     <w:p/>
     <w:p>
       <w:pPr>
-        <w:pStyle w:val="ListParagraph"/>
+        <w:pStyle w:val="Lijstalinea"/>
         <w:numPr>
           <w:ilvl w:val="0"/>
           <w:numId w:val="3"/>
@@ -1211,7 +1211,7 @@
     <w:p/>
     <w:p>
       <w:pPr>
-        <w:pStyle w:val="ListParagraph"/>
+        <w:pStyle w:val="Lijstalinea"/>
         <w:numPr>
           <w:ilvl w:val="0"/>
           <w:numId w:val="3"/>
@@ -1229,7 +1229,7 @@
     </w:p>
     <w:p>
       <w:pPr>
-        <w:pStyle w:val="ListParagraph"/>
+        <w:pStyle w:val="Lijstalinea"/>
         <w:numPr>
           <w:ilvl w:val="1"/>
           <w:numId w:val="3"/>
@@ -1241,7 +1241,7 @@
     </w:p>
     <w:p>
       <w:pPr>
-        <w:pStyle w:val="ListParagraph"/>
+        <w:pStyle w:val="Lijstalinea"/>
         <w:numPr>
           <w:ilvl w:val="1"/>
           <w:numId w:val="3"/>
@@ -1253,7 +1253,7 @@
     </w:p>
     <w:p>
       <w:pPr>
-        <w:pStyle w:val="ListParagraph"/>
+        <w:pStyle w:val="Lijstalinea"/>
         <w:numPr>
           <w:ilvl w:val="1"/>
           <w:numId w:val="3"/>
@@ -1306,7 +1306,7 @@
     <w:p/>
     <w:p>
       <w:pPr>
-        <w:pStyle w:val="ListParagraph"/>
+        <w:pStyle w:val="Lijstalinea"/>
         <w:numPr>
           <w:ilvl w:val="0"/>
           <w:numId w:val="3"/>
@@ -1363,12 +1363,12 @@
     </w:p>
     <w:p>
       <w:pPr>
-        <w:pStyle w:val="ListParagraph"/>
-      </w:pPr>
-    </w:p>
-    <w:p>
-      <w:pPr>
-        <w:pStyle w:val="ListParagraph"/>
+        <w:pStyle w:val="Lijstalinea"/>
+      </w:pPr>
+    </w:p>
+    <w:p>
+      <w:pPr>
+        <w:pStyle w:val="Lijstalinea"/>
         <w:numPr>
           <w:ilvl w:val="0"/>
           <w:numId w:val="3"/>
@@ -1394,13 +1394,13 @@
     </w:p>
     <w:p>
       <w:pPr>
-        <w:pStyle w:val="ListParagraph"/>
+        <w:pStyle w:val="Lijstalinea"/>
       </w:pPr>
     </w:p>
     <w:p/>
     <w:p>
       <w:pPr>
-        <w:pStyle w:val="ListParagraph"/>
+        <w:pStyle w:val="Lijstalinea"/>
         <w:numPr>
           <w:ilvl w:val="0"/>
           <w:numId w:val="3"/>
@@ -1418,7 +1418,7 @@
     </w:p>
     <w:p>
       <w:pPr>
-        <w:pStyle w:val="ListParagraph"/>
+        <w:pStyle w:val="Lijstalinea"/>
         <w:numPr>
           <w:ilvl w:val="0"/>
           <w:numId w:val="3"/>
@@ -1442,7 +1442,7 @@
     </w:p>
     <w:p>
       <w:pPr>
-        <w:pStyle w:val="ListParagraph"/>
+        <w:pStyle w:val="Lijstalinea"/>
         <w:numPr>
           <w:ilvl w:val="0"/>
           <w:numId w:val="3"/>
@@ -1457,7 +1457,7 @@
     </w:p>
     <w:p>
       <w:pPr>
-        <w:pStyle w:val="ListParagraph"/>
+        <w:pStyle w:val="Lijstalinea"/>
         <w:numPr>
           <w:ilvl w:val="0"/>
           <w:numId w:val="3"/>
@@ -1529,7 +1529,7 @@
     </w:p>
     <w:p>
       <w:pPr>
-        <w:pStyle w:val="ListParagraph"/>
+        <w:pStyle w:val="Lijstalinea"/>
         <w:numPr>
           <w:ilvl w:val="0"/>
           <w:numId w:val="3"/>
@@ -1625,46 +1625,85 @@
     </w:p>
     <w:p>
       <w:pPr>
-        <w:pStyle w:val="ListParagraph"/>
+        <w:pStyle w:val="Lijstalinea"/>
         <w:numPr>
           <w:ilvl w:val="0"/>
           <w:numId w:val="3"/>
         </w:numPr>
-      </w:pPr>
-      <w:r>
+        <w:rPr>
+          <w:highlight w:val="yellow"/>
+        </w:rPr>
+      </w:pPr>
+      <w:r>
+        <w:rPr>
+          <w:highlight w:val="yellow"/>
+        </w:rPr>
         <w:t xml:space="preserve">Create </w:t>
       </w:r>
       <w:r>
+        <w:rPr>
+          <w:highlight w:val="yellow"/>
+        </w:rPr>
         <w:t>migration</w:t>
       </w:r>
       <w:r>
+        <w:rPr>
+          <w:highlight w:val="yellow"/>
+        </w:rPr>
         <w:t xml:space="preserve"> gal</w:t>
       </w:r>
       <w:r>
+        <w:rPr>
+          <w:highlight w:val="yellow"/>
+        </w:rPr>
         <w:t>ler</w:t>
       </w:r>
       <w:r>
+        <w:rPr>
+          <w:highlight w:val="yellow"/>
+        </w:rPr>
         <w:t xml:space="preserve">ies </w:t>
       </w:r>
       <w:r>
+        <w:rPr>
+          <w:highlight w:val="yellow"/>
+        </w:rPr>
         <w:t xml:space="preserve">and </w:t>
       </w:r>
       <w:r>
+        <w:rPr>
+          <w:highlight w:val="yellow"/>
+        </w:rPr>
         <w:t>phase pla</w:t>
       </w:r>
       <w:r>
+        <w:rPr>
+          <w:highlight w:val="yellow"/>
+        </w:rPr>
         <w:t xml:space="preserve">ne fit </w:t>
       </w:r>
       <w:r>
+        <w:rPr>
+          <w:highlight w:val="yellow"/>
+        </w:rPr>
         <w:t xml:space="preserve">galleries </w:t>
       </w:r>
       <w:r>
+        <w:rPr>
+          <w:highlight w:val="yellow"/>
+        </w:rPr>
         <w:t>for fi</w:t>
       </w:r>
       <w:r>
+        <w:rPr>
+          <w:highlight w:val="yellow"/>
+        </w:rPr>
         <w:t>eld dat</w:t>
       </w:r>
       <w:r>
+        <w:rPr>
+          <w:highlight w:val="yellow"/>
+        </w:rPr>
         <w:t>a results</w:t>
       </w:r>
     </w:p>
@@ -1684,7 +1723,7 @@
     </w:p>
     <w:p>
       <w:pPr>
-        <w:pStyle w:val="ListParagraph"/>
+        <w:pStyle w:val="Lijstalinea"/>
         <w:numPr>
           <w:ilvl w:val="0"/>
           <w:numId w:val="4"/>
@@ -1696,7 +1735,7 @@
     </w:p>
     <w:p>
       <w:pPr>
-        <w:pStyle w:val="ListParagraph"/>
+        <w:pStyle w:val="Lijstalinea"/>
         <w:numPr>
           <w:ilvl w:val="0"/>
           <w:numId w:val="4"/>
@@ -1708,7 +1747,7 @@
     </w:p>
     <w:p>
       <w:pPr>
-        <w:pStyle w:val="ListParagraph"/>
+        <w:pStyle w:val="Lijstalinea"/>
         <w:numPr>
           <w:ilvl w:val="0"/>
           <w:numId w:val="4"/>
@@ -1728,7 +1767,7 @@
     </w:p>
     <w:p>
       <w:pPr>
-        <w:pStyle w:val="ListParagraph"/>
+        <w:pStyle w:val="Lijstalinea"/>
         <w:numPr>
           <w:ilvl w:val="0"/>
           <w:numId w:val="5"/>
@@ -1740,7 +1779,7 @@
     </w:p>
     <w:p>
       <w:pPr>
-        <w:pStyle w:val="ListParagraph"/>
+        <w:pStyle w:val="Lijstalinea"/>
         <w:numPr>
           <w:ilvl w:val="0"/>
           <w:numId w:val="5"/>
@@ -1752,7 +1791,7 @@
     </w:p>
     <w:p>
       <w:pPr>
-        <w:pStyle w:val="ListParagraph"/>
+        <w:pStyle w:val="Lijstalinea"/>
         <w:numPr>
           <w:ilvl w:val="0"/>
           <w:numId w:val="5"/>
@@ -1764,7 +1803,7 @@
     </w:p>
     <w:p>
       <w:pPr>
-        <w:pStyle w:val="ListParagraph"/>
+        <w:pStyle w:val="Lijstalinea"/>
         <w:numPr>
           <w:ilvl w:val="0"/>
           <w:numId w:val="5"/>
@@ -1777,7 +1816,7 @@
     <w:p/>
     <w:p>
       <w:pPr>
-        <w:pStyle w:val="ListParagraph"/>
+        <w:pStyle w:val="Lijstalinea"/>
         <w:numPr>
           <w:ilvl w:val="0"/>
           <w:numId w:val="1"/>
@@ -1824,7 +1863,7 @@
     </w:p>
     <w:p>
       <w:pPr>
-        <w:pStyle w:val="ListParagraph"/>
+        <w:pStyle w:val="Lijstalinea"/>
         <w:numPr>
           <w:ilvl w:val="0"/>
           <w:numId w:val="1"/>
@@ -1864,7 +1903,7 @@
     </w:p>
     <w:p>
       <w:pPr>
-        <w:pStyle w:val="ListParagraph"/>
+        <w:pStyle w:val="Lijstalinea"/>
         <w:numPr>
           <w:ilvl w:val="0"/>
           <w:numId w:val="1"/>
@@ -1904,7 +1943,7 @@
     </w:p>
     <w:p>
       <w:pPr>
-        <w:pStyle w:val="ListParagraph"/>
+        <w:pStyle w:val="Lijstalinea"/>
         <w:numPr>
           <w:ilvl w:val="0"/>
           <w:numId w:val="1"/>
@@ -1997,7 +2036,7 @@
     </w:p>
     <w:p>
       <w:pPr>
-        <w:pStyle w:val="ListParagraph"/>
+        <w:pStyle w:val="Lijstalinea"/>
         <w:numPr>
           <w:ilvl w:val="0"/>
           <w:numId w:val="7"/>
@@ -2079,7 +2118,7 @@
     </w:p>
     <w:p>
       <w:pPr>
-        <w:pStyle w:val="ListParagraph"/>
+        <w:pStyle w:val="Lijstalinea"/>
         <w:numPr>
           <w:ilvl w:val="1"/>
           <w:numId w:val="7"/>
@@ -2099,7 +2138,7 @@
     </w:p>
     <w:p>
       <w:pPr>
-        <w:pStyle w:val="ListParagraph"/>
+        <w:pStyle w:val="Lijstalinea"/>
         <w:numPr>
           <w:ilvl w:val="1"/>
           <w:numId w:val="7"/>
@@ -2126,7 +2165,7 @@
     </w:p>
     <w:p>
       <w:pPr>
-        <w:pStyle w:val="ListParagraph"/>
+        <w:pStyle w:val="Lijstalinea"/>
         <w:numPr>
           <w:ilvl w:val="0"/>
           <w:numId w:val="7"/>
@@ -2210,7 +2249,7 @@
     </w:p>
     <w:p>
       <w:pPr>
-        <w:pStyle w:val="ListParagraph"/>
+        <w:pStyle w:val="Lijstalinea"/>
         <w:numPr>
           <w:ilvl w:val="1"/>
           <w:numId w:val="7"/>
@@ -2230,7 +2269,7 @@
     </w:p>
     <w:p>
       <w:pPr>
-        <w:pStyle w:val="ListParagraph"/>
+        <w:pStyle w:val="Lijstalinea"/>
         <w:numPr>
           <w:ilvl w:val="1"/>
           <w:numId w:val="7"/>
@@ -2257,7 +2296,7 @@
     </w:p>
     <w:p>
       <w:pPr>
-        <w:pStyle w:val="ListParagraph"/>
+        <w:pStyle w:val="Lijstalinea"/>
         <w:numPr>
           <w:ilvl w:val="0"/>
           <w:numId w:val="7"/>
@@ -2346,7 +2385,7 @@
     </w:p>
     <w:p>
       <w:pPr>
-        <w:pStyle w:val="ListParagraph"/>
+        <w:pStyle w:val="Lijstalinea"/>
         <w:numPr>
           <w:ilvl w:val="1"/>
           <w:numId w:val="7"/>
@@ -2374,7 +2413,7 @@
     </w:p>
     <w:p>
       <w:pPr>
-        <w:pStyle w:val="ListParagraph"/>
+        <w:pStyle w:val="Lijstalinea"/>
         <w:numPr>
           <w:ilvl w:val="2"/>
           <w:numId w:val="7"/>
@@ -2389,7 +2428,7 @@
     </w:p>
     <w:p>
       <w:pPr>
-        <w:pStyle w:val="ListParagraph"/>
+        <w:pStyle w:val="Lijstalinea"/>
         <w:numPr>
           <w:ilvl w:val="2"/>
           <w:numId w:val="7"/>
@@ -2410,7 +2449,7 @@
     </w:p>
     <w:p>
       <w:pPr>
-        <w:pStyle w:val="ListParagraph"/>
+        <w:pStyle w:val="Lijstalinea"/>
         <w:numPr>
           <w:ilvl w:val="2"/>
           <w:numId w:val="7"/>
@@ -2431,7 +2470,7 @@
     </w:p>
     <w:p>
       <w:pPr>
-        <w:pStyle w:val="ListParagraph"/>
+        <w:pStyle w:val="Lijstalinea"/>
         <w:numPr>
           <w:ilvl w:val="2"/>
           <w:numId w:val="7"/>
@@ -2458,7 +2497,7 @@
     </w:p>
     <w:p>
       <w:pPr>
-        <w:pStyle w:val="ListParagraph"/>
+        <w:pStyle w:val="Lijstalinea"/>
         <w:numPr>
           <w:ilvl w:val="2"/>
           <w:numId w:val="7"/>
@@ -2485,7 +2524,7 @@
     </w:p>
     <w:p>
       <w:pPr>
-        <w:pStyle w:val="ListParagraph"/>
+        <w:pStyle w:val="Lijstalinea"/>
         <w:numPr>
           <w:ilvl w:val="1"/>
           <w:numId w:val="7"/>
@@ -2529,7 +2568,7 @@
     </w:p>
     <w:p>
       <w:pPr>
-        <w:pStyle w:val="ListParagraph"/>
+        <w:pStyle w:val="Lijstalinea"/>
         <w:numPr>
           <w:ilvl w:val="2"/>
           <w:numId w:val="7"/>
@@ -2550,7 +2589,7 @@
     </w:p>
     <w:p>
       <w:pPr>
-        <w:pStyle w:val="ListParagraph"/>
+        <w:pStyle w:val="Lijstalinea"/>
         <w:numPr>
           <w:ilvl w:val="2"/>
           <w:numId w:val="7"/>
@@ -2571,7 +2610,7 @@
     </w:p>
     <w:p>
       <w:pPr>
-        <w:pStyle w:val="ListParagraph"/>
+        <w:pStyle w:val="Lijstalinea"/>
         <w:numPr>
           <w:ilvl w:val="2"/>
           <w:numId w:val="7"/>
@@ -2598,7 +2637,7 @@
     </w:p>
     <w:p>
       <w:pPr>
-        <w:pStyle w:val="ListParagraph"/>
+        <w:pStyle w:val="Lijstalinea"/>
         <w:numPr>
           <w:ilvl w:val="2"/>
           <w:numId w:val="7"/>
@@ -2619,7 +2658,7 @@
     </w:p>
     <w:p>
       <w:pPr>
-        <w:pStyle w:val="ListParagraph"/>
+        <w:pStyle w:val="Lijstalinea"/>
         <w:numPr>
           <w:ilvl w:val="2"/>
           <w:numId w:val="7"/>
@@ -2741,7 +2780,7 @@
     </w:p>
     <w:p>
       <w:pPr>
-        <w:pStyle w:val="ListParagraph"/>
+        <w:pStyle w:val="Lijstalinea"/>
         <w:numPr>
           <w:ilvl w:val="0"/>
           <w:numId w:val="7"/>
@@ -2808,7 +2847,7 @@
     </w:p>
     <w:p>
       <w:pPr>
-        <w:pStyle w:val="ListParagraph"/>
+        <w:pStyle w:val="Lijstalinea"/>
         <w:numPr>
           <w:ilvl w:val="1"/>
           <w:numId w:val="7"/>
@@ -2828,7 +2867,7 @@
     </w:p>
     <w:p>
       <w:pPr>
-        <w:pStyle w:val="ListParagraph"/>
+        <w:pStyle w:val="Lijstalinea"/>
         <w:numPr>
           <w:ilvl w:val="1"/>
           <w:numId w:val="7"/>
@@ -2855,7 +2894,7 @@
     </w:p>
     <w:p>
       <w:pPr>
-        <w:pStyle w:val="ListParagraph"/>
+        <w:pStyle w:val="Lijstalinea"/>
         <w:numPr>
           <w:ilvl w:val="0"/>
           <w:numId w:val="7"/>
@@ -2928,7 +2967,7 @@
     </w:p>
     <w:p>
       <w:pPr>
-        <w:pStyle w:val="ListParagraph"/>
+        <w:pStyle w:val="Lijstalinea"/>
         <w:numPr>
           <w:ilvl w:val="0"/>
           <w:numId w:val="7"/>
@@ -4080,15 +4119,15 @@
     <w:lsdException w:name="Unresolved Mention" w:semiHidden="1" w:unhideWhenUsed="1"/>
     <w:lsdException w:name="Smart Link" w:semiHidden="1" w:unhideWhenUsed="1"/>
   </w:latentStyles>
-  <w:style w:type="paragraph" w:default="1" w:styleId="Normal">
+  <w:style w:type="paragraph" w:default="1" w:styleId="Standaard">
     <w:name w:val="Normal"/>
     <w:qFormat/>
   </w:style>
-  <w:style w:type="paragraph" w:styleId="Heading1">
+  <w:style w:type="paragraph" w:styleId="Kop1">
     <w:name w:val="heading 1"/>
-    <w:basedOn w:val="Normal"/>
-    <w:next w:val="Normal"/>
-    <w:link w:val="Heading1Char"/>
+    <w:basedOn w:val="Standaard"/>
+    <w:next w:val="Standaard"/>
+    <w:link w:val="Kop1Char"/>
     <w:uiPriority w:val="9"/>
     <w:qFormat/>
     <w:rsid w:val="005B10CC"/>
@@ -4105,11 +4144,11 @@
       <w:szCs w:val="40"/>
     </w:rPr>
   </w:style>
-  <w:style w:type="paragraph" w:styleId="Heading2">
+  <w:style w:type="paragraph" w:styleId="Kop2">
     <w:name w:val="heading 2"/>
-    <w:basedOn w:val="Normal"/>
-    <w:next w:val="Normal"/>
-    <w:link w:val="Heading2Char"/>
+    <w:basedOn w:val="Standaard"/>
+    <w:next w:val="Standaard"/>
+    <w:link w:val="Kop2Char"/>
     <w:uiPriority w:val="9"/>
     <w:semiHidden/>
     <w:unhideWhenUsed/>
@@ -4128,11 +4167,11 @@
       <w:szCs w:val="32"/>
     </w:rPr>
   </w:style>
-  <w:style w:type="paragraph" w:styleId="Heading3">
+  <w:style w:type="paragraph" w:styleId="Kop3">
     <w:name w:val="heading 3"/>
-    <w:basedOn w:val="Normal"/>
-    <w:next w:val="Normal"/>
-    <w:link w:val="Heading3Char"/>
+    <w:basedOn w:val="Standaard"/>
+    <w:next w:val="Standaard"/>
+    <w:link w:val="Kop3Char"/>
     <w:uiPriority w:val="9"/>
     <w:unhideWhenUsed/>
     <w:qFormat/>
@@ -4150,11 +4189,11 @@
       <w:szCs w:val="28"/>
     </w:rPr>
   </w:style>
-  <w:style w:type="paragraph" w:styleId="Heading4">
+  <w:style w:type="paragraph" w:styleId="Kop4">
     <w:name w:val="heading 4"/>
-    <w:basedOn w:val="Normal"/>
-    <w:next w:val="Normal"/>
-    <w:link w:val="Heading4Char"/>
+    <w:basedOn w:val="Standaard"/>
+    <w:next w:val="Standaard"/>
+    <w:link w:val="Kop4Char"/>
     <w:uiPriority w:val="9"/>
     <w:semiHidden/>
     <w:unhideWhenUsed/>
@@ -4173,11 +4212,11 @@
       <w:color w:val="0F4761" w:themeColor="accent1" w:themeShade="BF"/>
     </w:rPr>
   </w:style>
-  <w:style w:type="paragraph" w:styleId="Heading5">
+  <w:style w:type="paragraph" w:styleId="Kop5">
     <w:name w:val="heading 5"/>
-    <w:basedOn w:val="Normal"/>
-    <w:next w:val="Normal"/>
-    <w:link w:val="Heading5Char"/>
+    <w:basedOn w:val="Standaard"/>
+    <w:next w:val="Standaard"/>
+    <w:link w:val="Kop5Char"/>
     <w:uiPriority w:val="9"/>
     <w:semiHidden/>
     <w:unhideWhenUsed/>
@@ -4194,11 +4233,11 @@
       <w:color w:val="0F4761" w:themeColor="accent1" w:themeShade="BF"/>
     </w:rPr>
   </w:style>
-  <w:style w:type="paragraph" w:styleId="Heading6">
+  <w:style w:type="paragraph" w:styleId="Kop6">
     <w:name w:val="heading 6"/>
-    <w:basedOn w:val="Normal"/>
-    <w:next w:val="Normal"/>
-    <w:link w:val="Heading6Char"/>
+    <w:basedOn w:val="Standaard"/>
+    <w:next w:val="Standaard"/>
+    <w:link w:val="Kop6Char"/>
     <w:uiPriority w:val="9"/>
     <w:semiHidden/>
     <w:unhideWhenUsed/>
@@ -4217,11 +4256,11 @@
       <w:color w:val="595959" w:themeColor="text1" w:themeTint="A6"/>
     </w:rPr>
   </w:style>
-  <w:style w:type="paragraph" w:styleId="Heading7">
+  <w:style w:type="paragraph" w:styleId="Kop7">
     <w:name w:val="heading 7"/>
-    <w:basedOn w:val="Normal"/>
-    <w:next w:val="Normal"/>
-    <w:link w:val="Heading7Char"/>
+    <w:basedOn w:val="Standaard"/>
+    <w:next w:val="Standaard"/>
+    <w:link w:val="Kop7Char"/>
     <w:uiPriority w:val="9"/>
     <w:semiHidden/>
     <w:unhideWhenUsed/>
@@ -4238,11 +4277,11 @@
       <w:color w:val="595959" w:themeColor="text1" w:themeTint="A6"/>
     </w:rPr>
   </w:style>
-  <w:style w:type="paragraph" w:styleId="Heading8">
+  <w:style w:type="paragraph" w:styleId="Kop8">
     <w:name w:val="heading 8"/>
-    <w:basedOn w:val="Normal"/>
-    <w:next w:val="Normal"/>
-    <w:link w:val="Heading8Char"/>
+    <w:basedOn w:val="Standaard"/>
+    <w:next w:val="Standaard"/>
+    <w:link w:val="Kop8Char"/>
     <w:uiPriority w:val="9"/>
     <w:semiHidden/>
     <w:unhideWhenUsed/>
@@ -4261,11 +4300,11 @@
       <w:color w:val="272727" w:themeColor="text1" w:themeTint="D8"/>
     </w:rPr>
   </w:style>
-  <w:style w:type="paragraph" w:styleId="Heading9">
+  <w:style w:type="paragraph" w:styleId="Kop9">
     <w:name w:val="heading 9"/>
-    <w:basedOn w:val="Normal"/>
-    <w:next w:val="Normal"/>
-    <w:link w:val="Heading9Char"/>
+    <w:basedOn w:val="Standaard"/>
+    <w:next w:val="Standaard"/>
+    <w:link w:val="Kop9Char"/>
     <w:uiPriority w:val="9"/>
     <w:semiHidden/>
     <w:unhideWhenUsed/>
@@ -4282,12 +4321,13 @@
       <w:color w:val="272727" w:themeColor="text1" w:themeTint="D8"/>
     </w:rPr>
   </w:style>
-  <w:style w:type="character" w:default="1" w:styleId="DefaultParagraphFont">
+  <w:style w:type="character" w:default="1" w:styleId="Standaardalinea-lettertype">
     <w:name w:val="Default Paragraph Font"/>
     <w:uiPriority w:val="1"/>
+    <w:semiHidden/>
     <w:unhideWhenUsed/>
   </w:style>
-  <w:style w:type="table" w:default="1" w:styleId="TableNormal">
+  <w:style w:type="table" w:default="1" w:styleId="Standaardtabel">
     <w:name w:val="Normal Table"/>
     <w:uiPriority w:val="99"/>
     <w:semiHidden/>
@@ -4302,16 +4342,16 @@
       </w:tblCellMar>
     </w:tblPr>
   </w:style>
-  <w:style w:type="numbering" w:default="1" w:styleId="NoList">
+  <w:style w:type="numbering" w:default="1" w:styleId="Geenlijst">
     <w:name w:val="No List"/>
     <w:uiPriority w:val="99"/>
     <w:semiHidden/>
     <w:unhideWhenUsed/>
   </w:style>
-  <w:style w:type="character" w:customStyle="1" w:styleId="Heading1Char">
-    <w:name w:val="Heading 1 Char"/>
-    <w:basedOn w:val="DefaultParagraphFont"/>
-    <w:link w:val="Heading1"/>
+  <w:style w:type="character" w:customStyle="1" w:styleId="Kop1Char">
+    <w:name w:val="Kop 1 Char"/>
+    <w:basedOn w:val="Standaardalinea-lettertype"/>
+    <w:link w:val="Kop1"/>
     <w:uiPriority w:val="9"/>
     <w:rsid w:val="005B10CC"/>
     <w:rPr>
@@ -4321,10 +4361,10 @@
       <w:szCs w:val="40"/>
     </w:rPr>
   </w:style>
-  <w:style w:type="character" w:customStyle="1" w:styleId="Heading2Char">
-    <w:name w:val="Heading 2 Char"/>
-    <w:basedOn w:val="DefaultParagraphFont"/>
-    <w:link w:val="Heading2"/>
+  <w:style w:type="character" w:customStyle="1" w:styleId="Kop2Char">
+    <w:name w:val="Kop 2 Char"/>
+    <w:basedOn w:val="Standaardalinea-lettertype"/>
+    <w:link w:val="Kop2"/>
     <w:uiPriority w:val="9"/>
     <w:semiHidden/>
     <w:rsid w:val="005B10CC"/>
@@ -4335,10 +4375,10 @@
       <w:szCs w:val="32"/>
     </w:rPr>
   </w:style>
-  <w:style w:type="character" w:customStyle="1" w:styleId="Heading3Char">
-    <w:name w:val="Heading 3 Char"/>
-    <w:basedOn w:val="DefaultParagraphFont"/>
-    <w:link w:val="Heading3"/>
+  <w:style w:type="character" w:customStyle="1" w:styleId="Kop3Char">
+    <w:name w:val="Kop 3 Char"/>
+    <w:basedOn w:val="Standaardalinea-lettertype"/>
+    <w:link w:val="Kop3"/>
     <w:uiPriority w:val="9"/>
     <w:rsid w:val="005B10CC"/>
     <w:rPr>
@@ -4348,10 +4388,10 @@
       <w:szCs w:val="28"/>
     </w:rPr>
   </w:style>
-  <w:style w:type="character" w:customStyle="1" w:styleId="Heading4Char">
-    <w:name w:val="Heading 4 Char"/>
-    <w:basedOn w:val="DefaultParagraphFont"/>
-    <w:link w:val="Heading4"/>
+  <w:style w:type="character" w:customStyle="1" w:styleId="Kop4Char">
+    <w:name w:val="Kop 4 Char"/>
+    <w:basedOn w:val="Standaardalinea-lettertype"/>
+    <w:link w:val="Kop4"/>
     <w:uiPriority w:val="9"/>
     <w:semiHidden/>
     <w:rsid w:val="005B10CC"/>
@@ -4362,10 +4402,10 @@
       <w:color w:val="0F4761" w:themeColor="accent1" w:themeShade="BF"/>
     </w:rPr>
   </w:style>
-  <w:style w:type="character" w:customStyle="1" w:styleId="Heading5Char">
-    <w:name w:val="Heading 5 Char"/>
-    <w:basedOn w:val="DefaultParagraphFont"/>
-    <w:link w:val="Heading5"/>
+  <w:style w:type="character" w:customStyle="1" w:styleId="Kop5Char">
+    <w:name w:val="Kop 5 Char"/>
+    <w:basedOn w:val="Standaardalinea-lettertype"/>
+    <w:link w:val="Kop5"/>
     <w:uiPriority w:val="9"/>
     <w:semiHidden/>
     <w:rsid w:val="005B10CC"/>
@@ -4374,10 +4414,10 @@
       <w:color w:val="0F4761" w:themeColor="accent1" w:themeShade="BF"/>
     </w:rPr>
   </w:style>
-  <w:style w:type="character" w:customStyle="1" w:styleId="Heading6Char">
-    <w:name w:val="Heading 6 Char"/>
-    <w:basedOn w:val="DefaultParagraphFont"/>
-    <w:link w:val="Heading6"/>
+  <w:style w:type="character" w:customStyle="1" w:styleId="Kop6Char">
+    <w:name w:val="Kop 6 Char"/>
+    <w:basedOn w:val="Standaardalinea-lettertype"/>
+    <w:link w:val="Kop6"/>
     <w:uiPriority w:val="9"/>
     <w:semiHidden/>
     <w:rsid w:val="005B10CC"/>
@@ -4388,10 +4428,10 @@
       <w:color w:val="595959" w:themeColor="text1" w:themeTint="A6"/>
     </w:rPr>
   </w:style>
-  <w:style w:type="character" w:customStyle="1" w:styleId="Heading7Char">
-    <w:name w:val="Heading 7 Char"/>
-    <w:basedOn w:val="DefaultParagraphFont"/>
-    <w:link w:val="Heading7"/>
+  <w:style w:type="character" w:customStyle="1" w:styleId="Kop7Char">
+    <w:name w:val="Kop 7 Char"/>
+    <w:basedOn w:val="Standaardalinea-lettertype"/>
+    <w:link w:val="Kop7"/>
     <w:uiPriority w:val="9"/>
     <w:semiHidden/>
     <w:rsid w:val="005B10CC"/>
@@ -4400,10 +4440,10 @@
       <w:color w:val="595959" w:themeColor="text1" w:themeTint="A6"/>
     </w:rPr>
   </w:style>
-  <w:style w:type="character" w:customStyle="1" w:styleId="Heading8Char">
-    <w:name w:val="Heading 8 Char"/>
-    <w:basedOn w:val="DefaultParagraphFont"/>
-    <w:link w:val="Heading8"/>
+  <w:style w:type="character" w:customStyle="1" w:styleId="Kop8Char">
+    <w:name w:val="Kop 8 Char"/>
+    <w:basedOn w:val="Standaardalinea-lettertype"/>
+    <w:link w:val="Kop8"/>
     <w:uiPriority w:val="9"/>
     <w:semiHidden/>
     <w:rsid w:val="005B10CC"/>
@@ -4414,10 +4454,10 @@
       <w:color w:val="272727" w:themeColor="text1" w:themeTint="D8"/>
     </w:rPr>
   </w:style>
-  <w:style w:type="character" w:customStyle="1" w:styleId="Heading9Char">
-    <w:name w:val="Heading 9 Char"/>
-    <w:basedOn w:val="DefaultParagraphFont"/>
-    <w:link w:val="Heading9"/>
+  <w:style w:type="character" w:customStyle="1" w:styleId="Kop9Char">
+    <w:name w:val="Kop 9 Char"/>
+    <w:basedOn w:val="Standaardalinea-lettertype"/>
+    <w:link w:val="Kop9"/>
     <w:uiPriority w:val="9"/>
     <w:semiHidden/>
     <w:rsid w:val="005B10CC"/>
@@ -4426,11 +4466,11 @@
       <w:color w:val="272727" w:themeColor="text1" w:themeTint="D8"/>
     </w:rPr>
   </w:style>
-  <w:style w:type="paragraph" w:styleId="Title">
+  <w:style w:type="paragraph" w:styleId="Titel">
     <w:name w:val="Title"/>
-    <w:basedOn w:val="Normal"/>
-    <w:next w:val="Normal"/>
-    <w:link w:val="TitleChar"/>
+    <w:basedOn w:val="Standaard"/>
+    <w:next w:val="Standaard"/>
+    <w:link w:val="TitelChar"/>
     <w:uiPriority w:val="10"/>
     <w:qFormat/>
     <w:rsid w:val="005B10CC"/>
@@ -4446,10 +4486,10 @@
       <w:szCs w:val="56"/>
     </w:rPr>
   </w:style>
-  <w:style w:type="character" w:customStyle="1" w:styleId="TitleChar">
-    <w:name w:val="Title Char"/>
-    <w:basedOn w:val="DefaultParagraphFont"/>
-    <w:link w:val="Title"/>
+  <w:style w:type="character" w:customStyle="1" w:styleId="TitelChar">
+    <w:name w:val="Titel Char"/>
+    <w:basedOn w:val="Standaardalinea-lettertype"/>
+    <w:link w:val="Titel"/>
     <w:uiPriority w:val="10"/>
     <w:rsid w:val="005B10CC"/>
     <w:rPr>
@@ -4460,11 +4500,11 @@
       <w:szCs w:val="56"/>
     </w:rPr>
   </w:style>
-  <w:style w:type="paragraph" w:styleId="Subtitle">
+  <w:style w:type="paragraph" w:styleId="Ondertitel">
     <w:name w:val="Subtitle"/>
-    <w:basedOn w:val="Normal"/>
-    <w:next w:val="Normal"/>
-    <w:link w:val="SubtitleChar"/>
+    <w:basedOn w:val="Standaard"/>
+    <w:next w:val="Standaard"/>
+    <w:link w:val="OndertitelChar"/>
     <w:uiPriority w:val="11"/>
     <w:qFormat/>
     <w:rsid w:val="005B10CC"/>
@@ -4481,10 +4521,10 @@
       <w:szCs w:val="28"/>
     </w:rPr>
   </w:style>
-  <w:style w:type="character" w:customStyle="1" w:styleId="SubtitleChar">
-    <w:name w:val="Subtitle Char"/>
-    <w:basedOn w:val="DefaultParagraphFont"/>
-    <w:link w:val="Subtitle"/>
+  <w:style w:type="character" w:customStyle="1" w:styleId="OndertitelChar">
+    <w:name w:val="Ondertitel Char"/>
+    <w:basedOn w:val="Standaardalinea-lettertype"/>
+    <w:link w:val="Ondertitel"/>
     <w:uiPriority w:val="11"/>
     <w:rsid w:val="005B10CC"/>
     <w:rPr>
@@ -4495,11 +4535,11 @@
       <w:szCs w:val="28"/>
     </w:rPr>
   </w:style>
-  <w:style w:type="paragraph" w:styleId="Quote">
+  <w:style w:type="paragraph" w:styleId="Citaat">
     <w:name w:val="Quote"/>
-    <w:basedOn w:val="Normal"/>
-    <w:next w:val="Normal"/>
-    <w:link w:val="QuoteChar"/>
+    <w:basedOn w:val="Standaard"/>
+    <w:next w:val="Standaard"/>
+    <w:link w:val="CitaatChar"/>
     <w:uiPriority w:val="29"/>
     <w:qFormat/>
     <w:rsid w:val="005B10CC"/>
@@ -4513,10 +4553,10 @@
       <w:color w:val="404040" w:themeColor="text1" w:themeTint="BF"/>
     </w:rPr>
   </w:style>
-  <w:style w:type="character" w:customStyle="1" w:styleId="QuoteChar">
-    <w:name w:val="Quote Char"/>
-    <w:basedOn w:val="DefaultParagraphFont"/>
-    <w:link w:val="Quote"/>
+  <w:style w:type="character" w:customStyle="1" w:styleId="CitaatChar">
+    <w:name w:val="Citaat Char"/>
+    <w:basedOn w:val="Standaardalinea-lettertype"/>
+    <w:link w:val="Citaat"/>
     <w:uiPriority w:val="29"/>
     <w:rsid w:val="005B10CC"/>
     <w:rPr>
@@ -4525,9 +4565,9 @@
       <w:color w:val="404040" w:themeColor="text1" w:themeTint="BF"/>
     </w:rPr>
   </w:style>
-  <w:style w:type="paragraph" w:styleId="ListParagraph">
+  <w:style w:type="paragraph" w:styleId="Lijstalinea">
     <w:name w:val="List Paragraph"/>
-    <w:basedOn w:val="Normal"/>
+    <w:basedOn w:val="Standaard"/>
     <w:uiPriority w:val="34"/>
     <w:qFormat/>
     <w:rsid w:val="005B10CC"/>
@@ -4536,9 +4576,9 @@
       <w:contextualSpacing/>
     </w:pPr>
   </w:style>
-  <w:style w:type="character" w:styleId="IntenseEmphasis">
+  <w:style w:type="character" w:styleId="Intensievebenadrukking">
     <w:name w:val="Intense Emphasis"/>
-    <w:basedOn w:val="DefaultParagraphFont"/>
+    <w:basedOn w:val="Standaardalinea-lettertype"/>
     <w:uiPriority w:val="21"/>
     <w:qFormat/>
     <w:rsid w:val="005B10CC"/>
@@ -4548,11 +4588,11 @@
       <w:color w:val="0F4761" w:themeColor="accent1" w:themeShade="BF"/>
     </w:rPr>
   </w:style>
-  <w:style w:type="paragraph" w:styleId="IntenseQuote">
+  <w:style w:type="paragraph" w:styleId="Duidelijkcitaat">
     <w:name w:val="Intense Quote"/>
-    <w:basedOn w:val="Normal"/>
-    <w:next w:val="Normal"/>
-    <w:link w:val="IntenseQuoteChar"/>
+    <w:basedOn w:val="Standaard"/>
+    <w:next w:val="Standaard"/>
+    <w:link w:val="DuidelijkcitaatChar"/>
     <w:uiPriority w:val="30"/>
     <w:qFormat/>
     <w:rsid w:val="005B10CC"/>
@@ -4571,10 +4611,10 @@
       <w:color w:val="0F4761" w:themeColor="accent1" w:themeShade="BF"/>
     </w:rPr>
   </w:style>
-  <w:style w:type="character" w:customStyle="1" w:styleId="IntenseQuoteChar">
-    <w:name w:val="Intense Quote Char"/>
-    <w:basedOn w:val="DefaultParagraphFont"/>
-    <w:link w:val="IntenseQuote"/>
+  <w:style w:type="character" w:customStyle="1" w:styleId="DuidelijkcitaatChar">
+    <w:name w:val="Duidelijk citaat Char"/>
+    <w:basedOn w:val="Standaardalinea-lettertype"/>
+    <w:link w:val="Duidelijkcitaat"/>
     <w:uiPriority w:val="30"/>
     <w:rsid w:val="005B10CC"/>
     <w:rPr>
@@ -4583,9 +4623,9 @@
       <w:color w:val="0F4761" w:themeColor="accent1" w:themeShade="BF"/>
     </w:rPr>
   </w:style>
-  <w:style w:type="character" w:styleId="IntenseReference">
+  <w:style w:type="character" w:styleId="Intensieveverwijzing">
     <w:name w:val="Intense Reference"/>
-    <w:basedOn w:val="DefaultParagraphFont"/>
+    <w:basedOn w:val="Standaardalinea-lettertype"/>
     <w:uiPriority w:val="32"/>
     <w:qFormat/>
     <w:rsid w:val="005B10CC"/>
@@ -4597,9 +4637,9 @@
       <w:spacing w:val="5"/>
     </w:rPr>
   </w:style>
-  <w:style w:type="table" w:styleId="TableGrid">
+  <w:style w:type="table" w:styleId="Tabelraster">
     <w:name w:val="Table Grid"/>
-    <w:basedOn w:val="TableNormal"/>
+    <w:basedOn w:val="Standaardtabel"/>
     <w:uiPriority w:val="39"/>
     <w:rsid w:val="0024613D"/>
     <w:pPr>

</xml_diff>

<commit_message>
Trial 3D to 2D correction
</commit_message>
<xml_diff>
--- a/TimeLapse_LaTeX/Thesis/working summary.docx
+++ b/TimeLapse_LaTeX/Thesis/working summary.docx
@@ -90,7 +90,7 @@
     </w:p>
     <w:p>
       <w:pPr>
-        <w:pStyle w:val="Lijstalinea"/>
+        <w:pStyle w:val="ListParagraph"/>
         <w:numPr>
           <w:ilvl w:val="0"/>
           <w:numId w:val="4"/>
@@ -105,7 +105,7 @@
     </w:p>
     <w:p>
       <w:pPr>
-        <w:pStyle w:val="Lijstalinea"/>
+        <w:pStyle w:val="ListParagraph"/>
         <w:numPr>
           <w:ilvl w:val="0"/>
           <w:numId w:val="4"/>
@@ -117,7 +117,7 @@
     </w:p>
     <w:p>
       <w:pPr>
-        <w:pStyle w:val="Lijstalinea"/>
+        <w:pStyle w:val="ListParagraph"/>
         <w:numPr>
           <w:ilvl w:val="0"/>
           <w:numId w:val="4"/>
@@ -129,7 +129,7 @@
     </w:p>
     <w:p>
       <w:pPr>
-        <w:pStyle w:val="Lijstalinea"/>
+        <w:pStyle w:val="ListParagraph"/>
       </w:pPr>
     </w:p>
     <w:p>
@@ -151,18 +151,13 @@
       <w:r>
         <w:tab/>
       </w:r>
-      <w:proofErr w:type="gramStart"/>
-      <w:r>
-        <w:t>All of</w:t>
-      </w:r>
-      <w:proofErr w:type="gramEnd"/>
-      <w:r>
-        <w:t xml:space="preserve"> the materials and methods common to two or more experiments—specifically excluding the experimental procedure for each experiment.</w:t>
-      </w:r>
-    </w:p>
-    <w:p>
-      <w:pPr>
-        <w:pStyle w:val="Lijstalinea"/>
+      <w:r>
+        <w:t>All of the materials and methods common to two or more experiments—specifically excluding the experimental procedure for each experiment.</w:t>
+      </w:r>
+    </w:p>
+    <w:p>
+      <w:pPr>
+        <w:pStyle w:val="ListParagraph"/>
         <w:numPr>
           <w:ilvl w:val="0"/>
           <w:numId w:val="4"/>
@@ -174,24 +169,19 @@
     </w:p>
     <w:p>
       <w:pPr>
-        <w:pStyle w:val="Lijstalinea"/>
+        <w:pStyle w:val="ListParagraph"/>
         <w:numPr>
           <w:ilvl w:val="0"/>
           <w:numId w:val="4"/>
         </w:numPr>
       </w:pPr>
       <w:r>
-        <w:t xml:space="preserve">Discuss </w:t>
-      </w:r>
-      <w:proofErr w:type="spellStart"/>
-      <w:r>
-        <w:t>gprMax</w:t>
-      </w:r>
-      <w:proofErr w:type="spellEnd"/>
-    </w:p>
-    <w:p>
-      <w:pPr>
-        <w:pStyle w:val="Lijstalinea"/>
+        <w:t>Discuss gprMax</w:t>
+      </w:r>
+    </w:p>
+    <w:p>
+      <w:pPr>
+        <w:pStyle w:val="ListParagraph"/>
         <w:numPr>
           <w:ilvl w:val="0"/>
           <w:numId w:val="4"/>
@@ -203,7 +193,7 @@
     </w:p>
     <w:p>
       <w:pPr>
-        <w:pStyle w:val="Lijstalinea"/>
+        <w:pStyle w:val="ListParagraph"/>
         <w:numPr>
           <w:ilvl w:val="0"/>
           <w:numId w:val="4"/>
@@ -474,31 +464,7 @@
         <w:shd w:val="clear" w:color="auto" w:fill="83CAEB" w:themeFill="accent1" w:themeFillTint="66"/>
       </w:pPr>
       <w:r>
-        <w:t xml:space="preserve">Run </w:t>
-      </w:r>
-      <w:proofErr w:type="spellStart"/>
-      <w:r>
-        <w:t>gpr</w:t>
-      </w:r>
-      <w:proofErr w:type="spellEnd"/>
-      <w:r>
-        <w:t xml:space="preserve"> simulations for 2 </w:t>
-      </w:r>
-      <w:proofErr w:type="gramStart"/>
-      <w:r>
-        <w:t>lambda</w:t>
-      </w:r>
-      <w:proofErr w:type="gramEnd"/>
-      <w:r>
-        <w:t xml:space="preserve"> to 1/32 lambda movement and see if we can infer this movement using amplitude and </w:t>
-      </w:r>
-      <w:proofErr w:type="gramStart"/>
-      <w:r>
-        <w:t>phase based</w:t>
-      </w:r>
-      <w:proofErr w:type="gramEnd"/>
-      <w:r>
-        <w:t xml:space="preserve"> techniques</w:t>
+        <w:t>Run gpr simulations for 2 lambda to 1/32 lambda movement and see if we can infer this movement using amplitude and phase based techniques</w:t>
       </w:r>
     </w:p>
     <w:p/>
@@ -519,39 +485,7 @@
         <w:shd w:val="clear" w:color="auto" w:fill="E8E8E8" w:themeFill="background2"/>
       </w:pPr>
       <w:r>
-        <w:t xml:space="preserve">Tracking </w:t>
-      </w:r>
-      <w:proofErr w:type="spellStart"/>
-      <w:r>
-        <w:t>del_phi</w:t>
-      </w:r>
-      <w:proofErr w:type="spellEnd"/>
-      <w:r>
-        <w:t>/</w:t>
-      </w:r>
-      <w:proofErr w:type="spellStart"/>
-      <w:r>
-        <w:t>del_x</w:t>
-      </w:r>
-      <w:proofErr w:type="spellEnd"/>
-      <w:r>
-        <w:t xml:space="preserve"> and </w:t>
-      </w:r>
-      <w:proofErr w:type="spellStart"/>
-      <w:r>
-        <w:t>del_phi</w:t>
-      </w:r>
-      <w:proofErr w:type="spellEnd"/>
-      <w:r>
-        <w:t>/</w:t>
-      </w:r>
-      <w:proofErr w:type="spellStart"/>
-      <w:r>
-        <w:t>del_y</w:t>
-      </w:r>
-      <w:proofErr w:type="spellEnd"/>
-      <w:r>
-        <w:t xml:space="preserve"> to infer horizontal and vertical translation</w:t>
+        <w:t>Tracking del_phi/del_x and del_phi/del_y to infer horizontal and vertical translation</w:t>
       </w:r>
     </w:p>
     <w:p>
@@ -624,23 +558,7 @@
         <w:shd w:val="clear" w:color="auto" w:fill="B3E5A1" w:themeFill="accent6" w:themeFillTint="66"/>
       </w:pPr>
       <w:r>
-        <w:t xml:space="preserve">Run </w:t>
-      </w:r>
-      <w:proofErr w:type="spellStart"/>
-      <w:r>
-        <w:t>gpr</w:t>
-      </w:r>
-      <w:proofErr w:type="spellEnd"/>
-      <w:r>
-        <w:t xml:space="preserve"> simulations for scatterers changing material properties and a moving fluid front and see if we can infer this movement using amplitude and </w:t>
-      </w:r>
-      <w:proofErr w:type="gramStart"/>
-      <w:r>
-        <w:t>phase based</w:t>
-      </w:r>
-      <w:proofErr w:type="gramEnd"/>
-      <w:r>
-        <w:t xml:space="preserve"> techniques and see if we can infer the material change</w:t>
+        <w:t>Run gpr simulations for scatterers changing material properties and a moving fluid front and see if we can infer this movement using amplitude and phase based techniques and see if we can infer the material change</w:t>
       </w:r>
     </w:p>
     <w:p/>
@@ -981,7 +899,7 @@
     </w:p>
     <w:p>
       <w:pPr>
-        <w:pStyle w:val="Lijstalinea"/>
+        <w:pStyle w:val="ListParagraph"/>
         <w:numPr>
           <w:ilvl w:val="0"/>
           <w:numId w:val="4"/>
@@ -993,7 +911,7 @@
     </w:p>
     <w:p>
       <w:pPr>
-        <w:pStyle w:val="Lijstalinea"/>
+        <w:pStyle w:val="ListParagraph"/>
         <w:numPr>
           <w:ilvl w:val="0"/>
           <w:numId w:val="4"/>
@@ -1005,7 +923,7 @@
     </w:p>
     <w:p>
       <w:pPr>
-        <w:pStyle w:val="Lijstalinea"/>
+        <w:pStyle w:val="ListParagraph"/>
         <w:numPr>
           <w:ilvl w:val="0"/>
           <w:numId w:val="4"/>
@@ -1071,7 +989,7 @@
     </w:p>
     <w:p>
       <w:pPr>
-        <w:pStyle w:val="Lijstalinea"/>
+        <w:pStyle w:val="ListParagraph"/>
         <w:numPr>
           <w:ilvl w:val="0"/>
           <w:numId w:val="3"/>
@@ -1107,7 +1025,7 @@
     </w:p>
     <w:p>
       <w:pPr>
-        <w:pStyle w:val="Lijstalinea"/>
+        <w:pStyle w:val="ListParagraph"/>
         <w:numPr>
           <w:ilvl w:val="1"/>
           <w:numId w:val="3"/>
@@ -1116,26 +1034,16 @@
           <w:highlight w:val="yellow"/>
         </w:rPr>
       </w:pPr>
-      <w:proofErr w:type="spellStart"/>
-      <w:proofErr w:type="gramStart"/>
       <w:r>
         <w:rPr>
           <w:highlight w:val="yellow"/>
         </w:rPr>
-        <w:t>prof.rd</w:t>
-      </w:r>
-      <w:proofErr w:type="spellEnd"/>
-      <w:proofErr w:type="gramEnd"/>
-      <w:r>
-        <w:rPr>
-          <w:highlight w:val="yellow"/>
-        </w:rPr>
-        <w:t xml:space="preserve"> is the reference</w:t>
-      </w:r>
-    </w:p>
-    <w:p>
-      <w:pPr>
-        <w:pStyle w:val="Lijstalinea"/>
+        <w:t>prof.rd is the reference</w:t>
+      </w:r>
+    </w:p>
+    <w:p>
+      <w:pPr>
+        <w:pStyle w:val="ListParagraph"/>
         <w:numPr>
           <w:ilvl w:val="1"/>
           <w:numId w:val="3"/>
@@ -1160,7 +1068,7 @@
     </w:p>
     <w:p>
       <w:pPr>
-        <w:pStyle w:val="Lijstalinea"/>
+        <w:pStyle w:val="ListParagraph"/>
         <w:numPr>
           <w:ilvl w:val="0"/>
           <w:numId w:val="3"/>
@@ -1173,7 +1081,7 @@
     <w:p/>
     <w:p>
       <w:pPr>
-        <w:pStyle w:val="Lijstalinea"/>
+        <w:pStyle w:val="ListParagraph"/>
         <w:numPr>
           <w:ilvl w:val="0"/>
           <w:numId w:val="3"/>
@@ -1192,7 +1100,7 @@
     <w:p/>
     <w:p>
       <w:pPr>
-        <w:pStyle w:val="Lijstalinea"/>
+        <w:pStyle w:val="ListParagraph"/>
         <w:numPr>
           <w:ilvl w:val="0"/>
           <w:numId w:val="3"/>
@@ -1211,7 +1119,7 @@
     <w:p/>
     <w:p>
       <w:pPr>
-        <w:pStyle w:val="Lijstalinea"/>
+        <w:pStyle w:val="ListParagraph"/>
         <w:numPr>
           <w:ilvl w:val="0"/>
           <w:numId w:val="3"/>
@@ -1229,7 +1137,7 @@
     </w:p>
     <w:p>
       <w:pPr>
-        <w:pStyle w:val="Lijstalinea"/>
+        <w:pStyle w:val="ListParagraph"/>
         <w:numPr>
           <w:ilvl w:val="1"/>
           <w:numId w:val="3"/>
@@ -1241,7 +1149,7 @@
     </w:p>
     <w:p>
       <w:pPr>
-        <w:pStyle w:val="Lijstalinea"/>
+        <w:pStyle w:val="ListParagraph"/>
         <w:numPr>
           <w:ilvl w:val="1"/>
           <w:numId w:val="3"/>
@@ -1253,7 +1161,7 @@
     </w:p>
     <w:p>
       <w:pPr>
-        <w:pStyle w:val="Lijstalinea"/>
+        <w:pStyle w:val="ListParagraph"/>
         <w:numPr>
           <w:ilvl w:val="1"/>
           <w:numId w:val="3"/>
@@ -1306,7 +1214,7 @@
     <w:p/>
     <w:p>
       <w:pPr>
-        <w:pStyle w:val="Lijstalinea"/>
+        <w:pStyle w:val="ListParagraph"/>
         <w:numPr>
           <w:ilvl w:val="0"/>
           <w:numId w:val="3"/>
@@ -1319,15 +1227,7 @@
         <w:t>Investigate in literature</w:t>
       </w:r>
       <w:r>
-        <w:t xml:space="preserve"> for back-propagation how pre-processing is done before playing it back in </w:t>
-      </w:r>
-      <w:proofErr w:type="spellStart"/>
-      <w:r>
-        <w:t>gprMax</w:t>
-      </w:r>
-      <w:proofErr w:type="spellEnd"/>
-      <w:r>
-        <w:t xml:space="preserve"> to </w:t>
+        <w:t xml:space="preserve"> for back-propagation how pre-processing is done before playing it back in gprMax to </w:t>
       </w:r>
       <w:r>
         <w:t xml:space="preserve">get rid of the noise. Or maybe mask a large Region of Influence around the event before migrating it. Make sure to get most of the energy and get rid of the early </w:t>
@@ -1363,12 +1263,12 @@
     </w:p>
     <w:p>
       <w:pPr>
-        <w:pStyle w:val="Lijstalinea"/>
-      </w:pPr>
-    </w:p>
-    <w:p>
-      <w:pPr>
-        <w:pStyle w:val="Lijstalinea"/>
+        <w:pStyle w:val="ListParagraph"/>
+      </w:pPr>
+    </w:p>
+    <w:p>
+      <w:pPr>
+        <w:pStyle w:val="ListParagraph"/>
         <w:numPr>
           <w:ilvl w:val="0"/>
           <w:numId w:val="3"/>
@@ -1378,15 +1278,7 @@
         <w:t>Remember that when taking measurements at two points in time, there can be overlap in</w:t>
       </w:r>
       <w:r>
-        <w:t xml:space="preserve"> the location of the fluid front, so when taking the difference, it will not highlight. </w:t>
-      </w:r>
-      <w:proofErr w:type="gramStart"/>
-      <w:r>
-        <w:t>Also</w:t>
-      </w:r>
-      <w:proofErr w:type="gramEnd"/>
-      <w:r>
-        <w:t xml:space="preserve"> when taking a B-scan it takes time</w:t>
+        <w:t xml:space="preserve"> the location of the fluid front, so when taking the difference, it will not highlight. Also when taking a B-scan it takes time</w:t>
       </w:r>
       <w:r>
         <w:t xml:space="preserve"> (~1 min), and during that time, the fluid front might have moved.</w:t>
@@ -1394,13 +1286,13 @@
     </w:p>
     <w:p>
       <w:pPr>
-        <w:pStyle w:val="Lijstalinea"/>
+        <w:pStyle w:val="ListParagraph"/>
       </w:pPr>
     </w:p>
     <w:p/>
     <w:p>
       <w:pPr>
-        <w:pStyle w:val="Lijstalinea"/>
+        <w:pStyle w:val="ListParagraph"/>
         <w:numPr>
           <w:ilvl w:val="0"/>
           <w:numId w:val="3"/>
@@ -1418,7 +1310,7 @@
     </w:p>
     <w:p>
       <w:pPr>
-        <w:pStyle w:val="Lijstalinea"/>
+        <w:pStyle w:val="ListParagraph"/>
         <w:numPr>
           <w:ilvl w:val="0"/>
           <w:numId w:val="3"/>
@@ -1442,7 +1334,7 @@
     </w:p>
     <w:p>
       <w:pPr>
-        <w:pStyle w:val="Lijstalinea"/>
+        <w:pStyle w:val="ListParagraph"/>
         <w:numPr>
           <w:ilvl w:val="0"/>
           <w:numId w:val="3"/>
@@ -1457,79 +1349,145 @@
     </w:p>
     <w:p>
       <w:pPr>
-        <w:pStyle w:val="Lijstalinea"/>
+        <w:pStyle w:val="ListParagraph"/>
         <w:numPr>
           <w:ilvl w:val="0"/>
           <w:numId w:val="3"/>
         </w:numPr>
-      </w:pPr>
-      <w:r>
+        <w:rPr>
+          <w:highlight w:val="yellow"/>
+        </w:rPr>
+      </w:pPr>
+      <w:r>
+        <w:rPr>
+          <w:highlight w:val="yellow"/>
+        </w:rPr>
         <w:t>Creat</w:t>
       </w:r>
       <w:r>
+        <w:rPr>
+          <w:highlight w:val="yellow"/>
+        </w:rPr>
         <w:t xml:space="preserve">e </w:t>
       </w:r>
       <w:r>
+        <w:rPr>
+          <w:highlight w:val="yellow"/>
+        </w:rPr>
         <w:t>migr</w:t>
       </w:r>
       <w:r>
+        <w:rPr>
+          <w:highlight w:val="yellow"/>
+        </w:rPr>
         <w:t xml:space="preserve">ation </w:t>
       </w:r>
       <w:r>
+        <w:rPr>
+          <w:highlight w:val="yellow"/>
+        </w:rPr>
         <w:t xml:space="preserve">galleries and </w:t>
       </w:r>
       <w:r>
+        <w:rPr>
+          <w:highlight w:val="yellow"/>
+        </w:rPr>
         <w:t>PSF</w:t>
       </w:r>
       <w:r>
+        <w:rPr>
+          <w:highlight w:val="yellow"/>
+        </w:rPr>
         <w:t>’</w:t>
       </w:r>
       <w:r>
+        <w:rPr>
+          <w:highlight w:val="yellow"/>
+        </w:rPr>
         <w:t>s for n</w:t>
       </w:r>
       <w:r>
+        <w:rPr>
+          <w:highlight w:val="yellow"/>
+        </w:rPr>
         <w:t>oisy resu</w:t>
       </w:r>
       <w:r>
+        <w:rPr>
+          <w:highlight w:val="yellow"/>
+        </w:rPr>
         <w:t>lts and make</w:t>
       </w:r>
       <w:r>
+        <w:rPr>
+          <w:highlight w:val="yellow"/>
+        </w:rPr>
         <w:t xml:space="preserve"> sure all the </w:t>
       </w:r>
       <w:r>
+        <w:rPr>
+          <w:highlight w:val="yellow"/>
+        </w:rPr>
         <w:t>phase pl</w:t>
       </w:r>
       <w:r>
+        <w:rPr>
+          <w:highlight w:val="yellow"/>
+        </w:rPr>
         <w:t>ane fit image</w:t>
       </w:r>
       <w:r>
+        <w:rPr>
+          <w:highlight w:val="yellow"/>
+        </w:rPr>
         <w:t>s exist for</w:t>
       </w:r>
       <w:r>
+        <w:rPr>
+          <w:highlight w:val="yellow"/>
+        </w:rPr>
         <w:t xml:space="preserve"> all scenari</w:t>
       </w:r>
       <w:r>
+        <w:rPr>
+          <w:highlight w:val="yellow"/>
+        </w:rPr>
         <w:t xml:space="preserve">os, all </w:t>
       </w:r>
       <w:r>
+        <w:rPr>
+          <w:highlight w:val="yellow"/>
+        </w:rPr>
         <w:t xml:space="preserve">migration </w:t>
       </w:r>
       <w:r>
+        <w:rPr>
+          <w:highlight w:val="yellow"/>
+        </w:rPr>
         <w:t xml:space="preserve">methods, </w:t>
       </w:r>
       <w:r>
+        <w:rPr>
+          <w:highlight w:val="yellow"/>
+        </w:rPr>
         <w:t xml:space="preserve">including </w:t>
       </w:r>
       <w:r>
+        <w:rPr>
+          <w:highlight w:val="yellow"/>
+        </w:rPr>
         <w:t>wi</w:t>
       </w:r>
       <w:r>
+        <w:rPr>
+          <w:highlight w:val="yellow"/>
+        </w:rPr>
         <w:t>th noise</w:t>
       </w:r>
     </w:p>
     <w:p>
       <w:pPr>
-        <w:pStyle w:val="Lijstalinea"/>
+        <w:pStyle w:val="ListParagraph"/>
         <w:numPr>
           <w:ilvl w:val="0"/>
           <w:numId w:val="3"/>
@@ -1625,7 +1583,7 @@
     </w:p>
     <w:p>
       <w:pPr>
-        <w:pStyle w:val="Lijstalinea"/>
+        <w:pStyle w:val="ListParagraph"/>
         <w:numPr>
           <w:ilvl w:val="0"/>
           <w:numId w:val="3"/>
@@ -1709,13 +1667,8 @@
     </w:p>
     <w:p/>
     <w:p>
-      <w:proofErr w:type="gramStart"/>
-      <w:r>
-        <w:t>In order to</w:t>
-      </w:r>
-      <w:proofErr w:type="gramEnd"/>
-      <w:r>
-        <w:t xml:space="preserve"> write paragraph-per-paragraph, topic-per-topic</w:t>
+      <w:r>
+        <w:t>In order to write paragraph-per-paragraph, topic-per-topic</w:t>
       </w:r>
       <w:r>
         <w:t xml:space="preserve"> have this in order:</w:t>
@@ -1723,7 +1676,7 @@
     </w:p>
     <w:p>
       <w:pPr>
-        <w:pStyle w:val="Lijstalinea"/>
+        <w:pStyle w:val="ListParagraph"/>
         <w:numPr>
           <w:ilvl w:val="0"/>
           <w:numId w:val="4"/>
@@ -1735,7 +1688,7 @@
     </w:p>
     <w:p>
       <w:pPr>
-        <w:pStyle w:val="Lijstalinea"/>
+        <w:pStyle w:val="ListParagraph"/>
         <w:numPr>
           <w:ilvl w:val="0"/>
           <w:numId w:val="4"/>
@@ -1747,27 +1700,19 @@
     </w:p>
     <w:p>
       <w:pPr>
-        <w:pStyle w:val="Lijstalinea"/>
+        <w:pStyle w:val="ListParagraph"/>
         <w:numPr>
           <w:ilvl w:val="0"/>
           <w:numId w:val="4"/>
         </w:numPr>
       </w:pPr>
       <w:r>
-        <w:t xml:space="preserve">Have on </w:t>
-      </w:r>
-      <w:proofErr w:type="spellStart"/>
-      <w:r>
-        <w:t>notebookLM</w:t>
-      </w:r>
-      <w:proofErr w:type="spellEnd"/>
-      <w:r>
-        <w:t xml:space="preserve"> per main topic group:</w:t>
-      </w:r>
-    </w:p>
-    <w:p>
-      <w:pPr>
-        <w:pStyle w:val="Lijstalinea"/>
+        <w:t>Have on notebookLM per main topic group:</w:t>
+      </w:r>
+    </w:p>
+    <w:p>
+      <w:pPr>
+        <w:pStyle w:val="ListParagraph"/>
         <w:numPr>
           <w:ilvl w:val="0"/>
           <w:numId w:val="5"/>
@@ -1779,7 +1724,7 @@
     </w:p>
     <w:p>
       <w:pPr>
-        <w:pStyle w:val="Lijstalinea"/>
+        <w:pStyle w:val="ListParagraph"/>
         <w:numPr>
           <w:ilvl w:val="0"/>
           <w:numId w:val="5"/>
@@ -1791,7 +1736,7 @@
     </w:p>
     <w:p>
       <w:pPr>
-        <w:pStyle w:val="Lijstalinea"/>
+        <w:pStyle w:val="ListParagraph"/>
         <w:numPr>
           <w:ilvl w:val="0"/>
           <w:numId w:val="5"/>
@@ -1803,7 +1748,7 @@
     </w:p>
     <w:p>
       <w:pPr>
-        <w:pStyle w:val="Lijstalinea"/>
+        <w:pStyle w:val="ListParagraph"/>
         <w:numPr>
           <w:ilvl w:val="0"/>
           <w:numId w:val="5"/>
@@ -1816,7 +1761,7 @@
     <w:p/>
     <w:p>
       <w:pPr>
-        <w:pStyle w:val="Lijstalinea"/>
+        <w:pStyle w:val="ListParagraph"/>
         <w:numPr>
           <w:ilvl w:val="0"/>
           <w:numId w:val="1"/>
@@ -1863,7 +1808,7 @@
     </w:p>
     <w:p>
       <w:pPr>
-        <w:pStyle w:val="Lijstalinea"/>
+        <w:pStyle w:val="ListParagraph"/>
         <w:numPr>
           <w:ilvl w:val="0"/>
           <w:numId w:val="1"/>
@@ -1903,7 +1848,7 @@
     </w:p>
     <w:p>
       <w:pPr>
-        <w:pStyle w:val="Lijstalinea"/>
+        <w:pStyle w:val="ListParagraph"/>
         <w:numPr>
           <w:ilvl w:val="0"/>
           <w:numId w:val="1"/>
@@ -1943,7 +1888,7 @@
     </w:p>
     <w:p>
       <w:pPr>
-        <w:pStyle w:val="Lijstalinea"/>
+        <w:pStyle w:val="ListParagraph"/>
         <w:numPr>
           <w:ilvl w:val="0"/>
           <w:numId w:val="1"/>
@@ -2036,7 +1981,7 @@
     </w:p>
     <w:p>
       <w:pPr>
-        <w:pStyle w:val="Lijstalinea"/>
+        <w:pStyle w:val="ListParagraph"/>
         <w:numPr>
           <w:ilvl w:val="0"/>
           <w:numId w:val="7"/>
@@ -2044,12 +1989,14 @@
         <w:rPr>
           <w:b/>
           <w:bCs/>
-        </w:rPr>
-      </w:pPr>
-      <w:r>
-        <w:rPr>
-          <w:b/>
-          <w:bCs/>
+          <w:highlight w:val="magenta"/>
+        </w:rPr>
+      </w:pPr>
+      <w:r>
+        <w:rPr>
+          <w:b/>
+          <w:bCs/>
+          <w:highlight w:val="magenta"/>
         </w:rPr>
         <w:t>EM/GPR Physics &amp; Forward Modelling</w:t>
       </w:r>
@@ -2082,23 +2029,7 @@
           <w:sz w:val="20"/>
           <w:szCs w:val="20"/>
         </w:rPr>
-        <w:t xml:space="preserve"> and your </w:t>
-      </w:r>
-      <w:proofErr w:type="spellStart"/>
-      <w:r>
-        <w:rPr>
-          <w:sz w:val="20"/>
-          <w:szCs w:val="20"/>
-        </w:rPr>
-        <w:t>gprMax</w:t>
-      </w:r>
-      <w:proofErr w:type="spellEnd"/>
-      <w:r>
-        <w:rPr>
-          <w:sz w:val="20"/>
-          <w:szCs w:val="20"/>
-        </w:rPr>
-        <w:t xml:space="preserve"> setup in </w:t>
+        <w:t xml:space="preserve"> and your gprMax setup in </w:t>
       </w:r>
       <w:r>
         <w:rPr>
@@ -2118,7 +2049,7 @@
     </w:p>
     <w:p>
       <w:pPr>
-        <w:pStyle w:val="Lijstalinea"/>
+        <w:pStyle w:val="ListParagraph"/>
         <w:numPr>
           <w:ilvl w:val="1"/>
           <w:numId w:val="7"/>
@@ -2138,7 +2069,7 @@
     </w:p>
     <w:p>
       <w:pPr>
-        <w:pStyle w:val="Lijstalinea"/>
+        <w:pStyle w:val="ListParagraph"/>
         <w:numPr>
           <w:ilvl w:val="1"/>
           <w:numId w:val="7"/>
@@ -2165,19 +2096,21 @@
     </w:p>
     <w:p>
       <w:pPr>
-        <w:pStyle w:val="Lijstalinea"/>
+        <w:pStyle w:val="ListParagraph"/>
         <w:numPr>
           <w:ilvl w:val="0"/>
           <w:numId w:val="7"/>
         </w:numPr>
         <w:rPr>
-          <w:lang w:val="en-US"/>
-        </w:rPr>
-      </w:pPr>
-      <w:r>
-        <w:rPr>
-          <w:b/>
-          <w:bCs/>
+          <w:highlight w:val="yellow"/>
+          <w:lang w:val="en-US"/>
+        </w:rPr>
+      </w:pPr>
+      <w:r>
+        <w:rPr>
+          <w:b/>
+          <w:bCs/>
+          <w:highlight w:val="yellow"/>
           <w:lang w:val="en-US"/>
         </w:rPr>
         <w:t>Resolution &amp; Fresnel Zone Theory</w:t>
@@ -2197,23 +2130,7 @@
           <w:sz w:val="20"/>
           <w:szCs w:val="20"/>
         </w:rPr>
-        <w:t xml:space="preserve">Lateral/vertical resolution, fracture aperture &amp; thickness, </w:t>
-      </w:r>
-      <w:proofErr w:type="gramStart"/>
-      <w:r>
-        <w:rPr>
-          <w:sz w:val="20"/>
-          <w:szCs w:val="20"/>
-        </w:rPr>
-        <w:t>thin-bed</w:t>
-      </w:r>
-      <w:proofErr w:type="gramEnd"/>
-      <w:r>
-        <w:rPr>
-          <w:sz w:val="20"/>
-          <w:szCs w:val="20"/>
-        </w:rPr>
-        <w:t xml:space="preserve">/sub-wavelength detection → </w:t>
+        <w:t xml:space="preserve">Lateral/vertical resolution, fracture aperture &amp; thickness, thin-bed/sub-wavelength detection → </w:t>
       </w:r>
       <w:r>
         <w:rPr>
@@ -2249,7 +2166,7 @@
     </w:p>
     <w:p>
       <w:pPr>
-        <w:pStyle w:val="Lijstalinea"/>
+        <w:pStyle w:val="ListParagraph"/>
         <w:numPr>
           <w:ilvl w:val="1"/>
           <w:numId w:val="7"/>
@@ -2269,7 +2186,7 @@
     </w:p>
     <w:p>
       <w:pPr>
-        <w:pStyle w:val="Lijstalinea"/>
+        <w:pStyle w:val="ListParagraph"/>
         <w:numPr>
           <w:ilvl w:val="1"/>
           <w:numId w:val="7"/>
@@ -2296,19 +2213,21 @@
     </w:p>
     <w:p>
       <w:pPr>
-        <w:pStyle w:val="Lijstalinea"/>
+        <w:pStyle w:val="ListParagraph"/>
         <w:numPr>
           <w:ilvl w:val="0"/>
           <w:numId w:val="7"/>
         </w:numPr>
         <w:rPr>
-          <w:lang w:val="en-US"/>
-        </w:rPr>
-      </w:pPr>
-      <w:r>
-        <w:rPr>
-          <w:b/>
-          <w:bCs/>
+          <w:highlight w:val="green"/>
+          <w:lang w:val="en-US"/>
+        </w:rPr>
+      </w:pPr>
+      <w:r>
+        <w:rPr>
+          <w:b/>
+          <w:bCs/>
+          <w:highlight w:val="green"/>
           <w:lang w:val="en-US"/>
         </w:rPr>
         <w:t>Migration</w:t>
@@ -2317,6 +2236,7 @@
         <w:rPr>
           <w:b/>
           <w:bCs/>
+          <w:highlight w:val="green"/>
           <w:lang w:val="en-US"/>
         </w:rPr>
         <w:t xml:space="preserve"> &amp; Imaging Algorithms</w:t>
@@ -2385,7 +2305,7 @@
     </w:p>
     <w:p>
       <w:pPr>
-        <w:pStyle w:val="Lijstalinea"/>
+        <w:pStyle w:val="ListParagraph"/>
         <w:numPr>
           <w:ilvl w:val="1"/>
           <w:numId w:val="7"/>
@@ -2413,7 +2333,7 @@
     </w:p>
     <w:p>
       <w:pPr>
-        <w:pStyle w:val="Lijstalinea"/>
+        <w:pStyle w:val="ListParagraph"/>
         <w:numPr>
           <w:ilvl w:val="2"/>
           <w:numId w:val="7"/>
@@ -2428,7 +2348,7 @@
     </w:p>
     <w:p>
       <w:pPr>
-        <w:pStyle w:val="Lijstalinea"/>
+        <w:pStyle w:val="ListParagraph"/>
         <w:numPr>
           <w:ilvl w:val="2"/>
           <w:numId w:val="7"/>
@@ -2449,7 +2369,7 @@
     </w:p>
     <w:p>
       <w:pPr>
-        <w:pStyle w:val="Lijstalinea"/>
+        <w:pStyle w:val="ListParagraph"/>
         <w:numPr>
           <w:ilvl w:val="2"/>
           <w:numId w:val="7"/>
@@ -2470,7 +2390,7 @@
     </w:p>
     <w:p>
       <w:pPr>
-        <w:pStyle w:val="Lijstalinea"/>
+        <w:pStyle w:val="ListParagraph"/>
         <w:numPr>
           <w:ilvl w:val="2"/>
           <w:numId w:val="7"/>
@@ -2497,7 +2417,7 @@
     </w:p>
     <w:p>
       <w:pPr>
-        <w:pStyle w:val="Lijstalinea"/>
+        <w:pStyle w:val="ListParagraph"/>
         <w:numPr>
           <w:ilvl w:val="2"/>
           <w:numId w:val="7"/>
@@ -2524,7 +2444,7 @@
     </w:p>
     <w:p>
       <w:pPr>
-        <w:pStyle w:val="Lijstalinea"/>
+        <w:pStyle w:val="ListParagraph"/>
         <w:numPr>
           <w:ilvl w:val="1"/>
           <w:numId w:val="7"/>
@@ -2568,7 +2488,7 @@
     </w:p>
     <w:p>
       <w:pPr>
-        <w:pStyle w:val="Lijstalinea"/>
+        <w:pStyle w:val="ListParagraph"/>
         <w:numPr>
           <w:ilvl w:val="2"/>
           <w:numId w:val="7"/>
@@ -2589,7 +2509,7 @@
     </w:p>
     <w:p>
       <w:pPr>
-        <w:pStyle w:val="Lijstalinea"/>
+        <w:pStyle w:val="ListParagraph"/>
         <w:numPr>
           <w:ilvl w:val="2"/>
           <w:numId w:val="7"/>
@@ -2610,7 +2530,7 @@
     </w:p>
     <w:p>
       <w:pPr>
-        <w:pStyle w:val="Lijstalinea"/>
+        <w:pStyle w:val="ListParagraph"/>
         <w:numPr>
           <w:ilvl w:val="2"/>
           <w:numId w:val="7"/>
@@ -2637,7 +2557,7 @@
     </w:p>
     <w:p>
       <w:pPr>
-        <w:pStyle w:val="Lijstalinea"/>
+        <w:pStyle w:val="ListParagraph"/>
         <w:numPr>
           <w:ilvl w:val="2"/>
           <w:numId w:val="7"/>
@@ -2658,7 +2578,7 @@
     </w:p>
     <w:p>
       <w:pPr>
-        <w:pStyle w:val="Lijstalinea"/>
+        <w:pStyle w:val="ListParagraph"/>
         <w:numPr>
           <w:ilvl w:val="2"/>
           <w:numId w:val="7"/>
@@ -2708,21 +2628,12 @@
           <w:lang w:val="en-US"/>
         </w:rPr>
       </w:pPr>
-      <w:proofErr w:type="spellStart"/>
-      <w:r>
-        <w:rPr>
-          <w:sz w:val="20"/>
-          <w:szCs w:val="20"/>
-        </w:rPr>
-        <w:t>General_Migration_Reviews</w:t>
-      </w:r>
-      <w:proofErr w:type="spellEnd"/>
-      <w:r>
-        <w:rPr>
-          <w:sz w:val="20"/>
-          <w:szCs w:val="20"/>
-        </w:rPr>
-        <w:t xml:space="preserve"> papers likely survey </w:t>
+      <w:r>
+        <w:rPr>
+          <w:sz w:val="20"/>
+          <w:szCs w:val="20"/>
+        </w:rPr>
+        <w:t xml:space="preserve">General_Migration_Reviews papers likely survey </w:t>
       </w:r>
       <w:r>
         <w:rPr>
@@ -2780,19 +2691,21 @@
     </w:p>
     <w:p>
       <w:pPr>
-        <w:pStyle w:val="Lijstalinea"/>
+        <w:pStyle w:val="ListParagraph"/>
         <w:numPr>
           <w:ilvl w:val="0"/>
           <w:numId w:val="7"/>
         </w:numPr>
         <w:rPr>
-          <w:lang w:val="en-US"/>
-        </w:rPr>
-      </w:pPr>
-      <w:r>
-        <w:rPr>
-          <w:b/>
-          <w:bCs/>
+          <w:highlight w:val="red"/>
+          <w:lang w:val="en-US"/>
+        </w:rPr>
+      </w:pPr>
+      <w:r>
+        <w:rPr>
+          <w:b/>
+          <w:bCs/>
+          <w:highlight w:val="red"/>
           <w:lang w:val="en-US"/>
         </w:rPr>
         <w:t>Signal Processing</w:t>
@@ -2847,7 +2760,7 @@
     </w:p>
     <w:p>
       <w:pPr>
-        <w:pStyle w:val="Lijstalinea"/>
+        <w:pStyle w:val="ListParagraph"/>
         <w:numPr>
           <w:ilvl w:val="1"/>
           <w:numId w:val="7"/>
@@ -2867,7 +2780,7 @@
     </w:p>
     <w:p>
       <w:pPr>
-        <w:pStyle w:val="Lijstalinea"/>
+        <w:pStyle w:val="ListParagraph"/>
         <w:numPr>
           <w:ilvl w:val="1"/>
           <w:numId w:val="7"/>
@@ -2894,19 +2807,21 @@
     </w:p>
     <w:p>
       <w:pPr>
-        <w:pStyle w:val="Lijstalinea"/>
+        <w:pStyle w:val="ListParagraph"/>
         <w:numPr>
           <w:ilvl w:val="0"/>
           <w:numId w:val="7"/>
         </w:numPr>
         <w:rPr>
-          <w:lang w:val="en-US"/>
-        </w:rPr>
-      </w:pPr>
-      <w:r>
-        <w:rPr>
-          <w:b/>
-          <w:bCs/>
+          <w:highlight w:val="blue"/>
+          <w:lang w:val="en-US"/>
+        </w:rPr>
+      </w:pPr>
+      <w:r>
+        <w:rPr>
+          <w:b/>
+          <w:bCs/>
+          <w:highlight w:val="blue"/>
         </w:rPr>
         <w:t>Phase-Based Interpretation &amp; Time-Lapse Theory</w:t>
       </w:r>
@@ -2967,19 +2882,21 @@
     </w:p>
     <w:p>
       <w:pPr>
-        <w:pStyle w:val="Lijstalinea"/>
+        <w:pStyle w:val="ListParagraph"/>
         <w:numPr>
           <w:ilvl w:val="0"/>
           <w:numId w:val="7"/>
         </w:numPr>
         <w:rPr>
-          <w:lang w:val="en-US"/>
-        </w:rPr>
-      </w:pPr>
-      <w:r>
-        <w:rPr>
-          <w:b/>
-          <w:bCs/>
+          <w:highlight w:val="darkCyan"/>
+          <w:lang w:val="en-US"/>
+        </w:rPr>
+      </w:pPr>
+      <w:r>
+        <w:rPr>
+          <w:b/>
+          <w:bCs/>
+          <w:highlight w:val="darkCyan"/>
         </w:rPr>
         <w:t>Field &amp; Time-Lapse GPR Case Studies</w:t>
       </w:r>
@@ -2990,7 +2907,6 @@
         <w:rPr>
           <w:sz w:val="20"/>
           <w:szCs w:val="20"/>
-          <w:lang w:val="en-US"/>
         </w:rPr>
       </w:pPr>
       <w:r>
@@ -3015,6 +2931,2439 @@
         </w:rPr>
         <w:t>, your comparison/validation literature.</w:t>
       </w:r>
+    </w:p>
+    <w:p>
+      <w:pPr>
+        <w:rPr>
+          <w:sz w:val="20"/>
+          <w:szCs w:val="20"/>
+        </w:rPr>
+      </w:pPr>
+    </w:p>
+    <w:p>
+      <w:pPr>
+        <w:rPr>
+          <w:sz w:val="20"/>
+          <w:szCs w:val="20"/>
+        </w:rPr>
+      </w:pPr>
+    </w:p>
+    <w:p>
+      <w:pPr>
+        <w:rPr>
+          <w:sz w:val="20"/>
+          <w:szCs w:val="20"/>
+        </w:rPr>
+      </w:pPr>
+    </w:p>
+    <w:p>
+      <w:pPr>
+        <w:rPr>
+          <w:sz w:val="20"/>
+          <w:szCs w:val="20"/>
+        </w:rPr>
+      </w:pPr>
+    </w:p>
+    <w:p>
+      <w:pPr>
+        <w:rPr>
+          <w:sz w:val="20"/>
+          <w:szCs w:val="20"/>
+        </w:rPr>
+      </w:pPr>
+    </w:p>
+    <w:p>
+      <w:pPr>
+        <w:rPr>
+          <w:sz w:val="20"/>
+          <w:szCs w:val="20"/>
+        </w:rPr>
+      </w:pPr>
+    </w:p>
+    <w:p>
+      <w:pPr>
+        <w:rPr>
+          <w:sz w:val="20"/>
+          <w:szCs w:val="20"/>
+        </w:rPr>
+      </w:pPr>
+    </w:p>
+    <w:p>
+      <w:pPr>
+        <w:rPr>
+          <w:sz w:val="20"/>
+          <w:szCs w:val="20"/>
+        </w:rPr>
+      </w:pPr>
+    </w:p>
+    <w:p>
+      <w:pPr>
+        <w:rPr>
+          <w:sz w:val="20"/>
+          <w:szCs w:val="20"/>
+        </w:rPr>
+      </w:pPr>
+    </w:p>
+    <w:p>
+      <w:pPr>
+        <w:rPr>
+          <w:sz w:val="20"/>
+          <w:szCs w:val="20"/>
+        </w:rPr>
+      </w:pPr>
+      <w:r>
+        <w:rPr>
+          <w:sz w:val="20"/>
+          <w:szCs w:val="20"/>
+        </w:rPr>
+        <w:lastRenderedPageBreak/>
+        <w:t>Chapter 1: Introduction</w:t>
+      </w:r>
+    </w:p>
+    <w:p>
+      <w:pPr>
+        <w:pStyle w:val="ListParagraph"/>
+        <w:numPr>
+          <w:ilvl w:val="1"/>
+          <w:numId w:val="10"/>
+        </w:numPr>
+        <w:rPr>
+          <w:sz w:val="20"/>
+          <w:szCs w:val="20"/>
+        </w:rPr>
+      </w:pPr>
+      <w:r>
+        <w:rPr>
+          <w:sz w:val="20"/>
+          <w:szCs w:val="20"/>
+        </w:rPr>
+        <w:t>Research Question</w:t>
+      </w:r>
+    </w:p>
+    <w:p>
+      <w:pPr>
+        <w:pStyle w:val="ListParagraph"/>
+        <w:rPr>
+          <w:sz w:val="20"/>
+          <w:szCs w:val="20"/>
+        </w:rPr>
+      </w:pPr>
+      <w:r>
+        <w:rPr>
+          <w:sz w:val="20"/>
+          <w:szCs w:val="20"/>
+          <w:highlight w:val="yellow"/>
+        </w:rPr>
+        <w:t>H1</w:t>
+      </w:r>
+    </w:p>
+    <w:p>
+      <w:pPr>
+        <w:pStyle w:val="ListParagraph"/>
+        <w:rPr>
+          <w:sz w:val="20"/>
+          <w:szCs w:val="20"/>
+        </w:rPr>
+      </w:pPr>
+      <w:r>
+        <w:rPr>
+          <w:sz w:val="20"/>
+          <w:szCs w:val="20"/>
+          <w:highlight w:val="red"/>
+        </w:rPr>
+        <w:t>H2</w:t>
+      </w:r>
+    </w:p>
+    <w:p>
+      <w:pPr>
+        <w:pStyle w:val="ListParagraph"/>
+        <w:rPr>
+          <w:sz w:val="20"/>
+          <w:szCs w:val="20"/>
+        </w:rPr>
+      </w:pPr>
+      <w:r>
+        <w:rPr>
+          <w:sz w:val="20"/>
+          <w:szCs w:val="20"/>
+          <w:highlight w:val="darkCyan"/>
+        </w:rPr>
+        <w:t>H3</w:t>
+      </w:r>
+    </w:p>
+    <w:p>
+      <w:pPr>
+        <w:pStyle w:val="ListParagraph"/>
+        <w:numPr>
+          <w:ilvl w:val="1"/>
+          <w:numId w:val="10"/>
+        </w:numPr>
+        <w:rPr>
+          <w:sz w:val="20"/>
+          <w:szCs w:val="20"/>
+        </w:rPr>
+      </w:pPr>
+      <w:r>
+        <w:rPr>
+          <w:sz w:val="20"/>
+          <w:szCs w:val="20"/>
+        </w:rPr>
+        <w:t>Outline</w:t>
+      </w:r>
+    </w:p>
+    <w:p>
+      <w:pPr>
+        <w:rPr>
+          <w:sz w:val="20"/>
+          <w:szCs w:val="20"/>
+        </w:rPr>
+      </w:pPr>
+    </w:p>
+    <w:p>
+      <w:pPr>
+        <w:rPr>
+          <w:sz w:val="20"/>
+          <w:szCs w:val="20"/>
+        </w:rPr>
+      </w:pPr>
+      <w:r>
+        <w:rPr>
+          <w:sz w:val="20"/>
+          <w:szCs w:val="20"/>
+        </w:rPr>
+        <w:t>Chapter 2: Review of the Literature</w:t>
+      </w:r>
+    </w:p>
+    <w:p>
+      <w:pPr>
+        <w:rPr>
+          <w:sz w:val="20"/>
+          <w:szCs w:val="20"/>
+        </w:rPr>
+      </w:pPr>
+      <w:r>
+        <w:rPr>
+          <w:sz w:val="20"/>
+          <w:szCs w:val="20"/>
+          <w:highlight w:val="magenta"/>
+        </w:rPr>
+        <w:t>2.1 EM Theory and GPR Physics</w:t>
+      </w:r>
+    </w:p>
+    <w:p>
+      <w:pPr>
+        <w:rPr>
+          <w:sz w:val="20"/>
+          <w:szCs w:val="20"/>
+        </w:rPr>
+      </w:pPr>
+      <w:r>
+        <w:rPr>
+          <w:sz w:val="20"/>
+          <w:szCs w:val="20"/>
+          <w:highlight w:val="yellow"/>
+        </w:rPr>
+        <w:t>2.2 Resolution Problems (Lateral and Vertical) and the Fresnel Zone</w:t>
+      </w:r>
+    </w:p>
+    <w:p>
+      <w:pPr>
+        <w:rPr>
+          <w:sz w:val="20"/>
+          <w:szCs w:val="20"/>
+        </w:rPr>
+      </w:pPr>
+      <w:r>
+        <w:rPr>
+          <w:sz w:val="20"/>
+          <w:szCs w:val="20"/>
+          <w:highlight w:val="red"/>
+        </w:rPr>
+        <w:t>2.3 GPR Processing</w:t>
+      </w:r>
+    </w:p>
+    <w:p>
+      <w:pPr>
+        <w:rPr>
+          <w:sz w:val="20"/>
+          <w:szCs w:val="20"/>
+        </w:rPr>
+      </w:pPr>
+      <w:r>
+        <w:rPr>
+          <w:sz w:val="20"/>
+          <w:szCs w:val="20"/>
+          <w:highlight w:val="blue"/>
+        </w:rPr>
+        <w:t>2.4 Phase-Based Interpretation</w:t>
+      </w:r>
+    </w:p>
+    <w:p>
+      <w:pPr>
+        <w:rPr>
+          <w:sz w:val="20"/>
+          <w:szCs w:val="20"/>
+        </w:rPr>
+      </w:pPr>
+    </w:p>
+    <w:p>
+      <w:pPr>
+        <w:rPr>
+          <w:sz w:val="20"/>
+          <w:szCs w:val="20"/>
+        </w:rPr>
+      </w:pPr>
+      <w:r>
+        <w:rPr>
+          <w:sz w:val="20"/>
+          <w:szCs w:val="20"/>
+        </w:rPr>
+        <w:t>Chapter 3</w:t>
+      </w:r>
+      <w:r>
+        <w:rPr>
+          <w:sz w:val="20"/>
+          <w:szCs w:val="20"/>
+        </w:rPr>
+        <w:t>: Theoretical Background and Methodology</w:t>
+      </w:r>
+    </w:p>
+    <w:p>
+      <w:pPr>
+        <w:rPr>
+          <w:sz w:val="20"/>
+          <w:szCs w:val="20"/>
+        </w:rPr>
+      </w:pPr>
+      <w:r>
+        <w:rPr>
+          <w:sz w:val="20"/>
+          <w:szCs w:val="20"/>
+          <w:highlight w:val="green"/>
+        </w:rPr>
+        <w:t>3.1 GPR Migration Fundamental</w:t>
+      </w:r>
+    </w:p>
+    <w:p>
+      <w:pPr>
+        <w:rPr>
+          <w:sz w:val="20"/>
+          <w:szCs w:val="20"/>
+          <w:highlight w:val="blue"/>
+        </w:rPr>
+      </w:pPr>
+      <w:r>
+        <w:rPr>
+          <w:sz w:val="20"/>
+          <w:szCs w:val="20"/>
+          <w:highlight w:val="blue"/>
+        </w:rPr>
+        <w:t>3.2 Space-Wavenumber Duality</w:t>
+      </w:r>
+    </w:p>
+    <w:p>
+      <w:pPr>
+        <w:rPr>
+          <w:sz w:val="20"/>
+          <w:szCs w:val="20"/>
+          <w:highlight w:val="blue"/>
+        </w:rPr>
+      </w:pPr>
+      <w:r>
+        <w:rPr>
+          <w:sz w:val="20"/>
+          <w:szCs w:val="20"/>
+          <w:highlight w:val="blue"/>
+        </w:rPr>
+        <w:t>3.3 The 2D Fourier Shift Theorem</w:t>
+      </w:r>
+    </w:p>
+    <w:p>
+      <w:pPr>
+        <w:rPr>
+          <w:sz w:val="20"/>
+          <w:szCs w:val="20"/>
+          <w:highlight w:val="blue"/>
+        </w:rPr>
+      </w:pPr>
+      <w:r>
+        <w:rPr>
+          <w:sz w:val="20"/>
+          <w:szCs w:val="20"/>
+          <w:highlight w:val="blue"/>
+        </w:rPr>
+        <w:t>3.4 Isolating the Phase Plane</w:t>
+      </w:r>
+    </w:p>
+    <w:p>
+      <w:pPr>
+        <w:rPr>
+          <w:sz w:val="20"/>
+          <w:szCs w:val="20"/>
+          <w:highlight w:val="blue"/>
+        </w:rPr>
+      </w:pPr>
+      <w:r>
+        <w:rPr>
+          <w:sz w:val="20"/>
+          <w:szCs w:val="20"/>
+          <w:highlight w:val="red"/>
+        </w:rPr>
+        <w:t xml:space="preserve">3.5 WLS </w:t>
+      </w:r>
+      <w:r>
+        <w:rPr>
+          <w:sz w:val="20"/>
+          <w:szCs w:val="20"/>
+          <w:highlight w:val="blue"/>
+        </w:rPr>
+        <w:t>Plane Fitting</w:t>
+      </w:r>
+    </w:p>
+    <w:p>
+      <w:pPr>
+        <w:rPr>
+          <w:sz w:val="20"/>
+          <w:szCs w:val="20"/>
+          <w:highlight w:val="blue"/>
+        </w:rPr>
+      </w:pPr>
+      <w:r>
+        <w:rPr>
+          <w:sz w:val="20"/>
+          <w:szCs w:val="20"/>
+          <w:highlight w:val="blue"/>
+        </w:rPr>
+        <w:t>3.6 Time-Frequency Perspective: Local Phase and Spectral-Line Analysis</w:t>
+      </w:r>
+    </w:p>
+    <w:p>
+      <w:pPr>
+        <w:rPr>
+          <w:sz w:val="20"/>
+          <w:szCs w:val="20"/>
+        </w:rPr>
+      </w:pPr>
+      <w:r>
+        <w:rPr>
+          <w:sz w:val="20"/>
+          <w:szCs w:val="20"/>
+          <w:highlight w:val="red"/>
+        </w:rPr>
+        <w:t>3.7 Metho</w:t>
+      </w:r>
+      <w:r>
+        <w:rPr>
+          <w:sz w:val="20"/>
+          <w:szCs w:val="20"/>
+          <w:highlight w:val="blue"/>
+        </w:rPr>
+        <w:t>dology</w:t>
+      </w:r>
+    </w:p>
+    <w:p>
+      <w:pPr>
+        <w:rPr>
+          <w:sz w:val="20"/>
+          <w:szCs w:val="20"/>
+        </w:rPr>
+      </w:pPr>
+    </w:p>
+    <w:p>
+      <w:pPr>
+        <w:rPr>
+          <w:sz w:val="20"/>
+          <w:szCs w:val="20"/>
+        </w:rPr>
+      </w:pPr>
+      <w:r>
+        <w:rPr>
+          <w:sz w:val="20"/>
+          <w:szCs w:val="20"/>
+        </w:rPr>
+        <w:t xml:space="preserve">Chapter 4: </w:t>
+      </w:r>
+      <w:r>
+        <w:rPr>
+          <w:sz w:val="20"/>
+          <w:szCs w:val="20"/>
+          <w:highlight w:val="darkYellow"/>
+        </w:rPr>
+        <w:t>Hypothesis 1</w:t>
+      </w:r>
+    </w:p>
+    <w:p>
+      <w:pPr>
+        <w:rPr>
+          <w:sz w:val="20"/>
+          <w:szCs w:val="20"/>
+        </w:rPr>
+      </w:pPr>
+      <w:r>
+        <w:rPr>
+          <w:sz w:val="20"/>
+          <w:szCs w:val="20"/>
+        </w:rPr>
+        <w:t>Introduction</w:t>
+      </w:r>
+      <w:r>
+        <w:rPr>
+          <w:sz w:val="20"/>
+          <w:szCs w:val="20"/>
+        </w:rPr>
+        <w:t xml:space="preserve"> </w:t>
+      </w:r>
+      <w:r>
+        <w:rPr>
+          <w:sz w:val="20"/>
+          <w:szCs w:val="20"/>
+        </w:rPr>
+        <w:t>of chapter</w:t>
+      </w:r>
+    </w:p>
+    <w:p>
+      <w:pPr>
+        <w:rPr>
+          <w:sz w:val="20"/>
+          <w:szCs w:val="20"/>
+        </w:rPr>
+      </w:pPr>
+      <w:r>
+        <w:rPr>
+          <w:sz w:val="20"/>
+          <w:szCs w:val="20"/>
+          <w:highlight w:val="red"/>
+        </w:rPr>
+        <w:t>4.1 Workflo</w:t>
+      </w:r>
+      <w:r>
+        <w:rPr>
+          <w:sz w:val="20"/>
+          <w:szCs w:val="20"/>
+          <w:highlight w:val="red"/>
+        </w:rPr>
+        <w:t xml:space="preserve">w </w:t>
+      </w:r>
+      <w:r>
+        <w:rPr>
+          <w:sz w:val="20"/>
+          <w:szCs w:val="20"/>
+          <w:highlight w:val="red"/>
+        </w:rPr>
+        <w:t>Defined</w:t>
+      </w:r>
+    </w:p>
+    <w:p>
+      <w:pPr>
+        <w:rPr>
+          <w:sz w:val="20"/>
+          <w:szCs w:val="20"/>
+        </w:rPr>
+      </w:pPr>
+      <w:r>
+        <w:rPr>
+          <w:sz w:val="20"/>
+          <w:szCs w:val="20"/>
+        </w:rPr>
+        <w:t>4.2 Lateral Movement</w:t>
+      </w:r>
+    </w:p>
+    <w:p>
+      <w:pPr>
+        <w:rPr>
+          <w:sz w:val="20"/>
+          <w:szCs w:val="20"/>
+        </w:rPr>
+      </w:pPr>
+      <w:r>
+        <w:rPr>
+          <w:sz w:val="20"/>
+          <w:szCs w:val="20"/>
+        </w:rPr>
+        <w:tab/>
+        <w:t xml:space="preserve">4.2.1 Model </w:t>
+      </w:r>
+      <w:r>
+        <w:rPr>
+          <w:sz w:val="20"/>
+          <w:szCs w:val="20"/>
+        </w:rPr>
+        <w:t>s</w:t>
+      </w:r>
+      <w:r>
+        <w:rPr>
+          <w:sz w:val="20"/>
+          <w:szCs w:val="20"/>
+        </w:rPr>
+        <w:t>et up</w:t>
+      </w:r>
+    </w:p>
+    <w:p>
+      <w:pPr>
+        <w:rPr>
+          <w:sz w:val="20"/>
+          <w:szCs w:val="20"/>
+        </w:rPr>
+      </w:pPr>
+      <w:r>
+        <w:rPr>
+          <w:sz w:val="20"/>
+          <w:szCs w:val="20"/>
+        </w:rPr>
+        <w:tab/>
+        <w:t xml:space="preserve">4.2.2 </w:t>
+      </w:r>
+      <w:r>
+        <w:rPr>
+          <w:sz w:val="20"/>
+          <w:szCs w:val="20"/>
+        </w:rPr>
+        <w:t>Raw and processed B-scans</w:t>
+      </w:r>
+    </w:p>
+    <w:p>
+      <w:pPr>
+        <w:rPr>
+          <w:sz w:val="20"/>
+          <w:szCs w:val="20"/>
+        </w:rPr>
+      </w:pPr>
+      <w:r>
+        <w:rPr>
+          <w:sz w:val="20"/>
+          <w:szCs w:val="20"/>
+        </w:rPr>
+        <w:tab/>
+      </w:r>
+      <w:r>
+        <w:rPr>
+          <w:sz w:val="20"/>
+          <w:szCs w:val="20"/>
+        </w:rPr>
+        <w:t>4.2.3 Migration results</w:t>
+      </w:r>
+    </w:p>
+    <w:p>
+      <w:pPr>
+        <w:rPr>
+          <w:sz w:val="20"/>
+          <w:szCs w:val="20"/>
+        </w:rPr>
+      </w:pPr>
+      <w:r>
+        <w:rPr>
+          <w:sz w:val="20"/>
+          <w:szCs w:val="20"/>
+        </w:rPr>
+        <w:tab/>
+        <w:t xml:space="preserve">4.2.4 Amplitude test </w:t>
+      </w:r>
+      <w:r>
+        <w:rPr>
+          <w:sz w:val="20"/>
+          <w:szCs w:val="20"/>
+        </w:rPr>
+        <w:t xml:space="preserve">(PSF and </w:t>
+      </w:r>
+      <w:r>
+        <w:rPr>
+          <w:sz w:val="20"/>
+          <w:szCs w:val="20"/>
+        </w:rPr>
+        <w:t xml:space="preserve">lobe-separation </w:t>
+      </w:r>
+      <w:r>
+        <w:rPr>
+          <w:sz w:val="20"/>
+          <w:szCs w:val="20"/>
+        </w:rPr>
+        <w:t>table)</w:t>
+      </w:r>
+    </w:p>
+    <w:p>
+      <w:pPr>
+        <w:rPr>
+          <w:sz w:val="20"/>
+          <w:szCs w:val="20"/>
+        </w:rPr>
+      </w:pPr>
+      <w:r>
+        <w:rPr>
+          <w:sz w:val="20"/>
+          <w:szCs w:val="20"/>
+        </w:rPr>
+        <w:tab/>
+        <w:t>4.2.5 Phase test</w:t>
+      </w:r>
+      <w:r>
+        <w:rPr>
+          <w:sz w:val="20"/>
+          <w:szCs w:val="20"/>
+        </w:rPr>
+        <w:t xml:space="preserve"> (WLS and</w:t>
+      </w:r>
+      <w:r>
+        <w:rPr>
+          <w:sz w:val="20"/>
+          <w:szCs w:val="20"/>
+        </w:rPr>
+        <w:t xml:space="preserve"> movement estimate</w:t>
+      </w:r>
+      <w:r>
+        <w:rPr>
+          <w:sz w:val="20"/>
+          <w:szCs w:val="20"/>
+        </w:rPr>
+        <w:t xml:space="preserve"> table)</w:t>
+      </w:r>
+    </w:p>
+    <w:p>
+      <w:pPr>
+        <w:rPr>
+          <w:sz w:val="20"/>
+          <w:szCs w:val="20"/>
+        </w:rPr>
+      </w:pPr>
+      <w:r>
+        <w:rPr>
+          <w:sz w:val="20"/>
+          <w:szCs w:val="20"/>
+        </w:rPr>
+        <w:t>4.3 Vertical Movement</w:t>
+      </w:r>
+    </w:p>
+    <w:p>
+      <w:pPr>
+        <w:rPr>
+          <w:sz w:val="20"/>
+          <w:szCs w:val="20"/>
+        </w:rPr>
+      </w:pPr>
+      <w:r>
+        <w:rPr>
+          <w:sz w:val="20"/>
+          <w:szCs w:val="20"/>
+        </w:rPr>
+        <w:tab/>
+      </w:r>
+      <w:r>
+        <w:rPr>
+          <w:sz w:val="20"/>
+          <w:szCs w:val="20"/>
+        </w:rPr>
+        <w:t>S</w:t>
+      </w:r>
+      <w:r>
+        <w:rPr>
+          <w:sz w:val="20"/>
+          <w:szCs w:val="20"/>
+        </w:rPr>
+        <w:t>ame</w:t>
+      </w:r>
+      <w:r>
+        <w:rPr>
+          <w:sz w:val="20"/>
+          <w:szCs w:val="20"/>
+        </w:rPr>
+        <w:t xml:space="preserve"> structure</w:t>
+      </w:r>
+    </w:p>
+    <w:p>
+      <w:pPr>
+        <w:rPr>
+          <w:sz w:val="20"/>
+          <w:szCs w:val="20"/>
+        </w:rPr>
+      </w:pPr>
+      <w:r>
+        <w:rPr>
+          <w:sz w:val="20"/>
+          <w:szCs w:val="20"/>
+        </w:rPr>
+        <w:t>4.4 Diagonal Movement</w:t>
+      </w:r>
+    </w:p>
+    <w:p>
+      <w:pPr>
+        <w:rPr>
+          <w:sz w:val="20"/>
+          <w:szCs w:val="20"/>
+        </w:rPr>
+      </w:pPr>
+      <w:r>
+        <w:rPr>
+          <w:sz w:val="20"/>
+          <w:szCs w:val="20"/>
+        </w:rPr>
+        <w:lastRenderedPageBreak/>
+        <w:tab/>
+      </w:r>
+      <w:r>
+        <w:rPr>
+          <w:sz w:val="20"/>
+          <w:szCs w:val="20"/>
+        </w:rPr>
+        <w:t>Same structure</w:t>
+      </w:r>
+    </w:p>
+    <w:p>
+      <w:pPr>
+        <w:rPr>
+          <w:sz w:val="20"/>
+          <w:szCs w:val="20"/>
+        </w:rPr>
+      </w:pPr>
+      <w:r>
+        <w:rPr>
+          <w:sz w:val="20"/>
+          <w:szCs w:val="20"/>
+        </w:rPr>
+        <w:t>4.5 Fluid Flow</w:t>
+      </w:r>
+    </w:p>
+    <w:p>
+      <w:pPr>
+        <w:rPr>
+          <w:sz w:val="20"/>
+          <w:szCs w:val="20"/>
+        </w:rPr>
+      </w:pPr>
+      <w:r>
+        <w:rPr>
+          <w:sz w:val="20"/>
+          <w:szCs w:val="20"/>
+        </w:rPr>
+        <w:tab/>
+      </w:r>
+      <w:r>
+        <w:rPr>
+          <w:sz w:val="20"/>
+          <w:szCs w:val="20"/>
+        </w:rPr>
+        <w:t>Same structure</w:t>
+      </w:r>
+    </w:p>
+    <w:p>
+      <w:pPr>
+        <w:rPr>
+          <w:sz w:val="20"/>
+          <w:szCs w:val="20"/>
+        </w:rPr>
+      </w:pPr>
+      <w:r>
+        <w:rPr>
+          <w:sz w:val="20"/>
+          <w:szCs w:val="20"/>
+        </w:rPr>
+        <w:t>4.6 Summary of the Results</w:t>
+      </w:r>
+    </w:p>
+    <w:p>
+      <w:pPr>
+        <w:rPr>
+          <w:sz w:val="20"/>
+          <w:szCs w:val="20"/>
+        </w:rPr>
+      </w:pPr>
+    </w:p>
+    <w:p>
+      <w:pPr>
+        <w:rPr>
+          <w:sz w:val="20"/>
+          <w:szCs w:val="20"/>
+        </w:rPr>
+      </w:pPr>
+      <w:r>
+        <w:rPr>
+          <w:sz w:val="20"/>
+          <w:szCs w:val="20"/>
+        </w:rPr>
+        <w:t xml:space="preserve">Chapter 5: </w:t>
+      </w:r>
+      <w:r>
+        <w:rPr>
+          <w:sz w:val="20"/>
+          <w:szCs w:val="20"/>
+          <w:highlight w:val="red"/>
+        </w:rPr>
+        <w:t>Hypothesis 2</w:t>
+      </w:r>
+    </w:p>
+    <w:p>
+      <w:pPr>
+        <w:rPr>
+          <w:sz w:val="20"/>
+          <w:szCs w:val="20"/>
+        </w:rPr>
+      </w:pPr>
+      <w:r>
+        <w:rPr>
+          <w:sz w:val="20"/>
+          <w:szCs w:val="20"/>
+        </w:rPr>
+        <w:t>Introduction of chapter</w:t>
+      </w:r>
+    </w:p>
+    <w:p>
+      <w:pPr>
+        <w:rPr>
+          <w:sz w:val="20"/>
+          <w:szCs w:val="20"/>
+        </w:rPr>
+      </w:pPr>
+      <w:r>
+        <w:rPr>
+          <w:sz w:val="20"/>
+          <w:szCs w:val="20"/>
+          <w:highlight w:val="red"/>
+        </w:rPr>
+        <w:t>5.1 Noisy creation</w:t>
+      </w:r>
+    </w:p>
+    <w:p>
+      <w:pPr>
+        <w:rPr>
+          <w:sz w:val="20"/>
+          <w:szCs w:val="20"/>
+        </w:rPr>
+      </w:pPr>
+      <w:r>
+        <w:rPr>
+          <w:sz w:val="20"/>
+          <w:szCs w:val="20"/>
+        </w:rPr>
+        <w:t>5.2 Migrating noise (</w:t>
+      </w:r>
+      <w:r>
+        <w:rPr>
+          <w:sz w:val="20"/>
+          <w:szCs w:val="20"/>
+        </w:rPr>
+        <w:t>spectra of pure noise before and after migration)</w:t>
+      </w:r>
+    </w:p>
+    <w:p>
+      <w:pPr>
+        <w:rPr>
+          <w:sz w:val="20"/>
+          <w:szCs w:val="20"/>
+          <w:highlight w:val="red"/>
+        </w:rPr>
+      </w:pPr>
+      <w:r>
+        <w:rPr>
+          <w:sz w:val="20"/>
+          <w:szCs w:val="20"/>
+          <w:highlight w:val="red"/>
+        </w:rPr>
+        <w:t>5.3 Making back-propagation noise robust</w:t>
+      </w:r>
+    </w:p>
+    <w:p>
+      <w:pPr>
+        <w:rPr>
+          <w:sz w:val="20"/>
+          <w:szCs w:val="20"/>
+        </w:rPr>
+      </w:pPr>
+      <w:r>
+        <w:rPr>
+          <w:sz w:val="20"/>
+          <w:szCs w:val="20"/>
+          <w:highlight w:val="red"/>
+        </w:rPr>
+        <w:t>5.</w:t>
+      </w:r>
+      <w:r>
+        <w:rPr>
+          <w:sz w:val="20"/>
+          <w:szCs w:val="20"/>
+          <w:highlight w:val="red"/>
+        </w:rPr>
+        <w:t>4</w:t>
+      </w:r>
+      <w:r>
+        <w:rPr>
+          <w:sz w:val="20"/>
+          <w:szCs w:val="20"/>
+          <w:highlight w:val="red"/>
+        </w:rPr>
+        <w:t xml:space="preserve"> Extra processing steps in phase domain to remove noise</w:t>
+      </w:r>
+      <w:r>
+        <w:rPr>
+          <w:sz w:val="20"/>
+          <w:szCs w:val="20"/>
+        </w:rPr>
+        <w:t xml:space="preserve"> (?)</w:t>
+      </w:r>
+    </w:p>
+    <w:p>
+      <w:pPr>
+        <w:rPr>
+          <w:sz w:val="20"/>
+          <w:szCs w:val="20"/>
+        </w:rPr>
+      </w:pPr>
+      <w:r>
+        <w:rPr>
+          <w:sz w:val="20"/>
+          <w:szCs w:val="20"/>
+        </w:rPr>
+        <w:t>5.5</w:t>
+      </w:r>
+      <w:r>
+        <w:rPr>
+          <w:sz w:val="20"/>
+          <w:szCs w:val="20"/>
+        </w:rPr>
+        <w:t xml:space="preserve"> Lateral Movement</w:t>
+      </w:r>
+    </w:p>
+    <w:p>
+      <w:pPr>
+        <w:rPr>
+          <w:sz w:val="20"/>
+          <w:szCs w:val="20"/>
+        </w:rPr>
+      </w:pPr>
+      <w:r>
+        <w:rPr>
+          <w:sz w:val="20"/>
+          <w:szCs w:val="20"/>
+        </w:rPr>
+        <w:tab/>
+      </w:r>
+      <w:r>
+        <w:rPr>
+          <w:sz w:val="20"/>
+          <w:szCs w:val="20"/>
+        </w:rPr>
+        <w:t>5</w:t>
+      </w:r>
+      <w:r>
+        <w:rPr>
+          <w:sz w:val="20"/>
+          <w:szCs w:val="20"/>
+        </w:rPr>
+        <w:t>.</w:t>
+      </w:r>
+      <w:r>
+        <w:rPr>
+          <w:sz w:val="20"/>
+          <w:szCs w:val="20"/>
+        </w:rPr>
+        <w:t>5</w:t>
+      </w:r>
+      <w:r>
+        <w:rPr>
+          <w:sz w:val="20"/>
+          <w:szCs w:val="20"/>
+        </w:rPr>
+        <w:t>.3 Migration results</w:t>
+      </w:r>
+    </w:p>
+    <w:p>
+      <w:pPr>
+        <w:rPr>
+          <w:sz w:val="20"/>
+          <w:szCs w:val="20"/>
+        </w:rPr>
+      </w:pPr>
+      <w:r>
+        <w:rPr>
+          <w:sz w:val="20"/>
+          <w:szCs w:val="20"/>
+        </w:rPr>
+        <w:tab/>
+      </w:r>
+      <w:r>
+        <w:rPr>
+          <w:sz w:val="20"/>
+          <w:szCs w:val="20"/>
+        </w:rPr>
+        <w:t>5</w:t>
+      </w:r>
+      <w:r>
+        <w:rPr>
+          <w:sz w:val="20"/>
+          <w:szCs w:val="20"/>
+        </w:rPr>
+        <w:t>.</w:t>
+      </w:r>
+      <w:r>
+        <w:rPr>
+          <w:sz w:val="20"/>
+          <w:szCs w:val="20"/>
+        </w:rPr>
+        <w:t>5</w:t>
+      </w:r>
+      <w:r>
+        <w:rPr>
+          <w:sz w:val="20"/>
+          <w:szCs w:val="20"/>
+        </w:rPr>
+        <w:t>.4 Amplitude test (PSF and lobe-separation table)</w:t>
+      </w:r>
+    </w:p>
+    <w:p>
+      <w:pPr>
+        <w:rPr>
+          <w:sz w:val="20"/>
+          <w:szCs w:val="20"/>
+        </w:rPr>
+      </w:pPr>
+      <w:r>
+        <w:rPr>
+          <w:sz w:val="20"/>
+          <w:szCs w:val="20"/>
+        </w:rPr>
+        <w:tab/>
+      </w:r>
+      <w:r>
+        <w:rPr>
+          <w:sz w:val="20"/>
+          <w:szCs w:val="20"/>
+        </w:rPr>
+        <w:t>5</w:t>
+      </w:r>
+      <w:r>
+        <w:rPr>
+          <w:sz w:val="20"/>
+          <w:szCs w:val="20"/>
+        </w:rPr>
+        <w:t>.</w:t>
+      </w:r>
+      <w:r>
+        <w:rPr>
+          <w:sz w:val="20"/>
+          <w:szCs w:val="20"/>
+        </w:rPr>
+        <w:t>5</w:t>
+      </w:r>
+      <w:r>
+        <w:rPr>
+          <w:sz w:val="20"/>
+          <w:szCs w:val="20"/>
+        </w:rPr>
+        <w:t>.5 Phase test (WLS and movement estimate table)</w:t>
+      </w:r>
+    </w:p>
+    <w:p>
+      <w:pPr>
+        <w:rPr>
+          <w:sz w:val="20"/>
+          <w:szCs w:val="20"/>
+        </w:rPr>
+      </w:pPr>
+      <w:r>
+        <w:rPr>
+          <w:sz w:val="20"/>
+          <w:szCs w:val="20"/>
+        </w:rPr>
+        <w:t>5.6</w:t>
+      </w:r>
+      <w:r>
+        <w:rPr>
+          <w:sz w:val="20"/>
+          <w:szCs w:val="20"/>
+        </w:rPr>
+        <w:t xml:space="preserve"> Vertical Movement</w:t>
+      </w:r>
+    </w:p>
+    <w:p>
+      <w:pPr>
+        <w:rPr>
+          <w:sz w:val="20"/>
+          <w:szCs w:val="20"/>
+        </w:rPr>
+      </w:pPr>
+      <w:r>
+        <w:rPr>
+          <w:sz w:val="20"/>
+          <w:szCs w:val="20"/>
+        </w:rPr>
+        <w:tab/>
+      </w:r>
+      <w:r>
+        <w:rPr>
+          <w:sz w:val="20"/>
+          <w:szCs w:val="20"/>
+        </w:rPr>
+        <w:t>Same structure</w:t>
+      </w:r>
+    </w:p>
+    <w:p>
+      <w:pPr>
+        <w:rPr>
+          <w:sz w:val="20"/>
+          <w:szCs w:val="20"/>
+        </w:rPr>
+      </w:pPr>
+      <w:r>
+        <w:rPr>
+          <w:sz w:val="20"/>
+          <w:szCs w:val="20"/>
+        </w:rPr>
+        <w:t>5.7</w:t>
+      </w:r>
+      <w:r>
+        <w:rPr>
+          <w:sz w:val="20"/>
+          <w:szCs w:val="20"/>
+        </w:rPr>
+        <w:t xml:space="preserve"> Diagonal Movement</w:t>
+      </w:r>
+    </w:p>
+    <w:p>
+      <w:pPr>
+        <w:rPr>
+          <w:sz w:val="20"/>
+          <w:szCs w:val="20"/>
+        </w:rPr>
+      </w:pPr>
+      <w:r>
+        <w:rPr>
+          <w:sz w:val="20"/>
+          <w:szCs w:val="20"/>
+        </w:rPr>
+        <w:tab/>
+      </w:r>
+      <w:r>
+        <w:rPr>
+          <w:sz w:val="20"/>
+          <w:szCs w:val="20"/>
+        </w:rPr>
+        <w:t>Same structure</w:t>
+      </w:r>
+    </w:p>
+    <w:p>
+      <w:pPr>
+        <w:rPr>
+          <w:sz w:val="20"/>
+          <w:szCs w:val="20"/>
+        </w:rPr>
+      </w:pPr>
+      <w:r>
+        <w:rPr>
+          <w:sz w:val="20"/>
+          <w:szCs w:val="20"/>
+        </w:rPr>
+        <w:t>5.8</w:t>
+      </w:r>
+      <w:r>
+        <w:rPr>
+          <w:sz w:val="20"/>
+          <w:szCs w:val="20"/>
+        </w:rPr>
+        <w:t xml:space="preserve"> Fluid Flow</w:t>
+      </w:r>
+    </w:p>
+    <w:p>
+      <w:pPr>
+        <w:rPr>
+          <w:sz w:val="20"/>
+          <w:szCs w:val="20"/>
+        </w:rPr>
+      </w:pPr>
+      <w:r>
+        <w:rPr>
+          <w:sz w:val="20"/>
+          <w:szCs w:val="20"/>
+        </w:rPr>
+        <w:tab/>
+      </w:r>
+      <w:r>
+        <w:rPr>
+          <w:sz w:val="20"/>
+          <w:szCs w:val="20"/>
+        </w:rPr>
+        <w:t>Same structure</w:t>
+      </w:r>
+    </w:p>
+    <w:p>
+      <w:pPr>
+        <w:rPr>
+          <w:sz w:val="20"/>
+          <w:szCs w:val="20"/>
+        </w:rPr>
+      </w:pPr>
+      <w:r>
+        <w:rPr>
+          <w:sz w:val="20"/>
+          <w:szCs w:val="20"/>
+        </w:rPr>
+        <w:t xml:space="preserve">5.9 </w:t>
+      </w:r>
+      <w:r>
+        <w:rPr>
+          <w:sz w:val="20"/>
+          <w:szCs w:val="20"/>
+        </w:rPr>
+        <w:t>Summary of the Results</w:t>
+      </w:r>
+    </w:p>
+    <w:p>
+      <w:pPr>
+        <w:rPr>
+          <w:sz w:val="20"/>
+          <w:szCs w:val="20"/>
+        </w:rPr>
+      </w:pPr>
+    </w:p>
+    <w:p>
+      <w:pPr>
+        <w:rPr>
+          <w:sz w:val="20"/>
+          <w:szCs w:val="20"/>
+        </w:rPr>
+      </w:pPr>
+      <w:r>
+        <w:rPr>
+          <w:sz w:val="20"/>
+          <w:szCs w:val="20"/>
+        </w:rPr>
+        <w:t xml:space="preserve">Chapter 6: </w:t>
+      </w:r>
+      <w:r>
+        <w:rPr>
+          <w:sz w:val="20"/>
+          <w:szCs w:val="20"/>
+          <w:highlight w:val="darkCyan"/>
+        </w:rPr>
+        <w:t>Hypothesis 3</w:t>
+      </w:r>
+    </w:p>
+    <w:p>
+      <w:pPr>
+        <w:rPr>
+          <w:sz w:val="20"/>
+          <w:szCs w:val="20"/>
+        </w:rPr>
+      </w:pPr>
+      <w:r>
+        <w:rPr>
+          <w:sz w:val="20"/>
+          <w:szCs w:val="20"/>
+        </w:rPr>
+        <w:t>Introduction of chapter</w:t>
+      </w:r>
+    </w:p>
+    <w:p>
+      <w:pPr>
+        <w:rPr>
+          <w:sz w:val="20"/>
+          <w:szCs w:val="20"/>
+        </w:rPr>
+      </w:pPr>
+      <w:r>
+        <w:rPr>
+          <w:sz w:val="20"/>
+          <w:szCs w:val="20"/>
+          <w:highlight w:val="darkCyan"/>
+        </w:rPr>
+        <w:t>6.1 Field data explanation (raw field data)</w:t>
+      </w:r>
+    </w:p>
+    <w:p>
+      <w:pPr>
+        <w:rPr>
+          <w:sz w:val="20"/>
+          <w:szCs w:val="20"/>
+        </w:rPr>
+      </w:pPr>
+      <w:r>
+        <w:rPr>
+          <w:sz w:val="20"/>
+          <w:szCs w:val="20"/>
+          <w:highlight w:val="red"/>
+        </w:rPr>
+        <w:t>6.2 Processing</w:t>
+      </w:r>
+      <w:r>
+        <w:rPr>
+          <w:sz w:val="20"/>
+          <w:szCs w:val="20"/>
+          <w:highlight w:val="red"/>
+        </w:rPr>
+        <w:t xml:space="preserve"> (incl. migration)</w:t>
+      </w:r>
+      <w:r>
+        <w:rPr>
+          <w:sz w:val="20"/>
+          <w:szCs w:val="20"/>
+          <w:highlight w:val="red"/>
+        </w:rPr>
+        <w:t xml:space="preserve"> workflow (processed field data)</w:t>
+      </w:r>
+    </w:p>
+    <w:p>
+      <w:pPr>
+        <w:rPr>
+          <w:sz w:val="20"/>
+          <w:szCs w:val="20"/>
+          <w:highlight w:val="red"/>
+        </w:rPr>
+      </w:pPr>
+      <w:r>
+        <w:rPr>
+          <w:sz w:val="20"/>
+          <w:szCs w:val="20"/>
+          <w:highlight w:val="red"/>
+        </w:rPr>
+        <w:t>6.</w:t>
+      </w:r>
+      <w:r>
+        <w:rPr>
+          <w:sz w:val="20"/>
+          <w:szCs w:val="20"/>
+          <w:highlight w:val="red"/>
+        </w:rPr>
+        <w:t>3</w:t>
+      </w:r>
+      <w:r>
+        <w:rPr>
+          <w:sz w:val="20"/>
+          <w:szCs w:val="20"/>
+          <w:highlight w:val="red"/>
+        </w:rPr>
+        <w:t xml:space="preserve"> Region of Influence workflow</w:t>
+      </w:r>
+    </w:p>
+    <w:p>
+      <w:pPr>
+        <w:rPr>
+          <w:sz w:val="20"/>
+          <w:szCs w:val="20"/>
+          <w:highlight w:val="red"/>
+        </w:rPr>
+      </w:pPr>
+      <w:r>
+        <w:rPr>
+          <w:sz w:val="20"/>
+          <w:szCs w:val="20"/>
+          <w:highlight w:val="red"/>
+        </w:rPr>
+        <w:tab/>
+        <w:t>6.</w:t>
+      </w:r>
+      <w:r>
+        <w:rPr>
+          <w:sz w:val="20"/>
+          <w:szCs w:val="20"/>
+          <w:highlight w:val="red"/>
+        </w:rPr>
+        <w:t>3</w:t>
+      </w:r>
+      <w:r>
+        <w:rPr>
+          <w:sz w:val="20"/>
+          <w:szCs w:val="20"/>
+          <w:highlight w:val="red"/>
+        </w:rPr>
+        <w:t xml:space="preserve">.1 </w:t>
+      </w:r>
+      <w:r>
+        <w:rPr>
+          <w:sz w:val="20"/>
+          <w:szCs w:val="20"/>
+          <w:highlight w:val="red"/>
+        </w:rPr>
+        <w:t>Rectangular window</w:t>
+      </w:r>
+    </w:p>
+    <w:p>
+      <w:pPr>
+        <w:rPr>
+          <w:sz w:val="20"/>
+          <w:szCs w:val="20"/>
+          <w:highlight w:val="red"/>
+        </w:rPr>
+      </w:pPr>
+      <w:r>
+        <w:rPr>
+          <w:sz w:val="20"/>
+          <w:szCs w:val="20"/>
+          <w:highlight w:val="red"/>
+        </w:rPr>
+        <w:tab/>
+        <w:t>6.</w:t>
+      </w:r>
+      <w:r>
+        <w:rPr>
+          <w:sz w:val="20"/>
+          <w:szCs w:val="20"/>
+          <w:highlight w:val="red"/>
+        </w:rPr>
+        <w:t>3</w:t>
+      </w:r>
+      <w:r>
+        <w:rPr>
+          <w:sz w:val="20"/>
+          <w:szCs w:val="20"/>
+          <w:highlight w:val="red"/>
+        </w:rPr>
+        <w:t>.2 Sliding window</w:t>
+      </w:r>
+      <w:r>
+        <w:rPr>
+          <w:sz w:val="20"/>
+          <w:szCs w:val="20"/>
+        </w:rPr>
+        <w:t xml:space="preserve"> (?)</w:t>
+      </w:r>
+    </w:p>
+    <w:p>
+      <w:pPr>
+        <w:rPr>
+          <w:sz w:val="20"/>
+          <w:szCs w:val="20"/>
+        </w:rPr>
+      </w:pPr>
+      <w:r>
+        <w:rPr>
+          <w:sz w:val="20"/>
+          <w:szCs w:val="20"/>
+          <w:highlight w:val="red"/>
+        </w:rPr>
+        <w:tab/>
+        <w:t>6.</w:t>
+      </w:r>
+      <w:r>
+        <w:rPr>
+          <w:sz w:val="20"/>
+          <w:szCs w:val="20"/>
+          <w:highlight w:val="red"/>
+        </w:rPr>
+        <w:t>3</w:t>
+      </w:r>
+      <w:r>
+        <w:rPr>
+          <w:sz w:val="20"/>
+          <w:szCs w:val="20"/>
+          <w:highlight w:val="red"/>
+        </w:rPr>
+        <w:t>.3 Picking pixels</w:t>
+      </w:r>
+      <w:r>
+        <w:rPr>
+          <w:sz w:val="20"/>
+          <w:szCs w:val="20"/>
+        </w:rPr>
+        <w:t xml:space="preserve"> (?)</w:t>
+      </w:r>
+    </w:p>
+    <w:p>
+      <w:pPr>
+        <w:rPr>
+          <w:sz w:val="20"/>
+          <w:szCs w:val="20"/>
+        </w:rPr>
+      </w:pPr>
+      <w:r>
+        <w:rPr>
+          <w:sz w:val="20"/>
+          <w:szCs w:val="20"/>
+          <w:highlight w:val="blue"/>
+        </w:rPr>
+        <w:t>6.</w:t>
+      </w:r>
+      <w:r>
+        <w:rPr>
+          <w:sz w:val="20"/>
+          <w:szCs w:val="20"/>
+          <w:highlight w:val="blue"/>
+        </w:rPr>
+        <w:t>4</w:t>
+      </w:r>
+      <w:r>
+        <w:rPr>
+          <w:sz w:val="20"/>
+          <w:szCs w:val="20"/>
+          <w:highlight w:val="blue"/>
+        </w:rPr>
+        <w:t xml:space="preserve"> </w:t>
+      </w:r>
+      <w:r>
+        <w:rPr>
+          <w:sz w:val="20"/>
+          <w:szCs w:val="20"/>
+          <w:highlight w:val="blue"/>
+        </w:rPr>
+        <w:t>Phase</w:t>
+      </w:r>
+      <w:r>
+        <w:rPr>
+          <w:sz w:val="20"/>
+          <w:szCs w:val="20"/>
+        </w:rPr>
+        <w:t xml:space="preserve"> </w:t>
+      </w:r>
+      <w:r>
+        <w:rPr>
+          <w:sz w:val="20"/>
+          <w:szCs w:val="20"/>
+          <w:highlight w:val="red"/>
+        </w:rPr>
+        <w:t xml:space="preserve">plane fit </w:t>
+      </w:r>
+      <w:r>
+        <w:rPr>
+          <w:sz w:val="20"/>
+          <w:szCs w:val="20"/>
+          <w:highlight w:val="red"/>
+        </w:rPr>
+        <w:t>workflow</w:t>
+      </w:r>
+    </w:p>
+    <w:p>
+      <w:pPr>
+        <w:rPr>
+          <w:sz w:val="20"/>
+          <w:szCs w:val="20"/>
+        </w:rPr>
+      </w:pPr>
+      <w:r>
+        <w:rPr>
+          <w:sz w:val="20"/>
+          <w:szCs w:val="20"/>
+          <w:highlight w:val="darkCyan"/>
+        </w:rPr>
+        <w:lastRenderedPageBreak/>
+        <w:t>6.</w:t>
+      </w:r>
+      <w:r>
+        <w:rPr>
+          <w:sz w:val="20"/>
+          <w:szCs w:val="20"/>
+          <w:highlight w:val="darkCyan"/>
+        </w:rPr>
+        <w:t>5</w:t>
+      </w:r>
+      <w:r>
+        <w:rPr>
+          <w:sz w:val="20"/>
+          <w:szCs w:val="20"/>
+          <w:highlight w:val="darkCyan"/>
+        </w:rPr>
+        <w:t xml:space="preserve"> Interpretation</w:t>
+      </w:r>
+    </w:p>
+    <w:p>
+      <w:pPr>
+        <w:rPr>
+          <w:sz w:val="20"/>
+          <w:szCs w:val="20"/>
+        </w:rPr>
+      </w:pPr>
+    </w:p>
+    <w:p>
+      <w:pPr>
+        <w:rPr>
+          <w:sz w:val="20"/>
+          <w:szCs w:val="20"/>
+        </w:rPr>
+      </w:pPr>
+      <w:r>
+        <w:rPr>
+          <w:sz w:val="20"/>
+          <w:szCs w:val="20"/>
+        </w:rPr>
+        <w:t>Chapter 7: Discussion</w:t>
+      </w:r>
+    </w:p>
+    <w:p>
+      <w:pPr>
+        <w:rPr>
+          <w:sz w:val="20"/>
+          <w:szCs w:val="20"/>
+        </w:rPr>
+      </w:pPr>
+      <w:r>
+        <w:rPr>
+          <w:sz w:val="20"/>
+          <w:szCs w:val="20"/>
+        </w:rPr>
+        <w:t>Introduction of chapter</w:t>
+      </w:r>
+    </w:p>
+    <w:p>
+      <w:pPr>
+        <w:rPr>
+          <w:sz w:val="20"/>
+          <w:szCs w:val="20"/>
+        </w:rPr>
+      </w:pPr>
+      <w:r>
+        <w:rPr>
+          <w:sz w:val="20"/>
+          <w:szCs w:val="20"/>
+        </w:rPr>
+        <w:t xml:space="preserve">7.1: </w:t>
+      </w:r>
+      <w:r>
+        <w:rPr>
+          <w:sz w:val="20"/>
+          <w:szCs w:val="20"/>
+          <w:highlight w:val="yellow"/>
+        </w:rPr>
+        <w:t>H1</w:t>
+      </w:r>
+    </w:p>
+    <w:p>
+      <w:pPr>
+        <w:rPr>
+          <w:sz w:val="20"/>
+          <w:szCs w:val="20"/>
+        </w:rPr>
+      </w:pPr>
+      <w:r>
+        <w:rPr>
+          <w:sz w:val="20"/>
+          <w:szCs w:val="20"/>
+        </w:rPr>
+        <w:t xml:space="preserve">7.2 </w:t>
+      </w:r>
+      <w:r>
+        <w:rPr>
+          <w:sz w:val="20"/>
+          <w:szCs w:val="20"/>
+          <w:highlight w:val="red"/>
+        </w:rPr>
+        <w:t>H2</w:t>
+      </w:r>
+    </w:p>
+    <w:p>
+      <w:pPr>
+        <w:rPr>
+          <w:sz w:val="20"/>
+          <w:szCs w:val="20"/>
+        </w:rPr>
+      </w:pPr>
+      <w:r>
+        <w:rPr>
+          <w:sz w:val="20"/>
+          <w:szCs w:val="20"/>
+        </w:rPr>
+        <w:t xml:space="preserve">7.3: </w:t>
+      </w:r>
+      <w:r>
+        <w:rPr>
+          <w:sz w:val="20"/>
+          <w:szCs w:val="20"/>
+          <w:highlight w:val="darkCyan"/>
+        </w:rPr>
+        <w:t>H3</w:t>
+      </w:r>
+    </w:p>
+    <w:p>
+      <w:pPr>
+        <w:rPr>
+          <w:sz w:val="20"/>
+          <w:szCs w:val="20"/>
+        </w:rPr>
+      </w:pPr>
+      <w:r>
+        <w:rPr>
+          <w:sz w:val="20"/>
+          <w:szCs w:val="20"/>
+        </w:rPr>
+        <w:t>7.4: Limitation</w:t>
+      </w:r>
+    </w:p>
+    <w:p>
+      <w:pPr>
+        <w:rPr>
+          <w:sz w:val="20"/>
+          <w:szCs w:val="20"/>
+        </w:rPr>
+      </w:pPr>
+      <w:r>
+        <w:rPr>
+          <w:sz w:val="20"/>
+          <w:szCs w:val="20"/>
+        </w:rPr>
+        <w:t>7.5 Outlook</w:t>
+      </w:r>
+    </w:p>
+    <w:p>
+      <w:pPr>
+        <w:rPr>
+          <w:sz w:val="20"/>
+          <w:szCs w:val="20"/>
+        </w:rPr>
+      </w:pPr>
+    </w:p>
+    <w:p>
+      <w:pPr>
+        <w:rPr>
+          <w:sz w:val="20"/>
+          <w:szCs w:val="20"/>
+        </w:rPr>
+      </w:pPr>
+      <w:r>
+        <w:rPr>
+          <w:sz w:val="20"/>
+          <w:szCs w:val="20"/>
+        </w:rPr>
+        <w:t>Summary</w:t>
+      </w:r>
+    </w:p>
+    <w:p>
+      <w:pPr>
+        <w:rPr>
+          <w:sz w:val="20"/>
+          <w:szCs w:val="20"/>
+        </w:rPr>
+      </w:pPr>
+    </w:p>
+    <w:p>
+      <w:pPr>
+        <w:rPr>
+          <w:sz w:val="20"/>
+          <w:szCs w:val="20"/>
+        </w:rPr>
+      </w:pPr>
+    </w:p>
+    <w:p>
+      <w:pPr>
+        <w:rPr>
+          <w:sz w:val="20"/>
+          <w:szCs w:val="20"/>
+        </w:rPr>
+      </w:pPr>
+    </w:p>
+    <w:p>
+      <w:pPr>
+        <w:rPr>
+          <w:sz w:val="20"/>
+          <w:szCs w:val="20"/>
+        </w:rPr>
+      </w:pPr>
+    </w:p>
+    <w:p>
+      <w:pPr>
+        <w:ind w:firstLine="720"/>
+        <w:rPr>
+          <w:sz w:val="20"/>
+          <w:szCs w:val="20"/>
+        </w:rPr>
+      </w:pPr>
+      <w:r>
+        <w:rPr>
+          <w:sz w:val="20"/>
+          <w:szCs w:val="20"/>
+        </w:rPr>
+        <w:t>W</w:t>
+      </w:r>
+      <w:r>
+        <w:rPr>
+          <w:sz w:val="20"/>
+          <w:szCs w:val="20"/>
+        </w:rPr>
+        <w:t>orkflow</w:t>
+      </w:r>
+      <w:r>
+        <w:rPr>
+          <w:sz w:val="20"/>
+          <w:szCs w:val="20"/>
+        </w:rPr>
+        <w:t>:</w:t>
+      </w:r>
+    </w:p>
+    <w:p>
+      <w:pPr>
+        <w:pStyle w:val="ListParagraph"/>
+        <w:numPr>
+          <w:ilvl w:val="0"/>
+          <w:numId w:val="8"/>
+        </w:numPr>
+        <w:rPr>
+          <w:sz w:val="20"/>
+          <w:szCs w:val="20"/>
+        </w:rPr>
+      </w:pPr>
+      <w:r>
+        <w:rPr>
+          <w:sz w:val="20"/>
+          <w:szCs w:val="20"/>
+        </w:rPr>
+        <w:t>Direct wave removal</w:t>
+      </w:r>
+    </w:p>
+    <w:p>
+      <w:pPr>
+        <w:pStyle w:val="ListParagraph"/>
+        <w:numPr>
+          <w:ilvl w:val="0"/>
+          <w:numId w:val="8"/>
+        </w:numPr>
+        <w:rPr>
+          <w:sz w:val="20"/>
+          <w:szCs w:val="20"/>
+        </w:rPr>
+      </w:pPr>
+      <w:r>
+        <w:rPr>
+          <w:sz w:val="20"/>
+          <w:szCs w:val="20"/>
+        </w:rPr>
+        <w:t>Tapering</w:t>
+      </w:r>
+    </w:p>
+    <w:p>
+      <w:pPr>
+        <w:pStyle w:val="ListParagraph"/>
+        <w:numPr>
+          <w:ilvl w:val="0"/>
+          <w:numId w:val="8"/>
+        </w:numPr>
+        <w:rPr>
+          <w:sz w:val="20"/>
+          <w:szCs w:val="20"/>
+        </w:rPr>
+      </w:pPr>
+      <w:r>
+        <w:rPr>
+          <w:sz w:val="20"/>
+          <w:szCs w:val="20"/>
+        </w:rPr>
+        <w:t>Time zero correction</w:t>
+      </w:r>
+    </w:p>
+    <w:p>
+      <w:pPr>
+        <w:pStyle w:val="ListParagraph"/>
+        <w:numPr>
+          <w:ilvl w:val="0"/>
+          <w:numId w:val="8"/>
+        </w:numPr>
+        <w:rPr>
+          <w:sz w:val="20"/>
+          <w:szCs w:val="20"/>
+        </w:rPr>
+      </w:pPr>
+      <w:r>
+        <w:rPr>
+          <w:sz w:val="20"/>
+          <w:szCs w:val="20"/>
+        </w:rPr>
+        <w:t>etc</w:t>
+      </w:r>
+    </w:p>
+    <w:p>
+      <w:pPr>
+        <w:pStyle w:val="ListParagraph"/>
+        <w:numPr>
+          <w:ilvl w:val="0"/>
+          <w:numId w:val="8"/>
+        </w:numPr>
+        <w:rPr>
+          <w:sz w:val="20"/>
+          <w:szCs w:val="20"/>
+        </w:rPr>
+      </w:pPr>
+      <w:r>
+        <w:rPr>
+          <w:sz w:val="20"/>
+          <w:szCs w:val="20"/>
+        </w:rPr>
+        <w:t>For back-propagation:</w:t>
+      </w:r>
+    </w:p>
+    <w:p>
+      <w:pPr>
+        <w:pStyle w:val="ListParagraph"/>
+        <w:numPr>
+          <w:ilvl w:val="1"/>
+          <w:numId w:val="8"/>
+        </w:numPr>
+        <w:rPr>
+          <w:sz w:val="20"/>
+          <w:szCs w:val="20"/>
+        </w:rPr>
+      </w:pPr>
+      <w:r>
+        <w:rPr>
+          <w:sz w:val="20"/>
+          <w:szCs w:val="20"/>
+        </w:rPr>
+        <w:t>Time-reversal</w:t>
+      </w:r>
+    </w:p>
+    <w:p>
+      <w:pPr>
+        <w:pStyle w:val="ListParagraph"/>
+        <w:numPr>
+          <w:ilvl w:val="1"/>
+          <w:numId w:val="8"/>
+        </w:numPr>
+        <w:rPr>
+          <w:sz w:val="20"/>
+          <w:szCs w:val="20"/>
+        </w:rPr>
+      </w:pPr>
+      <w:r>
+        <w:rPr>
+          <w:sz w:val="20"/>
+          <w:szCs w:val="20"/>
+        </w:rPr>
+        <w:t>Bandpass filter</w:t>
+      </w:r>
+    </w:p>
+    <w:p>
+      <w:pPr>
+        <w:pStyle w:val="ListParagraph"/>
+        <w:numPr>
+          <w:ilvl w:val="1"/>
+          <w:numId w:val="8"/>
+        </w:numPr>
+        <w:rPr>
+          <w:sz w:val="20"/>
+          <w:szCs w:val="20"/>
+        </w:rPr>
+      </w:pPr>
+      <w:r>
+        <w:rPr>
+          <w:sz w:val="20"/>
+          <w:szCs w:val="20"/>
+        </w:rPr>
+        <w:t>Removing edge sources</w:t>
+      </w:r>
+    </w:p>
+    <w:p>
+      <w:pPr>
+        <w:pStyle w:val="ListParagraph"/>
+        <w:numPr>
+          <w:ilvl w:val="1"/>
+          <w:numId w:val="8"/>
+        </w:numPr>
+        <w:rPr>
+          <w:sz w:val="20"/>
+          <w:szCs w:val="20"/>
+        </w:rPr>
+      </w:pPr>
+      <w:r>
+        <w:rPr>
+          <w:sz w:val="20"/>
+          <w:szCs w:val="20"/>
+        </w:rPr>
+        <w:t>E</w:t>
+      </w:r>
+      <w:r>
+        <w:rPr>
+          <w:sz w:val="20"/>
+          <w:szCs w:val="20"/>
+        </w:rPr>
+        <w:t>tc</w:t>
+      </w:r>
+      <w:r>
+        <w:rPr>
+          <w:sz w:val="20"/>
+          <w:szCs w:val="20"/>
+        </w:rPr>
+        <w:t xml:space="preserve"> </w:t>
+      </w:r>
+    </w:p>
+    <w:p>
+      <w:pPr>
+        <w:rPr>
+          <w:sz w:val="20"/>
+          <w:szCs w:val="20"/>
+        </w:rPr>
+      </w:pPr>
+    </w:p>
+    <w:p>
+      <w:pPr>
+        <w:rPr>
+          <w:sz w:val="20"/>
+          <w:szCs w:val="20"/>
+        </w:rPr>
+      </w:pPr>
+      <w:r>
+        <w:rPr>
+          <w:sz w:val="20"/>
+          <w:szCs w:val="20"/>
+        </w:rPr>
+        <w:t xml:space="preserve">Ch 5. </w:t>
+      </w:r>
+    </w:p>
+    <w:p>
+      <w:pPr>
+        <w:ind w:firstLine="720"/>
+        <w:rPr>
+          <w:sz w:val="20"/>
+          <w:szCs w:val="20"/>
+        </w:rPr>
+      </w:pPr>
+      <w:r>
+        <w:rPr>
+          <w:sz w:val="20"/>
+          <w:szCs w:val="20"/>
+        </w:rPr>
+        <w:t>Introduction of chapter</w:t>
+      </w:r>
+    </w:p>
+    <w:p>
+      <w:pPr>
+        <w:ind w:firstLine="720"/>
+        <w:rPr>
+          <w:sz w:val="20"/>
+          <w:szCs w:val="20"/>
+        </w:rPr>
+      </w:pPr>
+      <w:r>
+        <w:rPr>
+          <w:sz w:val="20"/>
+          <w:szCs w:val="20"/>
+        </w:rPr>
+        <w:t>Workflow:</w:t>
+      </w:r>
+    </w:p>
+    <w:p>
+      <w:pPr>
+        <w:pStyle w:val="ListParagraph"/>
+        <w:numPr>
+          <w:ilvl w:val="0"/>
+          <w:numId w:val="9"/>
+        </w:numPr>
+        <w:rPr>
+          <w:sz w:val="20"/>
+          <w:szCs w:val="20"/>
+        </w:rPr>
+      </w:pPr>
+      <w:r>
+        <w:rPr>
+          <w:sz w:val="20"/>
+          <w:szCs w:val="20"/>
+        </w:rPr>
+        <w:t>Creating noise (show images of that)</w:t>
+      </w:r>
+    </w:p>
+    <w:p>
+      <w:pPr>
+        <w:pStyle w:val="ListParagraph"/>
+        <w:numPr>
+          <w:ilvl w:val="0"/>
+          <w:numId w:val="9"/>
+        </w:numPr>
+        <w:rPr>
+          <w:sz w:val="20"/>
+          <w:szCs w:val="20"/>
+        </w:rPr>
+      </w:pPr>
+      <w:r>
+        <w:rPr>
+          <w:sz w:val="20"/>
+          <w:szCs w:val="20"/>
+        </w:rPr>
+        <w:t>Spectrum of noise</w:t>
+      </w:r>
+    </w:p>
+    <w:p>
+      <w:pPr>
+        <w:pStyle w:val="ListParagraph"/>
+        <w:numPr>
+          <w:ilvl w:val="0"/>
+          <w:numId w:val="9"/>
+        </w:numPr>
+        <w:rPr>
+          <w:sz w:val="20"/>
+          <w:szCs w:val="20"/>
+        </w:rPr>
+      </w:pPr>
+      <w:r>
+        <w:rPr>
+          <w:sz w:val="20"/>
+          <w:szCs w:val="20"/>
+        </w:rPr>
+        <w:t>B-scans before and after adding noise (after the normal processing)</w:t>
+      </w:r>
+    </w:p>
+    <w:p>
+      <w:pPr>
+        <w:pStyle w:val="ListParagraph"/>
+        <w:numPr>
+          <w:ilvl w:val="0"/>
+          <w:numId w:val="9"/>
+        </w:numPr>
+        <w:rPr>
+          <w:sz w:val="20"/>
+          <w:szCs w:val="20"/>
+        </w:rPr>
+      </w:pPr>
+      <w:r>
+        <w:rPr>
+          <w:sz w:val="20"/>
+          <w:szCs w:val="20"/>
+        </w:rPr>
+        <w:t>For back-propagation:</w:t>
+      </w:r>
+    </w:p>
+    <w:p>
+      <w:pPr>
+        <w:pStyle w:val="ListParagraph"/>
+        <w:numPr>
+          <w:ilvl w:val="1"/>
+          <w:numId w:val="9"/>
+        </w:numPr>
+        <w:rPr>
+          <w:sz w:val="20"/>
+          <w:szCs w:val="20"/>
+        </w:rPr>
+      </w:pPr>
+      <w:r>
+        <w:rPr>
+          <w:sz w:val="20"/>
+          <w:szCs w:val="20"/>
+        </w:rPr>
+        <w:t>Time-reversal</w:t>
+      </w:r>
+    </w:p>
+    <w:p>
+      <w:pPr>
+        <w:pStyle w:val="ListParagraph"/>
+        <w:numPr>
+          <w:ilvl w:val="1"/>
+          <w:numId w:val="9"/>
+        </w:numPr>
+        <w:rPr>
+          <w:sz w:val="20"/>
+          <w:szCs w:val="20"/>
+        </w:rPr>
+      </w:pPr>
+      <w:r>
+        <w:rPr>
+          <w:sz w:val="20"/>
+          <w:szCs w:val="20"/>
+        </w:rPr>
+        <w:t>Bandpass filter</w:t>
+      </w:r>
+    </w:p>
+    <w:p>
+      <w:pPr>
+        <w:pStyle w:val="ListParagraph"/>
+        <w:numPr>
+          <w:ilvl w:val="1"/>
+          <w:numId w:val="9"/>
+        </w:numPr>
+        <w:rPr>
+          <w:sz w:val="20"/>
+          <w:szCs w:val="20"/>
+        </w:rPr>
+      </w:pPr>
+      <w:r>
+        <w:rPr>
+          <w:sz w:val="20"/>
+          <w:szCs w:val="20"/>
+        </w:rPr>
+        <w:t>Removing edge sources</w:t>
+      </w:r>
+    </w:p>
+    <w:p>
+      <w:pPr>
+        <w:pStyle w:val="ListParagraph"/>
+        <w:numPr>
+          <w:ilvl w:val="1"/>
+          <w:numId w:val="9"/>
+        </w:numPr>
+        <w:rPr>
+          <w:sz w:val="20"/>
+          <w:szCs w:val="20"/>
+        </w:rPr>
+      </w:pPr>
+      <w:r>
+        <w:rPr>
+          <w:sz w:val="20"/>
+          <w:szCs w:val="20"/>
+        </w:rPr>
+        <w:t>Sign-bit</w:t>
+      </w:r>
+    </w:p>
+    <w:p>
+      <w:pPr>
+        <w:pStyle w:val="ListParagraph"/>
+        <w:numPr>
+          <w:ilvl w:val="1"/>
+          <w:numId w:val="9"/>
+        </w:numPr>
+        <w:rPr>
+          <w:sz w:val="20"/>
+          <w:szCs w:val="20"/>
+        </w:rPr>
+      </w:pPr>
+      <w:r>
+        <w:rPr>
+          <w:sz w:val="20"/>
+          <w:szCs w:val="20"/>
+        </w:rPr>
+        <w:t>etc</w:t>
+      </w:r>
+    </w:p>
+    <w:p>
+      <w:pPr>
+        <w:rPr>
+          <w:sz w:val="20"/>
+          <w:szCs w:val="20"/>
+        </w:rPr>
+      </w:pPr>
+      <w:r>
+        <w:rPr>
+          <w:sz w:val="20"/>
+          <w:szCs w:val="20"/>
+        </w:rPr>
+        <w:lastRenderedPageBreak/>
+        <w:t>Ch 4.1 Lateral Movement</w:t>
+      </w:r>
+    </w:p>
+    <w:p>
+      <w:pPr>
+        <w:rPr>
+          <w:sz w:val="20"/>
+          <w:szCs w:val="20"/>
+        </w:rPr>
+      </w:pPr>
+      <w:r>
+        <w:rPr>
+          <w:sz w:val="20"/>
+          <w:szCs w:val="20"/>
+        </w:rPr>
+        <w:tab/>
+        <w:t>Model domain</w:t>
+      </w:r>
+    </w:p>
+    <w:p>
+      <w:pPr>
+        <w:rPr>
+          <w:sz w:val="20"/>
+          <w:szCs w:val="20"/>
+        </w:rPr>
+      </w:pPr>
+      <w:r>
+        <w:rPr>
+          <w:sz w:val="20"/>
+          <w:szCs w:val="20"/>
+        </w:rPr>
+        <w:tab/>
+        <w:t>B-scans before and after tapering, direct wave removal, time zero correction</w:t>
+      </w:r>
+    </w:p>
+    <w:p>
+      <w:pPr>
+        <w:rPr>
+          <w:sz w:val="20"/>
+          <w:szCs w:val="20"/>
+        </w:rPr>
+      </w:pPr>
+      <w:r>
+        <w:rPr>
+          <w:sz w:val="20"/>
+          <w:szCs w:val="20"/>
+        </w:rPr>
+        <w:tab/>
+        <w:t>Migration gallery</w:t>
+      </w:r>
+    </w:p>
+    <w:p>
+      <w:pPr>
+        <w:rPr>
+          <w:sz w:val="20"/>
+          <w:szCs w:val="20"/>
+        </w:rPr>
+      </w:pPr>
+      <w:r>
+        <w:rPr>
+          <w:sz w:val="20"/>
+          <w:szCs w:val="20"/>
+        </w:rPr>
+        <w:tab/>
+        <w:t>Amplitude test: PSF and lobe separation table</w:t>
+      </w:r>
+    </w:p>
+    <w:p>
+      <w:pPr>
+        <w:rPr>
+          <w:sz w:val="20"/>
+          <w:szCs w:val="20"/>
+        </w:rPr>
+      </w:pPr>
+      <w:r>
+        <w:rPr>
+          <w:sz w:val="20"/>
+          <w:szCs w:val="20"/>
+        </w:rPr>
+        <w:tab/>
+        <w:t>Phase test: WLS and movement table</w:t>
+      </w:r>
+    </w:p>
+    <w:p>
+      <w:pPr>
+        <w:rPr>
+          <w:sz w:val="20"/>
+          <w:szCs w:val="20"/>
+        </w:rPr>
+      </w:pPr>
+      <w:r>
+        <w:rPr>
+          <w:sz w:val="20"/>
+          <w:szCs w:val="20"/>
+        </w:rPr>
+        <w:t>Ch 4.2 Vertical Movement</w:t>
+      </w:r>
+    </w:p>
+    <w:p>
+      <w:pPr>
+        <w:rPr>
+          <w:sz w:val="20"/>
+          <w:szCs w:val="20"/>
+        </w:rPr>
+      </w:pPr>
+      <w:r>
+        <w:rPr>
+          <w:sz w:val="20"/>
+          <w:szCs w:val="20"/>
+        </w:rPr>
+        <w:tab/>
+        <w:t>Same set up</w:t>
+      </w:r>
+    </w:p>
+    <w:p>
+      <w:pPr>
+        <w:rPr>
+          <w:sz w:val="20"/>
+          <w:szCs w:val="20"/>
+        </w:rPr>
+      </w:pPr>
+      <w:r>
+        <w:rPr>
+          <w:sz w:val="20"/>
+          <w:szCs w:val="20"/>
+        </w:rPr>
+        <w:t>Ch 4.3 Diagonal Movement</w:t>
+      </w:r>
+    </w:p>
+    <w:p>
+      <w:pPr>
+        <w:rPr>
+          <w:sz w:val="20"/>
+          <w:szCs w:val="20"/>
+        </w:rPr>
+      </w:pPr>
+      <w:r>
+        <w:rPr>
+          <w:sz w:val="20"/>
+          <w:szCs w:val="20"/>
+        </w:rPr>
+        <w:t>Ch 4.4 Fluid Flow</w:t>
+      </w:r>
+    </w:p>
+    <w:p>
+      <w:pPr>
+        <w:rPr>
+          <w:sz w:val="20"/>
+          <w:szCs w:val="20"/>
+        </w:rPr>
+      </w:pPr>
     </w:p>
     <w:sectPr>
       <w:pgSz w:w="11906" w:h="16838"/>
@@ -3118,6 +5467,184 @@
     </w:lvl>
   </w:abstractNum>
   <w:abstractNum w:abstractNumId="1" w15:restartNumberingAfterBreak="0">
+    <w:nsid w:val="0D180F46"/>
+    <w:multiLevelType w:val="hybridMultilevel"/>
+    <w:tmpl w:val="3EB4D1DE"/>
+    <w:lvl w:ilvl="0" w:tplc="60D05F02">
+      <w:start w:val="1"/>
+      <w:numFmt w:val="decimal"/>
+      <w:lvlText w:val="%1."/>
+      <w:lvlJc w:val="left"/>
+      <w:pPr>
+        <w:ind w:left="1080" w:hanging="360"/>
+      </w:pPr>
+      <w:rPr>
+        <w:rFonts w:hint="default"/>
+      </w:rPr>
+    </w:lvl>
+    <w:lvl w:ilvl="1" w:tplc="08090019">
+      <w:start w:val="1"/>
+      <w:numFmt w:val="lowerLetter"/>
+      <w:lvlText w:val="%2."/>
+      <w:lvlJc w:val="left"/>
+      <w:pPr>
+        <w:ind w:left="1800" w:hanging="360"/>
+      </w:pPr>
+    </w:lvl>
+    <w:lvl w:ilvl="2" w:tplc="0809001B" w:tentative="1">
+      <w:start w:val="1"/>
+      <w:numFmt w:val="lowerRoman"/>
+      <w:lvlText w:val="%3."/>
+      <w:lvlJc w:val="right"/>
+      <w:pPr>
+        <w:ind w:left="2520" w:hanging="180"/>
+      </w:pPr>
+    </w:lvl>
+    <w:lvl w:ilvl="3" w:tplc="0809000F" w:tentative="1">
+      <w:start w:val="1"/>
+      <w:numFmt w:val="decimal"/>
+      <w:lvlText w:val="%4."/>
+      <w:lvlJc w:val="left"/>
+      <w:pPr>
+        <w:ind w:left="3240" w:hanging="360"/>
+      </w:pPr>
+    </w:lvl>
+    <w:lvl w:ilvl="4" w:tplc="08090019" w:tentative="1">
+      <w:start w:val="1"/>
+      <w:numFmt w:val="lowerLetter"/>
+      <w:lvlText w:val="%5."/>
+      <w:lvlJc w:val="left"/>
+      <w:pPr>
+        <w:ind w:left="3960" w:hanging="360"/>
+      </w:pPr>
+    </w:lvl>
+    <w:lvl w:ilvl="5" w:tplc="0809001B" w:tentative="1">
+      <w:start w:val="1"/>
+      <w:numFmt w:val="lowerRoman"/>
+      <w:lvlText w:val="%6."/>
+      <w:lvlJc w:val="right"/>
+      <w:pPr>
+        <w:ind w:left="4680" w:hanging="180"/>
+      </w:pPr>
+    </w:lvl>
+    <w:lvl w:ilvl="6" w:tplc="0809000F" w:tentative="1">
+      <w:start w:val="1"/>
+      <w:numFmt w:val="decimal"/>
+      <w:lvlText w:val="%7."/>
+      <w:lvlJc w:val="left"/>
+      <w:pPr>
+        <w:ind w:left="5400" w:hanging="360"/>
+      </w:pPr>
+    </w:lvl>
+    <w:lvl w:ilvl="7" w:tplc="08090019" w:tentative="1">
+      <w:start w:val="1"/>
+      <w:numFmt w:val="lowerLetter"/>
+      <w:lvlText w:val="%8."/>
+      <w:lvlJc w:val="left"/>
+      <w:pPr>
+        <w:ind w:left="6120" w:hanging="360"/>
+      </w:pPr>
+    </w:lvl>
+    <w:lvl w:ilvl="8" w:tplc="0809001B" w:tentative="1">
+      <w:start w:val="1"/>
+      <w:numFmt w:val="lowerRoman"/>
+      <w:lvlText w:val="%9."/>
+      <w:lvlJc w:val="right"/>
+      <w:pPr>
+        <w:ind w:left="6840" w:hanging="180"/>
+      </w:pPr>
+    </w:lvl>
+  </w:abstractNum>
+  <w:abstractNum w:abstractNumId="2" w15:restartNumberingAfterBreak="0">
+    <w:nsid w:val="266C2D1B"/>
+    <w:multiLevelType w:val="hybridMultilevel"/>
+    <w:tmpl w:val="98BE2DFA"/>
+    <w:lvl w:ilvl="0" w:tplc="0DE2DF8C">
+      <w:start w:val="1"/>
+      <w:numFmt w:val="decimal"/>
+      <w:lvlText w:val="%1."/>
+      <w:lvlJc w:val="left"/>
+      <w:pPr>
+        <w:ind w:left="1080" w:hanging="360"/>
+      </w:pPr>
+      <w:rPr>
+        <w:rFonts w:hint="default"/>
+      </w:rPr>
+    </w:lvl>
+    <w:lvl w:ilvl="1" w:tplc="08090019">
+      <w:start w:val="1"/>
+      <w:numFmt w:val="lowerLetter"/>
+      <w:lvlText w:val="%2."/>
+      <w:lvlJc w:val="left"/>
+      <w:pPr>
+        <w:ind w:left="1800" w:hanging="360"/>
+      </w:pPr>
+    </w:lvl>
+    <w:lvl w:ilvl="2" w:tplc="0809001B" w:tentative="1">
+      <w:start w:val="1"/>
+      <w:numFmt w:val="lowerRoman"/>
+      <w:lvlText w:val="%3."/>
+      <w:lvlJc w:val="right"/>
+      <w:pPr>
+        <w:ind w:left="2520" w:hanging="180"/>
+      </w:pPr>
+    </w:lvl>
+    <w:lvl w:ilvl="3" w:tplc="0809000F" w:tentative="1">
+      <w:start w:val="1"/>
+      <w:numFmt w:val="decimal"/>
+      <w:lvlText w:val="%4."/>
+      <w:lvlJc w:val="left"/>
+      <w:pPr>
+        <w:ind w:left="3240" w:hanging="360"/>
+      </w:pPr>
+    </w:lvl>
+    <w:lvl w:ilvl="4" w:tplc="08090019" w:tentative="1">
+      <w:start w:val="1"/>
+      <w:numFmt w:val="lowerLetter"/>
+      <w:lvlText w:val="%5."/>
+      <w:lvlJc w:val="left"/>
+      <w:pPr>
+        <w:ind w:left="3960" w:hanging="360"/>
+      </w:pPr>
+    </w:lvl>
+    <w:lvl w:ilvl="5" w:tplc="0809001B" w:tentative="1">
+      <w:start w:val="1"/>
+      <w:numFmt w:val="lowerRoman"/>
+      <w:lvlText w:val="%6."/>
+      <w:lvlJc w:val="right"/>
+      <w:pPr>
+        <w:ind w:left="4680" w:hanging="180"/>
+      </w:pPr>
+    </w:lvl>
+    <w:lvl w:ilvl="6" w:tplc="0809000F" w:tentative="1">
+      <w:start w:val="1"/>
+      <w:numFmt w:val="decimal"/>
+      <w:lvlText w:val="%7."/>
+      <w:lvlJc w:val="left"/>
+      <w:pPr>
+        <w:ind w:left="5400" w:hanging="360"/>
+      </w:pPr>
+    </w:lvl>
+    <w:lvl w:ilvl="7" w:tplc="08090019" w:tentative="1">
+      <w:start w:val="1"/>
+      <w:numFmt w:val="lowerLetter"/>
+      <w:lvlText w:val="%8."/>
+      <w:lvlJc w:val="left"/>
+      <w:pPr>
+        <w:ind w:left="6120" w:hanging="360"/>
+      </w:pPr>
+    </w:lvl>
+    <w:lvl w:ilvl="8" w:tplc="0809001B" w:tentative="1">
+      <w:start w:val="1"/>
+      <w:numFmt w:val="lowerRoman"/>
+      <w:lvlText w:val="%9."/>
+      <w:lvlJc w:val="right"/>
+      <w:pPr>
+        <w:ind w:left="6840" w:hanging="180"/>
+      </w:pPr>
+    </w:lvl>
+  </w:abstractNum>
+  <w:abstractNum w:abstractNumId="3" w15:restartNumberingAfterBreak="0">
     <w:nsid w:val="3623261C"/>
     <w:multiLevelType w:val="hybridMultilevel"/>
     <w:tmpl w:val="3A4E3940"/>
@@ -3206,7 +5733,7 @@
       </w:pPr>
     </w:lvl>
   </w:abstractNum>
-  <w:abstractNum w:abstractNumId="2" w15:restartNumberingAfterBreak="0">
+  <w:abstractNum w:abstractNumId="4" w15:restartNumberingAfterBreak="0">
     <w:nsid w:val="3894545A"/>
     <w:multiLevelType w:val="hybridMultilevel"/>
     <w:tmpl w:val="8FBC964A"/>
@@ -3318,7 +5845,7 @@
       </w:rPr>
     </w:lvl>
   </w:abstractNum>
-  <w:abstractNum w:abstractNumId="3" w15:restartNumberingAfterBreak="0">
+  <w:abstractNum w:abstractNumId="5" w15:restartNumberingAfterBreak="0">
     <w:nsid w:val="4E81638E"/>
     <w:multiLevelType w:val="hybridMultilevel"/>
     <w:tmpl w:val="14148838"/>
@@ -3431,7 +5958,7 @@
       </w:rPr>
     </w:lvl>
   </w:abstractNum>
-  <w:abstractNum w:abstractNumId="4" w15:restartNumberingAfterBreak="0">
+  <w:abstractNum w:abstractNumId="6" w15:restartNumberingAfterBreak="0">
     <w:nsid w:val="59B11C82"/>
     <w:multiLevelType w:val="hybridMultilevel"/>
     <w:tmpl w:val="4D3C7386"/>
@@ -3520,7 +6047,120 @@
       </w:pPr>
     </w:lvl>
   </w:abstractNum>
-  <w:abstractNum w:abstractNumId="5" w15:restartNumberingAfterBreak="0">
+  <w:abstractNum w:abstractNumId="7" w15:restartNumberingAfterBreak="0">
+    <w:nsid w:val="6D674AE1"/>
+    <w:multiLevelType w:val="multilevel"/>
+    <w:tmpl w:val="A80438C2"/>
+    <w:lvl w:ilvl="0">
+      <w:start w:val="1"/>
+      <w:numFmt w:val="decimal"/>
+      <w:lvlText w:val="%1"/>
+      <w:lvlJc w:val="left"/>
+      <w:pPr>
+        <w:ind w:left="360" w:hanging="360"/>
+      </w:pPr>
+      <w:rPr>
+        <w:rFonts w:hint="default"/>
+      </w:rPr>
+    </w:lvl>
+    <w:lvl w:ilvl="1">
+      <w:start w:val="1"/>
+      <w:numFmt w:val="decimal"/>
+      <w:lvlText w:val="%1.%2"/>
+      <w:lvlJc w:val="left"/>
+      <w:pPr>
+        <w:ind w:left="360" w:hanging="360"/>
+      </w:pPr>
+      <w:rPr>
+        <w:rFonts w:hint="default"/>
+      </w:rPr>
+    </w:lvl>
+    <w:lvl w:ilvl="2">
+      <w:start w:val="1"/>
+      <w:numFmt w:val="decimal"/>
+      <w:lvlText w:val="%1.%2.%3"/>
+      <w:lvlJc w:val="left"/>
+      <w:pPr>
+        <w:ind w:left="720" w:hanging="720"/>
+      </w:pPr>
+      <w:rPr>
+        <w:rFonts w:hint="default"/>
+      </w:rPr>
+    </w:lvl>
+    <w:lvl w:ilvl="3">
+      <w:start w:val="1"/>
+      <w:numFmt w:val="decimal"/>
+      <w:lvlText w:val="%1.%2.%3.%4"/>
+      <w:lvlJc w:val="left"/>
+      <w:pPr>
+        <w:ind w:left="720" w:hanging="720"/>
+      </w:pPr>
+      <w:rPr>
+        <w:rFonts w:hint="default"/>
+      </w:rPr>
+    </w:lvl>
+    <w:lvl w:ilvl="4">
+      <w:start w:val="1"/>
+      <w:numFmt w:val="decimal"/>
+      <w:lvlText w:val="%1.%2.%3.%4.%5"/>
+      <w:lvlJc w:val="left"/>
+      <w:pPr>
+        <w:ind w:left="1080" w:hanging="1080"/>
+      </w:pPr>
+      <w:rPr>
+        <w:rFonts w:hint="default"/>
+      </w:rPr>
+    </w:lvl>
+    <w:lvl w:ilvl="5">
+      <w:start w:val="1"/>
+      <w:numFmt w:val="decimal"/>
+      <w:lvlText w:val="%1.%2.%3.%4.%5.%6"/>
+      <w:lvlJc w:val="left"/>
+      <w:pPr>
+        <w:ind w:left="1080" w:hanging="1080"/>
+      </w:pPr>
+      <w:rPr>
+        <w:rFonts w:hint="default"/>
+      </w:rPr>
+    </w:lvl>
+    <w:lvl w:ilvl="6">
+      <w:start w:val="1"/>
+      <w:numFmt w:val="decimal"/>
+      <w:lvlText w:val="%1.%2.%3.%4.%5.%6.%7"/>
+      <w:lvlJc w:val="left"/>
+      <w:pPr>
+        <w:ind w:left="1440" w:hanging="1440"/>
+      </w:pPr>
+      <w:rPr>
+        <w:rFonts w:hint="default"/>
+      </w:rPr>
+    </w:lvl>
+    <w:lvl w:ilvl="7">
+      <w:start w:val="1"/>
+      <w:numFmt w:val="decimal"/>
+      <w:lvlText w:val="%1.%2.%3.%4.%5.%6.%7.%8"/>
+      <w:lvlJc w:val="left"/>
+      <w:pPr>
+        <w:ind w:left="1440" w:hanging="1440"/>
+      </w:pPr>
+      <w:rPr>
+        <w:rFonts w:hint="default"/>
+      </w:rPr>
+    </w:lvl>
+    <w:lvl w:ilvl="8">
+      <w:start w:val="1"/>
+      <w:numFmt w:val="decimal"/>
+      <w:lvlText w:val="%1.%2.%3.%4.%5.%6.%7.%8.%9"/>
+      <w:lvlJc w:val="left"/>
+      <w:pPr>
+        <w:ind w:left="1440" w:hanging="1440"/>
+      </w:pPr>
+      <w:rPr>
+        <w:rFonts w:hint="default"/>
+      </w:rPr>
+    </w:lvl>
+  </w:abstractNum>
+  <w:abstractNum w:abstractNumId="8" w15:restartNumberingAfterBreak="0">
     <w:nsid w:val="74BC1098"/>
     <w:multiLevelType w:val="hybridMultilevel"/>
     <w:tmpl w:val="2E32C37A"/>
@@ -3609,7 +6249,7 @@
       </w:pPr>
     </w:lvl>
   </w:abstractNum>
-  <w:abstractNum w:abstractNumId="6" w15:restartNumberingAfterBreak="0">
+  <w:abstractNum w:abstractNumId="9" w15:restartNumberingAfterBreak="0">
     <w:nsid w:val="772C15E0"/>
     <w:multiLevelType w:val="hybridMultilevel"/>
     <w:tmpl w:val="353CBA26"/>
@@ -3699,25 +6339,34 @@
     </w:lvl>
   </w:abstractNum>
   <w:num w:numId="1" w16cid:durableId="1339388064">
-    <w:abstractNumId w:val="3"/>
+    <w:abstractNumId w:val="5"/>
   </w:num>
   <w:num w:numId="2" w16cid:durableId="1361861515">
     <w:abstractNumId w:val="0"/>
   </w:num>
   <w:num w:numId="3" w16cid:durableId="18505631">
+    <w:abstractNumId w:val="6"/>
+  </w:num>
+  <w:num w:numId="4" w16cid:durableId="227349705">
     <w:abstractNumId w:val="4"/>
   </w:num>
-  <w:num w:numId="4" w16cid:durableId="227349705">
+  <w:num w:numId="5" w16cid:durableId="295137552">
+    <w:abstractNumId w:val="3"/>
+  </w:num>
+  <w:num w:numId="6" w16cid:durableId="1924609991">
+    <w:abstractNumId w:val="9"/>
+  </w:num>
+  <w:num w:numId="7" w16cid:durableId="1603563524">
+    <w:abstractNumId w:val="8"/>
+  </w:num>
+  <w:num w:numId="8" w16cid:durableId="1739786868">
+    <w:abstractNumId w:val="1"/>
+  </w:num>
+  <w:num w:numId="9" w16cid:durableId="539099689">
     <w:abstractNumId w:val="2"/>
   </w:num>
-  <w:num w:numId="5" w16cid:durableId="295137552">
-    <w:abstractNumId w:val="1"/>
-  </w:num>
-  <w:num w:numId="6" w16cid:durableId="1924609991">
-    <w:abstractNumId w:val="6"/>
-  </w:num>
-  <w:num w:numId="7" w16cid:durableId="1603563524">
-    <w:abstractNumId w:val="5"/>
+  <w:num w:numId="10" w16cid:durableId="1843547769">
+    <w:abstractNumId w:val="7"/>
   </w:num>
 </w:numbering>
 </file>
@@ -4119,15 +6768,15 @@
     <w:lsdException w:name="Unresolved Mention" w:semiHidden="1" w:unhideWhenUsed="1"/>
     <w:lsdException w:name="Smart Link" w:semiHidden="1" w:unhideWhenUsed="1"/>
   </w:latentStyles>
-  <w:style w:type="paragraph" w:default="1" w:styleId="Standaard">
+  <w:style w:type="paragraph" w:default="1" w:styleId="Normal">
     <w:name w:val="Normal"/>
     <w:qFormat/>
   </w:style>
-  <w:style w:type="paragraph" w:styleId="Kop1">
+  <w:style w:type="paragraph" w:styleId="Heading1">
     <w:name w:val="heading 1"/>
-    <w:basedOn w:val="Standaard"/>
-    <w:next w:val="Standaard"/>
-    <w:link w:val="Kop1Char"/>
+    <w:basedOn w:val="Normal"/>
+    <w:next w:val="Normal"/>
+    <w:link w:val="Heading1Char"/>
     <w:uiPriority w:val="9"/>
     <w:qFormat/>
     <w:rsid w:val="005B10CC"/>
@@ -4144,11 +6793,11 @@
       <w:szCs w:val="40"/>
     </w:rPr>
   </w:style>
-  <w:style w:type="paragraph" w:styleId="Kop2">
+  <w:style w:type="paragraph" w:styleId="Heading2">
     <w:name w:val="heading 2"/>
-    <w:basedOn w:val="Standaard"/>
-    <w:next w:val="Standaard"/>
-    <w:link w:val="Kop2Char"/>
+    <w:basedOn w:val="Normal"/>
+    <w:next w:val="Normal"/>
+    <w:link w:val="Heading2Char"/>
     <w:uiPriority w:val="9"/>
     <w:semiHidden/>
     <w:unhideWhenUsed/>
@@ -4167,11 +6816,11 @@
       <w:szCs w:val="32"/>
     </w:rPr>
   </w:style>
-  <w:style w:type="paragraph" w:styleId="Kop3">
+  <w:style w:type="paragraph" w:styleId="Heading3">
     <w:name w:val="heading 3"/>
-    <w:basedOn w:val="Standaard"/>
-    <w:next w:val="Standaard"/>
-    <w:link w:val="Kop3Char"/>
+    <w:basedOn w:val="Normal"/>
+    <w:next w:val="Normal"/>
+    <w:link w:val="Heading3Char"/>
     <w:uiPriority w:val="9"/>
     <w:unhideWhenUsed/>
     <w:qFormat/>
@@ -4189,11 +6838,11 @@
       <w:szCs w:val="28"/>
     </w:rPr>
   </w:style>
-  <w:style w:type="paragraph" w:styleId="Kop4">
+  <w:style w:type="paragraph" w:styleId="Heading4">
     <w:name w:val="heading 4"/>
-    <w:basedOn w:val="Standaard"/>
-    <w:next w:val="Standaard"/>
-    <w:link w:val="Kop4Char"/>
+    <w:basedOn w:val="Normal"/>
+    <w:next w:val="Normal"/>
+    <w:link w:val="Heading4Char"/>
     <w:uiPriority w:val="9"/>
     <w:semiHidden/>
     <w:unhideWhenUsed/>
@@ -4212,11 +6861,11 @@
       <w:color w:val="0F4761" w:themeColor="accent1" w:themeShade="BF"/>
     </w:rPr>
   </w:style>
-  <w:style w:type="paragraph" w:styleId="Kop5">
+  <w:style w:type="paragraph" w:styleId="Heading5">
     <w:name w:val="heading 5"/>
-    <w:basedOn w:val="Standaard"/>
-    <w:next w:val="Standaard"/>
-    <w:link w:val="Kop5Char"/>
+    <w:basedOn w:val="Normal"/>
+    <w:next w:val="Normal"/>
+    <w:link w:val="Heading5Char"/>
     <w:uiPriority w:val="9"/>
     <w:semiHidden/>
     <w:unhideWhenUsed/>
@@ -4233,11 +6882,11 @@
       <w:color w:val="0F4761" w:themeColor="accent1" w:themeShade="BF"/>
     </w:rPr>
   </w:style>
-  <w:style w:type="paragraph" w:styleId="Kop6">
+  <w:style w:type="paragraph" w:styleId="Heading6">
     <w:name w:val="heading 6"/>
-    <w:basedOn w:val="Standaard"/>
-    <w:next w:val="Standaard"/>
-    <w:link w:val="Kop6Char"/>
+    <w:basedOn w:val="Normal"/>
+    <w:next w:val="Normal"/>
+    <w:link w:val="Heading6Char"/>
     <w:uiPriority w:val="9"/>
     <w:semiHidden/>
     <w:unhideWhenUsed/>
@@ -4256,11 +6905,11 @@
       <w:color w:val="595959" w:themeColor="text1" w:themeTint="A6"/>
     </w:rPr>
   </w:style>
-  <w:style w:type="paragraph" w:styleId="Kop7">
+  <w:style w:type="paragraph" w:styleId="Heading7">
     <w:name w:val="heading 7"/>
-    <w:basedOn w:val="Standaard"/>
-    <w:next w:val="Standaard"/>
-    <w:link w:val="Kop7Char"/>
+    <w:basedOn w:val="Normal"/>
+    <w:next w:val="Normal"/>
+    <w:link w:val="Heading7Char"/>
     <w:uiPriority w:val="9"/>
     <w:semiHidden/>
     <w:unhideWhenUsed/>
@@ -4277,11 +6926,11 @@
       <w:color w:val="595959" w:themeColor="text1" w:themeTint="A6"/>
     </w:rPr>
   </w:style>
-  <w:style w:type="paragraph" w:styleId="Kop8">
+  <w:style w:type="paragraph" w:styleId="Heading8">
     <w:name w:val="heading 8"/>
-    <w:basedOn w:val="Standaard"/>
-    <w:next w:val="Standaard"/>
-    <w:link w:val="Kop8Char"/>
+    <w:basedOn w:val="Normal"/>
+    <w:next w:val="Normal"/>
+    <w:link w:val="Heading8Char"/>
     <w:uiPriority w:val="9"/>
     <w:semiHidden/>
     <w:unhideWhenUsed/>
@@ -4300,11 +6949,11 @@
       <w:color w:val="272727" w:themeColor="text1" w:themeTint="D8"/>
     </w:rPr>
   </w:style>
-  <w:style w:type="paragraph" w:styleId="Kop9">
+  <w:style w:type="paragraph" w:styleId="Heading9">
     <w:name w:val="heading 9"/>
-    <w:basedOn w:val="Standaard"/>
-    <w:next w:val="Standaard"/>
-    <w:link w:val="Kop9Char"/>
+    <w:basedOn w:val="Normal"/>
+    <w:next w:val="Normal"/>
+    <w:link w:val="Heading9Char"/>
     <w:uiPriority w:val="9"/>
     <w:semiHidden/>
     <w:unhideWhenUsed/>
@@ -4321,13 +6970,12 @@
       <w:color w:val="272727" w:themeColor="text1" w:themeTint="D8"/>
     </w:rPr>
   </w:style>
-  <w:style w:type="character" w:default="1" w:styleId="Standaardalinea-lettertype">
+  <w:style w:type="character" w:default="1" w:styleId="DefaultParagraphFont">
     <w:name w:val="Default Paragraph Font"/>
     <w:uiPriority w:val="1"/>
-    <w:semiHidden/>
     <w:unhideWhenUsed/>
   </w:style>
-  <w:style w:type="table" w:default="1" w:styleId="Standaardtabel">
+  <w:style w:type="table" w:default="1" w:styleId="TableNormal">
     <w:name w:val="Normal Table"/>
     <w:uiPriority w:val="99"/>
     <w:semiHidden/>
@@ -4342,16 +6990,16 @@
       </w:tblCellMar>
     </w:tblPr>
   </w:style>
-  <w:style w:type="numbering" w:default="1" w:styleId="Geenlijst">
+  <w:style w:type="numbering" w:default="1" w:styleId="NoList">
     <w:name w:val="No List"/>
     <w:uiPriority w:val="99"/>
     <w:semiHidden/>
     <w:unhideWhenUsed/>
   </w:style>
-  <w:style w:type="character" w:customStyle="1" w:styleId="Kop1Char">
-    <w:name w:val="Kop 1 Char"/>
-    <w:basedOn w:val="Standaardalinea-lettertype"/>
-    <w:link w:val="Kop1"/>
+  <w:style w:type="character" w:customStyle="1" w:styleId="Heading1Char">
+    <w:name w:val="Heading 1 Char"/>
+    <w:basedOn w:val="DefaultParagraphFont"/>
+    <w:link w:val="Heading1"/>
     <w:uiPriority w:val="9"/>
     <w:rsid w:val="005B10CC"/>
     <w:rPr>
@@ -4361,10 +7009,10 @@
       <w:szCs w:val="40"/>
     </w:rPr>
   </w:style>
-  <w:style w:type="character" w:customStyle="1" w:styleId="Kop2Char">
-    <w:name w:val="Kop 2 Char"/>
-    <w:basedOn w:val="Standaardalinea-lettertype"/>
-    <w:link w:val="Kop2"/>
+  <w:style w:type="character" w:customStyle="1" w:styleId="Heading2Char">
+    <w:name w:val="Heading 2 Char"/>
+    <w:basedOn w:val="DefaultParagraphFont"/>
+    <w:link w:val="Heading2"/>
     <w:uiPriority w:val="9"/>
     <w:semiHidden/>
     <w:rsid w:val="005B10CC"/>
@@ -4375,10 +7023,10 @@
       <w:szCs w:val="32"/>
     </w:rPr>
   </w:style>
-  <w:style w:type="character" w:customStyle="1" w:styleId="Kop3Char">
-    <w:name w:val="Kop 3 Char"/>
-    <w:basedOn w:val="Standaardalinea-lettertype"/>
-    <w:link w:val="Kop3"/>
+  <w:style w:type="character" w:customStyle="1" w:styleId="Heading3Char">
+    <w:name w:val="Heading 3 Char"/>
+    <w:basedOn w:val="DefaultParagraphFont"/>
+    <w:link w:val="Heading3"/>
     <w:uiPriority w:val="9"/>
     <w:rsid w:val="005B10CC"/>
     <w:rPr>
@@ -4388,10 +7036,10 @@
       <w:szCs w:val="28"/>
     </w:rPr>
   </w:style>
-  <w:style w:type="character" w:customStyle="1" w:styleId="Kop4Char">
-    <w:name w:val="Kop 4 Char"/>
-    <w:basedOn w:val="Standaardalinea-lettertype"/>
-    <w:link w:val="Kop4"/>
+  <w:style w:type="character" w:customStyle="1" w:styleId="Heading4Char">
+    <w:name w:val="Heading 4 Char"/>
+    <w:basedOn w:val="DefaultParagraphFont"/>
+    <w:link w:val="Heading4"/>
     <w:uiPriority w:val="9"/>
     <w:semiHidden/>
     <w:rsid w:val="005B10CC"/>
@@ -4402,10 +7050,10 @@
       <w:color w:val="0F4761" w:themeColor="accent1" w:themeShade="BF"/>
     </w:rPr>
   </w:style>
-  <w:style w:type="character" w:customStyle="1" w:styleId="Kop5Char">
-    <w:name w:val="Kop 5 Char"/>
-    <w:basedOn w:val="Standaardalinea-lettertype"/>
-    <w:link w:val="Kop5"/>
+  <w:style w:type="character" w:customStyle="1" w:styleId="Heading5Char">
+    <w:name w:val="Heading 5 Char"/>
+    <w:basedOn w:val="DefaultParagraphFont"/>
+    <w:link w:val="Heading5"/>
     <w:uiPriority w:val="9"/>
     <w:semiHidden/>
     <w:rsid w:val="005B10CC"/>
@@ -4414,10 +7062,10 @@
       <w:color w:val="0F4761" w:themeColor="accent1" w:themeShade="BF"/>
     </w:rPr>
   </w:style>
-  <w:style w:type="character" w:customStyle="1" w:styleId="Kop6Char">
-    <w:name w:val="Kop 6 Char"/>
-    <w:basedOn w:val="Standaardalinea-lettertype"/>
-    <w:link w:val="Kop6"/>
+  <w:style w:type="character" w:customStyle="1" w:styleId="Heading6Char">
+    <w:name w:val="Heading 6 Char"/>
+    <w:basedOn w:val="DefaultParagraphFont"/>
+    <w:link w:val="Heading6"/>
     <w:uiPriority w:val="9"/>
     <w:semiHidden/>
     <w:rsid w:val="005B10CC"/>
@@ -4428,10 +7076,10 @@
       <w:color w:val="595959" w:themeColor="text1" w:themeTint="A6"/>
     </w:rPr>
   </w:style>
-  <w:style w:type="character" w:customStyle="1" w:styleId="Kop7Char">
-    <w:name w:val="Kop 7 Char"/>
-    <w:basedOn w:val="Standaardalinea-lettertype"/>
-    <w:link w:val="Kop7"/>
+  <w:style w:type="character" w:customStyle="1" w:styleId="Heading7Char">
+    <w:name w:val="Heading 7 Char"/>
+    <w:basedOn w:val="DefaultParagraphFont"/>
+    <w:link w:val="Heading7"/>
     <w:uiPriority w:val="9"/>
     <w:semiHidden/>
     <w:rsid w:val="005B10CC"/>
@@ -4440,10 +7088,10 @@
       <w:color w:val="595959" w:themeColor="text1" w:themeTint="A6"/>
     </w:rPr>
   </w:style>
-  <w:style w:type="character" w:customStyle="1" w:styleId="Kop8Char">
-    <w:name w:val="Kop 8 Char"/>
-    <w:basedOn w:val="Standaardalinea-lettertype"/>
-    <w:link w:val="Kop8"/>
+  <w:style w:type="character" w:customStyle="1" w:styleId="Heading8Char">
+    <w:name w:val="Heading 8 Char"/>
+    <w:basedOn w:val="DefaultParagraphFont"/>
+    <w:link w:val="Heading8"/>
     <w:uiPriority w:val="9"/>
     <w:semiHidden/>
     <w:rsid w:val="005B10CC"/>
@@ -4454,10 +7102,10 @@
       <w:color w:val="272727" w:themeColor="text1" w:themeTint="D8"/>
     </w:rPr>
   </w:style>
-  <w:style w:type="character" w:customStyle="1" w:styleId="Kop9Char">
-    <w:name w:val="Kop 9 Char"/>
-    <w:basedOn w:val="Standaardalinea-lettertype"/>
-    <w:link w:val="Kop9"/>
+  <w:style w:type="character" w:customStyle="1" w:styleId="Heading9Char">
+    <w:name w:val="Heading 9 Char"/>
+    <w:basedOn w:val="DefaultParagraphFont"/>
+    <w:link w:val="Heading9"/>
     <w:uiPriority w:val="9"/>
     <w:semiHidden/>
     <w:rsid w:val="005B10CC"/>
@@ -4466,11 +7114,11 @@
       <w:color w:val="272727" w:themeColor="text1" w:themeTint="D8"/>
     </w:rPr>
   </w:style>
-  <w:style w:type="paragraph" w:styleId="Titel">
+  <w:style w:type="paragraph" w:styleId="Title">
     <w:name w:val="Title"/>
-    <w:basedOn w:val="Standaard"/>
-    <w:next w:val="Standaard"/>
-    <w:link w:val="TitelChar"/>
+    <w:basedOn w:val="Normal"/>
+    <w:next w:val="Normal"/>
+    <w:link w:val="TitleChar"/>
     <w:uiPriority w:val="10"/>
     <w:qFormat/>
     <w:rsid w:val="005B10CC"/>
@@ -4486,10 +7134,10 @@
       <w:szCs w:val="56"/>
     </w:rPr>
   </w:style>
-  <w:style w:type="character" w:customStyle="1" w:styleId="TitelChar">
-    <w:name w:val="Titel Char"/>
-    <w:basedOn w:val="Standaardalinea-lettertype"/>
-    <w:link w:val="Titel"/>
+  <w:style w:type="character" w:customStyle="1" w:styleId="TitleChar">
+    <w:name w:val="Title Char"/>
+    <w:basedOn w:val="DefaultParagraphFont"/>
+    <w:link w:val="Title"/>
     <w:uiPriority w:val="10"/>
     <w:rsid w:val="005B10CC"/>
     <w:rPr>
@@ -4500,11 +7148,11 @@
       <w:szCs w:val="56"/>
     </w:rPr>
   </w:style>
-  <w:style w:type="paragraph" w:styleId="Ondertitel">
+  <w:style w:type="paragraph" w:styleId="Subtitle">
     <w:name w:val="Subtitle"/>
-    <w:basedOn w:val="Standaard"/>
-    <w:next w:val="Standaard"/>
-    <w:link w:val="OndertitelChar"/>
+    <w:basedOn w:val="Normal"/>
+    <w:next w:val="Normal"/>
+    <w:link w:val="SubtitleChar"/>
     <w:uiPriority w:val="11"/>
     <w:qFormat/>
     <w:rsid w:val="005B10CC"/>
@@ -4521,10 +7169,10 @@
       <w:szCs w:val="28"/>
     </w:rPr>
   </w:style>
-  <w:style w:type="character" w:customStyle="1" w:styleId="OndertitelChar">
-    <w:name w:val="Ondertitel Char"/>
-    <w:basedOn w:val="Standaardalinea-lettertype"/>
-    <w:link w:val="Ondertitel"/>
+  <w:style w:type="character" w:customStyle="1" w:styleId="SubtitleChar">
+    <w:name w:val="Subtitle Char"/>
+    <w:basedOn w:val="DefaultParagraphFont"/>
+    <w:link w:val="Subtitle"/>
     <w:uiPriority w:val="11"/>
     <w:rsid w:val="005B10CC"/>
     <w:rPr>
@@ -4535,11 +7183,11 @@
       <w:szCs w:val="28"/>
     </w:rPr>
   </w:style>
-  <w:style w:type="paragraph" w:styleId="Citaat">
+  <w:style w:type="paragraph" w:styleId="Quote">
     <w:name w:val="Quote"/>
-    <w:basedOn w:val="Standaard"/>
-    <w:next w:val="Standaard"/>
-    <w:link w:val="CitaatChar"/>
+    <w:basedOn w:val="Normal"/>
+    <w:next w:val="Normal"/>
+    <w:link w:val="QuoteChar"/>
     <w:uiPriority w:val="29"/>
     <w:qFormat/>
     <w:rsid w:val="005B10CC"/>
@@ -4553,10 +7201,10 @@
       <w:color w:val="404040" w:themeColor="text1" w:themeTint="BF"/>
     </w:rPr>
   </w:style>
-  <w:style w:type="character" w:customStyle="1" w:styleId="CitaatChar">
-    <w:name w:val="Citaat Char"/>
-    <w:basedOn w:val="Standaardalinea-lettertype"/>
-    <w:link w:val="Citaat"/>
+  <w:style w:type="character" w:customStyle="1" w:styleId="QuoteChar">
+    <w:name w:val="Quote Char"/>
+    <w:basedOn w:val="DefaultParagraphFont"/>
+    <w:link w:val="Quote"/>
     <w:uiPriority w:val="29"/>
     <w:rsid w:val="005B10CC"/>
     <w:rPr>
@@ -4565,9 +7213,9 @@
       <w:color w:val="404040" w:themeColor="text1" w:themeTint="BF"/>
     </w:rPr>
   </w:style>
-  <w:style w:type="paragraph" w:styleId="Lijstalinea">
+  <w:style w:type="paragraph" w:styleId="ListParagraph">
     <w:name w:val="List Paragraph"/>
-    <w:basedOn w:val="Standaard"/>
+    <w:basedOn w:val="Normal"/>
     <w:uiPriority w:val="34"/>
     <w:qFormat/>
     <w:rsid w:val="005B10CC"/>
@@ -4576,9 +7224,9 @@
       <w:contextualSpacing/>
     </w:pPr>
   </w:style>
-  <w:style w:type="character" w:styleId="Intensievebenadrukking">
+  <w:style w:type="character" w:styleId="IntenseEmphasis">
     <w:name w:val="Intense Emphasis"/>
-    <w:basedOn w:val="Standaardalinea-lettertype"/>
+    <w:basedOn w:val="DefaultParagraphFont"/>
     <w:uiPriority w:val="21"/>
     <w:qFormat/>
     <w:rsid w:val="005B10CC"/>
@@ -4588,11 +7236,11 @@
       <w:color w:val="0F4761" w:themeColor="accent1" w:themeShade="BF"/>
     </w:rPr>
   </w:style>
-  <w:style w:type="paragraph" w:styleId="Duidelijkcitaat">
+  <w:style w:type="paragraph" w:styleId="IntenseQuote">
     <w:name w:val="Intense Quote"/>
-    <w:basedOn w:val="Standaard"/>
-    <w:next w:val="Standaard"/>
-    <w:link w:val="DuidelijkcitaatChar"/>
+    <w:basedOn w:val="Normal"/>
+    <w:next w:val="Normal"/>
+    <w:link w:val="IntenseQuoteChar"/>
     <w:uiPriority w:val="30"/>
     <w:qFormat/>
     <w:rsid w:val="005B10CC"/>
@@ -4611,10 +7259,10 @@
       <w:color w:val="0F4761" w:themeColor="accent1" w:themeShade="BF"/>
     </w:rPr>
   </w:style>
-  <w:style w:type="character" w:customStyle="1" w:styleId="DuidelijkcitaatChar">
-    <w:name w:val="Duidelijk citaat Char"/>
-    <w:basedOn w:val="Standaardalinea-lettertype"/>
-    <w:link w:val="Duidelijkcitaat"/>
+  <w:style w:type="character" w:customStyle="1" w:styleId="IntenseQuoteChar">
+    <w:name w:val="Intense Quote Char"/>
+    <w:basedOn w:val="DefaultParagraphFont"/>
+    <w:link w:val="IntenseQuote"/>
     <w:uiPriority w:val="30"/>
     <w:rsid w:val="005B10CC"/>
     <w:rPr>
@@ -4623,9 +7271,9 @@
       <w:color w:val="0F4761" w:themeColor="accent1" w:themeShade="BF"/>
     </w:rPr>
   </w:style>
-  <w:style w:type="character" w:styleId="Intensieveverwijzing">
+  <w:style w:type="character" w:styleId="IntenseReference">
     <w:name w:val="Intense Reference"/>
-    <w:basedOn w:val="Standaardalinea-lettertype"/>
+    <w:basedOn w:val="DefaultParagraphFont"/>
     <w:uiPriority w:val="32"/>
     <w:qFormat/>
     <w:rsid w:val="005B10CC"/>
@@ -4637,9 +7285,9 @@
       <w:spacing w:val="5"/>
     </w:rPr>
   </w:style>
-  <w:style w:type="table" w:styleId="Tabelraster">
+  <w:style w:type="table" w:styleId="TableGrid">
     <w:name w:val="Table Grid"/>
-    <w:basedOn w:val="Standaardtabel"/>
+    <w:basedOn w:val="TableNormal"/>
     <w:uiPriority w:val="39"/>
     <w:rsid w:val="0024613D"/>
     <w:pPr>

</xml_diff>

<commit_message>
Created H1,2,3 for plotting for thesis
</commit_message>
<xml_diff>
--- a/TimeLapse_LaTeX/Thesis/working summary.docx
+++ b/TimeLapse_LaTeX/Thesis/working summary.docx
@@ -151,8 +151,13 @@
       <w:r>
         <w:tab/>
       </w:r>
-      <w:r>
-        <w:t>All of the materials and methods common to two or more experiments—specifically excluding the experimental procedure for each experiment.</w:t>
+      <w:proofErr w:type="gramStart"/>
+      <w:r>
+        <w:t>All of</w:t>
+      </w:r>
+      <w:proofErr w:type="gramEnd"/>
+      <w:r>
+        <w:t xml:space="preserve"> the materials and methods common to two or more experiments—specifically excluding the experimental procedure for each experiment.</w:t>
       </w:r>
     </w:p>
     <w:p>
@@ -176,8 +181,13 @@
         </w:numPr>
       </w:pPr>
       <w:r>
-        <w:t>Discuss gprMax</w:t>
-      </w:r>
+        <w:t xml:space="preserve">Discuss </w:t>
+      </w:r>
+      <w:proofErr w:type="spellStart"/>
+      <w:r>
+        <w:t>gprMax</w:t>
+      </w:r>
+      <w:proofErr w:type="spellEnd"/>
     </w:p>
     <w:p>
       <w:pPr>
@@ -464,7 +474,31 @@
         <w:shd w:val="clear" w:color="auto" w:fill="83CAEB" w:themeFill="accent1" w:themeFillTint="66"/>
       </w:pPr>
       <w:r>
-        <w:t>Run gpr simulations for 2 lambda to 1/32 lambda movement and see if we can infer this movement using amplitude and phase based techniques</w:t>
+        <w:t xml:space="preserve">Run </w:t>
+      </w:r>
+      <w:proofErr w:type="spellStart"/>
+      <w:r>
+        <w:t>gpr</w:t>
+      </w:r>
+      <w:proofErr w:type="spellEnd"/>
+      <w:r>
+        <w:t xml:space="preserve"> simulations for 2 </w:t>
+      </w:r>
+      <w:proofErr w:type="gramStart"/>
+      <w:r>
+        <w:t>lambda</w:t>
+      </w:r>
+      <w:proofErr w:type="gramEnd"/>
+      <w:r>
+        <w:t xml:space="preserve"> to 1/32 lambda movement and see if we can infer this movement using amplitude and </w:t>
+      </w:r>
+      <w:proofErr w:type="gramStart"/>
+      <w:r>
+        <w:t>phase based</w:t>
+      </w:r>
+      <w:proofErr w:type="gramEnd"/>
+      <w:r>
+        <w:t xml:space="preserve"> techniques</w:t>
       </w:r>
     </w:p>
     <w:p/>
@@ -485,7 +519,39 @@
         <w:shd w:val="clear" w:color="auto" w:fill="E8E8E8" w:themeFill="background2"/>
       </w:pPr>
       <w:r>
-        <w:t>Tracking del_phi/del_x and del_phi/del_y to infer horizontal and vertical translation</w:t>
+        <w:t xml:space="preserve">Tracking </w:t>
+      </w:r>
+      <w:proofErr w:type="spellStart"/>
+      <w:r>
+        <w:t>del_phi</w:t>
+      </w:r>
+      <w:proofErr w:type="spellEnd"/>
+      <w:r>
+        <w:t>/</w:t>
+      </w:r>
+      <w:proofErr w:type="spellStart"/>
+      <w:r>
+        <w:t>del_x</w:t>
+      </w:r>
+      <w:proofErr w:type="spellEnd"/>
+      <w:r>
+        <w:t xml:space="preserve"> and </w:t>
+      </w:r>
+      <w:proofErr w:type="spellStart"/>
+      <w:r>
+        <w:t>del_phi</w:t>
+      </w:r>
+      <w:proofErr w:type="spellEnd"/>
+      <w:r>
+        <w:t>/</w:t>
+      </w:r>
+      <w:proofErr w:type="spellStart"/>
+      <w:r>
+        <w:t>del_y</w:t>
+      </w:r>
+      <w:proofErr w:type="spellEnd"/>
+      <w:r>
+        <w:t xml:space="preserve"> to infer horizontal and vertical translation</w:t>
       </w:r>
     </w:p>
     <w:p>
@@ -558,7 +624,23 @@
         <w:shd w:val="clear" w:color="auto" w:fill="B3E5A1" w:themeFill="accent6" w:themeFillTint="66"/>
       </w:pPr>
       <w:r>
-        <w:t>Run gpr simulations for scatterers changing material properties and a moving fluid front and see if we can infer this movement using amplitude and phase based techniques and see if we can infer the material change</w:t>
+        <w:t xml:space="preserve">Run </w:t>
+      </w:r>
+      <w:proofErr w:type="spellStart"/>
+      <w:r>
+        <w:t>gpr</w:t>
+      </w:r>
+      <w:proofErr w:type="spellEnd"/>
+      <w:r>
+        <w:t xml:space="preserve"> simulations for scatterers changing material properties and a moving fluid front and see if we can infer this movement using amplitude and </w:t>
+      </w:r>
+      <w:proofErr w:type="gramStart"/>
+      <w:r>
+        <w:t>phase based</w:t>
+      </w:r>
+      <w:proofErr w:type="gramEnd"/>
+      <w:r>
+        <w:t xml:space="preserve"> techniques and see if we can infer the material change</w:t>
       </w:r>
     </w:p>
     <w:p/>
@@ -1034,11 +1116,21 @@
           <w:highlight w:val="yellow"/>
         </w:rPr>
       </w:pPr>
+      <w:proofErr w:type="spellStart"/>
+      <w:proofErr w:type="gramStart"/>
       <w:r>
         <w:rPr>
           <w:highlight w:val="yellow"/>
         </w:rPr>
-        <w:t>prof.rd is the reference</w:t>
+        <w:t>prof.rd</w:t>
+      </w:r>
+      <w:proofErr w:type="spellEnd"/>
+      <w:proofErr w:type="gramEnd"/>
+      <w:r>
+        <w:rPr>
+          <w:highlight w:val="yellow"/>
+        </w:rPr>
+        <w:t xml:space="preserve"> is the reference</w:t>
       </w:r>
     </w:p>
     <w:p>
@@ -1227,7 +1319,15 @@
         <w:t>Investigate in literature</w:t>
       </w:r>
       <w:r>
-        <w:t xml:space="preserve"> for back-propagation how pre-processing is done before playing it back in gprMax to </w:t>
+        <w:t xml:space="preserve"> for back-propagation how pre-processing is done before playing it back in </w:t>
+      </w:r>
+      <w:proofErr w:type="spellStart"/>
+      <w:r>
+        <w:t>gprMax</w:t>
+      </w:r>
+      <w:proofErr w:type="spellEnd"/>
+      <w:r>
+        <w:t xml:space="preserve"> to </w:t>
       </w:r>
       <w:r>
         <w:t xml:space="preserve">get rid of the noise. Or maybe mask a large Region of Influence around the event before migrating it. Make sure to get most of the energy and get rid of the early </w:t>
@@ -1278,7 +1378,15 @@
         <w:t>Remember that when taking measurements at two points in time, there can be overlap in</w:t>
       </w:r>
       <w:r>
-        <w:t xml:space="preserve"> the location of the fluid front, so when taking the difference, it will not highlight. Also when taking a B-scan it takes time</w:t>
+        <w:t xml:space="preserve"> the location of the fluid front, so when taking the difference, it will not highlight. </w:t>
+      </w:r>
+      <w:proofErr w:type="gramStart"/>
+      <w:r>
+        <w:t>Also</w:t>
+      </w:r>
+      <w:proofErr w:type="gramEnd"/>
+      <w:r>
+        <w:t xml:space="preserve"> when taking a B-scan it takes time</w:t>
       </w:r>
       <w:r>
         <w:t xml:space="preserve"> (~1 min), and during that time, the fluid front might have moved.</w:t>
@@ -1667,8 +1775,13 @@
     </w:p>
     <w:p/>
     <w:p>
-      <w:r>
-        <w:t>In order to write paragraph-per-paragraph, topic-per-topic</w:t>
+      <w:proofErr w:type="gramStart"/>
+      <w:r>
+        <w:t>In order to</w:t>
+      </w:r>
+      <w:proofErr w:type="gramEnd"/>
+      <w:r>
+        <w:t xml:space="preserve"> write paragraph-per-paragraph, topic-per-topic</w:t>
       </w:r>
       <w:r>
         <w:t xml:space="preserve"> have this in order:</w:t>
@@ -1707,7 +1820,15 @@
         </w:numPr>
       </w:pPr>
       <w:r>
-        <w:t>Have on notebookLM per main topic group:</w:t>
+        <w:t xml:space="preserve">Have on </w:t>
+      </w:r>
+      <w:proofErr w:type="spellStart"/>
+      <w:r>
+        <w:t>notebookLM</w:t>
+      </w:r>
+      <w:proofErr w:type="spellEnd"/>
+      <w:r>
+        <w:t xml:space="preserve"> per main topic group:</w:t>
       </w:r>
     </w:p>
     <w:p>
@@ -2029,7 +2150,23 @@
           <w:sz w:val="20"/>
           <w:szCs w:val="20"/>
         </w:rPr>
-        <w:t xml:space="preserve"> and your gprMax setup in </w:t>
+        <w:t xml:space="preserve"> and your </w:t>
+      </w:r>
+      <w:proofErr w:type="spellStart"/>
+      <w:r>
+        <w:rPr>
+          <w:sz w:val="20"/>
+          <w:szCs w:val="20"/>
+        </w:rPr>
+        <w:t>gprMax</w:t>
+      </w:r>
+      <w:proofErr w:type="spellEnd"/>
+      <w:r>
+        <w:rPr>
+          <w:sz w:val="20"/>
+          <w:szCs w:val="20"/>
+        </w:rPr>
+        <w:t xml:space="preserve"> setup in </w:t>
       </w:r>
       <w:r>
         <w:rPr>
@@ -2130,7 +2267,23 @@
           <w:sz w:val="20"/>
           <w:szCs w:val="20"/>
         </w:rPr>
-        <w:t xml:space="preserve">Lateral/vertical resolution, fracture aperture &amp; thickness, thin-bed/sub-wavelength detection → </w:t>
+        <w:t xml:space="preserve">Lateral/vertical resolution, fracture aperture &amp; thickness, </w:t>
+      </w:r>
+      <w:proofErr w:type="gramStart"/>
+      <w:r>
+        <w:rPr>
+          <w:sz w:val="20"/>
+          <w:szCs w:val="20"/>
+        </w:rPr>
+        <w:t>thin-bed</w:t>
+      </w:r>
+      <w:proofErr w:type="gramEnd"/>
+      <w:r>
+        <w:rPr>
+          <w:sz w:val="20"/>
+          <w:szCs w:val="20"/>
+        </w:rPr>
+        <w:t xml:space="preserve">/sub-wavelength detection → </w:t>
       </w:r>
       <w:r>
         <w:rPr>
@@ -2628,12 +2781,21 @@
           <w:lang w:val="en-US"/>
         </w:rPr>
       </w:pPr>
-      <w:r>
-        <w:rPr>
-          <w:sz w:val="20"/>
-          <w:szCs w:val="20"/>
-        </w:rPr>
-        <w:t xml:space="preserve">General_Migration_Reviews papers likely survey </w:t>
+      <w:proofErr w:type="spellStart"/>
+      <w:r>
+        <w:rPr>
+          <w:sz w:val="20"/>
+          <w:szCs w:val="20"/>
+        </w:rPr>
+        <w:t>General_Migration_Reviews</w:t>
+      </w:r>
+      <w:proofErr w:type="spellEnd"/>
+      <w:r>
+        <w:rPr>
+          <w:sz w:val="20"/>
+          <w:szCs w:val="20"/>
+        </w:rPr>
+        <w:t xml:space="preserve"> papers likely survey </w:t>
       </w:r>
       <w:r>
         <w:rPr>
@@ -5356,6 +5518,22 @@
         </w:rPr>
         <w:t>Ch 4.4 Fluid Flow</w:t>
       </w:r>
+    </w:p>
+    <w:p>
+      <w:pPr>
+        <w:rPr>
+          <w:sz w:val="20"/>
+          <w:szCs w:val="20"/>
+        </w:rPr>
+      </w:pPr>
+    </w:p>
+    <w:p>
+      <w:pPr>
+        <w:rPr>
+          <w:sz w:val="20"/>
+          <w:szCs w:val="20"/>
+        </w:rPr>
+      </w:pPr>
     </w:p>
     <w:p>
       <w:pPr>

</xml_diff>

<commit_message>
Trial wavenumber filter and amplitude gate to improve borehole back prop results
</commit_message>
<xml_diff>
--- a/TimeLapse_LaTeX/Thesis/working summary.docx
+++ b/TimeLapse_LaTeX/Thesis/working summary.docx
@@ -90,7 +90,7 @@
     </w:p>
     <w:p>
       <w:pPr>
-        <w:pStyle w:val="ListParagraph"/>
+        <w:pStyle w:val="Lijstalinea"/>
         <w:numPr>
           <w:ilvl w:val="0"/>
           <w:numId w:val="4"/>
@@ -105,7 +105,7 @@
     </w:p>
     <w:p>
       <w:pPr>
-        <w:pStyle w:val="ListParagraph"/>
+        <w:pStyle w:val="Lijstalinea"/>
         <w:numPr>
           <w:ilvl w:val="0"/>
           <w:numId w:val="4"/>
@@ -117,7 +117,7 @@
     </w:p>
     <w:p>
       <w:pPr>
-        <w:pStyle w:val="ListParagraph"/>
+        <w:pStyle w:val="Lijstalinea"/>
         <w:numPr>
           <w:ilvl w:val="0"/>
           <w:numId w:val="4"/>
@@ -129,7 +129,7 @@
     </w:p>
     <w:p>
       <w:pPr>
-        <w:pStyle w:val="ListParagraph"/>
+        <w:pStyle w:val="Lijstalinea"/>
       </w:pPr>
     </w:p>
     <w:p>
@@ -162,7 +162,7 @@
     </w:p>
     <w:p>
       <w:pPr>
-        <w:pStyle w:val="ListParagraph"/>
+        <w:pStyle w:val="Lijstalinea"/>
         <w:numPr>
           <w:ilvl w:val="0"/>
           <w:numId w:val="4"/>
@@ -174,7 +174,7 @@
     </w:p>
     <w:p>
       <w:pPr>
-        <w:pStyle w:val="ListParagraph"/>
+        <w:pStyle w:val="Lijstalinea"/>
         <w:numPr>
           <w:ilvl w:val="0"/>
           <w:numId w:val="4"/>
@@ -191,7 +191,7 @@
     </w:p>
     <w:p>
       <w:pPr>
-        <w:pStyle w:val="ListParagraph"/>
+        <w:pStyle w:val="Lijstalinea"/>
         <w:numPr>
           <w:ilvl w:val="0"/>
           <w:numId w:val="4"/>
@@ -203,7 +203,7 @@
     </w:p>
     <w:p>
       <w:pPr>
-        <w:pStyle w:val="ListParagraph"/>
+        <w:pStyle w:val="Lijstalinea"/>
         <w:numPr>
           <w:ilvl w:val="0"/>
           <w:numId w:val="4"/>
@@ -981,7 +981,7 @@
     </w:p>
     <w:p>
       <w:pPr>
-        <w:pStyle w:val="ListParagraph"/>
+        <w:pStyle w:val="Lijstalinea"/>
         <w:numPr>
           <w:ilvl w:val="0"/>
           <w:numId w:val="4"/>
@@ -993,7 +993,7 @@
     </w:p>
     <w:p>
       <w:pPr>
-        <w:pStyle w:val="ListParagraph"/>
+        <w:pStyle w:val="Lijstalinea"/>
         <w:numPr>
           <w:ilvl w:val="0"/>
           <w:numId w:val="4"/>
@@ -1005,7 +1005,7 @@
     </w:p>
     <w:p>
       <w:pPr>
-        <w:pStyle w:val="ListParagraph"/>
+        <w:pStyle w:val="Lijstalinea"/>
         <w:numPr>
           <w:ilvl w:val="0"/>
           <w:numId w:val="4"/>
@@ -1071,7 +1071,7 @@
     </w:p>
     <w:p>
       <w:pPr>
-        <w:pStyle w:val="ListParagraph"/>
+        <w:pStyle w:val="Lijstalinea"/>
         <w:numPr>
           <w:ilvl w:val="0"/>
           <w:numId w:val="3"/>
@@ -1107,7 +1107,7 @@
     </w:p>
     <w:p>
       <w:pPr>
-        <w:pStyle w:val="ListParagraph"/>
+        <w:pStyle w:val="Lijstalinea"/>
         <w:numPr>
           <w:ilvl w:val="1"/>
           <w:numId w:val="3"/>
@@ -1135,7 +1135,7 @@
     </w:p>
     <w:p>
       <w:pPr>
-        <w:pStyle w:val="ListParagraph"/>
+        <w:pStyle w:val="Lijstalinea"/>
         <w:numPr>
           <w:ilvl w:val="1"/>
           <w:numId w:val="3"/>
@@ -1160,7 +1160,7 @@
     </w:p>
     <w:p>
       <w:pPr>
-        <w:pStyle w:val="ListParagraph"/>
+        <w:pStyle w:val="Lijstalinea"/>
         <w:numPr>
           <w:ilvl w:val="0"/>
           <w:numId w:val="3"/>
@@ -1173,7 +1173,7 @@
     <w:p/>
     <w:p>
       <w:pPr>
-        <w:pStyle w:val="ListParagraph"/>
+        <w:pStyle w:val="Lijstalinea"/>
         <w:numPr>
           <w:ilvl w:val="0"/>
           <w:numId w:val="3"/>
@@ -1192,7 +1192,7 @@
     <w:p/>
     <w:p>
       <w:pPr>
-        <w:pStyle w:val="ListParagraph"/>
+        <w:pStyle w:val="Lijstalinea"/>
         <w:numPr>
           <w:ilvl w:val="0"/>
           <w:numId w:val="3"/>
@@ -1211,7 +1211,7 @@
     <w:p/>
     <w:p>
       <w:pPr>
-        <w:pStyle w:val="ListParagraph"/>
+        <w:pStyle w:val="Lijstalinea"/>
         <w:numPr>
           <w:ilvl w:val="0"/>
           <w:numId w:val="3"/>
@@ -1241,7 +1241,7 @@
     </w:p>
     <w:p>
       <w:pPr>
-        <w:pStyle w:val="ListParagraph"/>
+        <w:pStyle w:val="Lijstalinea"/>
         <w:numPr>
           <w:ilvl w:val="1"/>
           <w:numId w:val="3"/>
@@ -1259,7 +1259,7 @@
     </w:p>
     <w:p>
       <w:pPr>
-        <w:pStyle w:val="ListParagraph"/>
+        <w:pStyle w:val="Lijstalinea"/>
         <w:numPr>
           <w:ilvl w:val="1"/>
           <w:numId w:val="3"/>
@@ -1277,7 +1277,7 @@
     </w:p>
     <w:p>
       <w:pPr>
-        <w:pStyle w:val="ListParagraph"/>
+        <w:pStyle w:val="Lijstalinea"/>
         <w:numPr>
           <w:ilvl w:val="1"/>
           <w:numId w:val="3"/>
@@ -1375,7 +1375,7 @@
     <w:p/>
     <w:p>
       <w:pPr>
-        <w:pStyle w:val="ListParagraph"/>
+        <w:pStyle w:val="Lijstalinea"/>
         <w:numPr>
           <w:ilvl w:val="0"/>
           <w:numId w:val="3"/>
@@ -1432,12 +1432,12 @@
     </w:p>
     <w:p>
       <w:pPr>
-        <w:pStyle w:val="ListParagraph"/>
-      </w:pPr>
-    </w:p>
-    <w:p>
-      <w:pPr>
-        <w:pStyle w:val="ListParagraph"/>
+        <w:pStyle w:val="Lijstalinea"/>
+      </w:pPr>
+    </w:p>
+    <w:p>
+      <w:pPr>
+        <w:pStyle w:val="Lijstalinea"/>
         <w:numPr>
           <w:ilvl w:val="0"/>
           <w:numId w:val="3"/>
@@ -1463,13 +1463,13 @@
     </w:p>
     <w:p>
       <w:pPr>
-        <w:pStyle w:val="ListParagraph"/>
+        <w:pStyle w:val="Lijstalinea"/>
       </w:pPr>
     </w:p>
     <w:p/>
     <w:p>
       <w:pPr>
-        <w:pStyle w:val="ListParagraph"/>
+        <w:pStyle w:val="Lijstalinea"/>
         <w:numPr>
           <w:ilvl w:val="0"/>
           <w:numId w:val="3"/>
@@ -1487,7 +1487,7 @@
     </w:p>
     <w:p>
       <w:pPr>
-        <w:pStyle w:val="ListParagraph"/>
+        <w:pStyle w:val="Lijstalinea"/>
         <w:numPr>
           <w:ilvl w:val="0"/>
           <w:numId w:val="3"/>
@@ -1511,7 +1511,7 @@
     </w:p>
     <w:p>
       <w:pPr>
-        <w:pStyle w:val="ListParagraph"/>
+        <w:pStyle w:val="Lijstalinea"/>
         <w:numPr>
           <w:ilvl w:val="0"/>
           <w:numId w:val="3"/>
@@ -1526,7 +1526,7 @@
     </w:p>
     <w:p>
       <w:pPr>
-        <w:pStyle w:val="ListParagraph"/>
+        <w:pStyle w:val="Lijstalinea"/>
         <w:numPr>
           <w:ilvl w:val="0"/>
           <w:numId w:val="3"/>
@@ -1664,7 +1664,7 @@
     </w:p>
     <w:p>
       <w:pPr>
-        <w:pStyle w:val="ListParagraph"/>
+        <w:pStyle w:val="Lijstalinea"/>
         <w:numPr>
           <w:ilvl w:val="0"/>
           <w:numId w:val="3"/>
@@ -1760,7 +1760,7 @@
     </w:p>
     <w:p>
       <w:pPr>
-        <w:pStyle w:val="ListParagraph"/>
+        <w:pStyle w:val="Lijstalinea"/>
         <w:numPr>
           <w:ilvl w:val="0"/>
           <w:numId w:val="3"/>
@@ -1845,7 +1845,7 @@
     <w:p/>
     <w:p>
       <w:pPr>
-        <w:pStyle w:val="ListParagraph"/>
+        <w:pStyle w:val="Lijstalinea"/>
         <w:numPr>
           <w:ilvl w:val="0"/>
           <w:numId w:val="3"/>
@@ -1860,7 +1860,7 @@
     </w:p>
     <w:p>
       <w:pPr>
-        <w:pStyle w:val="ListParagraph"/>
+        <w:pStyle w:val="Lijstalinea"/>
         <w:numPr>
           <w:ilvl w:val="0"/>
           <w:numId w:val="3"/>
@@ -1872,7 +1872,7 @@
     </w:p>
     <w:p>
       <w:pPr>
-        <w:pStyle w:val="ListParagraph"/>
+        <w:pStyle w:val="Lijstalinea"/>
         <w:numPr>
           <w:ilvl w:val="0"/>
           <w:numId w:val="3"/>
@@ -1887,7 +1887,7 @@
     </w:p>
     <w:p>
       <w:pPr>
-        <w:pStyle w:val="ListParagraph"/>
+        <w:pStyle w:val="Lijstalinea"/>
         <w:numPr>
           <w:ilvl w:val="0"/>
           <w:numId w:val="3"/>
@@ -1914,7 +1914,7 @@
     </w:p>
     <w:p>
       <w:pPr>
-        <w:pStyle w:val="ListParagraph"/>
+        <w:pStyle w:val="Lijstalinea"/>
         <w:numPr>
           <w:ilvl w:val="0"/>
           <w:numId w:val="4"/>
@@ -1926,7 +1926,7 @@
     </w:p>
     <w:p>
       <w:pPr>
-        <w:pStyle w:val="ListParagraph"/>
+        <w:pStyle w:val="Lijstalinea"/>
         <w:numPr>
           <w:ilvl w:val="0"/>
           <w:numId w:val="4"/>
@@ -1938,7 +1938,7 @@
     </w:p>
     <w:p>
       <w:pPr>
-        <w:pStyle w:val="ListParagraph"/>
+        <w:pStyle w:val="Lijstalinea"/>
         <w:numPr>
           <w:ilvl w:val="0"/>
           <w:numId w:val="4"/>
@@ -1958,7 +1958,7 @@
     </w:p>
     <w:p>
       <w:pPr>
-        <w:pStyle w:val="ListParagraph"/>
+        <w:pStyle w:val="Lijstalinea"/>
         <w:numPr>
           <w:ilvl w:val="0"/>
           <w:numId w:val="5"/>
@@ -1970,7 +1970,7 @@
     </w:p>
     <w:p>
       <w:pPr>
-        <w:pStyle w:val="ListParagraph"/>
+        <w:pStyle w:val="Lijstalinea"/>
         <w:numPr>
           <w:ilvl w:val="0"/>
           <w:numId w:val="5"/>
@@ -1982,7 +1982,7 @@
     </w:p>
     <w:p>
       <w:pPr>
-        <w:pStyle w:val="ListParagraph"/>
+        <w:pStyle w:val="Lijstalinea"/>
         <w:numPr>
           <w:ilvl w:val="0"/>
           <w:numId w:val="5"/>
@@ -1994,7 +1994,7 @@
     </w:p>
     <w:p>
       <w:pPr>
-        <w:pStyle w:val="ListParagraph"/>
+        <w:pStyle w:val="Lijstalinea"/>
         <w:numPr>
           <w:ilvl w:val="0"/>
           <w:numId w:val="5"/>
@@ -2007,7 +2007,7 @@
     <w:p/>
     <w:p>
       <w:pPr>
-        <w:pStyle w:val="ListParagraph"/>
+        <w:pStyle w:val="Lijstalinea"/>
         <w:numPr>
           <w:ilvl w:val="0"/>
           <w:numId w:val="1"/>
@@ -2053,7 +2053,7 @@
     </w:p>
     <w:p>
       <w:pPr>
-        <w:pStyle w:val="ListParagraph"/>
+        <w:pStyle w:val="Lijstalinea"/>
         <w:numPr>
           <w:ilvl w:val="0"/>
           <w:numId w:val="1"/>
@@ -2093,7 +2093,7 @@
     </w:p>
     <w:p>
       <w:pPr>
-        <w:pStyle w:val="ListParagraph"/>
+        <w:pStyle w:val="Lijstalinea"/>
         <w:numPr>
           <w:ilvl w:val="0"/>
           <w:numId w:val="1"/>
@@ -2133,7 +2133,7 @@
     </w:p>
     <w:p>
       <w:pPr>
-        <w:pStyle w:val="ListParagraph"/>
+        <w:pStyle w:val="Lijstalinea"/>
         <w:numPr>
           <w:ilvl w:val="0"/>
           <w:numId w:val="1"/>
@@ -2226,7 +2226,7 @@
     </w:p>
     <w:p>
       <w:pPr>
-        <w:pStyle w:val="ListParagraph"/>
+        <w:pStyle w:val="Lijstalinea"/>
         <w:numPr>
           <w:ilvl w:val="0"/>
           <w:numId w:val="7"/>
@@ -2310,7 +2310,7 @@
     </w:p>
     <w:p>
       <w:pPr>
-        <w:pStyle w:val="ListParagraph"/>
+        <w:pStyle w:val="Lijstalinea"/>
         <w:numPr>
           <w:ilvl w:val="1"/>
           <w:numId w:val="7"/>
@@ -2330,7 +2330,7 @@
     </w:p>
     <w:p>
       <w:pPr>
-        <w:pStyle w:val="ListParagraph"/>
+        <w:pStyle w:val="Lijstalinea"/>
         <w:numPr>
           <w:ilvl w:val="1"/>
           <w:numId w:val="7"/>
@@ -2357,7 +2357,7 @@
     </w:p>
     <w:p>
       <w:pPr>
-        <w:pStyle w:val="ListParagraph"/>
+        <w:pStyle w:val="Lijstalinea"/>
         <w:numPr>
           <w:ilvl w:val="0"/>
           <w:numId w:val="7"/>
@@ -2443,7 +2443,7 @@
     </w:p>
     <w:p>
       <w:pPr>
-        <w:pStyle w:val="ListParagraph"/>
+        <w:pStyle w:val="Lijstalinea"/>
         <w:numPr>
           <w:ilvl w:val="1"/>
           <w:numId w:val="7"/>
@@ -2463,7 +2463,7 @@
     </w:p>
     <w:p>
       <w:pPr>
-        <w:pStyle w:val="ListParagraph"/>
+        <w:pStyle w:val="Lijstalinea"/>
         <w:numPr>
           <w:ilvl w:val="1"/>
           <w:numId w:val="7"/>
@@ -2491,7 +2491,7 @@
     </w:p>
     <w:p>
       <w:pPr>
-        <w:pStyle w:val="ListParagraph"/>
+        <w:pStyle w:val="Lijstalinea"/>
         <w:numPr>
           <w:ilvl w:val="0"/>
           <w:numId w:val="7"/>
@@ -2583,7 +2583,7 @@
     </w:p>
     <w:p>
       <w:pPr>
-        <w:pStyle w:val="ListParagraph"/>
+        <w:pStyle w:val="Lijstalinea"/>
         <w:numPr>
           <w:ilvl w:val="1"/>
           <w:numId w:val="7"/>
@@ -2611,7 +2611,7 @@
     </w:p>
     <w:p>
       <w:pPr>
-        <w:pStyle w:val="ListParagraph"/>
+        <w:pStyle w:val="Lijstalinea"/>
         <w:numPr>
           <w:ilvl w:val="2"/>
           <w:numId w:val="7"/>
@@ -2626,7 +2626,7 @@
     </w:p>
     <w:p>
       <w:pPr>
-        <w:pStyle w:val="ListParagraph"/>
+        <w:pStyle w:val="Lijstalinea"/>
         <w:numPr>
           <w:ilvl w:val="2"/>
           <w:numId w:val="7"/>
@@ -2647,7 +2647,7 @@
     </w:p>
     <w:p>
       <w:pPr>
-        <w:pStyle w:val="ListParagraph"/>
+        <w:pStyle w:val="Lijstalinea"/>
         <w:numPr>
           <w:ilvl w:val="2"/>
           <w:numId w:val="7"/>
@@ -2668,7 +2668,7 @@
     </w:p>
     <w:p>
       <w:pPr>
-        <w:pStyle w:val="ListParagraph"/>
+        <w:pStyle w:val="Lijstalinea"/>
         <w:numPr>
           <w:ilvl w:val="2"/>
           <w:numId w:val="7"/>
@@ -2695,7 +2695,7 @@
     </w:p>
     <w:p>
       <w:pPr>
-        <w:pStyle w:val="ListParagraph"/>
+        <w:pStyle w:val="Lijstalinea"/>
         <w:numPr>
           <w:ilvl w:val="2"/>
           <w:numId w:val="7"/>
@@ -2722,7 +2722,7 @@
     </w:p>
     <w:p>
       <w:pPr>
-        <w:pStyle w:val="ListParagraph"/>
+        <w:pStyle w:val="Lijstalinea"/>
         <w:numPr>
           <w:ilvl w:val="1"/>
           <w:numId w:val="7"/>
@@ -2765,7 +2765,7 @@
     </w:p>
     <w:p>
       <w:pPr>
-        <w:pStyle w:val="ListParagraph"/>
+        <w:pStyle w:val="Lijstalinea"/>
         <w:numPr>
           <w:ilvl w:val="2"/>
           <w:numId w:val="7"/>
@@ -2786,7 +2786,7 @@
     </w:p>
     <w:p>
       <w:pPr>
-        <w:pStyle w:val="ListParagraph"/>
+        <w:pStyle w:val="Lijstalinea"/>
         <w:numPr>
           <w:ilvl w:val="2"/>
           <w:numId w:val="7"/>
@@ -2807,7 +2807,7 @@
     </w:p>
     <w:p>
       <w:pPr>
-        <w:pStyle w:val="ListParagraph"/>
+        <w:pStyle w:val="Lijstalinea"/>
         <w:numPr>
           <w:ilvl w:val="2"/>
           <w:numId w:val="7"/>
@@ -2834,7 +2834,7 @@
     </w:p>
     <w:p>
       <w:pPr>
-        <w:pStyle w:val="ListParagraph"/>
+        <w:pStyle w:val="Lijstalinea"/>
         <w:numPr>
           <w:ilvl w:val="2"/>
           <w:numId w:val="7"/>
@@ -2855,7 +2855,7 @@
     </w:p>
     <w:p>
       <w:pPr>
-        <w:pStyle w:val="ListParagraph"/>
+        <w:pStyle w:val="Lijstalinea"/>
         <w:numPr>
           <w:ilvl w:val="2"/>
           <w:numId w:val="7"/>
@@ -2977,7 +2977,7 @@
     </w:p>
     <w:p>
       <w:pPr>
-        <w:pStyle w:val="ListParagraph"/>
+        <w:pStyle w:val="Lijstalinea"/>
         <w:numPr>
           <w:ilvl w:val="0"/>
           <w:numId w:val="7"/>
@@ -3046,7 +3046,7 @@
     </w:p>
     <w:p>
       <w:pPr>
-        <w:pStyle w:val="ListParagraph"/>
+        <w:pStyle w:val="Lijstalinea"/>
         <w:numPr>
           <w:ilvl w:val="1"/>
           <w:numId w:val="7"/>
@@ -3066,7 +3066,7 @@
     </w:p>
     <w:p>
       <w:pPr>
-        <w:pStyle w:val="ListParagraph"/>
+        <w:pStyle w:val="Lijstalinea"/>
         <w:numPr>
           <w:ilvl w:val="1"/>
           <w:numId w:val="7"/>
@@ -3093,7 +3093,7 @@
     </w:p>
     <w:p>
       <w:pPr>
-        <w:pStyle w:val="ListParagraph"/>
+        <w:pStyle w:val="Lijstalinea"/>
         <w:numPr>
           <w:ilvl w:val="0"/>
           <w:numId w:val="7"/>
@@ -3168,7 +3168,7 @@
     </w:p>
     <w:p>
       <w:pPr>
-        <w:pStyle w:val="ListParagraph"/>
+        <w:pStyle w:val="Lijstalinea"/>
         <w:numPr>
           <w:ilvl w:val="0"/>
           <w:numId w:val="7"/>
@@ -3308,7 +3308,7 @@
     </w:p>
     <w:p>
       <w:pPr>
-        <w:pStyle w:val="ListParagraph"/>
+        <w:pStyle w:val="Lijstalinea"/>
         <w:numPr>
           <w:ilvl w:val="1"/>
           <w:numId w:val="10"/>
@@ -3328,7 +3328,7 @@
     </w:p>
     <w:p>
       <w:pPr>
-        <w:pStyle w:val="ListParagraph"/>
+        <w:pStyle w:val="Lijstalinea"/>
         <w:rPr>
           <w:sz w:val="20"/>
           <w:szCs w:val="20"/>
@@ -3345,7 +3345,7 @@
     </w:p>
     <w:p>
       <w:pPr>
-        <w:pStyle w:val="ListParagraph"/>
+        <w:pStyle w:val="Lijstalinea"/>
         <w:rPr>
           <w:sz w:val="20"/>
           <w:szCs w:val="20"/>
@@ -3362,7 +3362,7 @@
     </w:p>
     <w:p>
       <w:pPr>
-        <w:pStyle w:val="ListParagraph"/>
+        <w:pStyle w:val="Lijstalinea"/>
         <w:rPr>
           <w:sz w:val="20"/>
           <w:szCs w:val="20"/>
@@ -3379,7 +3379,7 @@
     </w:p>
     <w:p>
       <w:pPr>
-        <w:pStyle w:val="ListParagraph"/>
+        <w:pStyle w:val="Lijstalinea"/>
         <w:numPr>
           <w:ilvl w:val="1"/>
           <w:numId w:val="10"/>
@@ -5059,7 +5059,7 @@
     </w:p>
     <w:p>
       <w:pPr>
-        <w:pStyle w:val="ListParagraph"/>
+        <w:pStyle w:val="Lijstalinea"/>
         <w:numPr>
           <w:ilvl w:val="0"/>
           <w:numId w:val="8"/>
@@ -5079,7 +5079,7 @@
     </w:p>
     <w:p>
       <w:pPr>
-        <w:pStyle w:val="ListParagraph"/>
+        <w:pStyle w:val="Lijstalinea"/>
         <w:numPr>
           <w:ilvl w:val="0"/>
           <w:numId w:val="8"/>
@@ -5099,7 +5099,7 @@
     </w:p>
     <w:p>
       <w:pPr>
-        <w:pStyle w:val="ListParagraph"/>
+        <w:pStyle w:val="Lijstalinea"/>
         <w:numPr>
           <w:ilvl w:val="0"/>
           <w:numId w:val="8"/>
@@ -5119,7 +5119,7 @@
     </w:p>
     <w:p>
       <w:pPr>
-        <w:pStyle w:val="ListParagraph"/>
+        <w:pStyle w:val="Lijstalinea"/>
         <w:numPr>
           <w:ilvl w:val="0"/>
           <w:numId w:val="8"/>
@@ -5139,7 +5139,7 @@
     </w:p>
     <w:p>
       <w:pPr>
-        <w:pStyle w:val="ListParagraph"/>
+        <w:pStyle w:val="Lijstalinea"/>
         <w:numPr>
           <w:ilvl w:val="0"/>
           <w:numId w:val="8"/>
@@ -5159,7 +5159,7 @@
     </w:p>
     <w:p>
       <w:pPr>
-        <w:pStyle w:val="ListParagraph"/>
+        <w:pStyle w:val="Lijstalinea"/>
         <w:numPr>
           <w:ilvl w:val="1"/>
           <w:numId w:val="8"/>
@@ -5179,7 +5179,7 @@
     </w:p>
     <w:p>
       <w:pPr>
-        <w:pStyle w:val="ListParagraph"/>
+        <w:pStyle w:val="Lijstalinea"/>
         <w:numPr>
           <w:ilvl w:val="1"/>
           <w:numId w:val="8"/>
@@ -5199,7 +5199,7 @@
     </w:p>
     <w:p>
       <w:pPr>
-        <w:pStyle w:val="ListParagraph"/>
+        <w:pStyle w:val="Lijstalinea"/>
         <w:numPr>
           <w:ilvl w:val="1"/>
           <w:numId w:val="8"/>
@@ -5219,7 +5219,7 @@
     </w:p>
     <w:p>
       <w:pPr>
-        <w:pStyle w:val="ListParagraph"/>
+        <w:pStyle w:val="Lijstalinea"/>
         <w:numPr>
           <w:ilvl w:val="1"/>
           <w:numId w:val="8"/>
@@ -5309,7 +5309,7 @@
     </w:p>
     <w:p>
       <w:pPr>
-        <w:pStyle w:val="ListParagraph"/>
+        <w:pStyle w:val="Lijstalinea"/>
         <w:numPr>
           <w:ilvl w:val="0"/>
           <w:numId w:val="9"/>
@@ -5329,7 +5329,7 @@
     </w:p>
     <w:p>
       <w:pPr>
-        <w:pStyle w:val="ListParagraph"/>
+        <w:pStyle w:val="Lijstalinea"/>
         <w:numPr>
           <w:ilvl w:val="0"/>
           <w:numId w:val="9"/>
@@ -5349,7 +5349,7 @@
     </w:p>
     <w:p>
       <w:pPr>
-        <w:pStyle w:val="ListParagraph"/>
+        <w:pStyle w:val="Lijstalinea"/>
         <w:numPr>
           <w:ilvl w:val="0"/>
           <w:numId w:val="9"/>
@@ -5369,7 +5369,7 @@
     </w:p>
     <w:p>
       <w:pPr>
-        <w:pStyle w:val="ListParagraph"/>
+        <w:pStyle w:val="Lijstalinea"/>
         <w:numPr>
           <w:ilvl w:val="0"/>
           <w:numId w:val="9"/>
@@ -5389,7 +5389,7 @@
     </w:p>
     <w:p>
       <w:pPr>
-        <w:pStyle w:val="ListParagraph"/>
+        <w:pStyle w:val="Lijstalinea"/>
         <w:numPr>
           <w:ilvl w:val="1"/>
           <w:numId w:val="9"/>
@@ -5409,7 +5409,7 @@
     </w:p>
     <w:p>
       <w:pPr>
-        <w:pStyle w:val="ListParagraph"/>
+        <w:pStyle w:val="Lijstalinea"/>
         <w:numPr>
           <w:ilvl w:val="1"/>
           <w:numId w:val="9"/>
@@ -5429,7 +5429,7 @@
     </w:p>
     <w:p>
       <w:pPr>
-        <w:pStyle w:val="ListParagraph"/>
+        <w:pStyle w:val="Lijstalinea"/>
         <w:numPr>
           <w:ilvl w:val="1"/>
           <w:numId w:val="9"/>
@@ -5449,7 +5449,7 @@
     </w:p>
     <w:p>
       <w:pPr>
-        <w:pStyle w:val="ListParagraph"/>
+        <w:pStyle w:val="Lijstalinea"/>
         <w:numPr>
           <w:ilvl w:val="1"/>
           <w:numId w:val="9"/>
@@ -5469,7 +5469,7 @@
     </w:p>
     <w:p>
       <w:pPr>
-        <w:pStyle w:val="ListParagraph"/>
+        <w:pStyle w:val="Lijstalinea"/>
         <w:numPr>
           <w:ilvl w:val="1"/>
           <w:numId w:val="9"/>
@@ -5666,6 +5666,141 @@
           <w:szCs w:val="20"/>
         </w:rPr>
       </w:pPr>
+      <w:r>
+        <w:rPr>
+          <w:sz w:val="20"/>
+          <w:szCs w:val="20"/>
+        </w:rPr>
+        <w:t xml:space="preserve">Alright I want to go back to cleaning up the profiles after we import them. I would like to visualise the processing steps, one cell per step, so having an image from before and after the step: 1. </w:t>
+      </w:r>
+      <w:proofErr w:type="spellStart"/>
+      <w:r>
+        <w:rPr>
+          <w:sz w:val="20"/>
+          <w:szCs w:val="20"/>
+        </w:rPr>
+        <w:t>filter_data</w:t>
+      </w:r>
+      <w:proofErr w:type="spellEnd"/>
+      <w:r>
+        <w:rPr>
+          <w:sz w:val="20"/>
+          <w:szCs w:val="20"/>
+        </w:rPr>
+        <w:t xml:space="preserve"> 2. </w:t>
+      </w:r>
+      <w:proofErr w:type="spellStart"/>
+      <w:r>
+        <w:rPr>
+          <w:sz w:val="20"/>
+          <w:szCs w:val="20"/>
+        </w:rPr>
+        <w:t>remove_mean</w:t>
+      </w:r>
+      <w:proofErr w:type="spellEnd"/>
+      <w:r>
+        <w:rPr>
+          <w:sz w:val="20"/>
+          <w:szCs w:val="20"/>
+        </w:rPr>
+        <w:t xml:space="preserve"> 3. </w:t>
+      </w:r>
+      <w:proofErr w:type="spellStart"/>
+      <w:r>
+        <w:rPr>
+          <w:sz w:val="20"/>
+          <w:szCs w:val="20"/>
+        </w:rPr>
+        <w:t>align_traces</w:t>
+      </w:r>
+      <w:proofErr w:type="spellEnd"/>
+      <w:r>
+        <w:rPr>
+          <w:sz w:val="20"/>
+          <w:szCs w:val="20"/>
+        </w:rPr>
+        <w:t xml:space="preserve"> 4. </w:t>
+      </w:r>
+      <w:proofErr w:type="spellStart"/>
+      <w:r>
+        <w:rPr>
+          <w:sz w:val="20"/>
+          <w:szCs w:val="20"/>
+        </w:rPr>
+        <w:t>remove_svd</w:t>
+      </w:r>
+      <w:proofErr w:type="spellEnd"/>
+      <w:r>
+        <w:rPr>
+          <w:sz w:val="20"/>
+          <w:szCs w:val="20"/>
+        </w:rPr>
+        <w:t xml:space="preserve"> 5. </w:t>
+      </w:r>
+      <w:proofErr w:type="spellStart"/>
+      <w:r>
+        <w:rPr>
+          <w:sz w:val="20"/>
+          <w:szCs w:val="20"/>
+        </w:rPr>
+        <w:t>linear_gain</w:t>
+      </w:r>
+      <w:proofErr w:type="spellEnd"/>
+      <w:r>
+        <w:rPr>
+          <w:sz w:val="20"/>
+          <w:szCs w:val="20"/>
+        </w:rPr>
+        <w:t xml:space="preserve"> And I would like additional processing step to help improve the back-propagation results. 6. </w:t>
+      </w:r>
+      <w:proofErr w:type="gramStart"/>
+      <w:r>
+        <w:rPr>
+          <w:sz w:val="20"/>
+          <w:szCs w:val="20"/>
+        </w:rPr>
+        <w:t>Principle</w:t>
+      </w:r>
+      <w:proofErr w:type="gramEnd"/>
+      <w:r>
+        <w:rPr>
+          <w:sz w:val="20"/>
+          <w:szCs w:val="20"/>
+        </w:rPr>
+        <w:t xml:space="preserve"> Component Analysis or </w:t>
+      </w:r>
+      <w:proofErr w:type="spellStart"/>
+      <w:r>
+        <w:rPr>
+          <w:sz w:val="20"/>
+          <w:szCs w:val="20"/>
+        </w:rPr>
+        <w:t>Robuts</w:t>
+      </w:r>
+      <w:proofErr w:type="spellEnd"/>
+      <w:r>
+        <w:rPr>
+          <w:sz w:val="20"/>
+          <w:szCs w:val="20"/>
+        </w:rPr>
+        <w:t xml:space="preserve"> </w:t>
+      </w:r>
+      <w:proofErr w:type="gramStart"/>
+      <w:r>
+        <w:rPr>
+          <w:sz w:val="20"/>
+          <w:szCs w:val="20"/>
+        </w:rPr>
+        <w:t>Principle</w:t>
+      </w:r>
+      <w:proofErr w:type="gramEnd"/>
+      <w:r>
+        <w:rPr>
+          <w:sz w:val="20"/>
+          <w:szCs w:val="20"/>
+        </w:rPr>
+        <w:t xml:space="preserve"> Component Analysis 7.</w:t>
+      </w:r>
     </w:p>
     <w:sectPr>
       <w:pgSz w:w="11906" w:h="16838"/>
@@ -7070,15 +7205,15 @@
     <w:lsdException w:name="Unresolved Mention" w:semiHidden="1" w:unhideWhenUsed="1"/>
     <w:lsdException w:name="Smart Link" w:semiHidden="1" w:unhideWhenUsed="1"/>
   </w:latentStyles>
-  <w:style w:type="paragraph" w:default="1" w:styleId="Normal">
+  <w:style w:type="paragraph" w:default="1" w:styleId="Standaard">
     <w:name w:val="Normal"/>
     <w:qFormat/>
   </w:style>
-  <w:style w:type="paragraph" w:styleId="Heading1">
+  <w:style w:type="paragraph" w:styleId="Kop1">
     <w:name w:val="heading 1"/>
-    <w:basedOn w:val="Normal"/>
-    <w:next w:val="Normal"/>
-    <w:link w:val="Heading1Char"/>
+    <w:basedOn w:val="Standaard"/>
+    <w:next w:val="Standaard"/>
+    <w:link w:val="Kop1Char"/>
     <w:uiPriority w:val="9"/>
     <w:qFormat/>
     <w:rsid w:val="005B10CC"/>
@@ -7095,11 +7230,11 @@
       <w:szCs w:val="40"/>
     </w:rPr>
   </w:style>
-  <w:style w:type="paragraph" w:styleId="Heading2">
+  <w:style w:type="paragraph" w:styleId="Kop2">
     <w:name w:val="heading 2"/>
-    <w:basedOn w:val="Normal"/>
-    <w:next w:val="Normal"/>
-    <w:link w:val="Heading2Char"/>
+    <w:basedOn w:val="Standaard"/>
+    <w:next w:val="Standaard"/>
+    <w:link w:val="Kop2Char"/>
     <w:uiPriority w:val="9"/>
     <w:semiHidden/>
     <w:unhideWhenUsed/>
@@ -7118,11 +7253,11 @@
       <w:szCs w:val="32"/>
     </w:rPr>
   </w:style>
-  <w:style w:type="paragraph" w:styleId="Heading3">
+  <w:style w:type="paragraph" w:styleId="Kop3">
     <w:name w:val="heading 3"/>
-    <w:basedOn w:val="Normal"/>
-    <w:next w:val="Normal"/>
-    <w:link w:val="Heading3Char"/>
+    <w:basedOn w:val="Standaard"/>
+    <w:next w:val="Standaard"/>
+    <w:link w:val="Kop3Char"/>
     <w:uiPriority w:val="9"/>
     <w:unhideWhenUsed/>
     <w:qFormat/>
@@ -7140,11 +7275,11 @@
       <w:szCs w:val="28"/>
     </w:rPr>
   </w:style>
-  <w:style w:type="paragraph" w:styleId="Heading4">
+  <w:style w:type="paragraph" w:styleId="Kop4">
     <w:name w:val="heading 4"/>
-    <w:basedOn w:val="Normal"/>
-    <w:next w:val="Normal"/>
-    <w:link w:val="Heading4Char"/>
+    <w:basedOn w:val="Standaard"/>
+    <w:next w:val="Standaard"/>
+    <w:link w:val="Kop4Char"/>
     <w:uiPriority w:val="9"/>
     <w:semiHidden/>
     <w:unhideWhenUsed/>
@@ -7163,11 +7298,11 @@
       <w:color w:val="0F4761" w:themeColor="accent1" w:themeShade="BF"/>
     </w:rPr>
   </w:style>
-  <w:style w:type="paragraph" w:styleId="Heading5">
+  <w:style w:type="paragraph" w:styleId="Kop5">
     <w:name w:val="heading 5"/>
-    <w:basedOn w:val="Normal"/>
-    <w:next w:val="Normal"/>
-    <w:link w:val="Heading5Char"/>
+    <w:basedOn w:val="Standaard"/>
+    <w:next w:val="Standaard"/>
+    <w:link w:val="Kop5Char"/>
     <w:uiPriority w:val="9"/>
     <w:semiHidden/>
     <w:unhideWhenUsed/>
@@ -7184,11 +7319,11 @@
       <w:color w:val="0F4761" w:themeColor="accent1" w:themeShade="BF"/>
     </w:rPr>
   </w:style>
-  <w:style w:type="paragraph" w:styleId="Heading6">
+  <w:style w:type="paragraph" w:styleId="Kop6">
     <w:name w:val="heading 6"/>
-    <w:basedOn w:val="Normal"/>
-    <w:next w:val="Normal"/>
-    <w:link w:val="Heading6Char"/>
+    <w:basedOn w:val="Standaard"/>
+    <w:next w:val="Standaard"/>
+    <w:link w:val="Kop6Char"/>
     <w:uiPriority w:val="9"/>
     <w:semiHidden/>
     <w:unhideWhenUsed/>
@@ -7207,11 +7342,11 @@
       <w:color w:val="595959" w:themeColor="text1" w:themeTint="A6"/>
     </w:rPr>
   </w:style>
-  <w:style w:type="paragraph" w:styleId="Heading7">
+  <w:style w:type="paragraph" w:styleId="Kop7">
     <w:name w:val="heading 7"/>
-    <w:basedOn w:val="Normal"/>
-    <w:next w:val="Normal"/>
-    <w:link w:val="Heading7Char"/>
+    <w:basedOn w:val="Standaard"/>
+    <w:next w:val="Standaard"/>
+    <w:link w:val="Kop7Char"/>
     <w:uiPriority w:val="9"/>
     <w:semiHidden/>
     <w:unhideWhenUsed/>
@@ -7228,11 +7363,11 @@
       <w:color w:val="595959" w:themeColor="text1" w:themeTint="A6"/>
     </w:rPr>
   </w:style>
-  <w:style w:type="paragraph" w:styleId="Heading8">
+  <w:style w:type="paragraph" w:styleId="Kop8">
     <w:name w:val="heading 8"/>
-    <w:basedOn w:val="Normal"/>
-    <w:next w:val="Normal"/>
-    <w:link w:val="Heading8Char"/>
+    <w:basedOn w:val="Standaard"/>
+    <w:next w:val="Standaard"/>
+    <w:link w:val="Kop8Char"/>
     <w:uiPriority w:val="9"/>
     <w:semiHidden/>
     <w:unhideWhenUsed/>
@@ -7251,11 +7386,11 @@
       <w:color w:val="272727" w:themeColor="text1" w:themeTint="D8"/>
     </w:rPr>
   </w:style>
-  <w:style w:type="paragraph" w:styleId="Heading9">
+  <w:style w:type="paragraph" w:styleId="Kop9">
     <w:name w:val="heading 9"/>
-    <w:basedOn w:val="Normal"/>
-    <w:next w:val="Normal"/>
-    <w:link w:val="Heading9Char"/>
+    <w:basedOn w:val="Standaard"/>
+    <w:next w:val="Standaard"/>
+    <w:link w:val="Kop9Char"/>
     <w:uiPriority w:val="9"/>
     <w:semiHidden/>
     <w:unhideWhenUsed/>
@@ -7272,13 +7407,12 @@
       <w:color w:val="272727" w:themeColor="text1" w:themeTint="D8"/>
     </w:rPr>
   </w:style>
-  <w:style w:type="character" w:default="1" w:styleId="DefaultParagraphFont">
+  <w:style w:type="character" w:default="1" w:styleId="Standaardalinea-lettertype">
     <w:name w:val="Default Paragraph Font"/>
     <w:uiPriority w:val="1"/>
-    <w:semiHidden/>
     <w:unhideWhenUsed/>
   </w:style>
-  <w:style w:type="table" w:default="1" w:styleId="TableNormal">
+  <w:style w:type="table" w:default="1" w:styleId="Standaardtabel">
     <w:name w:val="Normal Table"/>
     <w:uiPriority w:val="99"/>
     <w:semiHidden/>
@@ -7293,16 +7427,16 @@
       </w:tblCellMar>
     </w:tblPr>
   </w:style>
-  <w:style w:type="numbering" w:default="1" w:styleId="NoList">
+  <w:style w:type="numbering" w:default="1" w:styleId="Geenlijst">
     <w:name w:val="No List"/>
     <w:uiPriority w:val="99"/>
     <w:semiHidden/>
     <w:unhideWhenUsed/>
   </w:style>
-  <w:style w:type="character" w:customStyle="1" w:styleId="Heading1Char">
-    <w:name w:val="Heading 1 Char"/>
-    <w:basedOn w:val="DefaultParagraphFont"/>
-    <w:link w:val="Heading1"/>
+  <w:style w:type="character" w:customStyle="1" w:styleId="Kop1Char">
+    <w:name w:val="Kop 1 Char"/>
+    <w:basedOn w:val="Standaardalinea-lettertype"/>
+    <w:link w:val="Kop1"/>
     <w:uiPriority w:val="9"/>
     <w:rsid w:val="005B10CC"/>
     <w:rPr>
@@ -7312,10 +7446,10 @@
       <w:szCs w:val="40"/>
     </w:rPr>
   </w:style>
-  <w:style w:type="character" w:customStyle="1" w:styleId="Heading2Char">
-    <w:name w:val="Heading 2 Char"/>
-    <w:basedOn w:val="DefaultParagraphFont"/>
-    <w:link w:val="Heading2"/>
+  <w:style w:type="character" w:customStyle="1" w:styleId="Kop2Char">
+    <w:name w:val="Kop 2 Char"/>
+    <w:basedOn w:val="Standaardalinea-lettertype"/>
+    <w:link w:val="Kop2"/>
     <w:uiPriority w:val="9"/>
     <w:semiHidden/>
     <w:rsid w:val="005B10CC"/>
@@ -7326,10 +7460,10 @@
       <w:szCs w:val="32"/>
     </w:rPr>
   </w:style>
-  <w:style w:type="character" w:customStyle="1" w:styleId="Heading3Char">
-    <w:name w:val="Heading 3 Char"/>
-    <w:basedOn w:val="DefaultParagraphFont"/>
-    <w:link w:val="Heading3"/>
+  <w:style w:type="character" w:customStyle="1" w:styleId="Kop3Char">
+    <w:name w:val="Kop 3 Char"/>
+    <w:basedOn w:val="Standaardalinea-lettertype"/>
+    <w:link w:val="Kop3"/>
     <w:uiPriority w:val="9"/>
     <w:rsid w:val="005B10CC"/>
     <w:rPr>
@@ -7339,10 +7473,10 @@
       <w:szCs w:val="28"/>
     </w:rPr>
   </w:style>
-  <w:style w:type="character" w:customStyle="1" w:styleId="Heading4Char">
-    <w:name w:val="Heading 4 Char"/>
-    <w:basedOn w:val="DefaultParagraphFont"/>
-    <w:link w:val="Heading4"/>
+  <w:style w:type="character" w:customStyle="1" w:styleId="Kop4Char">
+    <w:name w:val="Kop 4 Char"/>
+    <w:basedOn w:val="Standaardalinea-lettertype"/>
+    <w:link w:val="Kop4"/>
     <w:uiPriority w:val="9"/>
     <w:semiHidden/>
     <w:rsid w:val="005B10CC"/>
@@ -7353,10 +7487,10 @@
       <w:color w:val="0F4761" w:themeColor="accent1" w:themeShade="BF"/>
     </w:rPr>
   </w:style>
-  <w:style w:type="character" w:customStyle="1" w:styleId="Heading5Char">
-    <w:name w:val="Heading 5 Char"/>
-    <w:basedOn w:val="DefaultParagraphFont"/>
-    <w:link w:val="Heading5"/>
+  <w:style w:type="character" w:customStyle="1" w:styleId="Kop5Char">
+    <w:name w:val="Kop 5 Char"/>
+    <w:basedOn w:val="Standaardalinea-lettertype"/>
+    <w:link w:val="Kop5"/>
     <w:uiPriority w:val="9"/>
     <w:semiHidden/>
     <w:rsid w:val="005B10CC"/>
@@ -7365,10 +7499,10 @@
       <w:color w:val="0F4761" w:themeColor="accent1" w:themeShade="BF"/>
     </w:rPr>
   </w:style>
-  <w:style w:type="character" w:customStyle="1" w:styleId="Heading6Char">
-    <w:name w:val="Heading 6 Char"/>
-    <w:basedOn w:val="DefaultParagraphFont"/>
-    <w:link w:val="Heading6"/>
+  <w:style w:type="character" w:customStyle="1" w:styleId="Kop6Char">
+    <w:name w:val="Kop 6 Char"/>
+    <w:basedOn w:val="Standaardalinea-lettertype"/>
+    <w:link w:val="Kop6"/>
     <w:uiPriority w:val="9"/>
     <w:semiHidden/>
     <w:rsid w:val="005B10CC"/>
@@ -7379,10 +7513,10 @@
       <w:color w:val="595959" w:themeColor="text1" w:themeTint="A6"/>
     </w:rPr>
   </w:style>
-  <w:style w:type="character" w:customStyle="1" w:styleId="Heading7Char">
-    <w:name w:val="Heading 7 Char"/>
-    <w:basedOn w:val="DefaultParagraphFont"/>
-    <w:link w:val="Heading7"/>
+  <w:style w:type="character" w:customStyle="1" w:styleId="Kop7Char">
+    <w:name w:val="Kop 7 Char"/>
+    <w:basedOn w:val="Standaardalinea-lettertype"/>
+    <w:link w:val="Kop7"/>
     <w:uiPriority w:val="9"/>
     <w:semiHidden/>
     <w:rsid w:val="005B10CC"/>
@@ -7391,10 +7525,10 @@
       <w:color w:val="595959" w:themeColor="text1" w:themeTint="A6"/>
     </w:rPr>
   </w:style>
-  <w:style w:type="character" w:customStyle="1" w:styleId="Heading8Char">
-    <w:name w:val="Heading 8 Char"/>
-    <w:basedOn w:val="DefaultParagraphFont"/>
-    <w:link w:val="Heading8"/>
+  <w:style w:type="character" w:customStyle="1" w:styleId="Kop8Char">
+    <w:name w:val="Kop 8 Char"/>
+    <w:basedOn w:val="Standaardalinea-lettertype"/>
+    <w:link w:val="Kop8"/>
     <w:uiPriority w:val="9"/>
     <w:semiHidden/>
     <w:rsid w:val="005B10CC"/>
@@ -7405,10 +7539,10 @@
       <w:color w:val="272727" w:themeColor="text1" w:themeTint="D8"/>
     </w:rPr>
   </w:style>
-  <w:style w:type="character" w:customStyle="1" w:styleId="Heading9Char">
-    <w:name w:val="Heading 9 Char"/>
-    <w:basedOn w:val="DefaultParagraphFont"/>
-    <w:link w:val="Heading9"/>
+  <w:style w:type="character" w:customStyle="1" w:styleId="Kop9Char">
+    <w:name w:val="Kop 9 Char"/>
+    <w:basedOn w:val="Standaardalinea-lettertype"/>
+    <w:link w:val="Kop9"/>
     <w:uiPriority w:val="9"/>
     <w:semiHidden/>
     <w:rsid w:val="005B10CC"/>
@@ -7417,11 +7551,11 @@
       <w:color w:val="272727" w:themeColor="text1" w:themeTint="D8"/>
     </w:rPr>
   </w:style>
-  <w:style w:type="paragraph" w:styleId="Title">
+  <w:style w:type="paragraph" w:styleId="Titel">
     <w:name w:val="Title"/>
-    <w:basedOn w:val="Normal"/>
-    <w:next w:val="Normal"/>
-    <w:link w:val="TitleChar"/>
+    <w:basedOn w:val="Standaard"/>
+    <w:next w:val="Standaard"/>
+    <w:link w:val="TitelChar"/>
     <w:uiPriority w:val="10"/>
     <w:qFormat/>
     <w:rsid w:val="005B10CC"/>
@@ -7437,10 +7571,10 @@
       <w:szCs w:val="56"/>
     </w:rPr>
   </w:style>
-  <w:style w:type="character" w:customStyle="1" w:styleId="TitleChar">
-    <w:name w:val="Title Char"/>
-    <w:basedOn w:val="DefaultParagraphFont"/>
-    <w:link w:val="Title"/>
+  <w:style w:type="character" w:customStyle="1" w:styleId="TitelChar">
+    <w:name w:val="Titel Char"/>
+    <w:basedOn w:val="Standaardalinea-lettertype"/>
+    <w:link w:val="Titel"/>
     <w:uiPriority w:val="10"/>
     <w:rsid w:val="005B10CC"/>
     <w:rPr>
@@ -7451,11 +7585,11 @@
       <w:szCs w:val="56"/>
     </w:rPr>
   </w:style>
-  <w:style w:type="paragraph" w:styleId="Subtitle">
+  <w:style w:type="paragraph" w:styleId="Ondertitel">
     <w:name w:val="Subtitle"/>
-    <w:basedOn w:val="Normal"/>
-    <w:next w:val="Normal"/>
-    <w:link w:val="SubtitleChar"/>
+    <w:basedOn w:val="Standaard"/>
+    <w:next w:val="Standaard"/>
+    <w:link w:val="OndertitelChar"/>
     <w:uiPriority w:val="11"/>
     <w:qFormat/>
     <w:rsid w:val="005B10CC"/>
@@ -7472,10 +7606,10 @@
       <w:szCs w:val="28"/>
     </w:rPr>
   </w:style>
-  <w:style w:type="character" w:customStyle="1" w:styleId="SubtitleChar">
-    <w:name w:val="Subtitle Char"/>
-    <w:basedOn w:val="DefaultParagraphFont"/>
-    <w:link w:val="Subtitle"/>
+  <w:style w:type="character" w:customStyle="1" w:styleId="OndertitelChar">
+    <w:name w:val="Ondertitel Char"/>
+    <w:basedOn w:val="Standaardalinea-lettertype"/>
+    <w:link w:val="Ondertitel"/>
     <w:uiPriority w:val="11"/>
     <w:rsid w:val="005B10CC"/>
     <w:rPr>
@@ -7486,11 +7620,11 @@
       <w:szCs w:val="28"/>
     </w:rPr>
   </w:style>
-  <w:style w:type="paragraph" w:styleId="Quote">
+  <w:style w:type="paragraph" w:styleId="Citaat">
     <w:name w:val="Quote"/>
-    <w:basedOn w:val="Normal"/>
-    <w:next w:val="Normal"/>
-    <w:link w:val="QuoteChar"/>
+    <w:basedOn w:val="Standaard"/>
+    <w:next w:val="Standaard"/>
+    <w:link w:val="CitaatChar"/>
     <w:uiPriority w:val="29"/>
     <w:qFormat/>
     <w:rsid w:val="005B10CC"/>
@@ -7504,10 +7638,10 @@
       <w:color w:val="404040" w:themeColor="text1" w:themeTint="BF"/>
     </w:rPr>
   </w:style>
-  <w:style w:type="character" w:customStyle="1" w:styleId="QuoteChar">
-    <w:name w:val="Quote Char"/>
-    <w:basedOn w:val="DefaultParagraphFont"/>
-    <w:link w:val="Quote"/>
+  <w:style w:type="character" w:customStyle="1" w:styleId="CitaatChar">
+    <w:name w:val="Citaat Char"/>
+    <w:basedOn w:val="Standaardalinea-lettertype"/>
+    <w:link w:val="Citaat"/>
     <w:uiPriority w:val="29"/>
     <w:rsid w:val="005B10CC"/>
     <w:rPr>
@@ -7516,9 +7650,9 @@
       <w:color w:val="404040" w:themeColor="text1" w:themeTint="BF"/>
     </w:rPr>
   </w:style>
-  <w:style w:type="paragraph" w:styleId="ListParagraph">
+  <w:style w:type="paragraph" w:styleId="Lijstalinea">
     <w:name w:val="List Paragraph"/>
-    <w:basedOn w:val="Normal"/>
+    <w:basedOn w:val="Standaard"/>
     <w:uiPriority w:val="34"/>
     <w:qFormat/>
     <w:rsid w:val="005B10CC"/>
@@ -7527,9 +7661,9 @@
       <w:contextualSpacing/>
     </w:pPr>
   </w:style>
-  <w:style w:type="character" w:styleId="IntenseEmphasis">
+  <w:style w:type="character" w:styleId="Intensievebenadrukking">
     <w:name w:val="Intense Emphasis"/>
-    <w:basedOn w:val="DefaultParagraphFont"/>
+    <w:basedOn w:val="Standaardalinea-lettertype"/>
     <w:uiPriority w:val="21"/>
     <w:qFormat/>
     <w:rsid w:val="005B10CC"/>
@@ -7539,11 +7673,11 @@
       <w:color w:val="0F4761" w:themeColor="accent1" w:themeShade="BF"/>
     </w:rPr>
   </w:style>
-  <w:style w:type="paragraph" w:styleId="IntenseQuote">
+  <w:style w:type="paragraph" w:styleId="Duidelijkcitaat">
     <w:name w:val="Intense Quote"/>
-    <w:basedOn w:val="Normal"/>
-    <w:next w:val="Normal"/>
-    <w:link w:val="IntenseQuoteChar"/>
+    <w:basedOn w:val="Standaard"/>
+    <w:next w:val="Standaard"/>
+    <w:link w:val="DuidelijkcitaatChar"/>
     <w:uiPriority w:val="30"/>
     <w:qFormat/>
     <w:rsid w:val="005B10CC"/>
@@ -7562,10 +7696,10 @@
       <w:color w:val="0F4761" w:themeColor="accent1" w:themeShade="BF"/>
     </w:rPr>
   </w:style>
-  <w:style w:type="character" w:customStyle="1" w:styleId="IntenseQuoteChar">
-    <w:name w:val="Intense Quote Char"/>
-    <w:basedOn w:val="DefaultParagraphFont"/>
-    <w:link w:val="IntenseQuote"/>
+  <w:style w:type="character" w:customStyle="1" w:styleId="DuidelijkcitaatChar">
+    <w:name w:val="Duidelijk citaat Char"/>
+    <w:basedOn w:val="Standaardalinea-lettertype"/>
+    <w:link w:val="Duidelijkcitaat"/>
     <w:uiPriority w:val="30"/>
     <w:rsid w:val="005B10CC"/>
     <w:rPr>
@@ -7574,9 +7708,9 @@
       <w:color w:val="0F4761" w:themeColor="accent1" w:themeShade="BF"/>
     </w:rPr>
   </w:style>
-  <w:style w:type="character" w:styleId="IntenseReference">
+  <w:style w:type="character" w:styleId="Intensieveverwijzing">
     <w:name w:val="Intense Reference"/>
-    <w:basedOn w:val="DefaultParagraphFont"/>
+    <w:basedOn w:val="Standaardalinea-lettertype"/>
     <w:uiPriority w:val="32"/>
     <w:qFormat/>
     <w:rsid w:val="005B10CC"/>
@@ -7588,9 +7722,9 @@
       <w:spacing w:val="5"/>
     </w:rPr>
   </w:style>
-  <w:style w:type="table" w:styleId="TableGrid">
+  <w:style w:type="table" w:styleId="Tabelraster">
     <w:name w:val="Table Grid"/>
-    <w:basedOn w:val="TableNormal"/>
+    <w:basedOn w:val="Standaardtabel"/>
     <w:uiPriority w:val="39"/>
     <w:rsid w:val="0024613D"/>
     <w:pPr>

</xml_diff>

<commit_message>
Cleaned back prop results for fielddata
</commit_message>
<xml_diff>
--- a/TimeLapse_LaTeX/Thesis/working summary.docx
+++ b/TimeLapse_LaTeX/Thesis/working summary.docx
@@ -90,7 +90,7 @@
     </w:p>
     <w:p>
       <w:pPr>
-        <w:pStyle w:val="Lijstalinea"/>
+        <w:pStyle w:val="ListParagraph"/>
         <w:numPr>
           <w:ilvl w:val="0"/>
           <w:numId w:val="4"/>
@@ -105,7 +105,7 @@
     </w:p>
     <w:p>
       <w:pPr>
-        <w:pStyle w:val="Lijstalinea"/>
+        <w:pStyle w:val="ListParagraph"/>
         <w:numPr>
           <w:ilvl w:val="0"/>
           <w:numId w:val="4"/>
@@ -117,7 +117,7 @@
     </w:p>
     <w:p>
       <w:pPr>
-        <w:pStyle w:val="Lijstalinea"/>
+        <w:pStyle w:val="ListParagraph"/>
         <w:numPr>
           <w:ilvl w:val="0"/>
           <w:numId w:val="4"/>
@@ -129,7 +129,7 @@
     </w:p>
     <w:p>
       <w:pPr>
-        <w:pStyle w:val="Lijstalinea"/>
+        <w:pStyle w:val="ListParagraph"/>
       </w:pPr>
     </w:p>
     <w:p>
@@ -162,7 +162,7 @@
     </w:p>
     <w:p>
       <w:pPr>
-        <w:pStyle w:val="Lijstalinea"/>
+        <w:pStyle w:val="ListParagraph"/>
         <w:numPr>
           <w:ilvl w:val="0"/>
           <w:numId w:val="4"/>
@@ -174,7 +174,7 @@
     </w:p>
     <w:p>
       <w:pPr>
-        <w:pStyle w:val="Lijstalinea"/>
+        <w:pStyle w:val="ListParagraph"/>
         <w:numPr>
           <w:ilvl w:val="0"/>
           <w:numId w:val="4"/>
@@ -191,7 +191,7 @@
     </w:p>
     <w:p>
       <w:pPr>
-        <w:pStyle w:val="Lijstalinea"/>
+        <w:pStyle w:val="ListParagraph"/>
         <w:numPr>
           <w:ilvl w:val="0"/>
           <w:numId w:val="4"/>
@@ -203,7 +203,7 @@
     </w:p>
     <w:p>
       <w:pPr>
-        <w:pStyle w:val="Lijstalinea"/>
+        <w:pStyle w:val="ListParagraph"/>
         <w:numPr>
           <w:ilvl w:val="0"/>
           <w:numId w:val="4"/>
@@ -981,7 +981,7 @@
     </w:p>
     <w:p>
       <w:pPr>
-        <w:pStyle w:val="Lijstalinea"/>
+        <w:pStyle w:val="ListParagraph"/>
         <w:numPr>
           <w:ilvl w:val="0"/>
           <w:numId w:val="4"/>
@@ -993,7 +993,7 @@
     </w:p>
     <w:p>
       <w:pPr>
-        <w:pStyle w:val="Lijstalinea"/>
+        <w:pStyle w:val="ListParagraph"/>
         <w:numPr>
           <w:ilvl w:val="0"/>
           <w:numId w:val="4"/>
@@ -1005,7 +1005,7 @@
     </w:p>
     <w:p>
       <w:pPr>
-        <w:pStyle w:val="Lijstalinea"/>
+        <w:pStyle w:val="ListParagraph"/>
         <w:numPr>
           <w:ilvl w:val="0"/>
           <w:numId w:val="4"/>
@@ -1071,7 +1071,7 @@
     </w:p>
     <w:p>
       <w:pPr>
-        <w:pStyle w:val="Lijstalinea"/>
+        <w:pStyle w:val="ListParagraph"/>
         <w:numPr>
           <w:ilvl w:val="0"/>
           <w:numId w:val="3"/>
@@ -1107,7 +1107,7 @@
     </w:p>
     <w:p>
       <w:pPr>
-        <w:pStyle w:val="Lijstalinea"/>
+        <w:pStyle w:val="ListParagraph"/>
         <w:numPr>
           <w:ilvl w:val="1"/>
           <w:numId w:val="3"/>
@@ -1135,7 +1135,7 @@
     </w:p>
     <w:p>
       <w:pPr>
-        <w:pStyle w:val="Lijstalinea"/>
+        <w:pStyle w:val="ListParagraph"/>
         <w:numPr>
           <w:ilvl w:val="1"/>
           <w:numId w:val="3"/>
@@ -1160,7 +1160,7 @@
     </w:p>
     <w:p>
       <w:pPr>
-        <w:pStyle w:val="Lijstalinea"/>
+        <w:pStyle w:val="ListParagraph"/>
         <w:numPr>
           <w:ilvl w:val="0"/>
           <w:numId w:val="3"/>
@@ -1173,7 +1173,7 @@
     <w:p/>
     <w:p>
       <w:pPr>
-        <w:pStyle w:val="Lijstalinea"/>
+        <w:pStyle w:val="ListParagraph"/>
         <w:numPr>
           <w:ilvl w:val="0"/>
           <w:numId w:val="3"/>
@@ -1192,7 +1192,7 @@
     <w:p/>
     <w:p>
       <w:pPr>
-        <w:pStyle w:val="Lijstalinea"/>
+        <w:pStyle w:val="ListParagraph"/>
         <w:numPr>
           <w:ilvl w:val="0"/>
           <w:numId w:val="3"/>
@@ -1211,7 +1211,7 @@
     <w:p/>
     <w:p>
       <w:pPr>
-        <w:pStyle w:val="Lijstalinea"/>
+        <w:pStyle w:val="ListParagraph"/>
         <w:numPr>
           <w:ilvl w:val="0"/>
           <w:numId w:val="3"/>
@@ -1241,7 +1241,7 @@
     </w:p>
     <w:p>
       <w:pPr>
-        <w:pStyle w:val="Lijstalinea"/>
+        <w:pStyle w:val="ListParagraph"/>
         <w:numPr>
           <w:ilvl w:val="1"/>
           <w:numId w:val="3"/>
@@ -1259,7 +1259,7 @@
     </w:p>
     <w:p>
       <w:pPr>
-        <w:pStyle w:val="Lijstalinea"/>
+        <w:pStyle w:val="ListParagraph"/>
         <w:numPr>
           <w:ilvl w:val="1"/>
           <w:numId w:val="3"/>
@@ -1277,7 +1277,7 @@
     </w:p>
     <w:p>
       <w:pPr>
-        <w:pStyle w:val="Lijstalinea"/>
+        <w:pStyle w:val="ListParagraph"/>
         <w:numPr>
           <w:ilvl w:val="1"/>
           <w:numId w:val="3"/>
@@ -1375,7 +1375,7 @@
     <w:p/>
     <w:p>
       <w:pPr>
-        <w:pStyle w:val="Lijstalinea"/>
+        <w:pStyle w:val="ListParagraph"/>
         <w:numPr>
           <w:ilvl w:val="0"/>
           <w:numId w:val="3"/>
@@ -1432,12 +1432,12 @@
     </w:p>
     <w:p>
       <w:pPr>
-        <w:pStyle w:val="Lijstalinea"/>
-      </w:pPr>
-    </w:p>
-    <w:p>
-      <w:pPr>
-        <w:pStyle w:val="Lijstalinea"/>
+        <w:pStyle w:val="ListParagraph"/>
+      </w:pPr>
+    </w:p>
+    <w:p>
+      <w:pPr>
+        <w:pStyle w:val="ListParagraph"/>
         <w:numPr>
           <w:ilvl w:val="0"/>
           <w:numId w:val="3"/>
@@ -1463,13 +1463,13 @@
     </w:p>
     <w:p>
       <w:pPr>
-        <w:pStyle w:val="Lijstalinea"/>
+        <w:pStyle w:val="ListParagraph"/>
       </w:pPr>
     </w:p>
     <w:p/>
     <w:p>
       <w:pPr>
-        <w:pStyle w:val="Lijstalinea"/>
+        <w:pStyle w:val="ListParagraph"/>
         <w:numPr>
           <w:ilvl w:val="0"/>
           <w:numId w:val="3"/>
@@ -1487,7 +1487,7 @@
     </w:p>
     <w:p>
       <w:pPr>
-        <w:pStyle w:val="Lijstalinea"/>
+        <w:pStyle w:val="ListParagraph"/>
         <w:numPr>
           <w:ilvl w:val="0"/>
           <w:numId w:val="3"/>
@@ -1511,7 +1511,7 @@
     </w:p>
     <w:p>
       <w:pPr>
-        <w:pStyle w:val="Lijstalinea"/>
+        <w:pStyle w:val="ListParagraph"/>
         <w:numPr>
           <w:ilvl w:val="0"/>
           <w:numId w:val="3"/>
@@ -1526,7 +1526,7 @@
     </w:p>
     <w:p>
       <w:pPr>
-        <w:pStyle w:val="Lijstalinea"/>
+        <w:pStyle w:val="ListParagraph"/>
         <w:numPr>
           <w:ilvl w:val="0"/>
           <w:numId w:val="3"/>
@@ -1664,7 +1664,7 @@
     </w:p>
     <w:p>
       <w:pPr>
-        <w:pStyle w:val="Lijstalinea"/>
+        <w:pStyle w:val="ListParagraph"/>
         <w:numPr>
           <w:ilvl w:val="0"/>
           <w:numId w:val="3"/>
@@ -1760,7 +1760,7 @@
     </w:p>
     <w:p>
       <w:pPr>
-        <w:pStyle w:val="Lijstalinea"/>
+        <w:pStyle w:val="ListParagraph"/>
         <w:numPr>
           <w:ilvl w:val="0"/>
           <w:numId w:val="3"/>
@@ -1845,7 +1845,7 @@
     <w:p/>
     <w:p>
       <w:pPr>
-        <w:pStyle w:val="Lijstalinea"/>
+        <w:pStyle w:val="ListParagraph"/>
         <w:numPr>
           <w:ilvl w:val="0"/>
           <w:numId w:val="3"/>
@@ -1860,7 +1860,7 @@
     </w:p>
     <w:p>
       <w:pPr>
-        <w:pStyle w:val="Lijstalinea"/>
+        <w:pStyle w:val="ListParagraph"/>
         <w:numPr>
           <w:ilvl w:val="0"/>
           <w:numId w:val="3"/>
@@ -1872,7 +1872,7 @@
     </w:p>
     <w:p>
       <w:pPr>
-        <w:pStyle w:val="Lijstalinea"/>
+        <w:pStyle w:val="ListParagraph"/>
         <w:numPr>
           <w:ilvl w:val="0"/>
           <w:numId w:val="3"/>
@@ -1887,7 +1887,7 @@
     </w:p>
     <w:p>
       <w:pPr>
-        <w:pStyle w:val="Lijstalinea"/>
+        <w:pStyle w:val="ListParagraph"/>
         <w:numPr>
           <w:ilvl w:val="0"/>
           <w:numId w:val="3"/>
@@ -1914,7 +1914,7 @@
     </w:p>
     <w:p>
       <w:pPr>
-        <w:pStyle w:val="Lijstalinea"/>
+        <w:pStyle w:val="ListParagraph"/>
         <w:numPr>
           <w:ilvl w:val="0"/>
           <w:numId w:val="4"/>
@@ -1926,7 +1926,7 @@
     </w:p>
     <w:p>
       <w:pPr>
-        <w:pStyle w:val="Lijstalinea"/>
+        <w:pStyle w:val="ListParagraph"/>
         <w:numPr>
           <w:ilvl w:val="0"/>
           <w:numId w:val="4"/>
@@ -1938,7 +1938,7 @@
     </w:p>
     <w:p>
       <w:pPr>
-        <w:pStyle w:val="Lijstalinea"/>
+        <w:pStyle w:val="ListParagraph"/>
         <w:numPr>
           <w:ilvl w:val="0"/>
           <w:numId w:val="4"/>
@@ -1958,7 +1958,7 @@
     </w:p>
     <w:p>
       <w:pPr>
-        <w:pStyle w:val="Lijstalinea"/>
+        <w:pStyle w:val="ListParagraph"/>
         <w:numPr>
           <w:ilvl w:val="0"/>
           <w:numId w:val="5"/>
@@ -1970,7 +1970,7 @@
     </w:p>
     <w:p>
       <w:pPr>
-        <w:pStyle w:val="Lijstalinea"/>
+        <w:pStyle w:val="ListParagraph"/>
         <w:numPr>
           <w:ilvl w:val="0"/>
           <w:numId w:val="5"/>
@@ -1982,7 +1982,7 @@
     </w:p>
     <w:p>
       <w:pPr>
-        <w:pStyle w:val="Lijstalinea"/>
+        <w:pStyle w:val="ListParagraph"/>
         <w:numPr>
           <w:ilvl w:val="0"/>
           <w:numId w:val="5"/>
@@ -1994,7 +1994,7 @@
     </w:p>
     <w:p>
       <w:pPr>
-        <w:pStyle w:val="Lijstalinea"/>
+        <w:pStyle w:val="ListParagraph"/>
         <w:numPr>
           <w:ilvl w:val="0"/>
           <w:numId w:val="5"/>
@@ -2007,7 +2007,7 @@
     <w:p/>
     <w:p>
       <w:pPr>
-        <w:pStyle w:val="Lijstalinea"/>
+        <w:pStyle w:val="ListParagraph"/>
         <w:numPr>
           <w:ilvl w:val="0"/>
           <w:numId w:val="1"/>
@@ -2053,7 +2053,7 @@
     </w:p>
     <w:p>
       <w:pPr>
-        <w:pStyle w:val="Lijstalinea"/>
+        <w:pStyle w:val="ListParagraph"/>
         <w:numPr>
           <w:ilvl w:val="0"/>
           <w:numId w:val="1"/>
@@ -2093,7 +2093,7 @@
     </w:p>
     <w:p>
       <w:pPr>
-        <w:pStyle w:val="Lijstalinea"/>
+        <w:pStyle w:val="ListParagraph"/>
         <w:numPr>
           <w:ilvl w:val="0"/>
           <w:numId w:val="1"/>
@@ -2133,7 +2133,7 @@
     </w:p>
     <w:p>
       <w:pPr>
-        <w:pStyle w:val="Lijstalinea"/>
+        <w:pStyle w:val="ListParagraph"/>
         <w:numPr>
           <w:ilvl w:val="0"/>
           <w:numId w:val="1"/>
@@ -2226,7 +2226,7 @@
     </w:p>
     <w:p>
       <w:pPr>
-        <w:pStyle w:val="Lijstalinea"/>
+        <w:pStyle w:val="ListParagraph"/>
         <w:numPr>
           <w:ilvl w:val="0"/>
           <w:numId w:val="7"/>
@@ -2310,7 +2310,7 @@
     </w:p>
     <w:p>
       <w:pPr>
-        <w:pStyle w:val="Lijstalinea"/>
+        <w:pStyle w:val="ListParagraph"/>
         <w:numPr>
           <w:ilvl w:val="1"/>
           <w:numId w:val="7"/>
@@ -2330,7 +2330,7 @@
     </w:p>
     <w:p>
       <w:pPr>
-        <w:pStyle w:val="Lijstalinea"/>
+        <w:pStyle w:val="ListParagraph"/>
         <w:numPr>
           <w:ilvl w:val="1"/>
           <w:numId w:val="7"/>
@@ -2357,7 +2357,7 @@
     </w:p>
     <w:p>
       <w:pPr>
-        <w:pStyle w:val="Lijstalinea"/>
+        <w:pStyle w:val="ListParagraph"/>
         <w:numPr>
           <w:ilvl w:val="0"/>
           <w:numId w:val="7"/>
@@ -2443,7 +2443,7 @@
     </w:p>
     <w:p>
       <w:pPr>
-        <w:pStyle w:val="Lijstalinea"/>
+        <w:pStyle w:val="ListParagraph"/>
         <w:numPr>
           <w:ilvl w:val="1"/>
           <w:numId w:val="7"/>
@@ -2463,7 +2463,7 @@
     </w:p>
     <w:p>
       <w:pPr>
-        <w:pStyle w:val="Lijstalinea"/>
+        <w:pStyle w:val="ListParagraph"/>
         <w:numPr>
           <w:ilvl w:val="1"/>
           <w:numId w:val="7"/>
@@ -2491,7 +2491,7 @@
     </w:p>
     <w:p>
       <w:pPr>
-        <w:pStyle w:val="Lijstalinea"/>
+        <w:pStyle w:val="ListParagraph"/>
         <w:numPr>
           <w:ilvl w:val="0"/>
           <w:numId w:val="7"/>
@@ -2583,7 +2583,7 @@
     </w:p>
     <w:p>
       <w:pPr>
-        <w:pStyle w:val="Lijstalinea"/>
+        <w:pStyle w:val="ListParagraph"/>
         <w:numPr>
           <w:ilvl w:val="1"/>
           <w:numId w:val="7"/>
@@ -2611,7 +2611,7 @@
     </w:p>
     <w:p>
       <w:pPr>
-        <w:pStyle w:val="Lijstalinea"/>
+        <w:pStyle w:val="ListParagraph"/>
         <w:numPr>
           <w:ilvl w:val="2"/>
           <w:numId w:val="7"/>
@@ -2626,7 +2626,7 @@
     </w:p>
     <w:p>
       <w:pPr>
-        <w:pStyle w:val="Lijstalinea"/>
+        <w:pStyle w:val="ListParagraph"/>
         <w:numPr>
           <w:ilvl w:val="2"/>
           <w:numId w:val="7"/>
@@ -2647,7 +2647,7 @@
     </w:p>
     <w:p>
       <w:pPr>
-        <w:pStyle w:val="Lijstalinea"/>
+        <w:pStyle w:val="ListParagraph"/>
         <w:numPr>
           <w:ilvl w:val="2"/>
           <w:numId w:val="7"/>
@@ -2668,7 +2668,7 @@
     </w:p>
     <w:p>
       <w:pPr>
-        <w:pStyle w:val="Lijstalinea"/>
+        <w:pStyle w:val="ListParagraph"/>
         <w:numPr>
           <w:ilvl w:val="2"/>
           <w:numId w:val="7"/>
@@ -2695,7 +2695,7 @@
     </w:p>
     <w:p>
       <w:pPr>
-        <w:pStyle w:val="Lijstalinea"/>
+        <w:pStyle w:val="ListParagraph"/>
         <w:numPr>
           <w:ilvl w:val="2"/>
           <w:numId w:val="7"/>
@@ -2722,7 +2722,7 @@
     </w:p>
     <w:p>
       <w:pPr>
-        <w:pStyle w:val="Lijstalinea"/>
+        <w:pStyle w:val="ListParagraph"/>
         <w:numPr>
           <w:ilvl w:val="1"/>
           <w:numId w:val="7"/>
@@ -2765,7 +2765,7 @@
     </w:p>
     <w:p>
       <w:pPr>
-        <w:pStyle w:val="Lijstalinea"/>
+        <w:pStyle w:val="ListParagraph"/>
         <w:numPr>
           <w:ilvl w:val="2"/>
           <w:numId w:val="7"/>
@@ -2786,7 +2786,7 @@
     </w:p>
     <w:p>
       <w:pPr>
-        <w:pStyle w:val="Lijstalinea"/>
+        <w:pStyle w:val="ListParagraph"/>
         <w:numPr>
           <w:ilvl w:val="2"/>
           <w:numId w:val="7"/>
@@ -2807,7 +2807,7 @@
     </w:p>
     <w:p>
       <w:pPr>
-        <w:pStyle w:val="Lijstalinea"/>
+        <w:pStyle w:val="ListParagraph"/>
         <w:numPr>
           <w:ilvl w:val="2"/>
           <w:numId w:val="7"/>
@@ -2834,7 +2834,7 @@
     </w:p>
     <w:p>
       <w:pPr>
-        <w:pStyle w:val="Lijstalinea"/>
+        <w:pStyle w:val="ListParagraph"/>
         <w:numPr>
           <w:ilvl w:val="2"/>
           <w:numId w:val="7"/>
@@ -2855,7 +2855,7 @@
     </w:p>
     <w:p>
       <w:pPr>
-        <w:pStyle w:val="Lijstalinea"/>
+        <w:pStyle w:val="ListParagraph"/>
         <w:numPr>
           <w:ilvl w:val="2"/>
           <w:numId w:val="7"/>
@@ -2977,7 +2977,7 @@
     </w:p>
     <w:p>
       <w:pPr>
-        <w:pStyle w:val="Lijstalinea"/>
+        <w:pStyle w:val="ListParagraph"/>
         <w:numPr>
           <w:ilvl w:val="0"/>
           <w:numId w:val="7"/>
@@ -3046,7 +3046,7 @@
     </w:p>
     <w:p>
       <w:pPr>
-        <w:pStyle w:val="Lijstalinea"/>
+        <w:pStyle w:val="ListParagraph"/>
         <w:numPr>
           <w:ilvl w:val="1"/>
           <w:numId w:val="7"/>
@@ -3066,7 +3066,7 @@
     </w:p>
     <w:p>
       <w:pPr>
-        <w:pStyle w:val="Lijstalinea"/>
+        <w:pStyle w:val="ListParagraph"/>
         <w:numPr>
           <w:ilvl w:val="1"/>
           <w:numId w:val="7"/>
@@ -3093,7 +3093,7 @@
     </w:p>
     <w:p>
       <w:pPr>
-        <w:pStyle w:val="Lijstalinea"/>
+        <w:pStyle w:val="ListParagraph"/>
         <w:numPr>
           <w:ilvl w:val="0"/>
           <w:numId w:val="7"/>
@@ -3168,7 +3168,7 @@
     </w:p>
     <w:p>
       <w:pPr>
-        <w:pStyle w:val="Lijstalinea"/>
+        <w:pStyle w:val="ListParagraph"/>
         <w:numPr>
           <w:ilvl w:val="0"/>
           <w:numId w:val="7"/>
@@ -3308,7 +3308,7 @@
     </w:p>
     <w:p>
       <w:pPr>
-        <w:pStyle w:val="Lijstalinea"/>
+        <w:pStyle w:val="ListParagraph"/>
         <w:numPr>
           <w:ilvl w:val="1"/>
           <w:numId w:val="10"/>
@@ -3328,7 +3328,7 @@
     </w:p>
     <w:p>
       <w:pPr>
-        <w:pStyle w:val="Lijstalinea"/>
+        <w:pStyle w:val="ListParagraph"/>
         <w:rPr>
           <w:sz w:val="20"/>
           <w:szCs w:val="20"/>
@@ -3345,7 +3345,7 @@
     </w:p>
     <w:p>
       <w:pPr>
-        <w:pStyle w:val="Lijstalinea"/>
+        <w:pStyle w:val="ListParagraph"/>
         <w:rPr>
           <w:sz w:val="20"/>
           <w:szCs w:val="20"/>
@@ -3362,7 +3362,7 @@
     </w:p>
     <w:p>
       <w:pPr>
-        <w:pStyle w:val="Lijstalinea"/>
+        <w:pStyle w:val="ListParagraph"/>
         <w:rPr>
           <w:sz w:val="20"/>
           <w:szCs w:val="20"/>
@@ -3379,7 +3379,7 @@
     </w:p>
     <w:p>
       <w:pPr>
-        <w:pStyle w:val="Lijstalinea"/>
+        <w:pStyle w:val="ListParagraph"/>
         <w:numPr>
           <w:ilvl w:val="1"/>
           <w:numId w:val="10"/>
@@ -5059,7 +5059,7 @@
     </w:p>
     <w:p>
       <w:pPr>
-        <w:pStyle w:val="Lijstalinea"/>
+        <w:pStyle w:val="ListParagraph"/>
         <w:numPr>
           <w:ilvl w:val="0"/>
           <w:numId w:val="8"/>
@@ -5079,7 +5079,7 @@
     </w:p>
     <w:p>
       <w:pPr>
-        <w:pStyle w:val="Lijstalinea"/>
+        <w:pStyle w:val="ListParagraph"/>
         <w:numPr>
           <w:ilvl w:val="0"/>
           <w:numId w:val="8"/>
@@ -5099,7 +5099,7 @@
     </w:p>
     <w:p>
       <w:pPr>
-        <w:pStyle w:val="Lijstalinea"/>
+        <w:pStyle w:val="ListParagraph"/>
         <w:numPr>
           <w:ilvl w:val="0"/>
           <w:numId w:val="8"/>
@@ -5119,7 +5119,7 @@
     </w:p>
     <w:p>
       <w:pPr>
-        <w:pStyle w:val="Lijstalinea"/>
+        <w:pStyle w:val="ListParagraph"/>
         <w:numPr>
           <w:ilvl w:val="0"/>
           <w:numId w:val="8"/>
@@ -5139,7 +5139,7 @@
     </w:p>
     <w:p>
       <w:pPr>
-        <w:pStyle w:val="Lijstalinea"/>
+        <w:pStyle w:val="ListParagraph"/>
         <w:numPr>
           <w:ilvl w:val="0"/>
           <w:numId w:val="8"/>
@@ -5159,7 +5159,7 @@
     </w:p>
     <w:p>
       <w:pPr>
-        <w:pStyle w:val="Lijstalinea"/>
+        <w:pStyle w:val="ListParagraph"/>
         <w:numPr>
           <w:ilvl w:val="1"/>
           <w:numId w:val="8"/>
@@ -5179,7 +5179,7 @@
     </w:p>
     <w:p>
       <w:pPr>
-        <w:pStyle w:val="Lijstalinea"/>
+        <w:pStyle w:val="ListParagraph"/>
         <w:numPr>
           <w:ilvl w:val="1"/>
           <w:numId w:val="8"/>
@@ -5199,7 +5199,7 @@
     </w:p>
     <w:p>
       <w:pPr>
-        <w:pStyle w:val="Lijstalinea"/>
+        <w:pStyle w:val="ListParagraph"/>
         <w:numPr>
           <w:ilvl w:val="1"/>
           <w:numId w:val="8"/>
@@ -5219,7 +5219,7 @@
     </w:p>
     <w:p>
       <w:pPr>
-        <w:pStyle w:val="Lijstalinea"/>
+        <w:pStyle w:val="ListParagraph"/>
         <w:numPr>
           <w:ilvl w:val="1"/>
           <w:numId w:val="8"/>
@@ -5309,7 +5309,7 @@
     </w:p>
     <w:p>
       <w:pPr>
-        <w:pStyle w:val="Lijstalinea"/>
+        <w:pStyle w:val="ListParagraph"/>
         <w:numPr>
           <w:ilvl w:val="0"/>
           <w:numId w:val="9"/>
@@ -5329,7 +5329,7 @@
     </w:p>
     <w:p>
       <w:pPr>
-        <w:pStyle w:val="Lijstalinea"/>
+        <w:pStyle w:val="ListParagraph"/>
         <w:numPr>
           <w:ilvl w:val="0"/>
           <w:numId w:val="9"/>
@@ -5349,7 +5349,7 @@
     </w:p>
     <w:p>
       <w:pPr>
-        <w:pStyle w:val="Lijstalinea"/>
+        <w:pStyle w:val="ListParagraph"/>
         <w:numPr>
           <w:ilvl w:val="0"/>
           <w:numId w:val="9"/>
@@ -5369,7 +5369,7 @@
     </w:p>
     <w:p>
       <w:pPr>
-        <w:pStyle w:val="Lijstalinea"/>
+        <w:pStyle w:val="ListParagraph"/>
         <w:numPr>
           <w:ilvl w:val="0"/>
           <w:numId w:val="9"/>
@@ -5389,7 +5389,7 @@
     </w:p>
     <w:p>
       <w:pPr>
-        <w:pStyle w:val="Lijstalinea"/>
+        <w:pStyle w:val="ListParagraph"/>
         <w:numPr>
           <w:ilvl w:val="1"/>
           <w:numId w:val="9"/>
@@ -5409,7 +5409,7 @@
     </w:p>
     <w:p>
       <w:pPr>
-        <w:pStyle w:val="Lijstalinea"/>
+        <w:pStyle w:val="ListParagraph"/>
         <w:numPr>
           <w:ilvl w:val="1"/>
           <w:numId w:val="9"/>
@@ -5429,7 +5429,7 @@
     </w:p>
     <w:p>
       <w:pPr>
-        <w:pStyle w:val="Lijstalinea"/>
+        <w:pStyle w:val="ListParagraph"/>
         <w:numPr>
           <w:ilvl w:val="1"/>
           <w:numId w:val="9"/>
@@ -5449,7 +5449,7 @@
     </w:p>
     <w:p>
       <w:pPr>
-        <w:pStyle w:val="Lijstalinea"/>
+        <w:pStyle w:val="ListParagraph"/>
         <w:numPr>
           <w:ilvl w:val="1"/>
           <w:numId w:val="9"/>
@@ -5469,7 +5469,7 @@
     </w:p>
     <w:p>
       <w:pPr>
-        <w:pStyle w:val="Lijstalinea"/>
+        <w:pStyle w:val="ListParagraph"/>
         <w:numPr>
           <w:ilvl w:val="1"/>
           <w:numId w:val="9"/>
@@ -7205,15 +7205,15 @@
     <w:lsdException w:name="Unresolved Mention" w:semiHidden="1" w:unhideWhenUsed="1"/>
     <w:lsdException w:name="Smart Link" w:semiHidden="1" w:unhideWhenUsed="1"/>
   </w:latentStyles>
-  <w:style w:type="paragraph" w:default="1" w:styleId="Standaard">
+  <w:style w:type="paragraph" w:default="1" w:styleId="Normal">
     <w:name w:val="Normal"/>
     <w:qFormat/>
   </w:style>
-  <w:style w:type="paragraph" w:styleId="Kop1">
+  <w:style w:type="paragraph" w:styleId="Heading1">
     <w:name w:val="heading 1"/>
-    <w:basedOn w:val="Standaard"/>
-    <w:next w:val="Standaard"/>
-    <w:link w:val="Kop1Char"/>
+    <w:basedOn w:val="Normal"/>
+    <w:next w:val="Normal"/>
+    <w:link w:val="Heading1Char"/>
     <w:uiPriority w:val="9"/>
     <w:qFormat/>
     <w:rsid w:val="005B10CC"/>
@@ -7230,11 +7230,11 @@
       <w:szCs w:val="40"/>
     </w:rPr>
   </w:style>
-  <w:style w:type="paragraph" w:styleId="Kop2">
+  <w:style w:type="paragraph" w:styleId="Heading2">
     <w:name w:val="heading 2"/>
-    <w:basedOn w:val="Standaard"/>
-    <w:next w:val="Standaard"/>
-    <w:link w:val="Kop2Char"/>
+    <w:basedOn w:val="Normal"/>
+    <w:next w:val="Normal"/>
+    <w:link w:val="Heading2Char"/>
     <w:uiPriority w:val="9"/>
     <w:semiHidden/>
     <w:unhideWhenUsed/>
@@ -7253,11 +7253,11 @@
       <w:szCs w:val="32"/>
     </w:rPr>
   </w:style>
-  <w:style w:type="paragraph" w:styleId="Kop3">
+  <w:style w:type="paragraph" w:styleId="Heading3">
     <w:name w:val="heading 3"/>
-    <w:basedOn w:val="Standaard"/>
-    <w:next w:val="Standaard"/>
-    <w:link w:val="Kop3Char"/>
+    <w:basedOn w:val="Normal"/>
+    <w:next w:val="Normal"/>
+    <w:link w:val="Heading3Char"/>
     <w:uiPriority w:val="9"/>
     <w:unhideWhenUsed/>
     <w:qFormat/>
@@ -7275,11 +7275,11 @@
       <w:szCs w:val="28"/>
     </w:rPr>
   </w:style>
-  <w:style w:type="paragraph" w:styleId="Kop4">
+  <w:style w:type="paragraph" w:styleId="Heading4">
     <w:name w:val="heading 4"/>
-    <w:basedOn w:val="Standaard"/>
-    <w:next w:val="Standaard"/>
-    <w:link w:val="Kop4Char"/>
+    <w:basedOn w:val="Normal"/>
+    <w:next w:val="Normal"/>
+    <w:link w:val="Heading4Char"/>
     <w:uiPriority w:val="9"/>
     <w:semiHidden/>
     <w:unhideWhenUsed/>
@@ -7298,11 +7298,11 @@
       <w:color w:val="0F4761" w:themeColor="accent1" w:themeShade="BF"/>
     </w:rPr>
   </w:style>
-  <w:style w:type="paragraph" w:styleId="Kop5">
+  <w:style w:type="paragraph" w:styleId="Heading5">
     <w:name w:val="heading 5"/>
-    <w:basedOn w:val="Standaard"/>
-    <w:next w:val="Standaard"/>
-    <w:link w:val="Kop5Char"/>
+    <w:basedOn w:val="Normal"/>
+    <w:next w:val="Normal"/>
+    <w:link w:val="Heading5Char"/>
     <w:uiPriority w:val="9"/>
     <w:semiHidden/>
     <w:unhideWhenUsed/>
@@ -7319,11 +7319,11 @@
       <w:color w:val="0F4761" w:themeColor="accent1" w:themeShade="BF"/>
     </w:rPr>
   </w:style>
-  <w:style w:type="paragraph" w:styleId="Kop6">
+  <w:style w:type="paragraph" w:styleId="Heading6">
     <w:name w:val="heading 6"/>
-    <w:basedOn w:val="Standaard"/>
-    <w:next w:val="Standaard"/>
-    <w:link w:val="Kop6Char"/>
+    <w:basedOn w:val="Normal"/>
+    <w:next w:val="Normal"/>
+    <w:link w:val="Heading6Char"/>
     <w:uiPriority w:val="9"/>
     <w:semiHidden/>
     <w:unhideWhenUsed/>
@@ -7342,11 +7342,11 @@
       <w:color w:val="595959" w:themeColor="text1" w:themeTint="A6"/>
     </w:rPr>
   </w:style>
-  <w:style w:type="paragraph" w:styleId="Kop7">
+  <w:style w:type="paragraph" w:styleId="Heading7">
     <w:name w:val="heading 7"/>
-    <w:basedOn w:val="Standaard"/>
-    <w:next w:val="Standaard"/>
-    <w:link w:val="Kop7Char"/>
+    <w:basedOn w:val="Normal"/>
+    <w:next w:val="Normal"/>
+    <w:link w:val="Heading7Char"/>
     <w:uiPriority w:val="9"/>
     <w:semiHidden/>
     <w:unhideWhenUsed/>
@@ -7363,11 +7363,11 @@
       <w:color w:val="595959" w:themeColor="text1" w:themeTint="A6"/>
     </w:rPr>
   </w:style>
-  <w:style w:type="paragraph" w:styleId="Kop8">
+  <w:style w:type="paragraph" w:styleId="Heading8">
     <w:name w:val="heading 8"/>
-    <w:basedOn w:val="Standaard"/>
-    <w:next w:val="Standaard"/>
-    <w:link w:val="Kop8Char"/>
+    <w:basedOn w:val="Normal"/>
+    <w:next w:val="Normal"/>
+    <w:link w:val="Heading8Char"/>
     <w:uiPriority w:val="9"/>
     <w:semiHidden/>
     <w:unhideWhenUsed/>
@@ -7386,11 +7386,11 @@
       <w:color w:val="272727" w:themeColor="text1" w:themeTint="D8"/>
     </w:rPr>
   </w:style>
-  <w:style w:type="paragraph" w:styleId="Kop9">
+  <w:style w:type="paragraph" w:styleId="Heading9">
     <w:name w:val="heading 9"/>
-    <w:basedOn w:val="Standaard"/>
-    <w:next w:val="Standaard"/>
-    <w:link w:val="Kop9Char"/>
+    <w:basedOn w:val="Normal"/>
+    <w:next w:val="Normal"/>
+    <w:link w:val="Heading9Char"/>
     <w:uiPriority w:val="9"/>
     <w:semiHidden/>
     <w:unhideWhenUsed/>
@@ -7407,12 +7407,13 @@
       <w:color w:val="272727" w:themeColor="text1" w:themeTint="D8"/>
     </w:rPr>
   </w:style>
-  <w:style w:type="character" w:default="1" w:styleId="Standaardalinea-lettertype">
+  <w:style w:type="character" w:default="1" w:styleId="DefaultParagraphFont">
     <w:name w:val="Default Paragraph Font"/>
     <w:uiPriority w:val="1"/>
+    <w:semiHidden/>
     <w:unhideWhenUsed/>
   </w:style>
-  <w:style w:type="table" w:default="1" w:styleId="Standaardtabel">
+  <w:style w:type="table" w:default="1" w:styleId="TableNormal">
     <w:name w:val="Normal Table"/>
     <w:uiPriority w:val="99"/>
     <w:semiHidden/>
@@ -7427,16 +7428,16 @@
       </w:tblCellMar>
     </w:tblPr>
   </w:style>
-  <w:style w:type="numbering" w:default="1" w:styleId="Geenlijst">
+  <w:style w:type="numbering" w:default="1" w:styleId="NoList">
     <w:name w:val="No List"/>
     <w:uiPriority w:val="99"/>
     <w:semiHidden/>
     <w:unhideWhenUsed/>
   </w:style>
-  <w:style w:type="character" w:customStyle="1" w:styleId="Kop1Char">
-    <w:name w:val="Kop 1 Char"/>
-    <w:basedOn w:val="Standaardalinea-lettertype"/>
-    <w:link w:val="Kop1"/>
+  <w:style w:type="character" w:customStyle="1" w:styleId="Heading1Char">
+    <w:name w:val="Heading 1 Char"/>
+    <w:basedOn w:val="DefaultParagraphFont"/>
+    <w:link w:val="Heading1"/>
     <w:uiPriority w:val="9"/>
     <w:rsid w:val="005B10CC"/>
     <w:rPr>
@@ -7446,10 +7447,10 @@
       <w:szCs w:val="40"/>
     </w:rPr>
   </w:style>
-  <w:style w:type="character" w:customStyle="1" w:styleId="Kop2Char">
-    <w:name w:val="Kop 2 Char"/>
-    <w:basedOn w:val="Standaardalinea-lettertype"/>
-    <w:link w:val="Kop2"/>
+  <w:style w:type="character" w:customStyle="1" w:styleId="Heading2Char">
+    <w:name w:val="Heading 2 Char"/>
+    <w:basedOn w:val="DefaultParagraphFont"/>
+    <w:link w:val="Heading2"/>
     <w:uiPriority w:val="9"/>
     <w:semiHidden/>
     <w:rsid w:val="005B10CC"/>
@@ -7460,10 +7461,10 @@
       <w:szCs w:val="32"/>
     </w:rPr>
   </w:style>
-  <w:style w:type="character" w:customStyle="1" w:styleId="Kop3Char">
-    <w:name w:val="Kop 3 Char"/>
-    <w:basedOn w:val="Standaardalinea-lettertype"/>
-    <w:link w:val="Kop3"/>
+  <w:style w:type="character" w:customStyle="1" w:styleId="Heading3Char">
+    <w:name w:val="Heading 3 Char"/>
+    <w:basedOn w:val="DefaultParagraphFont"/>
+    <w:link w:val="Heading3"/>
     <w:uiPriority w:val="9"/>
     <w:rsid w:val="005B10CC"/>
     <w:rPr>
@@ -7473,10 +7474,10 @@
       <w:szCs w:val="28"/>
     </w:rPr>
   </w:style>
-  <w:style w:type="character" w:customStyle="1" w:styleId="Kop4Char">
-    <w:name w:val="Kop 4 Char"/>
-    <w:basedOn w:val="Standaardalinea-lettertype"/>
-    <w:link w:val="Kop4"/>
+  <w:style w:type="character" w:customStyle="1" w:styleId="Heading4Char">
+    <w:name w:val="Heading 4 Char"/>
+    <w:basedOn w:val="DefaultParagraphFont"/>
+    <w:link w:val="Heading4"/>
     <w:uiPriority w:val="9"/>
     <w:semiHidden/>
     <w:rsid w:val="005B10CC"/>
@@ -7487,10 +7488,10 @@
       <w:color w:val="0F4761" w:themeColor="accent1" w:themeShade="BF"/>
     </w:rPr>
   </w:style>
-  <w:style w:type="character" w:customStyle="1" w:styleId="Kop5Char">
-    <w:name w:val="Kop 5 Char"/>
-    <w:basedOn w:val="Standaardalinea-lettertype"/>
-    <w:link w:val="Kop5"/>
+  <w:style w:type="character" w:customStyle="1" w:styleId="Heading5Char">
+    <w:name w:val="Heading 5 Char"/>
+    <w:basedOn w:val="DefaultParagraphFont"/>
+    <w:link w:val="Heading5"/>
     <w:uiPriority w:val="9"/>
     <w:semiHidden/>
     <w:rsid w:val="005B10CC"/>
@@ -7499,10 +7500,10 @@
       <w:color w:val="0F4761" w:themeColor="accent1" w:themeShade="BF"/>
     </w:rPr>
   </w:style>
-  <w:style w:type="character" w:customStyle="1" w:styleId="Kop6Char">
-    <w:name w:val="Kop 6 Char"/>
-    <w:basedOn w:val="Standaardalinea-lettertype"/>
-    <w:link w:val="Kop6"/>
+  <w:style w:type="character" w:customStyle="1" w:styleId="Heading6Char">
+    <w:name w:val="Heading 6 Char"/>
+    <w:basedOn w:val="DefaultParagraphFont"/>
+    <w:link w:val="Heading6"/>
     <w:uiPriority w:val="9"/>
     <w:semiHidden/>
     <w:rsid w:val="005B10CC"/>
@@ -7513,10 +7514,10 @@
       <w:color w:val="595959" w:themeColor="text1" w:themeTint="A6"/>
     </w:rPr>
   </w:style>
-  <w:style w:type="character" w:customStyle="1" w:styleId="Kop7Char">
-    <w:name w:val="Kop 7 Char"/>
-    <w:basedOn w:val="Standaardalinea-lettertype"/>
-    <w:link w:val="Kop7"/>
+  <w:style w:type="character" w:customStyle="1" w:styleId="Heading7Char">
+    <w:name w:val="Heading 7 Char"/>
+    <w:basedOn w:val="DefaultParagraphFont"/>
+    <w:link w:val="Heading7"/>
     <w:uiPriority w:val="9"/>
     <w:semiHidden/>
     <w:rsid w:val="005B10CC"/>
@@ -7525,10 +7526,10 @@
       <w:color w:val="595959" w:themeColor="text1" w:themeTint="A6"/>
     </w:rPr>
   </w:style>
-  <w:style w:type="character" w:customStyle="1" w:styleId="Kop8Char">
-    <w:name w:val="Kop 8 Char"/>
-    <w:basedOn w:val="Standaardalinea-lettertype"/>
-    <w:link w:val="Kop8"/>
+  <w:style w:type="character" w:customStyle="1" w:styleId="Heading8Char">
+    <w:name w:val="Heading 8 Char"/>
+    <w:basedOn w:val="DefaultParagraphFont"/>
+    <w:link w:val="Heading8"/>
     <w:uiPriority w:val="9"/>
     <w:semiHidden/>
     <w:rsid w:val="005B10CC"/>
@@ -7539,10 +7540,10 @@
       <w:color w:val="272727" w:themeColor="text1" w:themeTint="D8"/>
     </w:rPr>
   </w:style>
-  <w:style w:type="character" w:customStyle="1" w:styleId="Kop9Char">
-    <w:name w:val="Kop 9 Char"/>
-    <w:basedOn w:val="Standaardalinea-lettertype"/>
-    <w:link w:val="Kop9"/>
+  <w:style w:type="character" w:customStyle="1" w:styleId="Heading9Char">
+    <w:name w:val="Heading 9 Char"/>
+    <w:basedOn w:val="DefaultParagraphFont"/>
+    <w:link w:val="Heading9"/>
     <w:uiPriority w:val="9"/>
     <w:semiHidden/>
     <w:rsid w:val="005B10CC"/>
@@ -7551,11 +7552,11 @@
       <w:color w:val="272727" w:themeColor="text1" w:themeTint="D8"/>
     </w:rPr>
   </w:style>
-  <w:style w:type="paragraph" w:styleId="Titel">
+  <w:style w:type="paragraph" w:styleId="Title">
     <w:name w:val="Title"/>
-    <w:basedOn w:val="Standaard"/>
-    <w:next w:val="Standaard"/>
-    <w:link w:val="TitelChar"/>
+    <w:basedOn w:val="Normal"/>
+    <w:next w:val="Normal"/>
+    <w:link w:val="TitleChar"/>
     <w:uiPriority w:val="10"/>
     <w:qFormat/>
     <w:rsid w:val="005B10CC"/>
@@ -7571,10 +7572,10 @@
       <w:szCs w:val="56"/>
     </w:rPr>
   </w:style>
-  <w:style w:type="character" w:customStyle="1" w:styleId="TitelChar">
-    <w:name w:val="Titel Char"/>
-    <w:basedOn w:val="Standaardalinea-lettertype"/>
-    <w:link w:val="Titel"/>
+  <w:style w:type="character" w:customStyle="1" w:styleId="TitleChar">
+    <w:name w:val="Title Char"/>
+    <w:basedOn w:val="DefaultParagraphFont"/>
+    <w:link w:val="Title"/>
     <w:uiPriority w:val="10"/>
     <w:rsid w:val="005B10CC"/>
     <w:rPr>
@@ -7585,11 +7586,11 @@
       <w:szCs w:val="56"/>
     </w:rPr>
   </w:style>
-  <w:style w:type="paragraph" w:styleId="Ondertitel">
+  <w:style w:type="paragraph" w:styleId="Subtitle">
     <w:name w:val="Subtitle"/>
-    <w:basedOn w:val="Standaard"/>
-    <w:next w:val="Standaard"/>
-    <w:link w:val="OndertitelChar"/>
+    <w:basedOn w:val="Normal"/>
+    <w:next w:val="Normal"/>
+    <w:link w:val="SubtitleChar"/>
     <w:uiPriority w:val="11"/>
     <w:qFormat/>
     <w:rsid w:val="005B10CC"/>
@@ -7606,10 +7607,10 @@
       <w:szCs w:val="28"/>
     </w:rPr>
   </w:style>
-  <w:style w:type="character" w:customStyle="1" w:styleId="OndertitelChar">
-    <w:name w:val="Ondertitel Char"/>
-    <w:basedOn w:val="Standaardalinea-lettertype"/>
-    <w:link w:val="Ondertitel"/>
+  <w:style w:type="character" w:customStyle="1" w:styleId="SubtitleChar">
+    <w:name w:val="Subtitle Char"/>
+    <w:basedOn w:val="DefaultParagraphFont"/>
+    <w:link w:val="Subtitle"/>
     <w:uiPriority w:val="11"/>
     <w:rsid w:val="005B10CC"/>
     <w:rPr>
@@ -7620,11 +7621,11 @@
       <w:szCs w:val="28"/>
     </w:rPr>
   </w:style>
-  <w:style w:type="paragraph" w:styleId="Citaat">
+  <w:style w:type="paragraph" w:styleId="Quote">
     <w:name w:val="Quote"/>
-    <w:basedOn w:val="Standaard"/>
-    <w:next w:val="Standaard"/>
-    <w:link w:val="CitaatChar"/>
+    <w:basedOn w:val="Normal"/>
+    <w:next w:val="Normal"/>
+    <w:link w:val="QuoteChar"/>
     <w:uiPriority w:val="29"/>
     <w:qFormat/>
     <w:rsid w:val="005B10CC"/>
@@ -7638,10 +7639,10 @@
       <w:color w:val="404040" w:themeColor="text1" w:themeTint="BF"/>
     </w:rPr>
   </w:style>
-  <w:style w:type="character" w:customStyle="1" w:styleId="CitaatChar">
-    <w:name w:val="Citaat Char"/>
-    <w:basedOn w:val="Standaardalinea-lettertype"/>
-    <w:link w:val="Citaat"/>
+  <w:style w:type="character" w:customStyle="1" w:styleId="QuoteChar">
+    <w:name w:val="Quote Char"/>
+    <w:basedOn w:val="DefaultParagraphFont"/>
+    <w:link w:val="Quote"/>
     <w:uiPriority w:val="29"/>
     <w:rsid w:val="005B10CC"/>
     <w:rPr>
@@ -7650,9 +7651,9 @@
       <w:color w:val="404040" w:themeColor="text1" w:themeTint="BF"/>
     </w:rPr>
   </w:style>
-  <w:style w:type="paragraph" w:styleId="Lijstalinea">
+  <w:style w:type="paragraph" w:styleId="ListParagraph">
     <w:name w:val="List Paragraph"/>
-    <w:basedOn w:val="Standaard"/>
+    <w:basedOn w:val="Normal"/>
     <w:uiPriority w:val="34"/>
     <w:qFormat/>
     <w:rsid w:val="005B10CC"/>
@@ -7661,9 +7662,9 @@
       <w:contextualSpacing/>
     </w:pPr>
   </w:style>
-  <w:style w:type="character" w:styleId="Intensievebenadrukking">
+  <w:style w:type="character" w:styleId="IntenseEmphasis">
     <w:name w:val="Intense Emphasis"/>
-    <w:basedOn w:val="Standaardalinea-lettertype"/>
+    <w:basedOn w:val="DefaultParagraphFont"/>
     <w:uiPriority w:val="21"/>
     <w:qFormat/>
     <w:rsid w:val="005B10CC"/>
@@ -7673,11 +7674,11 @@
       <w:color w:val="0F4761" w:themeColor="accent1" w:themeShade="BF"/>
     </w:rPr>
   </w:style>
-  <w:style w:type="paragraph" w:styleId="Duidelijkcitaat">
+  <w:style w:type="paragraph" w:styleId="IntenseQuote">
     <w:name w:val="Intense Quote"/>
-    <w:basedOn w:val="Standaard"/>
-    <w:next w:val="Standaard"/>
-    <w:link w:val="DuidelijkcitaatChar"/>
+    <w:basedOn w:val="Normal"/>
+    <w:next w:val="Normal"/>
+    <w:link w:val="IntenseQuoteChar"/>
     <w:uiPriority w:val="30"/>
     <w:qFormat/>
     <w:rsid w:val="005B10CC"/>
@@ -7696,10 +7697,10 @@
       <w:color w:val="0F4761" w:themeColor="accent1" w:themeShade="BF"/>
     </w:rPr>
   </w:style>
-  <w:style w:type="character" w:customStyle="1" w:styleId="DuidelijkcitaatChar">
-    <w:name w:val="Duidelijk citaat Char"/>
-    <w:basedOn w:val="Standaardalinea-lettertype"/>
-    <w:link w:val="Duidelijkcitaat"/>
+  <w:style w:type="character" w:customStyle="1" w:styleId="IntenseQuoteChar">
+    <w:name w:val="Intense Quote Char"/>
+    <w:basedOn w:val="DefaultParagraphFont"/>
+    <w:link w:val="IntenseQuote"/>
     <w:uiPriority w:val="30"/>
     <w:rsid w:val="005B10CC"/>
     <w:rPr>
@@ -7708,9 +7709,9 @@
       <w:color w:val="0F4761" w:themeColor="accent1" w:themeShade="BF"/>
     </w:rPr>
   </w:style>
-  <w:style w:type="character" w:styleId="Intensieveverwijzing">
+  <w:style w:type="character" w:styleId="IntenseReference">
     <w:name w:val="Intense Reference"/>
-    <w:basedOn w:val="Standaardalinea-lettertype"/>
+    <w:basedOn w:val="DefaultParagraphFont"/>
     <w:uiPriority w:val="32"/>
     <w:qFormat/>
     <w:rsid w:val="005B10CC"/>
@@ -7722,9 +7723,9 @@
       <w:spacing w:val="5"/>
     </w:rPr>
   </w:style>
-  <w:style w:type="table" w:styleId="Tabelraster">
+  <w:style w:type="table" w:styleId="TableGrid">
     <w:name w:val="Table Grid"/>
-    <w:basedOn w:val="Standaardtabel"/>
+    <w:basedOn w:val="TableNormal"/>
     <w:uiPriority w:val="39"/>
     <w:rsid w:val="0024613D"/>
     <w:pPr>

</xml_diff>

<commit_message>
Created supplementary file to move results to and cleaned up H1 and H2
</commit_message>
<xml_diff>
--- a/TimeLapse_LaTeX/Thesis/working summary.docx
+++ b/TimeLapse_LaTeX/Thesis/working summary.docx
@@ -90,7 +90,7 @@
     </w:p>
     <w:p>
       <w:pPr>
-        <w:pStyle w:val="ListParagraph"/>
+        <w:pStyle w:val="Lijstalinea"/>
         <w:numPr>
           <w:ilvl w:val="0"/>
           <w:numId w:val="4"/>
@@ -105,7 +105,7 @@
     </w:p>
     <w:p>
       <w:pPr>
-        <w:pStyle w:val="ListParagraph"/>
+        <w:pStyle w:val="Lijstalinea"/>
         <w:numPr>
           <w:ilvl w:val="0"/>
           <w:numId w:val="4"/>
@@ -117,7 +117,7 @@
     </w:p>
     <w:p>
       <w:pPr>
-        <w:pStyle w:val="ListParagraph"/>
+        <w:pStyle w:val="Lijstalinea"/>
         <w:numPr>
           <w:ilvl w:val="0"/>
           <w:numId w:val="4"/>
@@ -129,7 +129,7 @@
     </w:p>
     <w:p>
       <w:pPr>
-        <w:pStyle w:val="ListParagraph"/>
+        <w:pStyle w:val="Lijstalinea"/>
       </w:pPr>
     </w:p>
     <w:p>
@@ -162,7 +162,7 @@
     </w:p>
     <w:p>
       <w:pPr>
-        <w:pStyle w:val="ListParagraph"/>
+        <w:pStyle w:val="Lijstalinea"/>
         <w:numPr>
           <w:ilvl w:val="0"/>
           <w:numId w:val="4"/>
@@ -174,7 +174,7 @@
     </w:p>
     <w:p>
       <w:pPr>
-        <w:pStyle w:val="ListParagraph"/>
+        <w:pStyle w:val="Lijstalinea"/>
         <w:numPr>
           <w:ilvl w:val="0"/>
           <w:numId w:val="4"/>
@@ -191,7 +191,7 @@
     </w:p>
     <w:p>
       <w:pPr>
-        <w:pStyle w:val="ListParagraph"/>
+        <w:pStyle w:val="Lijstalinea"/>
         <w:numPr>
           <w:ilvl w:val="0"/>
           <w:numId w:val="4"/>
@@ -203,7 +203,7 @@
     </w:p>
     <w:p>
       <w:pPr>
-        <w:pStyle w:val="ListParagraph"/>
+        <w:pStyle w:val="Lijstalinea"/>
         <w:numPr>
           <w:ilvl w:val="0"/>
           <w:numId w:val="4"/>
@@ -981,7 +981,7 @@
     </w:p>
     <w:p>
       <w:pPr>
-        <w:pStyle w:val="ListParagraph"/>
+        <w:pStyle w:val="Lijstalinea"/>
         <w:numPr>
           <w:ilvl w:val="0"/>
           <w:numId w:val="4"/>
@@ -993,7 +993,7 @@
     </w:p>
     <w:p>
       <w:pPr>
-        <w:pStyle w:val="ListParagraph"/>
+        <w:pStyle w:val="Lijstalinea"/>
         <w:numPr>
           <w:ilvl w:val="0"/>
           <w:numId w:val="4"/>
@@ -1005,7 +1005,7 @@
     </w:p>
     <w:p>
       <w:pPr>
-        <w:pStyle w:val="ListParagraph"/>
+        <w:pStyle w:val="Lijstalinea"/>
         <w:numPr>
           <w:ilvl w:val="0"/>
           <w:numId w:val="4"/>
@@ -1071,7 +1071,7 @@
     </w:p>
     <w:p>
       <w:pPr>
-        <w:pStyle w:val="ListParagraph"/>
+        <w:pStyle w:val="Lijstalinea"/>
         <w:numPr>
           <w:ilvl w:val="0"/>
           <w:numId w:val="3"/>
@@ -1107,7 +1107,7 @@
     </w:p>
     <w:p>
       <w:pPr>
-        <w:pStyle w:val="ListParagraph"/>
+        <w:pStyle w:val="Lijstalinea"/>
         <w:numPr>
           <w:ilvl w:val="1"/>
           <w:numId w:val="3"/>
@@ -1135,7 +1135,7 @@
     </w:p>
     <w:p>
       <w:pPr>
-        <w:pStyle w:val="ListParagraph"/>
+        <w:pStyle w:val="Lijstalinea"/>
         <w:numPr>
           <w:ilvl w:val="1"/>
           <w:numId w:val="3"/>
@@ -1160,7 +1160,7 @@
     </w:p>
     <w:p>
       <w:pPr>
-        <w:pStyle w:val="ListParagraph"/>
+        <w:pStyle w:val="Lijstalinea"/>
         <w:numPr>
           <w:ilvl w:val="0"/>
           <w:numId w:val="3"/>
@@ -1173,7 +1173,7 @@
     <w:p/>
     <w:p>
       <w:pPr>
-        <w:pStyle w:val="ListParagraph"/>
+        <w:pStyle w:val="Lijstalinea"/>
         <w:numPr>
           <w:ilvl w:val="0"/>
           <w:numId w:val="3"/>
@@ -1192,7 +1192,7 @@
     <w:p/>
     <w:p>
       <w:pPr>
-        <w:pStyle w:val="ListParagraph"/>
+        <w:pStyle w:val="Lijstalinea"/>
         <w:numPr>
           <w:ilvl w:val="0"/>
           <w:numId w:val="3"/>
@@ -1211,7 +1211,7 @@
     <w:p/>
     <w:p>
       <w:pPr>
-        <w:pStyle w:val="ListParagraph"/>
+        <w:pStyle w:val="Lijstalinea"/>
         <w:numPr>
           <w:ilvl w:val="0"/>
           <w:numId w:val="3"/>
@@ -1241,7 +1241,7 @@
     </w:p>
     <w:p>
       <w:pPr>
-        <w:pStyle w:val="ListParagraph"/>
+        <w:pStyle w:val="Lijstalinea"/>
         <w:numPr>
           <w:ilvl w:val="1"/>
           <w:numId w:val="3"/>
@@ -1259,7 +1259,7 @@
     </w:p>
     <w:p>
       <w:pPr>
-        <w:pStyle w:val="ListParagraph"/>
+        <w:pStyle w:val="Lijstalinea"/>
         <w:numPr>
           <w:ilvl w:val="1"/>
           <w:numId w:val="3"/>
@@ -1277,7 +1277,7 @@
     </w:p>
     <w:p>
       <w:pPr>
-        <w:pStyle w:val="ListParagraph"/>
+        <w:pStyle w:val="Lijstalinea"/>
         <w:numPr>
           <w:ilvl w:val="1"/>
           <w:numId w:val="3"/>
@@ -1375,7 +1375,7 @@
     <w:p/>
     <w:p>
       <w:pPr>
-        <w:pStyle w:val="ListParagraph"/>
+        <w:pStyle w:val="Lijstalinea"/>
         <w:numPr>
           <w:ilvl w:val="0"/>
           <w:numId w:val="3"/>
@@ -1432,12 +1432,12 @@
     </w:p>
     <w:p>
       <w:pPr>
-        <w:pStyle w:val="ListParagraph"/>
-      </w:pPr>
-    </w:p>
-    <w:p>
-      <w:pPr>
-        <w:pStyle w:val="ListParagraph"/>
+        <w:pStyle w:val="Lijstalinea"/>
+      </w:pPr>
+    </w:p>
+    <w:p>
+      <w:pPr>
+        <w:pStyle w:val="Lijstalinea"/>
         <w:numPr>
           <w:ilvl w:val="0"/>
           <w:numId w:val="3"/>
@@ -1463,13 +1463,13 @@
     </w:p>
     <w:p>
       <w:pPr>
-        <w:pStyle w:val="ListParagraph"/>
+        <w:pStyle w:val="Lijstalinea"/>
       </w:pPr>
     </w:p>
     <w:p/>
     <w:p>
       <w:pPr>
-        <w:pStyle w:val="ListParagraph"/>
+        <w:pStyle w:val="Lijstalinea"/>
         <w:numPr>
           <w:ilvl w:val="0"/>
           <w:numId w:val="3"/>
@@ -1487,7 +1487,7 @@
     </w:p>
     <w:p>
       <w:pPr>
-        <w:pStyle w:val="ListParagraph"/>
+        <w:pStyle w:val="Lijstalinea"/>
         <w:numPr>
           <w:ilvl w:val="0"/>
           <w:numId w:val="3"/>
@@ -1511,7 +1511,7 @@
     </w:p>
     <w:p>
       <w:pPr>
-        <w:pStyle w:val="ListParagraph"/>
+        <w:pStyle w:val="Lijstalinea"/>
         <w:numPr>
           <w:ilvl w:val="0"/>
           <w:numId w:val="3"/>
@@ -1526,7 +1526,7 @@
     </w:p>
     <w:p>
       <w:pPr>
-        <w:pStyle w:val="ListParagraph"/>
+        <w:pStyle w:val="Lijstalinea"/>
         <w:numPr>
           <w:ilvl w:val="0"/>
           <w:numId w:val="3"/>
@@ -1664,7 +1664,7 @@
     </w:p>
     <w:p>
       <w:pPr>
-        <w:pStyle w:val="ListParagraph"/>
+        <w:pStyle w:val="Lijstalinea"/>
         <w:numPr>
           <w:ilvl w:val="0"/>
           <w:numId w:val="3"/>
@@ -1760,7 +1760,7 @@
     </w:p>
     <w:p>
       <w:pPr>
-        <w:pStyle w:val="ListParagraph"/>
+        <w:pStyle w:val="Lijstalinea"/>
         <w:numPr>
           <w:ilvl w:val="0"/>
           <w:numId w:val="3"/>
@@ -1845,7 +1845,7 @@
     <w:p/>
     <w:p>
       <w:pPr>
-        <w:pStyle w:val="ListParagraph"/>
+        <w:pStyle w:val="Lijstalinea"/>
         <w:numPr>
           <w:ilvl w:val="0"/>
           <w:numId w:val="3"/>
@@ -1860,7 +1860,7 @@
     </w:p>
     <w:p>
       <w:pPr>
-        <w:pStyle w:val="ListParagraph"/>
+        <w:pStyle w:val="Lijstalinea"/>
         <w:numPr>
           <w:ilvl w:val="0"/>
           <w:numId w:val="3"/>
@@ -1872,7 +1872,7 @@
     </w:p>
     <w:p>
       <w:pPr>
-        <w:pStyle w:val="ListParagraph"/>
+        <w:pStyle w:val="Lijstalinea"/>
         <w:numPr>
           <w:ilvl w:val="0"/>
           <w:numId w:val="3"/>
@@ -1887,18 +1887,396 @@
     </w:p>
     <w:p>
       <w:pPr>
-        <w:pStyle w:val="ListParagraph"/>
+        <w:pStyle w:val="Lijstalinea"/>
         <w:numPr>
           <w:ilvl w:val="0"/>
           <w:numId w:val="3"/>
         </w:numPr>
       </w:pPr>
       <w:r>
+        <w:t xml:space="preserve">Coherent storyline: </w:t>
+      </w:r>
+    </w:p>
+    <w:p>
+      <w:pPr>
+        <w:pStyle w:val="Lijstalinea"/>
+        <w:numPr>
+          <w:ilvl w:val="1"/>
+          <w:numId w:val="4"/>
+        </w:numPr>
+      </w:pPr>
+      <w:r>
+        <w:lastRenderedPageBreak/>
+        <w:t>R</w:t>
+      </w:r>
+      <w:r>
+        <w:t>emove everything that does not directly support the story or move it to the supplementary document that contains more details.</w:t>
+      </w:r>
+    </w:p>
+    <w:p>
+      <w:pPr>
+        <w:pStyle w:val="Lijstalinea"/>
+        <w:numPr>
+          <w:ilvl w:val="1"/>
+          <w:numId w:val="4"/>
+        </w:numPr>
+      </w:pPr>
+      <w:r>
+        <w:t xml:space="preserve">Appendix: things you don’t </w:t>
+      </w:r>
+      <w:proofErr w:type="spellStart"/>
+      <w:r>
+        <w:t>wanna</w:t>
+      </w:r>
+      <w:proofErr w:type="spellEnd"/>
+      <w:r>
+        <w:t xml:space="preserve"> describe and might put in later,</w:t>
+      </w:r>
+      <w:r>
         <w:t xml:space="preserve"> </w:t>
       </w:r>
+      <w:r>
+        <w:t>e.g. additional information about the migration</w:t>
+      </w:r>
+    </w:p>
+    <w:p>
+      <w:pPr>
+        <w:pStyle w:val="Lijstalinea"/>
+        <w:numPr>
+          <w:ilvl w:val="1"/>
+          <w:numId w:val="4"/>
+        </w:numPr>
+      </w:pPr>
+      <w:r>
+        <w:rPr>
+          <w:b/>
+          <w:bCs/>
+        </w:rPr>
+        <w:t>Short thesis</w:t>
+      </w:r>
+      <w:r>
+        <w:t>! Only important info and figures to support the story. Keep it to the point!</w:t>
+      </w:r>
+    </w:p>
+    <w:p>
+      <w:pPr>
+        <w:pStyle w:val="Lijstalinea"/>
+        <w:numPr>
+          <w:ilvl w:val="1"/>
+          <w:numId w:val="4"/>
+        </w:numPr>
+      </w:pPr>
+      <w:r>
+        <w:t>For now, focus on having a clear story and shortening the document</w:t>
+      </w:r>
+    </w:p>
+    <w:p>
+      <w:pPr>
+        <w:pStyle w:val="Lijstalinea"/>
+        <w:numPr>
+          <w:ilvl w:val="0"/>
+          <w:numId w:val="3"/>
+        </w:numPr>
+      </w:pPr>
+      <w:r>
+        <w:t>Uncertainty should be discussed:</w:t>
+      </w:r>
+      <w:r>
+        <w:t xml:space="preserve"> (discussion)</w:t>
+      </w:r>
+    </w:p>
+    <w:p>
+      <w:pPr>
+        <w:pStyle w:val="Lijstalinea"/>
+        <w:numPr>
+          <w:ilvl w:val="1"/>
+          <w:numId w:val="4"/>
+        </w:numPr>
+      </w:pPr>
+      <w:r>
+        <w:t>Not for synthetic data as we know the ground truth but for field data</w:t>
+      </w:r>
+    </w:p>
+    <w:p>
+      <w:pPr>
+        <w:pStyle w:val="Lijstalinea"/>
+        <w:numPr>
+          <w:ilvl w:val="1"/>
+          <w:numId w:val="4"/>
+        </w:numPr>
+      </w:pPr>
+      <w:r>
+        <w:t>Uncertainty in reproducibility or in processing</w:t>
+      </w:r>
+      <w:r>
+        <w:t>, as every processing step can introduce uncertainty</w:t>
+      </w:r>
+    </w:p>
+    <w:p>
+      <w:pPr>
+        <w:pStyle w:val="Lijstalinea"/>
+        <w:numPr>
+          <w:ilvl w:val="2"/>
+          <w:numId w:val="4"/>
+        </w:numPr>
+      </w:pPr>
+      <w:r>
+        <w:t>E.g. when migrating and getting noise near the borehole appearing as high amplitude regions</w:t>
+      </w:r>
+      <w:r>
+        <w:t xml:space="preserve">, so </w:t>
+      </w:r>
+      <w:r>
+        <w:rPr>
+          <w:b/>
+          <w:bCs/>
+        </w:rPr>
+        <w:t>discuss them</w:t>
+      </w:r>
+    </w:p>
+    <w:p>
+      <w:pPr>
+        <w:pStyle w:val="Lijstalinea"/>
+        <w:numPr>
+          <w:ilvl w:val="1"/>
+          <w:numId w:val="4"/>
+        </w:numPr>
+      </w:pPr>
+      <w:r>
+        <w:t xml:space="preserve">We </w:t>
+      </w:r>
+      <w:r>
+        <w:rPr>
+          <w:u w:val="single"/>
+        </w:rPr>
+        <w:t>compare</w:t>
+      </w:r>
+      <w:r>
+        <w:t xml:space="preserve"> noisy relative clean field data, where does uncertainty exist</w:t>
+      </w:r>
+      <w:r>
+        <w:t xml:space="preserve">. </w:t>
+      </w:r>
+      <w:r>
+        <w:rPr>
+          <w:b/>
+          <w:bCs/>
+        </w:rPr>
+        <w:t>Can be asked during the defence</w:t>
+      </w:r>
+    </w:p>
+    <w:p>
+      <w:pPr>
+        <w:pStyle w:val="Lijstalinea"/>
+        <w:numPr>
+          <w:ilvl w:val="1"/>
+          <w:numId w:val="4"/>
+        </w:numPr>
+      </w:pPr>
+      <w:r>
+        <w:t xml:space="preserve">Uncertainty in positioning (Napari vs moving window), or in 2D/3D conversion, how far do we </w:t>
+      </w:r>
+      <w:r>
+        <w:rPr>
+          <w:u w:val="single"/>
+        </w:rPr>
+        <w:t>expect</w:t>
+      </w:r>
+      <w:r>
+        <w:t xml:space="preserve"> to be able to go in super-resolution</w:t>
+      </w:r>
+      <w:r>
+        <w:t xml:space="preserve">, so </w:t>
+      </w:r>
+      <w:r>
+        <w:rPr>
+          <w:b/>
+          <w:bCs/>
+        </w:rPr>
+        <w:t>every processing step introduces some form of uncertainty</w:t>
+      </w:r>
+    </w:p>
+    <w:p>
+      <w:pPr>
+        <w:pStyle w:val="Lijstalinea"/>
+        <w:numPr>
+          <w:ilvl w:val="1"/>
+          <w:numId w:val="4"/>
+        </w:numPr>
+      </w:pPr>
+      <w:proofErr w:type="gramStart"/>
+      <w:r>
+        <w:t>Also</w:t>
+      </w:r>
+      <w:proofErr w:type="gramEnd"/>
+      <w:r>
+        <w:t xml:space="preserve"> when developing the WLS phase-shift workflow, there are design choices and uncertainties and subjectivities.</w:t>
+      </w:r>
+    </w:p>
+    <w:p>
+      <w:pPr>
+        <w:pStyle w:val="Lijstalinea"/>
+        <w:numPr>
+          <w:ilvl w:val="0"/>
+          <w:numId w:val="3"/>
+        </w:numPr>
+      </w:pPr>
+      <w:r>
+        <w:t>Literature review:</w:t>
+      </w:r>
+    </w:p>
+    <w:p>
+      <w:pPr>
+        <w:pStyle w:val="Lijstalinea"/>
+        <w:numPr>
+          <w:ilvl w:val="1"/>
+          <w:numId w:val="4"/>
+        </w:numPr>
+      </w:pPr>
+      <w:r>
+        <w:t>Define resolution</w:t>
+      </w:r>
+    </w:p>
+    <w:p>
+      <w:pPr>
+        <w:pStyle w:val="Lijstalinea"/>
+        <w:numPr>
+          <w:ilvl w:val="2"/>
+          <w:numId w:val="4"/>
+        </w:numPr>
+      </w:pPr>
+      <w:r>
+        <w:t>Lateral</w:t>
+      </w:r>
+    </w:p>
+    <w:p>
+      <w:pPr>
+        <w:pStyle w:val="Lijstalinea"/>
+        <w:numPr>
+          <w:ilvl w:val="2"/>
+          <w:numId w:val="4"/>
+        </w:numPr>
+      </w:pPr>
+      <w:r>
+        <w:t>Vertical</w:t>
+      </w:r>
+    </w:p>
+    <w:p>
+      <w:pPr>
+        <w:pStyle w:val="Lijstalinea"/>
+        <w:numPr>
+          <w:ilvl w:val="2"/>
+          <w:numId w:val="4"/>
+        </w:numPr>
+      </w:pPr>
+      <w:r>
+        <w:t>Radial</w:t>
+      </w:r>
+    </w:p>
+    <w:p>
+      <w:pPr>
+        <w:pStyle w:val="Lijstalinea"/>
+        <w:numPr>
+          <w:ilvl w:val="1"/>
+          <w:numId w:val="4"/>
+        </w:numPr>
+      </w:pPr>
+      <w:r>
+        <w:t>Change 2.3 GPR processing</w:t>
+      </w:r>
+      <w:r>
+        <w:t xml:space="preserve"> title, is only relevant if you discuss the </w:t>
+      </w:r>
+      <w:proofErr w:type="gramStart"/>
+      <w:r>
+        <w:rPr>
+          <w:u w:val="single"/>
+        </w:rPr>
+        <w:t>amplitude based</w:t>
+      </w:r>
+      <w:proofErr w:type="gramEnd"/>
+      <w:r>
+        <w:rPr>
+          <w:u w:val="single"/>
+        </w:rPr>
+        <w:t xml:space="preserve"> </w:t>
+      </w:r>
+      <w:r>
+        <w:t>methods that have been tried so far to achieve super resolution.</w:t>
+      </w:r>
+    </w:p>
+    <w:p>
+      <w:pPr>
+        <w:pStyle w:val="Lijstalinea"/>
+        <w:numPr>
+          <w:ilvl w:val="1"/>
+          <w:numId w:val="4"/>
+        </w:numPr>
+      </w:pPr>
+      <w:r>
+        <w:t>Also add an interlude of phase-vs-amplitude based interpretation</w:t>
+      </w:r>
+      <w:r>
+        <w:t xml:space="preserve">. </w:t>
+      </w:r>
+      <w:proofErr w:type="gramStart"/>
+      <w:r>
+        <w:t>So</w:t>
+      </w:r>
+      <w:proofErr w:type="gramEnd"/>
+      <w:r>
+        <w:t xml:space="preserve"> moving away from traditional amplitude to phase methods</w:t>
+      </w:r>
+    </w:p>
+    <w:p>
+      <w:pPr>
+        <w:pStyle w:val="Lijstalinea"/>
+        <w:numPr>
+          <w:ilvl w:val="0"/>
+          <w:numId w:val="3"/>
+        </w:numPr>
+      </w:pPr>
+      <w:r>
+        <w:t>Focus now on cleaning up:</w:t>
+      </w:r>
+    </w:p>
+    <w:p>
+      <w:pPr>
+        <w:pStyle w:val="Lijstalinea"/>
+        <w:numPr>
+          <w:ilvl w:val="1"/>
+          <w:numId w:val="4"/>
+        </w:numPr>
+      </w:pPr>
+      <w:r>
+        <w:t>Figures that support the story</w:t>
+      </w:r>
+    </w:p>
+    <w:p>
+      <w:pPr>
+        <w:pStyle w:val="Lijstalinea"/>
+        <w:numPr>
+          <w:ilvl w:val="1"/>
+          <w:numId w:val="4"/>
+        </w:numPr>
+      </w:pPr>
+      <w:r>
+        <w:t>Coherent story</w:t>
+      </w:r>
+    </w:p>
+    <w:p>
+      <w:pPr>
+        <w:pStyle w:val="Lijstalinea"/>
+        <w:numPr>
+          <w:ilvl w:val="0"/>
+          <w:numId w:val="3"/>
+        </w:numPr>
+      </w:pPr>
+      <w:r>
+        <w:t>Also write in thesis: guidelines for spatial resolution when wanting to deal with super resolution. Dealing with time resolution is easy. (in methodology)</w:t>
+      </w:r>
     </w:p>
     <w:p/>
-    <w:p/>
     <w:p>
       <w:proofErr w:type="gramStart"/>
       <w:r>
@@ -1914,7 +2292,7 @@
     </w:p>
     <w:p>
       <w:pPr>
-        <w:pStyle w:val="ListParagraph"/>
+        <w:pStyle w:val="Lijstalinea"/>
         <w:numPr>
           <w:ilvl w:val="0"/>
           <w:numId w:val="4"/>
@@ -1926,7 +2304,7 @@
     </w:p>
     <w:p>
       <w:pPr>
-        <w:pStyle w:val="ListParagraph"/>
+        <w:pStyle w:val="Lijstalinea"/>
         <w:numPr>
           <w:ilvl w:val="0"/>
           <w:numId w:val="4"/>
@@ -1938,7 +2316,7 @@
     </w:p>
     <w:p>
       <w:pPr>
-        <w:pStyle w:val="ListParagraph"/>
+        <w:pStyle w:val="Lijstalinea"/>
         <w:numPr>
           <w:ilvl w:val="0"/>
           <w:numId w:val="4"/>
@@ -1958,19 +2336,20 @@
     </w:p>
     <w:p>
       <w:pPr>
-        <w:pStyle w:val="ListParagraph"/>
+        <w:pStyle w:val="Lijstalinea"/>
         <w:numPr>
           <w:ilvl w:val="0"/>
           <w:numId w:val="5"/>
         </w:numPr>
       </w:pPr>
       <w:r>
+        <w:lastRenderedPageBreak/>
         <w:t>EM theory, GPR resolution, acquisition</w:t>
       </w:r>
     </w:p>
     <w:p>
       <w:pPr>
-        <w:pStyle w:val="ListParagraph"/>
+        <w:pStyle w:val="Lijstalinea"/>
         <w:numPr>
           <w:ilvl w:val="0"/>
           <w:numId w:val="5"/>
@@ -1982,7 +2361,7 @@
     </w:p>
     <w:p>
       <w:pPr>
-        <w:pStyle w:val="ListParagraph"/>
+        <w:pStyle w:val="Lijstalinea"/>
         <w:numPr>
           <w:ilvl w:val="0"/>
           <w:numId w:val="5"/>
@@ -1994,7 +2373,7 @@
     </w:p>
     <w:p>
       <w:pPr>
-        <w:pStyle w:val="ListParagraph"/>
+        <w:pStyle w:val="Lijstalinea"/>
         <w:numPr>
           <w:ilvl w:val="0"/>
           <w:numId w:val="5"/>
@@ -2007,7 +2386,7 @@
     <w:p/>
     <w:p>
       <w:pPr>
-        <w:pStyle w:val="ListParagraph"/>
+        <w:pStyle w:val="Lijstalinea"/>
         <w:numPr>
           <w:ilvl w:val="0"/>
           <w:numId w:val="1"/>
@@ -2053,7 +2432,7 @@
     </w:p>
     <w:p>
       <w:pPr>
-        <w:pStyle w:val="ListParagraph"/>
+        <w:pStyle w:val="Lijstalinea"/>
         <w:numPr>
           <w:ilvl w:val="0"/>
           <w:numId w:val="1"/>
@@ -2093,7 +2472,7 @@
     </w:p>
     <w:p>
       <w:pPr>
-        <w:pStyle w:val="ListParagraph"/>
+        <w:pStyle w:val="Lijstalinea"/>
         <w:numPr>
           <w:ilvl w:val="0"/>
           <w:numId w:val="1"/>
@@ -2133,7 +2512,7 @@
     </w:p>
     <w:p>
       <w:pPr>
-        <w:pStyle w:val="ListParagraph"/>
+        <w:pStyle w:val="Lijstalinea"/>
         <w:numPr>
           <w:ilvl w:val="0"/>
           <w:numId w:val="1"/>
@@ -2226,7 +2605,7 @@
     </w:p>
     <w:p>
       <w:pPr>
-        <w:pStyle w:val="ListParagraph"/>
+        <w:pStyle w:val="Lijstalinea"/>
         <w:numPr>
           <w:ilvl w:val="0"/>
           <w:numId w:val="7"/>
@@ -2310,7 +2689,7 @@
     </w:p>
     <w:p>
       <w:pPr>
-        <w:pStyle w:val="ListParagraph"/>
+        <w:pStyle w:val="Lijstalinea"/>
         <w:numPr>
           <w:ilvl w:val="1"/>
           <w:numId w:val="7"/>
@@ -2330,7 +2709,7 @@
     </w:p>
     <w:p>
       <w:pPr>
-        <w:pStyle w:val="ListParagraph"/>
+        <w:pStyle w:val="Lijstalinea"/>
         <w:numPr>
           <w:ilvl w:val="1"/>
           <w:numId w:val="7"/>
@@ -2357,7 +2736,7 @@
     </w:p>
     <w:p>
       <w:pPr>
-        <w:pStyle w:val="ListParagraph"/>
+        <w:pStyle w:val="Lijstalinea"/>
         <w:numPr>
           <w:ilvl w:val="0"/>
           <w:numId w:val="7"/>
@@ -2443,7 +2822,7 @@
     </w:p>
     <w:p>
       <w:pPr>
-        <w:pStyle w:val="ListParagraph"/>
+        <w:pStyle w:val="Lijstalinea"/>
         <w:numPr>
           <w:ilvl w:val="1"/>
           <w:numId w:val="7"/>
@@ -2463,7 +2842,7 @@
     </w:p>
     <w:p>
       <w:pPr>
-        <w:pStyle w:val="ListParagraph"/>
+        <w:pStyle w:val="Lijstalinea"/>
         <w:numPr>
           <w:ilvl w:val="1"/>
           <w:numId w:val="7"/>
@@ -2478,7 +2857,6 @@
           <w:bCs/>
           <w:lang w:val="en-US"/>
         </w:rPr>
-        <w:lastRenderedPageBreak/>
         <w:t>Thin Beds and Subwavelength Detection</w:t>
       </w:r>
     </w:p>
@@ -2491,7 +2869,7 @@
     </w:p>
     <w:p>
       <w:pPr>
-        <w:pStyle w:val="ListParagraph"/>
+        <w:pStyle w:val="Lijstalinea"/>
         <w:numPr>
           <w:ilvl w:val="0"/>
           <w:numId w:val="7"/>
@@ -2583,7 +2961,7 @@
     </w:p>
     <w:p>
       <w:pPr>
-        <w:pStyle w:val="ListParagraph"/>
+        <w:pStyle w:val="Lijstalinea"/>
         <w:numPr>
           <w:ilvl w:val="1"/>
           <w:numId w:val="7"/>
@@ -2598,6 +2976,7 @@
           <w:bCs/>
           <w:lang w:val="en-US"/>
         </w:rPr>
+        <w:lastRenderedPageBreak/>
         <w:t>Used</w:t>
       </w:r>
       <w:r>
@@ -2611,7 +2990,7 @@
     </w:p>
     <w:p>
       <w:pPr>
-        <w:pStyle w:val="ListParagraph"/>
+        <w:pStyle w:val="Lijstalinea"/>
         <w:numPr>
           <w:ilvl w:val="2"/>
           <w:numId w:val="7"/>
@@ -2626,7 +3005,7 @@
     </w:p>
     <w:p>
       <w:pPr>
-        <w:pStyle w:val="ListParagraph"/>
+        <w:pStyle w:val="Lijstalinea"/>
         <w:numPr>
           <w:ilvl w:val="2"/>
           <w:numId w:val="7"/>
@@ -2647,7 +3026,7 @@
     </w:p>
     <w:p>
       <w:pPr>
-        <w:pStyle w:val="ListParagraph"/>
+        <w:pStyle w:val="Lijstalinea"/>
         <w:numPr>
           <w:ilvl w:val="2"/>
           <w:numId w:val="7"/>
@@ -2668,7 +3047,7 @@
     </w:p>
     <w:p>
       <w:pPr>
-        <w:pStyle w:val="ListParagraph"/>
+        <w:pStyle w:val="Lijstalinea"/>
         <w:numPr>
           <w:ilvl w:val="2"/>
           <w:numId w:val="7"/>
@@ -2695,7 +3074,7 @@
     </w:p>
     <w:p>
       <w:pPr>
-        <w:pStyle w:val="ListParagraph"/>
+        <w:pStyle w:val="Lijstalinea"/>
         <w:numPr>
           <w:ilvl w:val="2"/>
           <w:numId w:val="7"/>
@@ -2722,7 +3101,7 @@
     </w:p>
     <w:p>
       <w:pPr>
-        <w:pStyle w:val="ListParagraph"/>
+        <w:pStyle w:val="Lijstalinea"/>
         <w:numPr>
           <w:ilvl w:val="1"/>
           <w:numId w:val="7"/>
@@ -2765,7 +3144,7 @@
     </w:p>
     <w:p>
       <w:pPr>
-        <w:pStyle w:val="ListParagraph"/>
+        <w:pStyle w:val="Lijstalinea"/>
         <w:numPr>
           <w:ilvl w:val="2"/>
           <w:numId w:val="7"/>
@@ -2786,7 +3165,7 @@
     </w:p>
     <w:p>
       <w:pPr>
-        <w:pStyle w:val="ListParagraph"/>
+        <w:pStyle w:val="Lijstalinea"/>
         <w:numPr>
           <w:ilvl w:val="2"/>
           <w:numId w:val="7"/>
@@ -2807,7 +3186,7 @@
     </w:p>
     <w:p>
       <w:pPr>
-        <w:pStyle w:val="ListParagraph"/>
+        <w:pStyle w:val="Lijstalinea"/>
         <w:numPr>
           <w:ilvl w:val="2"/>
           <w:numId w:val="7"/>
@@ -2834,7 +3213,7 @@
     </w:p>
     <w:p>
       <w:pPr>
-        <w:pStyle w:val="ListParagraph"/>
+        <w:pStyle w:val="Lijstalinea"/>
         <w:numPr>
           <w:ilvl w:val="2"/>
           <w:numId w:val="7"/>
@@ -2855,7 +3234,7 @@
     </w:p>
     <w:p>
       <w:pPr>
-        <w:pStyle w:val="ListParagraph"/>
+        <w:pStyle w:val="Lijstalinea"/>
         <w:numPr>
           <w:ilvl w:val="2"/>
           <w:numId w:val="7"/>
@@ -2977,7 +3356,7 @@
     </w:p>
     <w:p>
       <w:pPr>
-        <w:pStyle w:val="ListParagraph"/>
+        <w:pStyle w:val="Lijstalinea"/>
         <w:numPr>
           <w:ilvl w:val="0"/>
           <w:numId w:val="7"/>
@@ -3046,7 +3425,7 @@
     </w:p>
     <w:p>
       <w:pPr>
-        <w:pStyle w:val="ListParagraph"/>
+        <w:pStyle w:val="Lijstalinea"/>
         <w:numPr>
           <w:ilvl w:val="1"/>
           <w:numId w:val="7"/>
@@ -3066,7 +3445,7 @@
     </w:p>
     <w:p>
       <w:pPr>
-        <w:pStyle w:val="ListParagraph"/>
+        <w:pStyle w:val="Lijstalinea"/>
         <w:numPr>
           <w:ilvl w:val="1"/>
           <w:numId w:val="7"/>
@@ -3093,7 +3472,7 @@
     </w:p>
     <w:p>
       <w:pPr>
-        <w:pStyle w:val="ListParagraph"/>
+        <w:pStyle w:val="Lijstalinea"/>
         <w:numPr>
           <w:ilvl w:val="0"/>
           <w:numId w:val="7"/>
@@ -3168,7 +3547,7 @@
     </w:p>
     <w:p>
       <w:pPr>
-        <w:pStyle w:val="ListParagraph"/>
+        <w:pStyle w:val="Lijstalinea"/>
         <w:numPr>
           <w:ilvl w:val="0"/>
           <w:numId w:val="7"/>
@@ -3200,7 +3579,6 @@
           <w:sz w:val="20"/>
           <w:szCs w:val="20"/>
         </w:rPr>
-        <w:lastRenderedPageBreak/>
         <w:t xml:space="preserve">Precedent field/time-lapse studies (glacier collapse, resin injection, unsaturated flow, root detection, etc.) → </w:t>
       </w:r>
       <w:r>
@@ -3308,7 +3686,7 @@
     </w:p>
     <w:p>
       <w:pPr>
-        <w:pStyle w:val="ListParagraph"/>
+        <w:pStyle w:val="Lijstalinea"/>
         <w:numPr>
           <w:ilvl w:val="1"/>
           <w:numId w:val="10"/>
@@ -3328,7 +3706,7 @@
     </w:p>
     <w:p>
       <w:pPr>
-        <w:pStyle w:val="ListParagraph"/>
+        <w:pStyle w:val="Lijstalinea"/>
         <w:rPr>
           <w:sz w:val="20"/>
           <w:szCs w:val="20"/>
@@ -3345,7 +3723,7 @@
     </w:p>
     <w:p>
       <w:pPr>
-        <w:pStyle w:val="ListParagraph"/>
+        <w:pStyle w:val="Lijstalinea"/>
         <w:rPr>
           <w:sz w:val="20"/>
           <w:szCs w:val="20"/>
@@ -3362,7 +3740,7 @@
     </w:p>
     <w:p>
       <w:pPr>
-        <w:pStyle w:val="ListParagraph"/>
+        <w:pStyle w:val="Lijstalinea"/>
         <w:rPr>
           <w:sz w:val="20"/>
           <w:szCs w:val="20"/>
@@ -3379,7 +3757,7 @@
     </w:p>
     <w:p>
       <w:pPr>
-        <w:pStyle w:val="ListParagraph"/>
+        <w:pStyle w:val="Lijstalinea"/>
         <w:numPr>
           <w:ilvl w:val="1"/>
           <w:numId w:val="10"/>
@@ -3690,7 +4068,6 @@
           <w:sz w:val="20"/>
           <w:szCs w:val="20"/>
         </w:rPr>
-        <w:lastRenderedPageBreak/>
         <w:t>Introduction</w:t>
       </w:r>
       <w:r>
@@ -3879,6 +4256,7 @@
           <w:sz w:val="20"/>
           <w:szCs w:val="20"/>
         </w:rPr>
+        <w:lastRenderedPageBreak/>
         <w:tab/>
         <w:t>4.2.5 Phase test</w:t>
       </w:r>
@@ -4479,134 +4857,163 @@
           <w:sz w:val="20"/>
           <w:szCs w:val="20"/>
         </w:rPr>
+        <w:t xml:space="preserve">5.9 </w:t>
+      </w:r>
+      <w:r>
+        <w:rPr>
+          <w:sz w:val="20"/>
+          <w:szCs w:val="20"/>
+        </w:rPr>
+        <w:t>Summary of the Results</w:t>
+      </w:r>
+    </w:p>
+    <w:p>
+      <w:pPr>
+        <w:rPr>
+          <w:sz w:val="20"/>
+          <w:szCs w:val="20"/>
+        </w:rPr>
+      </w:pPr>
+    </w:p>
+    <w:p>
+      <w:pPr>
+        <w:rPr>
+          <w:sz w:val="20"/>
+          <w:szCs w:val="20"/>
+        </w:rPr>
+      </w:pPr>
+      <w:r>
+        <w:rPr>
+          <w:sz w:val="20"/>
+          <w:szCs w:val="20"/>
+        </w:rPr>
+        <w:t xml:space="preserve">Chapter 6: </w:t>
+      </w:r>
+      <w:r>
+        <w:rPr>
+          <w:sz w:val="20"/>
+          <w:szCs w:val="20"/>
+          <w:highlight w:val="darkCyan"/>
+        </w:rPr>
+        <w:t>Hypothesis 3</w:t>
+      </w:r>
+    </w:p>
+    <w:p>
+      <w:pPr>
+        <w:rPr>
+          <w:sz w:val="20"/>
+          <w:szCs w:val="20"/>
+        </w:rPr>
+      </w:pPr>
+      <w:r>
+        <w:rPr>
+          <w:sz w:val="20"/>
+          <w:szCs w:val="20"/>
+        </w:rPr>
+        <w:t>Introduction of chapter</w:t>
+      </w:r>
+    </w:p>
+    <w:p>
+      <w:pPr>
+        <w:rPr>
+          <w:sz w:val="20"/>
+          <w:szCs w:val="20"/>
+        </w:rPr>
+      </w:pPr>
+      <w:r>
+        <w:rPr>
+          <w:sz w:val="20"/>
+          <w:szCs w:val="20"/>
+          <w:highlight w:val="darkCyan"/>
+        </w:rPr>
+        <w:t>6.1 Field data explanation (raw field data)</w:t>
+      </w:r>
+    </w:p>
+    <w:p>
+      <w:pPr>
+        <w:rPr>
+          <w:sz w:val="20"/>
+          <w:szCs w:val="20"/>
+        </w:rPr>
+      </w:pPr>
+      <w:r>
+        <w:rPr>
+          <w:sz w:val="20"/>
+          <w:szCs w:val="20"/>
+          <w:highlight w:val="red"/>
+        </w:rPr>
+        <w:t>6.2 Processing</w:t>
+      </w:r>
+      <w:r>
+        <w:rPr>
+          <w:sz w:val="20"/>
+          <w:szCs w:val="20"/>
+          <w:highlight w:val="red"/>
+        </w:rPr>
+        <w:t xml:space="preserve"> (incl. migration)</w:t>
+      </w:r>
+      <w:r>
+        <w:rPr>
+          <w:sz w:val="20"/>
+          <w:szCs w:val="20"/>
+          <w:highlight w:val="red"/>
+        </w:rPr>
+        <w:t xml:space="preserve"> workflow (processed field data)</w:t>
+      </w:r>
+    </w:p>
+    <w:p>
+      <w:pPr>
+        <w:rPr>
+          <w:sz w:val="20"/>
+          <w:szCs w:val="20"/>
+        </w:rPr>
+      </w:pPr>
+      <w:r>
+        <w:rPr>
+          <w:sz w:val="20"/>
+          <w:szCs w:val="20"/>
+        </w:rPr>
+        <w:t>6.3 Post Processing (of back propagation results</w:t>
+      </w:r>
+      <w:r>
+        <w:rPr>
+          <w:sz w:val="20"/>
+          <w:szCs w:val="20"/>
+        </w:rPr>
+        <w:t xml:space="preserve"> but maybe all 3 migration results</w:t>
+      </w:r>
+      <w:r>
+        <w:rPr>
+          <w:sz w:val="20"/>
+          <w:szCs w:val="20"/>
+        </w:rPr>
+        <w:t>)</w:t>
+      </w:r>
+    </w:p>
+    <w:p>
+      <w:pPr>
+        <w:rPr>
+          <w:sz w:val="20"/>
+          <w:szCs w:val="20"/>
+          <w:highlight w:val="red"/>
+        </w:rPr>
+      </w:pPr>
+      <w:r>
+        <w:rPr>
+          <w:sz w:val="20"/>
+          <w:szCs w:val="20"/>
+          <w:highlight w:val="red"/>
+        </w:rPr>
         <w:lastRenderedPageBreak/>
-        <w:t xml:space="preserve">5.9 </w:t>
-      </w:r>
-      <w:r>
-        <w:rPr>
-          <w:sz w:val="20"/>
-          <w:szCs w:val="20"/>
-        </w:rPr>
-        <w:t>Summary of the Results</w:t>
-      </w:r>
-    </w:p>
-    <w:p>
-      <w:pPr>
-        <w:rPr>
-          <w:sz w:val="20"/>
-          <w:szCs w:val="20"/>
-        </w:rPr>
-      </w:pPr>
-    </w:p>
-    <w:p>
-      <w:pPr>
-        <w:rPr>
-          <w:sz w:val="20"/>
-          <w:szCs w:val="20"/>
-        </w:rPr>
-      </w:pPr>
-      <w:r>
-        <w:rPr>
-          <w:sz w:val="20"/>
-          <w:szCs w:val="20"/>
-        </w:rPr>
-        <w:t xml:space="preserve">Chapter 6: </w:t>
-      </w:r>
-      <w:r>
-        <w:rPr>
-          <w:sz w:val="20"/>
-          <w:szCs w:val="20"/>
-          <w:highlight w:val="darkCyan"/>
-        </w:rPr>
-        <w:t>Hypothesis 3</w:t>
-      </w:r>
-    </w:p>
-    <w:p>
-      <w:pPr>
-        <w:rPr>
-          <w:sz w:val="20"/>
-          <w:szCs w:val="20"/>
-        </w:rPr>
-      </w:pPr>
-      <w:r>
-        <w:rPr>
-          <w:sz w:val="20"/>
-          <w:szCs w:val="20"/>
-        </w:rPr>
-        <w:t>Introduction of chapter</w:t>
-      </w:r>
-    </w:p>
-    <w:p>
-      <w:pPr>
-        <w:rPr>
-          <w:sz w:val="20"/>
-          <w:szCs w:val="20"/>
-        </w:rPr>
-      </w:pPr>
-      <w:r>
-        <w:rPr>
-          <w:sz w:val="20"/>
-          <w:szCs w:val="20"/>
-          <w:highlight w:val="darkCyan"/>
-        </w:rPr>
-        <w:t>6.1 Field data explanation (raw field data)</w:t>
-      </w:r>
-    </w:p>
-    <w:p>
-      <w:pPr>
-        <w:rPr>
-          <w:sz w:val="20"/>
-          <w:szCs w:val="20"/>
-        </w:rPr>
-      </w:pPr>
+        <w:t>6.</w:t>
+      </w:r>
       <w:r>
         <w:rPr>
           <w:sz w:val="20"/>
           <w:szCs w:val="20"/>
           <w:highlight w:val="red"/>
         </w:rPr>
-        <w:t>6.2 Processing</w:t>
-      </w:r>
-      <w:r>
-        <w:rPr>
-          <w:sz w:val="20"/>
-          <w:szCs w:val="20"/>
-          <w:highlight w:val="red"/>
-        </w:rPr>
-        <w:t xml:space="preserve"> (incl. migration)</w:t>
-      </w:r>
-      <w:r>
-        <w:rPr>
-          <w:sz w:val="20"/>
-          <w:szCs w:val="20"/>
-          <w:highlight w:val="red"/>
-        </w:rPr>
-        <w:t xml:space="preserve"> workflow (processed field data)</w:t>
-      </w:r>
-    </w:p>
-    <w:p>
-      <w:pPr>
-        <w:rPr>
-          <w:sz w:val="20"/>
-          <w:szCs w:val="20"/>
-          <w:highlight w:val="red"/>
-        </w:rPr>
-      </w:pPr>
-      <w:r>
-        <w:rPr>
-          <w:sz w:val="20"/>
-          <w:szCs w:val="20"/>
-          <w:highlight w:val="red"/>
-        </w:rPr>
-        <w:t>6.</w:t>
-      </w:r>
-      <w:r>
-        <w:rPr>
-          <w:sz w:val="20"/>
-          <w:szCs w:val="20"/>
-          <w:highlight w:val="red"/>
-        </w:rPr>
-        <w:t>3</w:t>
+        <w:t>4</w:t>
       </w:r>
       <w:r>
         <w:rPr>
@@ -4640,7 +5047,7 @@
           <w:szCs w:val="20"/>
           <w:highlight w:val="red"/>
         </w:rPr>
-        <w:t>3</w:t>
+        <w:t>4</w:t>
       </w:r>
       <w:r>
         <w:rPr>
@@ -4682,7 +5089,7 @@
           <w:szCs w:val="20"/>
           <w:highlight w:val="red"/>
         </w:rPr>
-        <w:t>3</w:t>
+        <w:t>4</w:t>
       </w:r>
       <w:r>
         <w:rPr>
@@ -4691,13 +5098,6 @@
           <w:highlight w:val="red"/>
         </w:rPr>
         <w:t>.2 Sliding window</w:t>
-      </w:r>
-      <w:r>
-        <w:rPr>
-          <w:sz w:val="20"/>
-          <w:szCs w:val="20"/>
-        </w:rPr>
-        <w:t xml:space="preserve"> (?)</w:t>
       </w:r>
     </w:p>
     <w:p>
@@ -4722,7 +5122,7 @@
           <w:szCs w:val="20"/>
           <w:highlight w:val="red"/>
         </w:rPr>
-        <w:t>3</w:t>
+        <w:t>4</w:t>
       </w:r>
       <w:r>
         <w:rPr>
@@ -4732,13 +5132,6 @@
         </w:rPr>
         <w:t>.3 Picking pixels</w:t>
       </w:r>
-      <w:r>
-        <w:rPr>
-          <w:sz w:val="20"/>
-          <w:szCs w:val="20"/>
-        </w:rPr>
-        <w:t xml:space="preserve"> (?)</w:t>
-      </w:r>
     </w:p>
     <w:p>
       <w:pPr>
@@ -4761,7 +5154,7 @@
           <w:szCs w:val="20"/>
           <w:highlight w:val="blue"/>
         </w:rPr>
-        <w:t>4</w:t>
+        <w:t>5</w:t>
       </w:r>
       <w:r>
         <w:rPr>
@@ -4824,7 +5217,7 @@
           <w:szCs w:val="20"/>
           <w:highlight w:val="darkCyan"/>
         </w:rPr>
-        <w:t>5</w:t>
+        <w:t>6</w:t>
       </w:r>
       <w:r>
         <w:rPr>
@@ -5059,7 +5452,7 @@
     </w:p>
     <w:p>
       <w:pPr>
-        <w:pStyle w:val="ListParagraph"/>
+        <w:pStyle w:val="Lijstalinea"/>
         <w:numPr>
           <w:ilvl w:val="0"/>
           <w:numId w:val="8"/>
@@ -5079,7 +5472,7 @@
     </w:p>
     <w:p>
       <w:pPr>
-        <w:pStyle w:val="ListParagraph"/>
+        <w:pStyle w:val="Lijstalinea"/>
         <w:numPr>
           <w:ilvl w:val="0"/>
           <w:numId w:val="8"/>
@@ -5099,7 +5492,7 @@
     </w:p>
     <w:p>
       <w:pPr>
-        <w:pStyle w:val="ListParagraph"/>
+        <w:pStyle w:val="Lijstalinea"/>
         <w:numPr>
           <w:ilvl w:val="0"/>
           <w:numId w:val="8"/>
@@ -5119,7 +5512,7 @@
     </w:p>
     <w:p>
       <w:pPr>
-        <w:pStyle w:val="ListParagraph"/>
+        <w:pStyle w:val="Lijstalinea"/>
         <w:numPr>
           <w:ilvl w:val="0"/>
           <w:numId w:val="8"/>
@@ -5139,7 +5532,7 @@
     </w:p>
     <w:p>
       <w:pPr>
-        <w:pStyle w:val="ListParagraph"/>
+        <w:pStyle w:val="Lijstalinea"/>
         <w:numPr>
           <w:ilvl w:val="0"/>
           <w:numId w:val="8"/>
@@ -5159,7 +5552,7 @@
     </w:p>
     <w:p>
       <w:pPr>
-        <w:pStyle w:val="ListParagraph"/>
+        <w:pStyle w:val="Lijstalinea"/>
         <w:numPr>
           <w:ilvl w:val="1"/>
           <w:numId w:val="8"/>
@@ -5179,7 +5572,7 @@
     </w:p>
     <w:p>
       <w:pPr>
-        <w:pStyle w:val="ListParagraph"/>
+        <w:pStyle w:val="Lijstalinea"/>
         <w:numPr>
           <w:ilvl w:val="1"/>
           <w:numId w:val="8"/>
@@ -5199,7 +5592,7 @@
     </w:p>
     <w:p>
       <w:pPr>
-        <w:pStyle w:val="ListParagraph"/>
+        <w:pStyle w:val="Lijstalinea"/>
         <w:numPr>
           <w:ilvl w:val="1"/>
           <w:numId w:val="8"/>
@@ -5219,7 +5612,7 @@
     </w:p>
     <w:p>
       <w:pPr>
-        <w:pStyle w:val="ListParagraph"/>
+        <w:pStyle w:val="Lijstalinea"/>
         <w:numPr>
           <w:ilvl w:val="1"/>
           <w:numId w:val="8"/>
@@ -5234,7 +5627,6 @@
           <w:sz w:val="20"/>
           <w:szCs w:val="20"/>
         </w:rPr>
-        <w:lastRenderedPageBreak/>
         <w:t>E</w:t>
       </w:r>
       <w:r>
@@ -5309,7 +5701,7 @@
     </w:p>
     <w:p>
       <w:pPr>
-        <w:pStyle w:val="ListParagraph"/>
+        <w:pStyle w:val="Lijstalinea"/>
         <w:numPr>
           <w:ilvl w:val="0"/>
           <w:numId w:val="9"/>
@@ -5329,7 +5721,7 @@
     </w:p>
     <w:p>
       <w:pPr>
-        <w:pStyle w:val="ListParagraph"/>
+        <w:pStyle w:val="Lijstalinea"/>
         <w:numPr>
           <w:ilvl w:val="0"/>
           <w:numId w:val="9"/>
@@ -5344,12 +5736,13 @@
           <w:sz w:val="20"/>
           <w:szCs w:val="20"/>
         </w:rPr>
+        <w:lastRenderedPageBreak/>
         <w:t>Spectrum of noise</w:t>
       </w:r>
     </w:p>
     <w:p>
       <w:pPr>
-        <w:pStyle w:val="ListParagraph"/>
+        <w:pStyle w:val="Lijstalinea"/>
         <w:numPr>
           <w:ilvl w:val="0"/>
           <w:numId w:val="9"/>
@@ -5369,7 +5762,7 @@
     </w:p>
     <w:p>
       <w:pPr>
-        <w:pStyle w:val="ListParagraph"/>
+        <w:pStyle w:val="Lijstalinea"/>
         <w:numPr>
           <w:ilvl w:val="0"/>
           <w:numId w:val="9"/>
@@ -5389,7 +5782,7 @@
     </w:p>
     <w:p>
       <w:pPr>
-        <w:pStyle w:val="ListParagraph"/>
+        <w:pStyle w:val="Lijstalinea"/>
         <w:numPr>
           <w:ilvl w:val="1"/>
           <w:numId w:val="9"/>
@@ -5409,7 +5802,7 @@
     </w:p>
     <w:p>
       <w:pPr>
-        <w:pStyle w:val="ListParagraph"/>
+        <w:pStyle w:val="Lijstalinea"/>
         <w:numPr>
           <w:ilvl w:val="1"/>
           <w:numId w:val="9"/>
@@ -5429,7 +5822,7 @@
     </w:p>
     <w:p>
       <w:pPr>
-        <w:pStyle w:val="ListParagraph"/>
+        <w:pStyle w:val="Lijstalinea"/>
         <w:numPr>
           <w:ilvl w:val="1"/>
           <w:numId w:val="9"/>
@@ -5449,7 +5842,7 @@
     </w:p>
     <w:p>
       <w:pPr>
-        <w:pStyle w:val="ListParagraph"/>
+        <w:pStyle w:val="Lijstalinea"/>
         <w:numPr>
           <w:ilvl w:val="1"/>
           <w:numId w:val="9"/>
@@ -5469,7 +5862,7 @@
     </w:p>
     <w:p>
       <w:pPr>
-        <w:pStyle w:val="ListParagraph"/>
+        <w:pStyle w:val="Lijstalinea"/>
         <w:numPr>
           <w:ilvl w:val="1"/>
           <w:numId w:val="9"/>
@@ -6173,7 +6566,7 @@
   <w:abstractNum w:abstractNumId="4" w15:restartNumberingAfterBreak="0">
     <w:nsid w:val="3894545A"/>
     <w:multiLevelType w:val="hybridMultilevel"/>
-    <w:tmpl w:val="8FBC964A"/>
+    <w:tmpl w:val="7D5A5020"/>
     <w:lvl w:ilvl="0" w:tplc="2D8E11EA">
       <w:numFmt w:val="bullet"/>
       <w:lvlText w:val="-"/>
@@ -6197,19 +6590,19 @@
         <w:rFonts w:ascii="Courier New" w:hAnsi="Courier New" w:cs="Courier New" w:hint="default"/>
       </w:rPr>
     </w:lvl>
-    <w:lvl w:ilvl="2" w:tplc="08090005" w:tentative="1">
-      <w:start w:val="1"/>
+    <w:lvl w:ilvl="2" w:tplc="5C8A73C6">
+      <w:start w:val="18"/>
       <w:numFmt w:val="bullet"/>
-      <w:lvlText w:val=""/>
+      <w:lvlText w:val=""/>
       <w:lvlJc w:val="left"/>
       <w:pPr>
         <w:ind w:left="2160" w:hanging="360"/>
       </w:pPr>
       <w:rPr>
-        <w:rFonts w:ascii="Wingdings" w:hAnsi="Wingdings" w:hint="default"/>
+        <w:rFonts w:ascii="Symbol" w:eastAsiaTheme="minorHAnsi" w:hAnsi="Symbol" w:cstheme="minorBidi" w:hint="default"/>
       </w:rPr>
     </w:lvl>
-    <w:lvl w:ilvl="3" w:tplc="08090001" w:tentative="1">
+    <w:lvl w:ilvl="3" w:tplc="08090001">
       <w:start w:val="1"/>
       <w:numFmt w:val="bullet"/>
       <w:lvlText w:val=""/>
@@ -7205,15 +7598,15 @@
     <w:lsdException w:name="Unresolved Mention" w:semiHidden="1" w:unhideWhenUsed="1"/>
     <w:lsdException w:name="Smart Link" w:semiHidden="1" w:unhideWhenUsed="1"/>
   </w:latentStyles>
-  <w:style w:type="paragraph" w:default="1" w:styleId="Normal">
+  <w:style w:type="paragraph" w:default="1" w:styleId="Standaard">
     <w:name w:val="Normal"/>
     <w:qFormat/>
   </w:style>
-  <w:style w:type="paragraph" w:styleId="Heading1">
+  <w:style w:type="paragraph" w:styleId="Kop1">
     <w:name w:val="heading 1"/>
-    <w:basedOn w:val="Normal"/>
-    <w:next w:val="Normal"/>
-    <w:link w:val="Heading1Char"/>
+    <w:basedOn w:val="Standaard"/>
+    <w:next w:val="Standaard"/>
+    <w:link w:val="Kop1Char"/>
     <w:uiPriority w:val="9"/>
     <w:qFormat/>
     <w:rsid w:val="005B10CC"/>
@@ -7230,11 +7623,11 @@
       <w:szCs w:val="40"/>
     </w:rPr>
   </w:style>
-  <w:style w:type="paragraph" w:styleId="Heading2">
+  <w:style w:type="paragraph" w:styleId="Kop2">
     <w:name w:val="heading 2"/>
-    <w:basedOn w:val="Normal"/>
-    <w:next w:val="Normal"/>
-    <w:link w:val="Heading2Char"/>
+    <w:basedOn w:val="Standaard"/>
+    <w:next w:val="Standaard"/>
+    <w:link w:val="Kop2Char"/>
     <w:uiPriority w:val="9"/>
     <w:semiHidden/>
     <w:unhideWhenUsed/>
@@ -7253,11 +7646,11 @@
       <w:szCs w:val="32"/>
     </w:rPr>
   </w:style>
-  <w:style w:type="paragraph" w:styleId="Heading3">
+  <w:style w:type="paragraph" w:styleId="Kop3">
     <w:name w:val="heading 3"/>
-    <w:basedOn w:val="Normal"/>
-    <w:next w:val="Normal"/>
-    <w:link w:val="Heading3Char"/>
+    <w:basedOn w:val="Standaard"/>
+    <w:next w:val="Standaard"/>
+    <w:link w:val="Kop3Char"/>
     <w:uiPriority w:val="9"/>
     <w:unhideWhenUsed/>
     <w:qFormat/>
@@ -7275,11 +7668,11 @@
       <w:szCs w:val="28"/>
     </w:rPr>
   </w:style>
-  <w:style w:type="paragraph" w:styleId="Heading4">
+  <w:style w:type="paragraph" w:styleId="Kop4">
     <w:name w:val="heading 4"/>
-    <w:basedOn w:val="Normal"/>
-    <w:next w:val="Normal"/>
-    <w:link w:val="Heading4Char"/>
+    <w:basedOn w:val="Standaard"/>
+    <w:next w:val="Standaard"/>
+    <w:link w:val="Kop4Char"/>
     <w:uiPriority w:val="9"/>
     <w:semiHidden/>
     <w:unhideWhenUsed/>
@@ -7298,11 +7691,11 @@
       <w:color w:val="0F4761" w:themeColor="accent1" w:themeShade="BF"/>
     </w:rPr>
   </w:style>
-  <w:style w:type="paragraph" w:styleId="Heading5">
+  <w:style w:type="paragraph" w:styleId="Kop5">
     <w:name w:val="heading 5"/>
-    <w:basedOn w:val="Normal"/>
-    <w:next w:val="Normal"/>
-    <w:link w:val="Heading5Char"/>
+    <w:basedOn w:val="Standaard"/>
+    <w:next w:val="Standaard"/>
+    <w:link w:val="Kop5Char"/>
     <w:uiPriority w:val="9"/>
     <w:semiHidden/>
     <w:unhideWhenUsed/>
@@ -7319,11 +7712,11 @@
       <w:color w:val="0F4761" w:themeColor="accent1" w:themeShade="BF"/>
     </w:rPr>
   </w:style>
-  <w:style w:type="paragraph" w:styleId="Heading6">
+  <w:style w:type="paragraph" w:styleId="Kop6">
     <w:name w:val="heading 6"/>
-    <w:basedOn w:val="Normal"/>
-    <w:next w:val="Normal"/>
-    <w:link w:val="Heading6Char"/>
+    <w:basedOn w:val="Standaard"/>
+    <w:next w:val="Standaard"/>
+    <w:link w:val="Kop6Char"/>
     <w:uiPriority w:val="9"/>
     <w:semiHidden/>
     <w:unhideWhenUsed/>
@@ -7342,11 +7735,11 @@
       <w:color w:val="595959" w:themeColor="text1" w:themeTint="A6"/>
     </w:rPr>
   </w:style>
-  <w:style w:type="paragraph" w:styleId="Heading7">
+  <w:style w:type="paragraph" w:styleId="Kop7">
     <w:name w:val="heading 7"/>
-    <w:basedOn w:val="Normal"/>
-    <w:next w:val="Normal"/>
-    <w:link w:val="Heading7Char"/>
+    <w:basedOn w:val="Standaard"/>
+    <w:next w:val="Standaard"/>
+    <w:link w:val="Kop7Char"/>
     <w:uiPriority w:val="9"/>
     <w:semiHidden/>
     <w:unhideWhenUsed/>
@@ -7363,11 +7756,11 @@
       <w:color w:val="595959" w:themeColor="text1" w:themeTint="A6"/>
     </w:rPr>
   </w:style>
-  <w:style w:type="paragraph" w:styleId="Heading8">
+  <w:style w:type="paragraph" w:styleId="Kop8">
     <w:name w:val="heading 8"/>
-    <w:basedOn w:val="Normal"/>
-    <w:next w:val="Normal"/>
-    <w:link w:val="Heading8Char"/>
+    <w:basedOn w:val="Standaard"/>
+    <w:next w:val="Standaard"/>
+    <w:link w:val="Kop8Char"/>
     <w:uiPriority w:val="9"/>
     <w:semiHidden/>
     <w:unhideWhenUsed/>
@@ -7386,11 +7779,11 @@
       <w:color w:val="272727" w:themeColor="text1" w:themeTint="D8"/>
     </w:rPr>
   </w:style>
-  <w:style w:type="paragraph" w:styleId="Heading9">
+  <w:style w:type="paragraph" w:styleId="Kop9">
     <w:name w:val="heading 9"/>
-    <w:basedOn w:val="Normal"/>
-    <w:next w:val="Normal"/>
-    <w:link w:val="Heading9Char"/>
+    <w:basedOn w:val="Standaard"/>
+    <w:next w:val="Standaard"/>
+    <w:link w:val="Kop9Char"/>
     <w:uiPriority w:val="9"/>
     <w:semiHidden/>
     <w:unhideWhenUsed/>
@@ -7407,13 +7800,13 @@
       <w:color w:val="272727" w:themeColor="text1" w:themeTint="D8"/>
     </w:rPr>
   </w:style>
-  <w:style w:type="character" w:default="1" w:styleId="DefaultParagraphFont">
+  <w:style w:type="character" w:default="1" w:styleId="Standaardalinea-lettertype">
     <w:name w:val="Default Paragraph Font"/>
     <w:uiPriority w:val="1"/>
     <w:semiHidden/>
     <w:unhideWhenUsed/>
   </w:style>
-  <w:style w:type="table" w:default="1" w:styleId="TableNormal">
+  <w:style w:type="table" w:default="1" w:styleId="Standaardtabel">
     <w:name w:val="Normal Table"/>
     <w:uiPriority w:val="99"/>
     <w:semiHidden/>
@@ -7428,16 +7821,16 @@
       </w:tblCellMar>
     </w:tblPr>
   </w:style>
-  <w:style w:type="numbering" w:default="1" w:styleId="NoList">
+  <w:style w:type="numbering" w:default="1" w:styleId="Geenlijst">
     <w:name w:val="No List"/>
     <w:uiPriority w:val="99"/>
     <w:semiHidden/>
     <w:unhideWhenUsed/>
   </w:style>
-  <w:style w:type="character" w:customStyle="1" w:styleId="Heading1Char">
-    <w:name w:val="Heading 1 Char"/>
-    <w:basedOn w:val="DefaultParagraphFont"/>
-    <w:link w:val="Heading1"/>
+  <w:style w:type="character" w:customStyle="1" w:styleId="Kop1Char">
+    <w:name w:val="Kop 1 Char"/>
+    <w:basedOn w:val="Standaardalinea-lettertype"/>
+    <w:link w:val="Kop1"/>
     <w:uiPriority w:val="9"/>
     <w:rsid w:val="005B10CC"/>
     <w:rPr>
@@ -7447,10 +7840,10 @@
       <w:szCs w:val="40"/>
     </w:rPr>
   </w:style>
-  <w:style w:type="character" w:customStyle="1" w:styleId="Heading2Char">
-    <w:name w:val="Heading 2 Char"/>
-    <w:basedOn w:val="DefaultParagraphFont"/>
-    <w:link w:val="Heading2"/>
+  <w:style w:type="character" w:customStyle="1" w:styleId="Kop2Char">
+    <w:name w:val="Kop 2 Char"/>
+    <w:basedOn w:val="Standaardalinea-lettertype"/>
+    <w:link w:val="Kop2"/>
     <w:uiPriority w:val="9"/>
     <w:semiHidden/>
     <w:rsid w:val="005B10CC"/>
@@ -7461,10 +7854,10 @@
       <w:szCs w:val="32"/>
     </w:rPr>
   </w:style>
-  <w:style w:type="character" w:customStyle="1" w:styleId="Heading3Char">
-    <w:name w:val="Heading 3 Char"/>
-    <w:basedOn w:val="DefaultParagraphFont"/>
-    <w:link w:val="Heading3"/>
+  <w:style w:type="character" w:customStyle="1" w:styleId="Kop3Char">
+    <w:name w:val="Kop 3 Char"/>
+    <w:basedOn w:val="Standaardalinea-lettertype"/>
+    <w:link w:val="Kop3"/>
     <w:uiPriority w:val="9"/>
     <w:rsid w:val="005B10CC"/>
     <w:rPr>
@@ -7474,10 +7867,10 @@
       <w:szCs w:val="28"/>
     </w:rPr>
   </w:style>
-  <w:style w:type="character" w:customStyle="1" w:styleId="Heading4Char">
-    <w:name w:val="Heading 4 Char"/>
-    <w:basedOn w:val="DefaultParagraphFont"/>
-    <w:link w:val="Heading4"/>
+  <w:style w:type="character" w:customStyle="1" w:styleId="Kop4Char">
+    <w:name w:val="Kop 4 Char"/>
+    <w:basedOn w:val="Standaardalinea-lettertype"/>
+    <w:link w:val="Kop4"/>
     <w:uiPriority w:val="9"/>
     <w:semiHidden/>
     <w:rsid w:val="005B10CC"/>
@@ -7488,10 +7881,10 @@
       <w:color w:val="0F4761" w:themeColor="accent1" w:themeShade="BF"/>
     </w:rPr>
   </w:style>
-  <w:style w:type="character" w:customStyle="1" w:styleId="Heading5Char">
-    <w:name w:val="Heading 5 Char"/>
-    <w:basedOn w:val="DefaultParagraphFont"/>
-    <w:link w:val="Heading5"/>
+  <w:style w:type="character" w:customStyle="1" w:styleId="Kop5Char">
+    <w:name w:val="Kop 5 Char"/>
+    <w:basedOn w:val="Standaardalinea-lettertype"/>
+    <w:link w:val="Kop5"/>
     <w:uiPriority w:val="9"/>
     <w:semiHidden/>
     <w:rsid w:val="005B10CC"/>
@@ -7500,10 +7893,10 @@
       <w:color w:val="0F4761" w:themeColor="accent1" w:themeShade="BF"/>
     </w:rPr>
   </w:style>
-  <w:style w:type="character" w:customStyle="1" w:styleId="Heading6Char">
-    <w:name w:val="Heading 6 Char"/>
-    <w:basedOn w:val="DefaultParagraphFont"/>
-    <w:link w:val="Heading6"/>
+  <w:style w:type="character" w:customStyle="1" w:styleId="Kop6Char">
+    <w:name w:val="Kop 6 Char"/>
+    <w:basedOn w:val="Standaardalinea-lettertype"/>
+    <w:link w:val="Kop6"/>
     <w:uiPriority w:val="9"/>
     <w:semiHidden/>
     <w:rsid w:val="005B10CC"/>
@@ -7514,10 +7907,10 @@
       <w:color w:val="595959" w:themeColor="text1" w:themeTint="A6"/>
     </w:rPr>
   </w:style>
-  <w:style w:type="character" w:customStyle="1" w:styleId="Heading7Char">
-    <w:name w:val="Heading 7 Char"/>
-    <w:basedOn w:val="DefaultParagraphFont"/>
-    <w:link w:val="Heading7"/>
+  <w:style w:type="character" w:customStyle="1" w:styleId="Kop7Char">
+    <w:name w:val="Kop 7 Char"/>
+    <w:basedOn w:val="Standaardalinea-lettertype"/>
+    <w:link w:val="Kop7"/>
     <w:uiPriority w:val="9"/>
     <w:semiHidden/>
     <w:rsid w:val="005B10CC"/>
@@ -7526,10 +7919,10 @@
       <w:color w:val="595959" w:themeColor="text1" w:themeTint="A6"/>
     </w:rPr>
   </w:style>
-  <w:style w:type="character" w:customStyle="1" w:styleId="Heading8Char">
-    <w:name w:val="Heading 8 Char"/>
-    <w:basedOn w:val="DefaultParagraphFont"/>
-    <w:link w:val="Heading8"/>
+  <w:style w:type="character" w:customStyle="1" w:styleId="Kop8Char">
+    <w:name w:val="Kop 8 Char"/>
+    <w:basedOn w:val="Standaardalinea-lettertype"/>
+    <w:link w:val="Kop8"/>
     <w:uiPriority w:val="9"/>
     <w:semiHidden/>
     <w:rsid w:val="005B10CC"/>
@@ -7540,10 +7933,10 @@
       <w:color w:val="272727" w:themeColor="text1" w:themeTint="D8"/>
     </w:rPr>
   </w:style>
-  <w:style w:type="character" w:customStyle="1" w:styleId="Heading9Char">
-    <w:name w:val="Heading 9 Char"/>
-    <w:basedOn w:val="DefaultParagraphFont"/>
-    <w:link w:val="Heading9"/>
+  <w:style w:type="character" w:customStyle="1" w:styleId="Kop9Char">
+    <w:name w:val="Kop 9 Char"/>
+    <w:basedOn w:val="Standaardalinea-lettertype"/>
+    <w:link w:val="Kop9"/>
     <w:uiPriority w:val="9"/>
     <w:semiHidden/>
     <w:rsid w:val="005B10CC"/>
@@ -7552,11 +7945,11 @@
       <w:color w:val="272727" w:themeColor="text1" w:themeTint="D8"/>
     </w:rPr>
   </w:style>
-  <w:style w:type="paragraph" w:styleId="Title">
+  <w:style w:type="paragraph" w:styleId="Titel">
     <w:name w:val="Title"/>
-    <w:basedOn w:val="Normal"/>
-    <w:next w:val="Normal"/>
-    <w:link w:val="TitleChar"/>
+    <w:basedOn w:val="Standaard"/>
+    <w:next w:val="Standaard"/>
+    <w:link w:val="TitelChar"/>
     <w:uiPriority w:val="10"/>
     <w:qFormat/>
     <w:rsid w:val="005B10CC"/>
@@ -7572,10 +7965,10 @@
       <w:szCs w:val="56"/>
     </w:rPr>
   </w:style>
-  <w:style w:type="character" w:customStyle="1" w:styleId="TitleChar">
-    <w:name w:val="Title Char"/>
-    <w:basedOn w:val="DefaultParagraphFont"/>
-    <w:link w:val="Title"/>
+  <w:style w:type="character" w:customStyle="1" w:styleId="TitelChar">
+    <w:name w:val="Titel Char"/>
+    <w:basedOn w:val="Standaardalinea-lettertype"/>
+    <w:link w:val="Titel"/>
     <w:uiPriority w:val="10"/>
     <w:rsid w:val="005B10CC"/>
     <w:rPr>
@@ -7586,11 +7979,11 @@
       <w:szCs w:val="56"/>
     </w:rPr>
   </w:style>
-  <w:style w:type="paragraph" w:styleId="Subtitle">
+  <w:style w:type="paragraph" w:styleId="Ondertitel">
     <w:name w:val="Subtitle"/>
-    <w:basedOn w:val="Normal"/>
-    <w:next w:val="Normal"/>
-    <w:link w:val="SubtitleChar"/>
+    <w:basedOn w:val="Standaard"/>
+    <w:next w:val="Standaard"/>
+    <w:link w:val="OndertitelChar"/>
     <w:uiPriority w:val="11"/>
     <w:qFormat/>
     <w:rsid w:val="005B10CC"/>
@@ -7607,10 +8000,10 @@
       <w:szCs w:val="28"/>
     </w:rPr>
   </w:style>
-  <w:style w:type="character" w:customStyle="1" w:styleId="SubtitleChar">
-    <w:name w:val="Subtitle Char"/>
-    <w:basedOn w:val="DefaultParagraphFont"/>
-    <w:link w:val="Subtitle"/>
+  <w:style w:type="character" w:customStyle="1" w:styleId="OndertitelChar">
+    <w:name w:val="Ondertitel Char"/>
+    <w:basedOn w:val="Standaardalinea-lettertype"/>
+    <w:link w:val="Ondertitel"/>
     <w:uiPriority w:val="11"/>
     <w:rsid w:val="005B10CC"/>
     <w:rPr>
@@ -7621,11 +8014,11 @@
       <w:szCs w:val="28"/>
     </w:rPr>
   </w:style>
-  <w:style w:type="paragraph" w:styleId="Quote">
+  <w:style w:type="paragraph" w:styleId="Citaat">
     <w:name w:val="Quote"/>
-    <w:basedOn w:val="Normal"/>
-    <w:next w:val="Normal"/>
-    <w:link w:val="QuoteChar"/>
+    <w:basedOn w:val="Standaard"/>
+    <w:next w:val="Standaard"/>
+    <w:link w:val="CitaatChar"/>
     <w:uiPriority w:val="29"/>
     <w:qFormat/>
     <w:rsid w:val="005B10CC"/>
@@ -7639,10 +8032,10 @@
       <w:color w:val="404040" w:themeColor="text1" w:themeTint="BF"/>
     </w:rPr>
   </w:style>
-  <w:style w:type="character" w:customStyle="1" w:styleId="QuoteChar">
-    <w:name w:val="Quote Char"/>
-    <w:basedOn w:val="DefaultParagraphFont"/>
-    <w:link w:val="Quote"/>
+  <w:style w:type="character" w:customStyle="1" w:styleId="CitaatChar">
+    <w:name w:val="Citaat Char"/>
+    <w:basedOn w:val="Standaardalinea-lettertype"/>
+    <w:link w:val="Citaat"/>
     <w:uiPriority w:val="29"/>
     <w:rsid w:val="005B10CC"/>
     <w:rPr>
@@ -7651,9 +8044,9 @@
       <w:color w:val="404040" w:themeColor="text1" w:themeTint="BF"/>
     </w:rPr>
   </w:style>
-  <w:style w:type="paragraph" w:styleId="ListParagraph">
+  <w:style w:type="paragraph" w:styleId="Lijstalinea">
     <w:name w:val="List Paragraph"/>
-    <w:basedOn w:val="Normal"/>
+    <w:basedOn w:val="Standaard"/>
     <w:uiPriority w:val="34"/>
     <w:qFormat/>
     <w:rsid w:val="005B10CC"/>
@@ -7662,9 +8055,9 @@
       <w:contextualSpacing/>
     </w:pPr>
   </w:style>
-  <w:style w:type="character" w:styleId="IntenseEmphasis">
+  <w:style w:type="character" w:styleId="Intensievebenadrukking">
     <w:name w:val="Intense Emphasis"/>
-    <w:basedOn w:val="DefaultParagraphFont"/>
+    <w:basedOn w:val="Standaardalinea-lettertype"/>
     <w:uiPriority w:val="21"/>
     <w:qFormat/>
     <w:rsid w:val="005B10CC"/>
@@ -7674,11 +8067,11 @@
       <w:color w:val="0F4761" w:themeColor="accent1" w:themeShade="BF"/>
     </w:rPr>
   </w:style>
-  <w:style w:type="paragraph" w:styleId="IntenseQuote">
+  <w:style w:type="paragraph" w:styleId="Duidelijkcitaat">
     <w:name w:val="Intense Quote"/>
-    <w:basedOn w:val="Normal"/>
-    <w:next w:val="Normal"/>
-    <w:link w:val="IntenseQuoteChar"/>
+    <w:basedOn w:val="Standaard"/>
+    <w:next w:val="Standaard"/>
+    <w:link w:val="DuidelijkcitaatChar"/>
     <w:uiPriority w:val="30"/>
     <w:qFormat/>
     <w:rsid w:val="005B10CC"/>
@@ -7697,10 +8090,10 @@
       <w:color w:val="0F4761" w:themeColor="accent1" w:themeShade="BF"/>
     </w:rPr>
   </w:style>
-  <w:style w:type="character" w:customStyle="1" w:styleId="IntenseQuoteChar">
-    <w:name w:val="Intense Quote Char"/>
-    <w:basedOn w:val="DefaultParagraphFont"/>
-    <w:link w:val="IntenseQuote"/>
+  <w:style w:type="character" w:customStyle="1" w:styleId="DuidelijkcitaatChar">
+    <w:name w:val="Duidelijk citaat Char"/>
+    <w:basedOn w:val="Standaardalinea-lettertype"/>
+    <w:link w:val="Duidelijkcitaat"/>
     <w:uiPriority w:val="30"/>
     <w:rsid w:val="005B10CC"/>
     <w:rPr>
@@ -7709,9 +8102,9 @@
       <w:color w:val="0F4761" w:themeColor="accent1" w:themeShade="BF"/>
     </w:rPr>
   </w:style>
-  <w:style w:type="character" w:styleId="IntenseReference">
+  <w:style w:type="character" w:styleId="Intensieveverwijzing">
     <w:name w:val="Intense Reference"/>
-    <w:basedOn w:val="DefaultParagraphFont"/>
+    <w:basedOn w:val="Standaardalinea-lettertype"/>
     <w:uiPriority w:val="32"/>
     <w:qFormat/>
     <w:rsid w:val="005B10CC"/>
@@ -7723,9 +8116,9 @@
       <w:spacing w:val="5"/>
     </w:rPr>
   </w:style>
-  <w:style w:type="table" w:styleId="TableGrid">
+  <w:style w:type="table" w:styleId="Tabelraster">
     <w:name w:val="Table Grid"/>
-    <w:basedOn w:val="TableNormal"/>
+    <w:basedOn w:val="Standaardtabel"/>
     <w:uiPriority w:val="39"/>
     <w:rsid w:val="0024613D"/>
     <w:pPr>

</xml_diff>

<commit_message>
More corrections in text
</commit_message>
<xml_diff>
--- a/TimeLapse_LaTeX/Thesis/working summary.docx
+++ b/TimeLapse_LaTeX/Thesis/working summary.docx
@@ -6027,12 +6027,14 @@
         <w:rPr>
           <w:sz w:val="20"/>
           <w:szCs w:val="20"/>
-        </w:rPr>
-      </w:pPr>
-      <w:r>
-        <w:rPr>
-          <w:sz w:val="20"/>
-          <w:szCs w:val="20"/>
+          <w:u w:val="single"/>
+        </w:rPr>
+      </w:pPr>
+      <w:r>
+        <w:rPr>
+          <w:sz w:val="20"/>
+          <w:szCs w:val="20"/>
+          <w:u w:val="single"/>
         </w:rPr>
         <w:t xml:space="preserve">Summarise in the results sections. Not every number at every step is necessary. </w:t>
       </w:r>
@@ -6040,6 +6042,7 @@
         <w:rPr>
           <w:sz w:val="20"/>
           <w:szCs w:val="20"/>
+          <w:u w:val="single"/>
         </w:rPr>
         <w:t>Not necessarily shorter but less listing of all cases in all details.</w:t>
       </w:r>
@@ -6047,6 +6050,7 @@
         <w:rPr>
           <w:sz w:val="20"/>
           <w:szCs w:val="20"/>
+          <w:u w:val="single"/>
         </w:rPr>
         <w:t xml:space="preserve"> Make it like figures 15/16 </w:t>
       </w:r>
@@ -6054,6 +6058,7 @@
         <w:rPr>
           <w:sz w:val="20"/>
           <w:szCs w:val="20"/>
+          <w:u w:val="single"/>
         </w:rPr>
         <w:t>on 1 page</w:t>
       </w:r>
@@ -6068,12 +6073,14 @@
         <w:rPr>
           <w:sz w:val="20"/>
           <w:szCs w:val="20"/>
-        </w:rPr>
-      </w:pPr>
-      <w:r>
-        <w:rPr>
-          <w:sz w:val="20"/>
-          <w:szCs w:val="20"/>
+          <w:u w:val="single"/>
+        </w:rPr>
+      </w:pPr>
+      <w:r>
+        <w:rPr>
+          <w:sz w:val="20"/>
+          <w:szCs w:val="20"/>
+          <w:u w:val="single"/>
         </w:rPr>
         <w:t>If a number in a table or figure does not change/effect the hypothesis/result it is not relevant for the discussion/conclusion</w:t>
       </w:r>
@@ -6081,8 +6088,151 @@
         <w:rPr>
           <w:sz w:val="20"/>
           <w:szCs w:val="20"/>
+          <w:u w:val="single"/>
         </w:rPr>
         <w:t xml:space="preserve"> and does not have to be discussed</w:t>
+      </w:r>
+    </w:p>
+    <w:p>
+      <w:pPr>
+        <w:pStyle w:val="ListParagraph"/>
+        <w:numPr>
+          <w:ilvl w:val="0"/>
+          <w:numId w:val="11"/>
+        </w:numPr>
+        <w:rPr>
+          <w:sz w:val="20"/>
+          <w:szCs w:val="20"/>
+        </w:rPr>
+      </w:pPr>
+      <w:r>
+        <w:rPr>
+          <w:sz w:val="20"/>
+          <w:szCs w:val="20"/>
+        </w:rPr>
+        <w:t>Change figures to tables</w:t>
+      </w:r>
+      <w:r>
+        <w:rPr>
+          <w:sz w:val="20"/>
+          <w:szCs w:val="20"/>
+        </w:rPr>
+        <w:t xml:space="preserve"> and correct figure numbering</w:t>
+      </w:r>
+    </w:p>
+    <w:p>
+      <w:pPr>
+        <w:pStyle w:val="ListParagraph"/>
+        <w:numPr>
+          <w:ilvl w:val="0"/>
+          <w:numId w:val="11"/>
+        </w:numPr>
+        <w:rPr>
+          <w:sz w:val="20"/>
+          <w:szCs w:val="20"/>
+        </w:rPr>
+      </w:pPr>
+      <w:r>
+        <w:rPr>
+          <w:sz w:val="20"/>
+          <w:szCs w:val="20"/>
+        </w:rPr>
+        <w:t>Maybe one more figure in chapter 5 to explain</w:t>
+      </w:r>
+    </w:p>
+    <w:p>
+      <w:pPr>
+        <w:pStyle w:val="ListParagraph"/>
+        <w:numPr>
+          <w:ilvl w:val="0"/>
+          <w:numId w:val="11"/>
+        </w:numPr>
+        <w:rPr>
+          <w:sz w:val="20"/>
+          <w:szCs w:val="20"/>
+        </w:rPr>
+      </w:pPr>
+      <w:r>
+        <w:rPr>
+          <w:sz w:val="20"/>
+          <w:szCs w:val="20"/>
+        </w:rPr>
+        <w:t xml:space="preserve">Summarise </w:t>
+      </w:r>
+      <w:r>
+        <w:rPr>
+          <w:sz w:val="20"/>
+          <w:szCs w:val="20"/>
+        </w:rPr>
+        <w:t>6.8 Results across Movement Types</w:t>
+      </w:r>
+    </w:p>
+    <w:p>
+      <w:pPr>
+        <w:pStyle w:val="ListParagraph"/>
+        <w:numPr>
+          <w:ilvl w:val="0"/>
+          <w:numId w:val="11"/>
+        </w:numPr>
+        <w:rPr>
+          <w:sz w:val="20"/>
+          <w:szCs w:val="20"/>
+        </w:rPr>
+      </w:pPr>
+      <w:r>
+        <w:rPr>
+          <w:sz w:val="20"/>
+          <w:szCs w:val="20"/>
+        </w:rPr>
+        <w:t>Do we still need the tables in chapter 5 and 6 or better figures</w:t>
+      </w:r>
+    </w:p>
+    <w:p>
+      <w:pPr>
+        <w:pStyle w:val="ListParagraph"/>
+        <w:numPr>
+          <w:ilvl w:val="0"/>
+          <w:numId w:val="11"/>
+        </w:numPr>
+        <w:rPr>
+          <w:sz w:val="20"/>
+          <w:szCs w:val="20"/>
+        </w:rPr>
+      </w:pPr>
+      <w:r>
+        <w:rPr>
+          <w:sz w:val="20"/>
+          <w:szCs w:val="20"/>
+        </w:rPr>
+        <w:t xml:space="preserve">In </w:t>
+      </w:r>
+      <w:r>
+        <w:rPr>
+          <w:sz w:val="20"/>
+          <w:szCs w:val="20"/>
+        </w:rPr>
+        <w:t>7.2 Processing and Migration</w:t>
+      </w:r>
+      <w:r>
+        <w:rPr>
+          <w:sz w:val="20"/>
+          <w:szCs w:val="20"/>
+        </w:rPr>
+        <w:t xml:space="preserve"> shorten “</w:t>
+      </w:r>
+      <w:r>
+        <w:rPr>
+          <w:sz w:val="20"/>
+          <w:szCs w:val="20"/>
+        </w:rPr>
+        <w:t>Post-imaging processing (all three techniques)</w:t>
+      </w:r>
+      <w:r>
+        <w:rPr>
+          <w:sz w:val="20"/>
+          <w:szCs w:val="20"/>
+        </w:rPr>
+        <w:t>”</w:t>
       </w:r>
     </w:p>
     <w:p>
@@ -6104,41 +6254,209 @@
       </w:pPr>
       <w:r>
         <w:rPr>
-          <w:sz w:val="20"/>
-          <w:szCs w:val="20"/>
-        </w:rPr>
-        <w:t xml:space="preserve">cross correlation of migrated amplitudes could work. But it indirectly considers the phase via the </w:t>
-      </w:r>
-      <w:r>
-        <w:rPr>
-          <w:sz w:val="20"/>
-          <w:szCs w:val="20"/>
-        </w:rPr>
-        <w:t xml:space="preserve">windowed cross correlation. </w:t>
-      </w:r>
-    </w:p>
-    <w:p>
-      <w:pPr>
-        <w:rPr>
-          <w:sz w:val="20"/>
-          <w:szCs w:val="20"/>
-        </w:rPr>
-      </w:pPr>
-    </w:p>
-    <w:p>
-      <w:pPr>
-        <w:rPr>
-          <w:sz w:val="20"/>
-          <w:szCs w:val="20"/>
-        </w:rPr>
-      </w:pPr>
-      <w:r>
-        <w:rPr>
           <w:b/>
           <w:bCs/>
           <w:sz w:val="20"/>
           <w:szCs w:val="20"/>
         </w:rPr>
+        <w:t>Figures:</w:t>
+      </w:r>
+    </w:p>
+    <w:p>
+      <w:pPr>
+        <w:pStyle w:val="ListParagraph"/>
+        <w:numPr>
+          <w:ilvl w:val="0"/>
+          <w:numId w:val="13"/>
+        </w:numPr>
+        <w:rPr>
+          <w:sz w:val="20"/>
+          <w:szCs w:val="20"/>
+        </w:rPr>
+      </w:pPr>
+      <w:r>
+        <w:rPr>
+          <w:sz w:val="20"/>
+          <w:szCs w:val="20"/>
+        </w:rPr>
+        <w:t>Figure 1, correct title</w:t>
+      </w:r>
+    </w:p>
+    <w:p>
+      <w:pPr>
+        <w:pStyle w:val="ListParagraph"/>
+        <w:numPr>
+          <w:ilvl w:val="0"/>
+          <w:numId w:val="13"/>
+        </w:numPr>
+        <w:rPr>
+          <w:sz w:val="20"/>
+          <w:szCs w:val="20"/>
+        </w:rPr>
+      </w:pPr>
+      <w:r>
+        <w:rPr>
+          <w:sz w:val="20"/>
+          <w:szCs w:val="20"/>
+        </w:rPr>
+        <w:t>Figure 3, correct processing panels</w:t>
+      </w:r>
+    </w:p>
+    <w:p>
+      <w:pPr>
+        <w:pStyle w:val="ListParagraph"/>
+        <w:numPr>
+          <w:ilvl w:val="0"/>
+          <w:numId w:val="13"/>
+        </w:numPr>
+        <w:rPr>
+          <w:sz w:val="20"/>
+          <w:szCs w:val="20"/>
+        </w:rPr>
+      </w:pPr>
+      <w:r>
+        <w:rPr>
+          <w:sz w:val="20"/>
+          <w:szCs w:val="20"/>
+        </w:rPr>
+        <w:t>Figure 4, increase font size in both panels</w:t>
+      </w:r>
+    </w:p>
+    <w:p>
+      <w:pPr>
+        <w:pStyle w:val="ListParagraph"/>
+        <w:numPr>
+          <w:ilvl w:val="0"/>
+          <w:numId w:val="13"/>
+        </w:numPr>
+        <w:rPr>
+          <w:sz w:val="20"/>
+          <w:szCs w:val="20"/>
+        </w:rPr>
+      </w:pPr>
+      <w:r>
+        <w:rPr>
+          <w:sz w:val="20"/>
+          <w:szCs w:val="20"/>
+        </w:rPr>
+        <w:t xml:space="preserve">Table 1, put title and explain </w:t>
+      </w:r>
+      <w:r>
+        <w:rPr>
+          <w:sz w:val="20"/>
+          <w:szCs w:val="20"/>
+        </w:rPr>
+        <w:t>FTDT grid limit</w:t>
+      </w:r>
+    </w:p>
+    <w:p>
+      <w:pPr>
+        <w:pStyle w:val="ListParagraph"/>
+        <w:numPr>
+          <w:ilvl w:val="0"/>
+          <w:numId w:val="13"/>
+        </w:numPr>
+        <w:rPr>
+          <w:sz w:val="20"/>
+          <w:szCs w:val="20"/>
+        </w:rPr>
+      </w:pPr>
+      <w:r>
+        <w:rPr>
+          <w:sz w:val="20"/>
+          <w:szCs w:val="20"/>
+        </w:rPr>
+        <w:t>Figure 9, change title</w:t>
+      </w:r>
+      <w:r>
+        <w:rPr>
+          <w:sz w:val="20"/>
+          <w:szCs w:val="20"/>
+        </w:rPr>
+        <w:t xml:space="preserve"> </w:t>
+      </w:r>
+      <w:r>
+        <w:rPr>
+          <w:sz w:val="20"/>
+          <w:szCs w:val="20"/>
+        </w:rPr>
+        <w:t>(H3)</w:t>
+      </w:r>
+    </w:p>
+    <w:p>
+      <w:pPr>
+        <w:pStyle w:val="ListParagraph"/>
+        <w:numPr>
+          <w:ilvl w:val="0"/>
+          <w:numId w:val="13"/>
+        </w:numPr>
+        <w:rPr>
+          <w:sz w:val="20"/>
+          <w:szCs w:val="20"/>
+        </w:rPr>
+      </w:pPr>
+      <w:r>
+        <w:rPr>
+          <w:sz w:val="20"/>
+          <w:szCs w:val="20"/>
+        </w:rPr>
+        <w:t>Figure 12, compact (H3)</w:t>
+      </w:r>
+    </w:p>
+    <w:p>
+      <w:pPr>
+        <w:pStyle w:val="ListParagraph"/>
+        <w:numPr>
+          <w:ilvl w:val="0"/>
+          <w:numId w:val="13"/>
+        </w:numPr>
+        <w:rPr>
+          <w:sz w:val="20"/>
+          <w:szCs w:val="20"/>
+        </w:rPr>
+      </w:pPr>
+      <w:r>
+        <w:rPr>
+          <w:sz w:val="20"/>
+          <w:szCs w:val="20"/>
+        </w:rPr>
+        <w:t>Figure 13, pick better example and better paragraph</w:t>
+      </w:r>
+    </w:p>
+    <w:p>
+      <w:pPr>
+        <w:pStyle w:val="ListParagraph"/>
+        <w:numPr>
+          <w:ilvl w:val="0"/>
+          <w:numId w:val="13"/>
+        </w:numPr>
+        <w:rPr>
+          <w:sz w:val="20"/>
+          <w:szCs w:val="20"/>
+        </w:rPr>
+      </w:pPr>
+      <w:r>
+        <w:rPr>
+          <w:sz w:val="20"/>
+          <w:szCs w:val="20"/>
+        </w:rPr>
+        <w:t>Figure 19, change title</w:t>
+      </w:r>
+    </w:p>
+    <w:p>
+      <w:pPr>
+        <w:rPr>
+          <w:sz w:val="20"/>
+          <w:szCs w:val="20"/>
+        </w:rPr>
+      </w:pPr>
+      <w:r>
+        <w:rPr>
+          <w:b/>
+          <w:bCs/>
+          <w:sz w:val="20"/>
+          <w:szCs w:val="20"/>
+        </w:rPr>
         <w:t>Papa Feedback</w:t>
       </w:r>
     </w:p>
@@ -6165,371 +6483,6 @@
           <w:szCs w:val="20"/>
         </w:rPr>
       </w:pPr>
-    </w:p>
-    <w:p>
-      <w:pPr>
-        <w:rPr>
-          <w:sz w:val="20"/>
-          <w:szCs w:val="20"/>
-        </w:rPr>
-      </w:pPr>
-    </w:p>
-    <w:p>
-      <w:pPr>
-        <w:rPr>
-          <w:sz w:val="20"/>
-          <w:szCs w:val="20"/>
-        </w:rPr>
-      </w:pPr>
-    </w:p>
-    <w:p>
-      <w:pPr>
-        <w:rPr>
-          <w:sz w:val="20"/>
-          <w:szCs w:val="20"/>
-        </w:rPr>
-      </w:pPr>
-    </w:p>
-    <w:p>
-      <w:pPr>
-        <w:rPr>
-          <w:sz w:val="20"/>
-          <w:szCs w:val="20"/>
-        </w:rPr>
-      </w:pPr>
-    </w:p>
-    <w:p>
-      <w:pPr>
-        <w:rPr>
-          <w:sz w:val="20"/>
-          <w:szCs w:val="20"/>
-        </w:rPr>
-      </w:pPr>
-    </w:p>
-    <w:p>
-      <w:pPr>
-        <w:rPr>
-          <w:sz w:val="20"/>
-          <w:szCs w:val="20"/>
-        </w:rPr>
-      </w:pPr>
-      <w:r>
-        <w:rPr>
-          <w:sz w:val="20"/>
-          <w:szCs w:val="20"/>
-        </w:rPr>
-        <w:lastRenderedPageBreak/>
-        <w:t xml:space="preserve">"Geng and Ye’s RTM additionally forward-models the source-side wavefield with </w:t>
-      </w:r>
-      <w:proofErr w:type="spellStart"/>
-      <w:r>
-        <w:rPr>
-          <w:sz w:val="20"/>
-          <w:szCs w:val="20"/>
-        </w:rPr>
-        <w:t>gprMax</w:t>
-      </w:r>
-      <w:proofErr w:type="spellEnd"/>
-      <w:r>
-        <w:rPr>
-          <w:sz w:val="20"/>
-          <w:szCs w:val="20"/>
-        </w:rPr>
-        <w:t xml:space="preserve"> and cross-correlates it against the reverse-time-extrapolated receiver-side wavefield at every time step to build the image (Geng and Ye, 2022), a genuinely two-wavefield imaging condition. While this full cross-correlation approach offers distinct advantages in noise suppression and phase accuracy—particularly when a high-quality wavelet is used for the forward extrapolation—the added computational expense is not strictly required here. Because every survey in this thesis is zero-offset and already treated under the exploding-reflector convention of Section 3.1 (</w:t>
-      </w:r>
-      <w:proofErr w:type="spellStart"/>
-      <w:r>
-        <w:rPr>
-          <w:sz w:val="20"/>
-          <w:szCs w:val="20"/>
-        </w:rPr>
-        <w:t>Claerbout</w:t>
-      </w:r>
-      <w:proofErr w:type="spellEnd"/>
-      <w:r>
-        <w:rPr>
-          <w:sz w:val="20"/>
-          <w:szCs w:val="20"/>
-        </w:rPr>
-        <w:t xml:space="preserve">, 1985), the recorded data effectively stand in for the source-side wavefield. Consequently, reading off a single back-propagated wavefield at </w:t>
-      </w:r>
-      <m:oMath>
-        <m:sSub>
-          <m:sSubPr>
-            <m:ctrlPr>
-              <w:rPr>
-                <w:rFonts w:ascii="Cambria Math" w:hAnsi="Cambria Math"/>
-                <w:sz w:val="20"/>
-                <w:szCs w:val="20"/>
-              </w:rPr>
-            </m:ctrlPr>
-          </m:sSubPr>
-          <m:e>
-            <m:r>
-              <w:rPr>
-                <w:rFonts w:ascii="Cambria Math" w:hAnsi="Cambria Math"/>
-                <w:sz w:val="20"/>
-                <w:szCs w:val="20"/>
-              </w:rPr>
-              <m:t>t</m:t>
-            </m:r>
-          </m:e>
-          <m:sub>
-            <m:r>
-              <m:rPr>
-                <m:nor/>
-              </m:rPr>
-              <w:rPr>
-                <w:sz w:val="20"/>
-                <w:szCs w:val="20"/>
-              </w:rPr>
-              <m:t>focus</m:t>
-            </m:r>
-          </m:sub>
-        </m:sSub>
-      </m:oMath>
-      <w:r>
-        <w:rPr>
-          <w:sz w:val="20"/>
-          <w:szCs w:val="20"/>
-        </w:rPr>
-        <w:t xml:space="preserve"> provides sufficient structural fidelity for this analysis; this thesis therefore implements back-propagation rather than full cross-correlation RTM. Because it makes no high-frequency, single-arrival, or </w:t>
-      </w:r>
-      <m:oMath>
-        <m:r>
-          <w:rPr>
-            <w:rFonts w:ascii="Cambria Math" w:hAnsi="Cambria Math"/>
-            <w:sz w:val="20"/>
-            <w:szCs w:val="20"/>
-          </w:rPr>
-          <m:t>v</m:t>
-        </m:r>
-        <m:d>
-          <m:dPr>
-            <m:ctrlPr>
-              <w:rPr>
-                <w:rFonts w:ascii="Cambria Math" w:hAnsi="Cambria Math"/>
-                <w:sz w:val="20"/>
-                <w:szCs w:val="20"/>
-              </w:rPr>
-            </m:ctrlPr>
-          </m:dPr>
-          <m:e>
-            <m:r>
-              <w:rPr>
-                <w:rFonts w:ascii="Cambria Math" w:hAnsi="Cambria Math"/>
-                <w:sz w:val="20"/>
-                <w:szCs w:val="20"/>
-              </w:rPr>
-              <m:t>z</m:t>
-            </m:r>
-          </m:e>
-        </m:d>
-      </m:oMath>
-      <w:r>
-        <w:rPr>
-          <w:sz w:val="20"/>
-          <w:szCs w:val="20"/>
-        </w:rPr>
-        <w:t>-only approximation beyond the exploding-reflector velocity halving itself, this method serves as a useful independent numerical check on the other two."</w:t>
-      </w:r>
-    </w:p>
-    <w:p>
-      <w:pPr>
-        <w:rPr>
-          <w:sz w:val="20"/>
-          <w:szCs w:val="20"/>
-        </w:rPr>
-      </w:pPr>
-      <w:r>
-        <w:rPr>
-          <w:sz w:val="20"/>
-          <w:szCs w:val="20"/>
-        </w:rPr>
-        <w:t xml:space="preserve">Geng and Ye’s RTM additionally forward-models the source-side wavefield with </w:t>
-      </w:r>
-      <w:proofErr w:type="spellStart"/>
-      <w:r>
-        <w:rPr>
-          <w:sz w:val="20"/>
-          <w:szCs w:val="20"/>
-        </w:rPr>
-        <w:t>gprMax</w:t>
-      </w:r>
-      <w:proofErr w:type="spellEnd"/>
-      <w:r>
-        <w:rPr>
-          <w:sz w:val="20"/>
-          <w:szCs w:val="20"/>
-        </w:rPr>
-        <w:t xml:space="preserve"> and cross</w:t>
-      </w:r>
-    </w:p>
-    <w:p>
-      <w:pPr>
-        <w:rPr>
-          <w:sz w:val="20"/>
-          <w:szCs w:val="20"/>
-        </w:rPr>
-      </w:pPr>
-      <w:r>
-        <w:rPr>
-          <w:sz w:val="20"/>
-          <w:szCs w:val="20"/>
-        </w:rPr>
-        <w:t>correlates it against the reverse-time-extrapolated receiver-side wavefield at every time step to build</w:t>
-      </w:r>
-    </w:p>
-    <w:p>
-      <w:pPr>
-        <w:rPr>
-          <w:sz w:val="20"/>
-          <w:szCs w:val="20"/>
-        </w:rPr>
-      </w:pPr>
-      <w:r>
-        <w:rPr>
-          <w:sz w:val="20"/>
-          <w:szCs w:val="20"/>
-        </w:rPr>
-        <w:t>the image (Geng and Ye 2022), a genuinely two-wavefield imaging condition. That is unnecessary</w:t>
-      </w:r>
-    </w:p>
-    <w:p>
-      <w:pPr>
-        <w:rPr>
-          <w:sz w:val="20"/>
-          <w:szCs w:val="20"/>
-        </w:rPr>
-      </w:pPr>
-      <w:r>
-        <w:rPr>
-          <w:sz w:val="20"/>
-          <w:szCs w:val="20"/>
-        </w:rPr>
-        <w:t>here: because every survey in this thesis is zero-offset and already treated under the exploding</w:t>
-      </w:r>
-    </w:p>
-    <w:p>
-      <w:pPr>
-        <w:rPr>
-          <w:sz w:val="20"/>
-          <w:szCs w:val="20"/>
-        </w:rPr>
-      </w:pPr>
-      <w:r>
-        <w:rPr>
-          <w:sz w:val="20"/>
-          <w:szCs w:val="20"/>
-        </w:rPr>
-        <w:t>reflector convention of Section 3.1 (</w:t>
-      </w:r>
-      <w:proofErr w:type="spellStart"/>
-      <w:r>
-        <w:rPr>
-          <w:sz w:val="20"/>
-          <w:szCs w:val="20"/>
-        </w:rPr>
-        <w:t>Claerbout</w:t>
-      </w:r>
-      <w:proofErr w:type="spellEnd"/>
-      <w:r>
-        <w:rPr>
-          <w:sz w:val="20"/>
-          <w:szCs w:val="20"/>
-        </w:rPr>
-        <w:t xml:space="preserve"> 1985), the recorded data already stand in for the</w:t>
-      </w:r>
-    </w:p>
-    <w:p>
-      <w:pPr>
-        <w:rPr>
-          <w:sz w:val="20"/>
-          <w:szCs w:val="20"/>
-        </w:rPr>
-      </w:pPr>
-      <w:r>
-        <w:rPr>
-          <w:sz w:val="20"/>
-          <w:szCs w:val="20"/>
-        </w:rPr>
-        <w:t xml:space="preserve">source-side wavefield, so the single back-propagated wavefield read off at </w:t>
-      </w:r>
-      <w:r>
-        <w:rPr>
-          <w:rFonts w:ascii="Cambria Math" w:hAnsi="Cambria Math" w:cs="Cambria Math"/>
-          <w:sz w:val="20"/>
-          <w:szCs w:val="20"/>
-        </w:rPr>
-        <w:t>𝑡</w:t>
-      </w:r>
-      <w:r>
-        <w:rPr>
-          <w:sz w:val="20"/>
-          <w:szCs w:val="20"/>
-        </w:rPr>
-        <w:t>focus is sufficient — this thesis therefore implements back-propagation, not full cross-correlation RTM. Because it makes no</w:t>
-      </w:r>
-    </w:p>
-    <w:p>
-      <w:pPr>
-        <w:rPr>
-          <w:sz w:val="20"/>
-          <w:szCs w:val="20"/>
-        </w:rPr>
-      </w:pPr>
-      <w:r>
-        <w:rPr>
-          <w:sz w:val="20"/>
-          <w:szCs w:val="20"/>
-        </w:rPr>
-        <w:t xml:space="preserve">high-frequency, single-arrival, or </w:t>
-      </w:r>
-      <w:r>
-        <w:rPr>
-          <w:rFonts w:ascii="Cambria Math" w:hAnsi="Cambria Math" w:cs="Cambria Math"/>
-          <w:sz w:val="20"/>
-          <w:szCs w:val="20"/>
-        </w:rPr>
-        <w:t>𝑣</w:t>
-      </w:r>
-      <w:r>
-        <w:rPr>
-          <w:sz w:val="20"/>
-          <w:szCs w:val="20"/>
-        </w:rPr>
-        <w:t>(</w:t>
-      </w:r>
-      <w:r>
-        <w:rPr>
-          <w:rFonts w:ascii="Cambria Math" w:hAnsi="Cambria Math" w:cs="Cambria Math"/>
-          <w:sz w:val="20"/>
-          <w:szCs w:val="20"/>
-        </w:rPr>
-        <w:t>𝑧</w:t>
-      </w:r>
-      <w:r>
-        <w:rPr>
-          <w:sz w:val="20"/>
-          <w:szCs w:val="20"/>
-        </w:rPr>
-        <w:t>)-only approximation beyond the exploding-reflector velocity</w:t>
-      </w:r>
-    </w:p>
-    <w:p>
-      <w:pPr>
-        <w:rPr>
-          <w:sz w:val="20"/>
-          <w:szCs w:val="20"/>
-        </w:rPr>
-      </w:pPr>
-      <w:r>
-        <w:rPr>
-          <w:sz w:val="20"/>
-          <w:szCs w:val="20"/>
-        </w:rPr>
-        <w:t>halving itself, this method serves as a useful independent numerical check on the other two.</w:t>
-      </w:r>
     </w:p>
     <w:p>
       <w:pPr>
@@ -6641,6 +6594,95 @@
     </w:lvl>
   </w:abstractNum>
   <w:abstractNum w:abstractNumId="1" w15:restartNumberingAfterBreak="0">
+    <w:nsid w:val="05320E90"/>
+    <w:multiLevelType w:val="hybridMultilevel"/>
+    <w:tmpl w:val="C44895E0"/>
+    <w:lvl w:ilvl="0" w:tplc="0809000F">
+      <w:start w:val="1"/>
+      <w:numFmt w:val="decimal"/>
+      <w:lvlText w:val="%1."/>
+      <w:lvlJc w:val="left"/>
+      <w:pPr>
+        <w:ind w:left="720" w:hanging="360"/>
+      </w:pPr>
+      <w:rPr>
+        <w:rFonts w:hint="default"/>
+      </w:rPr>
+    </w:lvl>
+    <w:lvl w:ilvl="1" w:tplc="08090019" w:tentative="1">
+      <w:start w:val="1"/>
+      <w:numFmt w:val="lowerLetter"/>
+      <w:lvlText w:val="%2."/>
+      <w:lvlJc w:val="left"/>
+      <w:pPr>
+        <w:ind w:left="1440" w:hanging="360"/>
+      </w:pPr>
+    </w:lvl>
+    <w:lvl w:ilvl="2" w:tplc="0809001B" w:tentative="1">
+      <w:start w:val="1"/>
+      <w:numFmt w:val="lowerRoman"/>
+      <w:lvlText w:val="%3."/>
+      <w:lvlJc w:val="right"/>
+      <w:pPr>
+        <w:ind w:left="2160" w:hanging="180"/>
+      </w:pPr>
+    </w:lvl>
+    <w:lvl w:ilvl="3" w:tplc="0809000F" w:tentative="1">
+      <w:start w:val="1"/>
+      <w:numFmt w:val="decimal"/>
+      <w:lvlText w:val="%4."/>
+      <w:lvlJc w:val="left"/>
+      <w:pPr>
+        <w:ind w:left="2880" w:hanging="360"/>
+      </w:pPr>
+    </w:lvl>
+    <w:lvl w:ilvl="4" w:tplc="08090019" w:tentative="1">
+      <w:start w:val="1"/>
+      <w:numFmt w:val="lowerLetter"/>
+      <w:lvlText w:val="%5."/>
+      <w:lvlJc w:val="left"/>
+      <w:pPr>
+        <w:ind w:left="3600" w:hanging="360"/>
+      </w:pPr>
+    </w:lvl>
+    <w:lvl w:ilvl="5" w:tplc="0809001B" w:tentative="1">
+      <w:start w:val="1"/>
+      <w:numFmt w:val="lowerRoman"/>
+      <w:lvlText w:val="%6."/>
+      <w:lvlJc w:val="right"/>
+      <w:pPr>
+        <w:ind w:left="4320" w:hanging="180"/>
+      </w:pPr>
+    </w:lvl>
+    <w:lvl w:ilvl="6" w:tplc="0809000F" w:tentative="1">
+      <w:start w:val="1"/>
+      <w:numFmt w:val="decimal"/>
+      <w:lvlText w:val="%7."/>
+      <w:lvlJc w:val="left"/>
+      <w:pPr>
+        <w:ind w:left="5040" w:hanging="360"/>
+      </w:pPr>
+    </w:lvl>
+    <w:lvl w:ilvl="7" w:tplc="08090019" w:tentative="1">
+      <w:start w:val="1"/>
+      <w:numFmt w:val="lowerLetter"/>
+      <w:lvlText w:val="%8."/>
+      <w:lvlJc w:val="left"/>
+      <w:pPr>
+        <w:ind w:left="5760" w:hanging="360"/>
+      </w:pPr>
+    </w:lvl>
+    <w:lvl w:ilvl="8" w:tplc="0809001B" w:tentative="1">
+      <w:start w:val="1"/>
+      <w:numFmt w:val="lowerRoman"/>
+      <w:lvlText w:val="%9."/>
+      <w:lvlJc w:val="right"/>
+      <w:pPr>
+        <w:ind w:left="6480" w:hanging="180"/>
+      </w:pPr>
+    </w:lvl>
+  </w:abstractNum>
+  <w:abstractNum w:abstractNumId="2" w15:restartNumberingAfterBreak="0">
     <w:nsid w:val="0D180F46"/>
     <w:multiLevelType w:val="hybridMultilevel"/>
     <w:tmpl w:val="3EB4D1DE"/>
@@ -6729,7 +6771,7 @@
       </w:pPr>
     </w:lvl>
   </w:abstractNum>
-  <w:abstractNum w:abstractNumId="2" w15:restartNumberingAfterBreak="0">
+  <w:abstractNum w:abstractNumId="3" w15:restartNumberingAfterBreak="0">
     <w:nsid w:val="19CB4574"/>
     <w:multiLevelType w:val="hybridMultilevel"/>
     <w:tmpl w:val="5DE0F5EA"/>
@@ -6818,7 +6860,7 @@
       </w:pPr>
     </w:lvl>
   </w:abstractNum>
-  <w:abstractNum w:abstractNumId="3" w15:restartNumberingAfterBreak="0">
+  <w:abstractNum w:abstractNumId="4" w15:restartNumberingAfterBreak="0">
     <w:nsid w:val="266C2D1B"/>
     <w:multiLevelType w:val="hybridMultilevel"/>
     <w:tmpl w:val="98BE2DFA"/>
@@ -6907,7 +6949,7 @@
       </w:pPr>
     </w:lvl>
   </w:abstractNum>
-  <w:abstractNum w:abstractNumId="4" w15:restartNumberingAfterBreak="0">
+  <w:abstractNum w:abstractNumId="5" w15:restartNumberingAfterBreak="0">
     <w:nsid w:val="3623261C"/>
     <w:multiLevelType w:val="hybridMultilevel"/>
     <w:tmpl w:val="3A4E3940"/>
@@ -6996,7 +7038,7 @@
       </w:pPr>
     </w:lvl>
   </w:abstractNum>
-  <w:abstractNum w:abstractNumId="5" w15:restartNumberingAfterBreak="0">
+  <w:abstractNum w:abstractNumId="6" w15:restartNumberingAfterBreak="0">
     <w:nsid w:val="3894545A"/>
     <w:multiLevelType w:val="hybridMultilevel"/>
     <w:tmpl w:val="7D5A5020"/>
@@ -7108,7 +7150,7 @@
       </w:rPr>
     </w:lvl>
   </w:abstractNum>
-  <w:abstractNum w:abstractNumId="6" w15:restartNumberingAfterBreak="0">
+  <w:abstractNum w:abstractNumId="7" w15:restartNumberingAfterBreak="0">
     <w:nsid w:val="4E81638E"/>
     <w:multiLevelType w:val="hybridMultilevel"/>
     <w:tmpl w:val="14148838"/>
@@ -7221,7 +7263,7 @@
       </w:rPr>
     </w:lvl>
   </w:abstractNum>
-  <w:abstractNum w:abstractNumId="7" w15:restartNumberingAfterBreak="0">
+  <w:abstractNum w:abstractNumId="8" w15:restartNumberingAfterBreak="0">
     <w:nsid w:val="59B11C82"/>
     <w:multiLevelType w:val="hybridMultilevel"/>
     <w:tmpl w:val="4D3C7386"/>
@@ -7310,7 +7352,7 @@
       </w:pPr>
     </w:lvl>
   </w:abstractNum>
-  <w:abstractNum w:abstractNumId="8" w15:restartNumberingAfterBreak="0">
+  <w:abstractNum w:abstractNumId="9" w15:restartNumberingAfterBreak="0">
     <w:nsid w:val="6BB55E74"/>
     <w:multiLevelType w:val="hybridMultilevel"/>
     <w:tmpl w:val="F7F041B8"/>
@@ -7399,7 +7441,7 @@
       </w:pPr>
     </w:lvl>
   </w:abstractNum>
-  <w:abstractNum w:abstractNumId="9" w15:restartNumberingAfterBreak="0">
+  <w:abstractNum w:abstractNumId="10" w15:restartNumberingAfterBreak="0">
     <w:nsid w:val="6D674AE1"/>
     <w:multiLevelType w:val="multilevel"/>
     <w:tmpl w:val="A80438C2"/>
@@ -7512,7 +7554,7 @@
       </w:rPr>
     </w:lvl>
   </w:abstractNum>
-  <w:abstractNum w:abstractNumId="10" w15:restartNumberingAfterBreak="0">
+  <w:abstractNum w:abstractNumId="11" w15:restartNumberingAfterBreak="0">
     <w:nsid w:val="74BC1098"/>
     <w:multiLevelType w:val="hybridMultilevel"/>
     <w:tmpl w:val="2E32C37A"/>
@@ -7601,7 +7643,7 @@
       </w:pPr>
     </w:lvl>
   </w:abstractNum>
-  <w:abstractNum w:abstractNumId="11" w15:restartNumberingAfterBreak="0">
+  <w:abstractNum w:abstractNumId="12" w15:restartNumberingAfterBreak="0">
     <w:nsid w:val="772C15E0"/>
     <w:multiLevelType w:val="hybridMultilevel"/>
     <w:tmpl w:val="353CBA26"/>
@@ -7691,40 +7733,43 @@
     </w:lvl>
   </w:abstractNum>
   <w:num w:numId="1" w16cid:durableId="1339388064">
-    <w:abstractNumId w:val="6"/>
+    <w:abstractNumId w:val="7"/>
   </w:num>
   <w:num w:numId="2" w16cid:durableId="1361861515">
     <w:abstractNumId w:val="0"/>
   </w:num>
   <w:num w:numId="3" w16cid:durableId="18505631">
-    <w:abstractNumId w:val="7"/>
+    <w:abstractNumId w:val="8"/>
   </w:num>
   <w:num w:numId="4" w16cid:durableId="227349705">
+    <w:abstractNumId w:val="6"/>
+  </w:num>
+  <w:num w:numId="5" w16cid:durableId="295137552">
     <w:abstractNumId w:val="5"/>
   </w:num>
-  <w:num w:numId="5" w16cid:durableId="295137552">
+  <w:num w:numId="6" w16cid:durableId="1924609991">
+    <w:abstractNumId w:val="12"/>
+  </w:num>
+  <w:num w:numId="7" w16cid:durableId="1603563524">
+    <w:abstractNumId w:val="11"/>
+  </w:num>
+  <w:num w:numId="8" w16cid:durableId="1739786868">
+    <w:abstractNumId w:val="2"/>
+  </w:num>
+  <w:num w:numId="9" w16cid:durableId="539099689">
     <w:abstractNumId w:val="4"/>
   </w:num>
-  <w:num w:numId="6" w16cid:durableId="1924609991">
-    <w:abstractNumId w:val="11"/>
-  </w:num>
-  <w:num w:numId="7" w16cid:durableId="1603563524">
+  <w:num w:numId="10" w16cid:durableId="1843547769">
     <w:abstractNumId w:val="10"/>
   </w:num>
-  <w:num w:numId="8" w16cid:durableId="1739786868">
-    <w:abstractNumId w:val="1"/>
+  <w:num w:numId="11" w16cid:durableId="788857738">
+    <w:abstractNumId w:val="9"/>
   </w:num>
-  <w:num w:numId="9" w16cid:durableId="539099689">
+  <w:num w:numId="12" w16cid:durableId="655719573">
     <w:abstractNumId w:val="3"/>
   </w:num>
-  <w:num w:numId="10" w16cid:durableId="1843547769">
-    <w:abstractNumId w:val="9"/>
-  </w:num>
-  <w:num w:numId="11" w16cid:durableId="788857738">
-    <w:abstractNumId w:val="8"/>
-  </w:num>
-  <w:num w:numId="12" w16cid:durableId="655719573">
-    <w:abstractNumId w:val="2"/>
+  <w:num w:numId="13" w16cid:durableId="1566186543">
+    <w:abstractNumId w:val="1"/>
   </w:num>
 </w:numbering>
 </file>

</xml_diff>

<commit_message>
More updates and shortened chapters 5 and 6 by using figures rather than tables
</commit_message>
<xml_diff>
--- a/TimeLapse_LaTeX/Thesis/working summary.docx
+++ b/TimeLapse_LaTeX/Thesis/working summary.docx
@@ -143,14 +143,7 @@
     <w:p>
       <w:r>
         <w:tab/>
-      </w:r>
-      <w:proofErr w:type="gramStart"/>
-      <w:r>
-        <w:t>All of</w:t>
-      </w:r>
-      <w:proofErr w:type="gramEnd"/>
-      <w:r>
-        <w:t xml:space="preserve"> the materials and methods common to two or more experiments—specifically excluding the experimental procedure for each experiment.</w:t>
+        <w:t>All of the materials and methods common to two or more experiments—specifically excluding the experimental procedure for each experiment.</w:t>
       </w:r>
     </w:p>
     <w:p>
@@ -174,13 +167,8 @@
         </w:numPr>
       </w:pPr>
       <w:r>
-        <w:t xml:space="preserve">Discuss </w:t>
-      </w:r>
-      <w:proofErr w:type="spellStart"/>
-      <w:r>
-        <w:t>gprMax</w:t>
-      </w:r>
-      <w:proofErr w:type="spellEnd"/>
+        <w:t>Discuss gprMax</w:t>
+      </w:r>
     </w:p>
     <w:p>
       <w:pPr>
@@ -400,39 +388,7 @@
         <w:shd w:val="clear" w:color="auto" w:fill="E8E8E8" w:themeFill="background2"/>
       </w:pPr>
       <w:r>
-        <w:t xml:space="preserve">Tracking </w:t>
-      </w:r>
-      <w:proofErr w:type="spellStart"/>
-      <w:r>
-        <w:t>del_phi</w:t>
-      </w:r>
-      <w:proofErr w:type="spellEnd"/>
-      <w:r>
-        <w:t>/</w:t>
-      </w:r>
-      <w:proofErr w:type="spellStart"/>
-      <w:r>
-        <w:t>del_x</w:t>
-      </w:r>
-      <w:proofErr w:type="spellEnd"/>
-      <w:r>
-        <w:t xml:space="preserve"> and </w:t>
-      </w:r>
-      <w:proofErr w:type="spellStart"/>
-      <w:r>
-        <w:t>del_phi</w:t>
-      </w:r>
-      <w:proofErr w:type="spellEnd"/>
-      <w:r>
-        <w:t>/</w:t>
-      </w:r>
-      <w:proofErr w:type="spellStart"/>
-      <w:r>
-        <w:t>del_y</w:t>
-      </w:r>
-      <w:proofErr w:type="spellEnd"/>
-      <w:r>
-        <w:t xml:space="preserve"> to infer horizontal and vertical translation</w:t>
+        <w:t>Tracking del_phi/del_x and del_phi/del_y to infer horizontal and vertical translation</w:t>
       </w:r>
     </w:p>
     <w:p>
@@ -604,15 +560,7 @@
         <w:t xml:space="preserve">(so material change rather than scatterer translation) </w:t>
       </w:r>
       <w:r>
-        <w:t xml:space="preserve">a subwavelength amount and use an amplitude and </w:t>
-      </w:r>
-      <w:proofErr w:type="gramStart"/>
-      <w:r>
-        <w:t>phase based</w:t>
-      </w:r>
-      <w:proofErr w:type="gramEnd"/>
-      <w:r>
-        <w:t xml:space="preserve"> technique to try to infer the subwavelength movement</w:t>
+        <w:t>a subwavelength amount and use an amplitude and phase based technique to try to infer the subwavelength movement</w:t>
       </w:r>
     </w:p>
     <w:p>
@@ -1100,21 +1048,11 @@
           <w:highlight w:val="yellow"/>
         </w:rPr>
       </w:pPr>
-      <w:proofErr w:type="spellStart"/>
-      <w:proofErr w:type="gramStart"/>
-      <w:r>
-        <w:rPr>
-          <w:highlight w:val="yellow"/>
-        </w:rPr>
-        <w:t>prof.rd</w:t>
-      </w:r>
-      <w:proofErr w:type="spellEnd"/>
-      <w:proofErr w:type="gramEnd"/>
-      <w:r>
-        <w:rPr>
-          <w:highlight w:val="yellow"/>
-        </w:rPr>
-        <w:t xml:space="preserve"> is the reference</w:t>
+      <w:r>
+        <w:rPr>
+          <w:highlight w:val="yellow"/>
+        </w:rPr>
+        <w:t>prof.rd is the reference</w:t>
       </w:r>
     </w:p>
     <w:p>
@@ -1378,21 +1316,7 @@
         <w:rPr>
           <w:highlight w:val="yellow"/>
         </w:rPr>
-        <w:t xml:space="preserve"> for back-propagation how pre-processing is done before playing it back in </w:t>
-      </w:r>
-      <w:proofErr w:type="spellStart"/>
-      <w:r>
-        <w:rPr>
-          <w:highlight w:val="yellow"/>
-        </w:rPr>
-        <w:t>gprMax</w:t>
-      </w:r>
-      <w:proofErr w:type="spellEnd"/>
-      <w:r>
-        <w:rPr>
-          <w:highlight w:val="yellow"/>
-        </w:rPr>
-        <w:t xml:space="preserve"> to </w:t>
+        <w:t xml:space="preserve"> for back-propagation how pre-processing is done before playing it back in gprMax to </w:t>
       </w:r>
       <w:r>
         <w:rPr>
@@ -1476,21 +1400,7 @@
         <w:rPr>
           <w:highlight w:val="yellow"/>
         </w:rPr>
-        <w:t xml:space="preserve"> the location of the fluid front, so when taking the difference, it will not highlight. </w:t>
-      </w:r>
-      <w:proofErr w:type="gramStart"/>
-      <w:r>
-        <w:rPr>
-          <w:highlight w:val="yellow"/>
-        </w:rPr>
-        <w:t>Also</w:t>
-      </w:r>
-      <w:proofErr w:type="gramEnd"/>
-      <w:r>
-        <w:rPr>
-          <w:highlight w:val="yellow"/>
-        </w:rPr>
-        <w:t xml:space="preserve"> when taking a B-scan it takes time</w:t>
+        <w:t xml:space="preserve"> the location of the fluid front, so when taking the difference, it will not highlight. Also when taking a B-scan it takes time</w:t>
       </w:r>
       <w:r>
         <w:rPr>
@@ -1977,15 +1887,7 @@
         </w:numPr>
       </w:pPr>
       <w:r>
-        <w:t xml:space="preserve">Appendix: things you don’t </w:t>
-      </w:r>
-      <w:proofErr w:type="spellStart"/>
-      <w:r>
-        <w:t>wanna</w:t>
-      </w:r>
-      <w:proofErr w:type="spellEnd"/>
-      <w:r>
-        <w:t xml:space="preserve"> describe and might put in later,</w:t>
+        <w:t>Appendix: things you don’t wanna describe and might put in later,</w:t>
       </w:r>
       <w:r>
         <w:t xml:space="preserve"> </w:t>
@@ -2160,13 +2062,8 @@
           <w:numId w:val="4"/>
         </w:numPr>
       </w:pPr>
-      <w:proofErr w:type="gramStart"/>
-      <w:r>
-        <w:t>Also</w:t>
-      </w:r>
-      <w:proofErr w:type="gramEnd"/>
-      <w:r>
-        <w:t xml:space="preserve"> when developing the WLS phase-shift workflow, there are design choices and uncertainties and subjectivities.</w:t>
+      <w:r>
+        <w:t>Also when developing the WLS phase-shift workflow, there are design choices and uncertainties and subjectivities.</w:t>
       </w:r>
     </w:p>
     <w:p>
@@ -2282,21 +2179,12 @@
         </w:rPr>
         <w:t xml:space="preserve"> title, is only relevant if you discuss the </w:t>
       </w:r>
-      <w:proofErr w:type="gramStart"/>
       <w:r>
         <w:rPr>
           <w:highlight w:val="yellow"/>
           <w:u w:val="single"/>
         </w:rPr>
-        <w:t>amplitude based</w:t>
-      </w:r>
-      <w:proofErr w:type="gramEnd"/>
-      <w:r>
-        <w:rPr>
-          <w:highlight w:val="yellow"/>
-          <w:u w:val="single"/>
-        </w:rPr>
-        <w:t xml:space="preserve"> </w:t>
+        <w:t xml:space="preserve">amplitude based </w:t>
       </w:r>
       <w:r>
         <w:rPr>
@@ -2326,21 +2214,7 @@
         <w:rPr>
           <w:highlight w:val="yellow"/>
         </w:rPr>
-        <w:t xml:space="preserve">. </w:t>
-      </w:r>
-      <w:proofErr w:type="gramStart"/>
-      <w:r>
-        <w:rPr>
-          <w:highlight w:val="yellow"/>
-        </w:rPr>
-        <w:t>So</w:t>
-      </w:r>
-      <w:proofErr w:type="gramEnd"/>
-      <w:r>
-        <w:rPr>
-          <w:highlight w:val="yellow"/>
-        </w:rPr>
-        <w:t xml:space="preserve"> moving away from traditional amplitude to phase methods</w:t>
+        <w:t>. So moving away from traditional amplitude to phase methods</w:t>
       </w:r>
     </w:p>
     <w:p>
@@ -2393,13 +2267,8 @@
     </w:p>
     <w:p/>
     <w:p>
-      <w:proofErr w:type="gramStart"/>
-      <w:r>
-        <w:t>In order to</w:t>
-      </w:r>
-      <w:proofErr w:type="gramEnd"/>
-      <w:r>
-        <w:t xml:space="preserve"> write paragraph-per-paragraph, topic-per-topic</w:t>
+      <w:r>
+        <w:t>In order to write paragraph-per-paragraph, topic-per-topic</w:t>
       </w:r>
       <w:r>
         <w:t xml:space="preserve"> have this in order:</w:t>
@@ -2438,15 +2307,7 @@
         </w:numPr>
       </w:pPr>
       <w:r>
-        <w:t xml:space="preserve">Have on </w:t>
-      </w:r>
-      <w:proofErr w:type="spellStart"/>
-      <w:r>
-        <w:t>notebookLM</w:t>
-      </w:r>
-      <w:proofErr w:type="spellEnd"/>
-      <w:r>
-        <w:t xml:space="preserve"> per main topic group:</w:t>
+        <w:t>Have on notebookLM per main topic group:</w:t>
       </w:r>
     </w:p>
     <w:p>
@@ -2702,23 +2563,7 @@
           <w:sz w:val="20"/>
           <w:szCs w:val="20"/>
         </w:rPr>
-        <w:t xml:space="preserve"> and your </w:t>
-      </w:r>
-      <w:proofErr w:type="spellStart"/>
-      <w:r>
-        <w:rPr>
-          <w:sz w:val="20"/>
-          <w:szCs w:val="20"/>
-        </w:rPr>
-        <w:t>gprMax</w:t>
-      </w:r>
-      <w:proofErr w:type="spellEnd"/>
-      <w:r>
-        <w:rPr>
-          <w:sz w:val="20"/>
-          <w:szCs w:val="20"/>
-        </w:rPr>
-        <w:t xml:space="preserve"> setup in </w:t>
+        <w:t xml:space="preserve"> and your gprMax setup in </w:t>
       </w:r>
       <w:r>
         <w:rPr>
@@ -2802,23 +2647,7 @@
           <w:sz w:val="20"/>
           <w:szCs w:val="20"/>
         </w:rPr>
-        <w:t xml:space="preserve">Lateral/vertical resolution, fracture aperture &amp; thickness, </w:t>
-      </w:r>
-      <w:proofErr w:type="gramStart"/>
-      <w:r>
-        <w:rPr>
-          <w:sz w:val="20"/>
-          <w:szCs w:val="20"/>
-        </w:rPr>
-        <w:t>thin-bed</w:t>
-      </w:r>
-      <w:proofErr w:type="gramEnd"/>
-      <w:r>
-        <w:rPr>
-          <w:sz w:val="20"/>
-          <w:szCs w:val="20"/>
-        </w:rPr>
-        <w:t xml:space="preserve">/sub-wavelength detection → </w:t>
+        <w:t xml:space="preserve">Lateral/vertical resolution, fracture aperture &amp; thickness, thin-bed/sub-wavelength detection → </w:t>
       </w:r>
       <w:r>
         <w:rPr>
@@ -3200,21 +3029,12 @@
           <w:szCs w:val="20"/>
         </w:rPr>
       </w:pPr>
-      <w:proofErr w:type="spellStart"/>
-      <w:r>
-        <w:rPr>
-          <w:sz w:val="20"/>
-          <w:szCs w:val="20"/>
-        </w:rPr>
-        <w:t>General_Migration_Reviews</w:t>
-      </w:r>
-      <w:proofErr w:type="spellEnd"/>
-      <w:r>
-        <w:rPr>
-          <w:sz w:val="20"/>
-          <w:szCs w:val="20"/>
-        </w:rPr>
-        <w:t xml:space="preserve"> papers likely survey </w:t>
+      <w:r>
+        <w:rPr>
+          <w:sz w:val="20"/>
+          <w:szCs w:val="20"/>
+        </w:rPr>
+        <w:t xml:space="preserve">General_Migration_Reviews papers likely survey </w:t>
       </w:r>
       <w:r>
         <w:rPr>
@@ -6103,12 +5923,14 @@
         <w:rPr>
           <w:sz w:val="20"/>
           <w:szCs w:val="20"/>
-        </w:rPr>
-      </w:pPr>
-      <w:r>
-        <w:rPr>
-          <w:sz w:val="20"/>
-          <w:szCs w:val="20"/>
+          <w:highlight w:val="yellow"/>
+        </w:rPr>
+      </w:pPr>
+      <w:r>
+        <w:rPr>
+          <w:sz w:val="20"/>
+          <w:szCs w:val="20"/>
+          <w:highlight w:val="yellow"/>
         </w:rPr>
         <w:t>Change figures to tables</w:t>
       </w:r>
@@ -6116,6 +5938,7 @@
         <w:rPr>
           <w:sz w:val="20"/>
           <w:szCs w:val="20"/>
+          <w:highlight w:val="yellow"/>
         </w:rPr>
         <w:t xml:space="preserve"> and correct figure numbering</w:t>
       </w:r>
@@ -6130,12 +5953,14 @@
         <w:rPr>
           <w:sz w:val="20"/>
           <w:szCs w:val="20"/>
-        </w:rPr>
-      </w:pPr>
-      <w:r>
-        <w:rPr>
-          <w:sz w:val="20"/>
-          <w:szCs w:val="20"/>
+          <w:highlight w:val="yellow"/>
+        </w:rPr>
+      </w:pPr>
+      <w:r>
+        <w:rPr>
+          <w:sz w:val="20"/>
+          <w:szCs w:val="20"/>
+          <w:highlight w:val="yellow"/>
         </w:rPr>
         <w:t>Maybe one more figure in chapter 5 to explain</w:t>
       </w:r>
@@ -6442,31 +6267,6 @@
         </w:rPr>
         <w:t>Figure 19, change title</w:t>
       </w:r>
-    </w:p>
-    <w:p>
-      <w:pPr>
-        <w:rPr>
-          <w:sz w:val="20"/>
-          <w:szCs w:val="20"/>
-        </w:rPr>
-      </w:pPr>
-      <w:r>
-        <w:rPr>
-          <w:b/>
-          <w:bCs/>
-          <w:sz w:val="20"/>
-          <w:szCs w:val="20"/>
-        </w:rPr>
-        <w:t>Papa Feedback</w:t>
-      </w:r>
-    </w:p>
-    <w:p>
-      <w:pPr>
-        <w:rPr>
-          <w:sz w:val="20"/>
-          <w:szCs w:val="20"/>
-        </w:rPr>
-      </w:pPr>
     </w:p>
     <w:p>
       <w:pPr>

</xml_diff>

<commit_message>
Moved appendix to supplementary and shortened it
</commit_message>
<xml_diff>
--- a/TimeLapse_LaTeX/Thesis/working summary.docx
+++ b/TimeLapse_LaTeX/Thesis/working summary.docx
@@ -143,7 +143,14 @@
     <w:p>
       <w:r>
         <w:tab/>
-        <w:t>All of the materials and methods common to two or more experiments—specifically excluding the experimental procedure for each experiment.</w:t>
+      </w:r>
+      <w:proofErr w:type="gramStart"/>
+      <w:r>
+        <w:t>All of</w:t>
+      </w:r>
+      <w:proofErr w:type="gramEnd"/>
+      <w:r>
+        <w:t xml:space="preserve"> the materials and methods common to two or more experiments—specifically excluding the experimental procedure for each experiment.</w:t>
       </w:r>
     </w:p>
     <w:p>
@@ -167,8 +174,13 @@
         </w:numPr>
       </w:pPr>
       <w:r>
-        <w:t>Discuss gprMax</w:t>
-      </w:r>
+        <w:t xml:space="preserve">Discuss </w:t>
+      </w:r>
+      <w:proofErr w:type="spellStart"/>
+      <w:r>
+        <w:t>gprMax</w:t>
+      </w:r>
+      <w:proofErr w:type="spellEnd"/>
     </w:p>
     <w:p>
       <w:pPr>
@@ -388,7 +400,39 @@
         <w:shd w:val="clear" w:color="auto" w:fill="E8E8E8" w:themeFill="background2"/>
       </w:pPr>
       <w:r>
-        <w:t>Tracking del_phi/del_x and del_phi/del_y to infer horizontal and vertical translation</w:t>
+        <w:t xml:space="preserve">Tracking </w:t>
+      </w:r>
+      <w:proofErr w:type="spellStart"/>
+      <w:r>
+        <w:t>del_phi</w:t>
+      </w:r>
+      <w:proofErr w:type="spellEnd"/>
+      <w:r>
+        <w:t>/</w:t>
+      </w:r>
+      <w:proofErr w:type="spellStart"/>
+      <w:r>
+        <w:t>del_x</w:t>
+      </w:r>
+      <w:proofErr w:type="spellEnd"/>
+      <w:r>
+        <w:t xml:space="preserve"> and </w:t>
+      </w:r>
+      <w:proofErr w:type="spellStart"/>
+      <w:r>
+        <w:t>del_phi</w:t>
+      </w:r>
+      <w:proofErr w:type="spellEnd"/>
+      <w:r>
+        <w:t>/</w:t>
+      </w:r>
+      <w:proofErr w:type="spellStart"/>
+      <w:r>
+        <w:t>del_y</w:t>
+      </w:r>
+      <w:proofErr w:type="spellEnd"/>
+      <w:r>
+        <w:t xml:space="preserve"> to infer horizontal and vertical translation</w:t>
       </w:r>
     </w:p>
     <w:p>
@@ -560,7 +604,15 @@
         <w:t xml:space="preserve">(so material change rather than scatterer translation) </w:t>
       </w:r>
       <w:r>
-        <w:t>a subwavelength amount and use an amplitude and phase based technique to try to infer the subwavelength movement</w:t>
+        <w:t xml:space="preserve">a subwavelength amount and use an amplitude and </w:t>
+      </w:r>
+      <w:proofErr w:type="gramStart"/>
+      <w:r>
+        <w:t>phase based</w:t>
+      </w:r>
+      <w:proofErr w:type="gramEnd"/>
+      <w:r>
+        <w:t xml:space="preserve"> technique to try to infer the subwavelength movement</w:t>
       </w:r>
     </w:p>
     <w:p>
@@ -1048,11 +1100,21 @@
           <w:highlight w:val="yellow"/>
         </w:rPr>
       </w:pPr>
-      <w:r>
-        <w:rPr>
-          <w:highlight w:val="yellow"/>
-        </w:rPr>
-        <w:t>prof.rd is the reference</w:t>
+      <w:proofErr w:type="spellStart"/>
+      <w:proofErr w:type="gramStart"/>
+      <w:r>
+        <w:rPr>
+          <w:highlight w:val="yellow"/>
+        </w:rPr>
+        <w:t>prof.rd</w:t>
+      </w:r>
+      <w:proofErr w:type="spellEnd"/>
+      <w:proofErr w:type="gramEnd"/>
+      <w:r>
+        <w:rPr>
+          <w:highlight w:val="yellow"/>
+        </w:rPr>
+        <w:t xml:space="preserve"> is the reference</w:t>
       </w:r>
     </w:p>
     <w:p>
@@ -1316,7 +1378,21 @@
         <w:rPr>
           <w:highlight w:val="yellow"/>
         </w:rPr>
-        <w:t xml:space="preserve"> for back-propagation how pre-processing is done before playing it back in gprMax to </w:t>
+        <w:t xml:space="preserve"> for back-propagation how pre-processing is done before playing it back in </w:t>
+      </w:r>
+      <w:proofErr w:type="spellStart"/>
+      <w:r>
+        <w:rPr>
+          <w:highlight w:val="yellow"/>
+        </w:rPr>
+        <w:t>gprMax</w:t>
+      </w:r>
+      <w:proofErr w:type="spellEnd"/>
+      <w:r>
+        <w:rPr>
+          <w:highlight w:val="yellow"/>
+        </w:rPr>
+        <w:t xml:space="preserve"> to </w:t>
       </w:r>
       <w:r>
         <w:rPr>
@@ -1400,7 +1476,21 @@
         <w:rPr>
           <w:highlight w:val="yellow"/>
         </w:rPr>
-        <w:t xml:space="preserve"> the location of the fluid front, so when taking the difference, it will not highlight. Also when taking a B-scan it takes time</w:t>
+        <w:t xml:space="preserve"> the location of the fluid front, so when taking the difference, it will not highlight. </w:t>
+      </w:r>
+      <w:proofErr w:type="gramStart"/>
+      <w:r>
+        <w:rPr>
+          <w:highlight w:val="yellow"/>
+        </w:rPr>
+        <w:t>Also</w:t>
+      </w:r>
+      <w:proofErr w:type="gramEnd"/>
+      <w:r>
+        <w:rPr>
+          <w:highlight w:val="yellow"/>
+        </w:rPr>
+        <w:t xml:space="preserve"> when taking a B-scan it takes time</w:t>
       </w:r>
       <w:r>
         <w:rPr>
@@ -1887,7 +1977,15 @@
         </w:numPr>
       </w:pPr>
       <w:r>
-        <w:t>Appendix: things you don’t wanna describe and might put in later,</w:t>
+        <w:t xml:space="preserve">Appendix: things you don’t </w:t>
+      </w:r>
+      <w:proofErr w:type="spellStart"/>
+      <w:r>
+        <w:t>wanna</w:t>
+      </w:r>
+      <w:proofErr w:type="spellEnd"/>
+      <w:r>
+        <w:t xml:space="preserve"> describe and might put in later,</w:t>
       </w:r>
       <w:r>
         <w:t xml:space="preserve"> </w:t>
@@ -2062,8 +2160,13 @@
           <w:numId w:val="4"/>
         </w:numPr>
       </w:pPr>
-      <w:r>
-        <w:t>Also when developing the WLS phase-shift workflow, there are design choices and uncertainties and subjectivities.</w:t>
+      <w:proofErr w:type="gramStart"/>
+      <w:r>
+        <w:t>Also</w:t>
+      </w:r>
+      <w:proofErr w:type="gramEnd"/>
+      <w:r>
+        <w:t xml:space="preserve"> when developing the WLS phase-shift workflow, there are design choices and uncertainties and subjectivities.</w:t>
       </w:r>
     </w:p>
     <w:p>
@@ -2179,12 +2282,21 @@
         </w:rPr>
         <w:t xml:space="preserve"> title, is only relevant if you discuss the </w:t>
       </w:r>
+      <w:proofErr w:type="gramStart"/>
       <w:r>
         <w:rPr>
           <w:highlight w:val="yellow"/>
           <w:u w:val="single"/>
         </w:rPr>
-        <w:t xml:space="preserve">amplitude based </w:t>
+        <w:t>amplitude based</w:t>
+      </w:r>
+      <w:proofErr w:type="gramEnd"/>
+      <w:r>
+        <w:rPr>
+          <w:highlight w:val="yellow"/>
+          <w:u w:val="single"/>
+        </w:rPr>
+        <w:t xml:space="preserve"> </w:t>
       </w:r>
       <w:r>
         <w:rPr>
@@ -2214,7 +2326,21 @@
         <w:rPr>
           <w:highlight w:val="yellow"/>
         </w:rPr>
-        <w:t>. So moving away from traditional amplitude to phase methods</w:t>
+        <w:t xml:space="preserve">. </w:t>
+      </w:r>
+      <w:proofErr w:type="gramStart"/>
+      <w:r>
+        <w:rPr>
+          <w:highlight w:val="yellow"/>
+        </w:rPr>
+        <w:t>So</w:t>
+      </w:r>
+      <w:proofErr w:type="gramEnd"/>
+      <w:r>
+        <w:rPr>
+          <w:highlight w:val="yellow"/>
+        </w:rPr>
+        <w:t xml:space="preserve"> moving away from traditional amplitude to phase methods</w:t>
       </w:r>
     </w:p>
     <w:p>
@@ -2267,8 +2393,13 @@
     </w:p>
     <w:p/>
     <w:p>
-      <w:r>
-        <w:t>In order to write paragraph-per-paragraph, topic-per-topic</w:t>
+      <w:proofErr w:type="gramStart"/>
+      <w:r>
+        <w:t>In order to</w:t>
+      </w:r>
+      <w:proofErr w:type="gramEnd"/>
+      <w:r>
+        <w:t xml:space="preserve"> write paragraph-per-paragraph, topic-per-topic</w:t>
       </w:r>
       <w:r>
         <w:t xml:space="preserve"> have this in order:</w:t>
@@ -2307,7 +2438,15 @@
         </w:numPr>
       </w:pPr>
       <w:r>
-        <w:t>Have on notebookLM per main topic group:</w:t>
+        <w:t xml:space="preserve">Have on </w:t>
+      </w:r>
+      <w:proofErr w:type="spellStart"/>
+      <w:r>
+        <w:t>notebookLM</w:t>
+      </w:r>
+      <w:proofErr w:type="spellEnd"/>
+      <w:r>
+        <w:t xml:space="preserve"> per main topic group:</w:t>
       </w:r>
     </w:p>
     <w:p>
@@ -2563,7 +2702,23 @@
           <w:sz w:val="20"/>
           <w:szCs w:val="20"/>
         </w:rPr>
-        <w:t xml:space="preserve"> and your gprMax setup in </w:t>
+        <w:t xml:space="preserve"> and your </w:t>
+      </w:r>
+      <w:proofErr w:type="spellStart"/>
+      <w:r>
+        <w:rPr>
+          <w:sz w:val="20"/>
+          <w:szCs w:val="20"/>
+        </w:rPr>
+        <w:t>gprMax</w:t>
+      </w:r>
+      <w:proofErr w:type="spellEnd"/>
+      <w:r>
+        <w:rPr>
+          <w:sz w:val="20"/>
+          <w:szCs w:val="20"/>
+        </w:rPr>
+        <w:t xml:space="preserve"> setup in </w:t>
       </w:r>
       <w:r>
         <w:rPr>
@@ -2647,7 +2802,23 @@
           <w:sz w:val="20"/>
           <w:szCs w:val="20"/>
         </w:rPr>
-        <w:t xml:space="preserve">Lateral/vertical resolution, fracture aperture &amp; thickness, thin-bed/sub-wavelength detection → </w:t>
+        <w:t xml:space="preserve">Lateral/vertical resolution, fracture aperture &amp; thickness, </w:t>
+      </w:r>
+      <w:proofErr w:type="gramStart"/>
+      <w:r>
+        <w:rPr>
+          <w:sz w:val="20"/>
+          <w:szCs w:val="20"/>
+        </w:rPr>
+        <w:t>thin-bed</w:t>
+      </w:r>
+      <w:proofErr w:type="gramEnd"/>
+      <w:r>
+        <w:rPr>
+          <w:sz w:val="20"/>
+          <w:szCs w:val="20"/>
+        </w:rPr>
+        <w:t xml:space="preserve">/sub-wavelength detection → </w:t>
       </w:r>
       <w:r>
         <w:rPr>
@@ -3029,12 +3200,21 @@
           <w:szCs w:val="20"/>
         </w:rPr>
       </w:pPr>
-      <w:r>
-        <w:rPr>
-          <w:sz w:val="20"/>
-          <w:szCs w:val="20"/>
-        </w:rPr>
-        <w:t xml:space="preserve">General_Migration_Reviews papers likely survey </w:t>
+      <w:proofErr w:type="spellStart"/>
+      <w:r>
+        <w:rPr>
+          <w:sz w:val="20"/>
+          <w:szCs w:val="20"/>
+        </w:rPr>
+        <w:t>General_Migration_Reviews</w:t>
+      </w:r>
+      <w:proofErr w:type="spellEnd"/>
+      <w:r>
+        <w:rPr>
+          <w:sz w:val="20"/>
+          <w:szCs w:val="20"/>
+        </w:rPr>
+        <w:t xml:space="preserve"> papers likely survey </w:t>
       </w:r>
       <w:r>
         <w:rPr>
@@ -6279,18 +6459,21 @@
     <w:p>
       <w:pPr>
         <w:rPr>
-          <w:sz w:val="20"/>
-          <w:szCs w:val="20"/>
-        </w:rPr>
-      </w:pPr>
-    </w:p>
-    <w:p>
-      <w:pPr>
-        <w:rPr>
-          <w:sz w:val="20"/>
-          <w:szCs w:val="20"/>
-        </w:rPr>
-      </w:pPr>
+          <w:b/>
+          <w:bCs/>
+          <w:sz w:val="20"/>
+          <w:szCs w:val="20"/>
+        </w:rPr>
+      </w:pPr>
+      <w:r>
+        <w:rPr>
+          <w:b/>
+          <w:bCs/>
+          <w:sz w:val="20"/>
+          <w:szCs w:val="20"/>
+        </w:rPr>
+        <w:t>Fix sources!</w:t>
+      </w:r>
     </w:p>
     <w:sectPr>
       <w:pgSz w:w="11906" w:h="16838"/>

</xml_diff>